<commit_message>
Blank Word template update with new syntax and tweak personalisation content on /upload-a-letter
</commit_message>
<xml_diff>
--- a/docs/assets/worddocs/letter-template-nhs-notify-large-print.docx
+++ b/docs/assets/worddocs/letter-template-nhs-notify-large-print.docx
@@ -19,52 +19,64 @@
         </w:rPr>
         <w:t>T</w:t>
       </w:r>
+      <w:commentRangeEnd w:id="3"/>
+      <w:r>
+        <w:rPr>
+          <w:rStyle w:val="CommentReference"/>
+          <w:rFonts w:cs="Noto Sans Medium"/>
+          <w:sz w:val="32"/>
+          <w:szCs w:val="32"/>
+        </w:rPr>
+        <w:commentReference w:id="3"/>
+      </w:r>
+      <w:commentRangeEnd w:id="2"/>
+      <w:r>
+        <w:rPr>
+          <w:rStyle w:val="CommentReference"/>
+          <w:rFonts w:cs="Noto Sans Medium"/>
+          <w:sz w:val="32"/>
+          <w:szCs w:val="32"/>
+        </w:rPr>
+        <w:commentReference w:id="2"/>
+      </w:r>
+      <w:commentRangeEnd w:id="1"/>
+      <w:r>
+        <w:rPr>
+          <w:rStyle w:val="CommentReference"/>
+          <w:rFonts w:cs="Noto Sans Medium"/>
+          <w:sz w:val="32"/>
+          <w:szCs w:val="32"/>
+        </w:rPr>
+        <w:commentReference w:id="1"/>
+      </w:r>
+      <w:r>
+        <w:rPr>
+          <w:rFonts w:cs="Noto Sans Medium"/>
+        </w:rPr>
+        <w:t xml:space="preserve">his is </w:t>
+      </w:r>
+      <w:r>
+        <w:rPr>
+          <w:rFonts w:cs="Noto Sans Medium"/>
+        </w:rPr>
+        <w:t>the main</w:t>
+      </w:r>
+      <w:r>
+        <w:rPr>
+          <w:rFonts w:cs="Noto Sans Medium"/>
+        </w:rPr>
+        <w:t xml:space="preserve"> heading</w:t>
+      </w:r>
       <w:commentRangeEnd w:id="0"/>
-      <w:commentRangeEnd w:id="1"/>
-      <w:r>
-        <w:rPr>
-          <w:rFonts w:cs="Noto Sans Medium"/>
+      <w:r>
+        <w:rPr>
+          <w:rStyle w:val="CommentReference"/>
+          <w:rFonts w:cs="Noto Sans Medium"/>
+          <w:sz w:val="32"/>
+          <w:szCs w:val="32"/>
         </w:rPr>
         <w:commentReference w:id="0"/>
       </w:r>
-      <w:r>
-        <w:rPr>
-          <w:rFonts w:cs="Noto Sans Medium"/>
-        </w:rPr>
-        <w:commentReference w:id="1"/>
-      </w:r>
-      <w:commentRangeEnd w:id="2"/>
-      <w:r>
-        <w:rPr>
-          <w:rFonts w:cs="Noto Sans Medium"/>
-        </w:rPr>
-        <w:commentReference w:id="2"/>
-      </w:r>
-      <w:r>
-        <w:rPr>
-          <w:rFonts w:cs="Noto Sans Medium"/>
-        </w:rPr>
-        <w:t xml:space="preserve">his is </w:t>
-      </w:r>
-      <w:r>
-        <w:rPr>
-          <w:rFonts w:cs="Noto Sans Medium"/>
-        </w:rPr>
-        <w:t>the main</w:t>
-      </w:r>
-      <w:r>
-        <w:rPr>
-          <w:rFonts w:cs="Noto Sans Medium"/>
-        </w:rPr>
-        <w:t xml:space="preserve"> heading</w:t>
-      </w:r>
-      <w:commentRangeEnd w:id="3"/>
-      <w:r>
-        <w:rPr>
-          <w:rFonts w:cs="Noto Sans Medium"/>
-        </w:rPr>
-        <w:commentReference w:id="3"/>
-      </w:r>
     </w:p>
     <w:p>
       <w:pPr>
@@ -86,6 +98,9 @@
         <w:rPr>
           <w:rStyle w:val="CommentReference"/>
           <w:rFonts w:cs="Noto Sans Medium"/>
+          <w:sz w:val="32"/>
+          <w:szCs w:val="24"/>
+          <w:lang w:eastAsia="en-GB"/>
         </w:rPr>
         <w:commentReference w:id="4"/>
       </w:r>
@@ -96,18 +111,28 @@
         </w:rPr>
         <w:t xml:space="preserve"> </w:t>
       </w:r>
+      <w:r>
+        <w:rPr>
+          <w:rFonts w:cs="Noto Sans Medium"/>
+          <w:lang w:eastAsia="en-GB"/>
+        </w:rPr>
+        <w:t>{d.</w:t>
+      </w:r>
       <w:commentRangeStart w:id="5"/>
       <w:r>
         <w:rPr>
           <w:rFonts w:cs="Noto Sans Medium"/>
           <w:lang w:eastAsia="en-GB"/>
         </w:rPr>
-        <w:t>((fullName))</w:t>
+        <w:t>fullName</w:t>
       </w:r>
       <w:commentRangeEnd w:id="5"/>
       <w:r>
         <w:rPr>
-          <w:rFonts w:cs="Noto Sans Medium"/>
+          <w:rStyle w:val="CommentReference"/>
+          <w:rFonts w:cs="Noto Sans Medium"/>
+          <w:sz w:val="32"/>
+          <w:szCs w:val="24"/>
           <w:lang w:eastAsia="en-GB"/>
         </w:rPr>
         <w:commentReference w:id="5"/>
@@ -117,6 +142,13 @@
           <w:rFonts w:cs="Noto Sans Medium"/>
           <w:lang w:eastAsia="en-GB"/>
         </w:rPr>
+        <w:t>}</w:t>
+      </w:r>
+      <w:r>
+        <w:rPr>
+          <w:rFonts w:cs="Noto Sans Medium"/>
+          <w:lang w:eastAsia="en-GB"/>
+        </w:rPr>
         <w:t>,</w:t>
       </w:r>
     </w:p>
@@ -140,6 +172,9 @@
         <w:rPr>
           <w:rStyle w:val="CommentReference"/>
           <w:rFonts w:cs="Noto Sans Medium"/>
+          <w:sz w:val="32"/>
+          <w:szCs w:val="24"/>
+          <w:lang w:eastAsia="en-GB"/>
         </w:rPr>
         <w:commentReference w:id="6"/>
       </w:r>
@@ -239,7 +274,13 @@
       <w:r>
         <w:rPr>
           <w:rStyle w:val="CommentReference"/>
-          <w:rFonts w:cs="Noto Sans Medium"/>
+          <w:rFonts w:eastAsia="Times New Roman" w:cs="Noto Sans Medium"/>
+          <w:color w:val="0D0D0D" w:themeColor="text1" w:themeTint="F2"/>
+          <w:kern w:val="0"/>
+          <w:sz w:val="32"/>
+          <w:szCs w:val="32"/>
+          <w:lang w:eastAsia="en-GB"/>
+          <w14:ligatures w14:val="none"/>
         </w:rPr>
         <w:commentReference w:id="7"/>
       </w:r>
@@ -342,6 +383,8 @@
         <w:rPr>
           <w:rStyle w:val="CommentReference"/>
           <w:rFonts w:cs="Noto Sans Medium"/>
+          <w:sz w:val="32"/>
+          <w:szCs w:val="24"/>
         </w:rPr>
         <w:commentReference w:id="8"/>
       </w:r>
@@ -361,24 +404,11 @@
         <w:rPr>
           <w:rFonts w:cs="Noto Sans Medium"/>
         </w:rPr>
-        <w:t>hello ((firstName)), your NHS Number is ((nhsNumber)).</w:t>
-      </w:r>
-      <w:r>
-        <w:rPr>
-          <w:rFonts w:cs="Noto Sans Medium"/>
-        </w:rPr>
-        <w:t xml:space="preserve"> </w:t>
-      </w:r>
-      <w:r>
-        <w:rPr>
-          <w:rFonts w:cs="Noto Sans Medium"/>
-        </w:rPr>
-        <w:t>Your GP surgery is ((gpSurgeryName)), located at ((gpSurgeryAddress)). Call ((gpSurgeryPhone)) to book your appointment. </w:t>
-      </w:r>
-    </w:p>
-    <w:p>
-      <w:pPr>
-        <w:pStyle w:val="Heading2"/>
+        <w:t>Hello {d.fullName}, your NHS Number is {d.nhsNumber}. Your appointment is on {d.appointmentDate} at {d.gpSurgery}.</w:t>
+      </w:r>
+    </w:p>
+    <w:p>
+      <w:pPr>
         <w:rPr>
           <w:rFonts w:cs="Noto Sans Medium"/>
         </w:rPr>
@@ -425,6 +455,15 @@
       <w:commentRangeEnd w:id="9"/>
       <w:r>
         <w:rPr>
+          <w:rStyle w:val="CommentReference"/>
+          <w:b/>
+          <w:sz w:val="32"/>
+          <w:szCs w:val="24"/>
+        </w:rPr>
+        <w:commentReference w:id="9"/>
+      </w:r>
+      <w:r>
+        <w:rPr>
           <w:rStyle w:val="Hyperlink"/>
         </w:rPr>
         <w:instrText>"</w:instrText>
@@ -451,12 +490,6 @@
           <w:rStyle w:val="Hyperlink"/>
         </w:rPr>
         <w:fldChar w:fldCharType="end"/>
-      </w:r>
-      <w:r>
-        <w:rPr>
-          <w:rStyle w:val="Hyperlink"/>
-        </w:rPr>
-        <w:commentReference w:id="9"/>
       </w:r>
       <w:r>
         <w:rPr>
@@ -753,7 +786,7 @@
           <w:noProof/>
         </w:rPr>
         <w:drawing>
-          <wp:inline distT="0" distB="0" distL="0" distR="0" wp14:anchorId="1EB53E18" wp14:editId="3660A197">
+          <wp:inline distT="0" distB="0" distL="0" distR="0" wp14:anchorId="1EB53E18" wp14:editId="73AF8998">
             <wp:extent cx="1336431" cy="1336431"/>
             <wp:effectExtent l="0" t="0" r="0" b="0"/>
             <wp:docPr id="1392541066" name="Picture 2" descr="A qr code with a black background&#10;&#10;Description automatically generated"/>
@@ -1072,7 +1105,7 @@
 
 <file path=word/comments.xml><?xml version="1.0" encoding="utf-8"?>
 <w:comments xmlns:wpc="http://schemas.microsoft.com/office/word/2010/wordprocessingCanvas" xmlns:cx="http://schemas.microsoft.com/office/drawing/2014/chartex" xmlns:cx1="http://schemas.microsoft.com/office/drawing/2015/9/8/chartex" xmlns:cx2="http://schemas.microsoft.com/office/drawing/2015/10/21/chartex" xmlns:cx3="http://schemas.microsoft.com/office/drawing/2016/5/9/chartex" xmlns:cx4="http://schemas.microsoft.com/office/drawing/2016/5/10/chartex" xmlns:cx5="http://schemas.microsoft.com/office/drawing/2016/5/11/chartex" xmlns:cx6="http://schemas.microsoft.com/office/drawing/2016/5/12/chartex" xmlns:cx7="http://schemas.microsoft.com/office/drawing/2016/5/13/chartex" xmlns:cx8="http://schemas.microsoft.com/office/drawing/2016/5/14/chartex" xmlns:mc="http://schemas.openxmlformats.org/markup-compatibility/2006" xmlns:aink="http://schemas.microsoft.com/office/drawing/2016/ink" xmlns:am3d="http://schemas.microsoft.com/office/drawing/2017/model3d" xmlns:o="urn:schemas-microsoft-com:office:office" xmlns:oel="http://schemas.microsoft.com/office/2019/extlst" xmlns:r="http://schemas.openxmlformats.org/officeDocument/2006/relationships" xmlns:m="http://schemas.openxmlformats.org/officeDocument/2006/math" xmlns:v="urn:schemas-microsoft-com:vml" xmlns:wp14="http://schemas.microsoft.com/office/word/2010/wordprocessingDrawing" xmlns:wp="http://schemas.openxmlformats.org/drawingml/2006/wordprocessingDrawing" xmlns:w10="urn:schemas-microsoft-com:office:word" xmlns:w="http://schemas.openxmlformats.org/wordprocessingml/2006/main" xmlns:w14="http://schemas.microsoft.com/office/word/2010/wordml" xmlns:w15="http://schemas.microsoft.com/office/word/2012/wordml" xmlns:w16cex="http://schemas.microsoft.com/office/word/2018/wordml/cex" xmlns:w16cid="http://schemas.microsoft.com/office/word/2016/wordml/cid" xmlns:w16="http://schemas.microsoft.com/office/word/2018/wordml" xmlns:w16du="http://schemas.microsoft.com/office/word/2023/wordml/word16du" xmlns:w16sdtdh="http://schemas.microsoft.com/office/word/2020/wordml/sdtdatahash" xmlns:w16sdtfl="http://schemas.microsoft.com/office/word/2024/wordml/sdtformatlock" xmlns:w16se="http://schemas.microsoft.com/office/word/2015/wordml/symex" xmlns:wpg="http://schemas.microsoft.com/office/word/2010/wordprocessingGroup" xmlns:wpi="http://schemas.microsoft.com/office/word/2010/wordprocessingInk" xmlns:wne="http://schemas.microsoft.com/office/word/2006/wordml" xmlns:wps="http://schemas.microsoft.com/office/word/2010/wordprocessingShape" mc:Ignorable="w14 w15 w16se w16cid w16 w16cex w16sdtdh w16sdtfl w16du wp14">
-  <w:comment w:id="0" w:author="GIFFORD, Emma (NHS ENGLAND - X26)" w:date="2024-08-27T13:51:00Z" w:initials="EG">
+  <w:comment w:id="3" w:author="GIFFORD, Emma (NHS ENGLAND - X26)" w:date="2024-08-27T13:51:00Z" w:initials="EG">
     <w:p>
       <w:pPr>
         <w:pStyle w:val="CommentText"/>
@@ -1121,7 +1154,7 @@
       </w:r>
     </w:p>
   </w:comment>
-  <w:comment w:id="1" w:author="GIFFORD, Emma (NHS ENGLAND - X26)" w:date="2024-08-27T13:50:00Z" w:initials="EG">
+  <w:comment w:id="2" w:author="GIFFORD, Emma (NHS ENGLAND - X26)" w:date="2024-08-27T13:50:00Z" w:initials="EG">
     <w:p>
       <w:pPr>
         <w:pStyle w:val="CommentText"/>
@@ -1137,7 +1170,7 @@
       </w:r>
     </w:p>
   </w:comment>
-  <w:comment w:id="2" w:author="GIFFORD, Emma (NHS ENGLAND - X26)" w:date="2024-08-27T14:00:00Z" w:initials="EG">
+  <w:comment w:id="1" w:author="GIFFORD, Emma (NHS ENGLAND - X26)" w:date="2024-08-27T14:00:00Z" w:initials="EG">
     <w:p>
       <w:pPr>
         <w:pStyle w:val="CommentText"/>
@@ -1183,7 +1216,7 @@
       </w:r>
     </w:p>
   </w:comment>
-  <w:comment w:id="3" w:author="GIFFORD, Emma (NHS ENGLAND - X26)" w:date="2024-08-27T14:15:00Z" w:initials="EG">
+  <w:comment w:id="0" w:author="GIFFORD, Emma (NHS ENGLAND - X26)" w:date="2024-08-27T14:15:00Z" w:initials="EG">
     <w:p>
       <w:pPr>
         <w:pStyle w:val="CommentText"/>
@@ -1850,7 +1883,23 @@
         <w:sz w:val="16"/>
         <w:szCs w:val="16"/>
       </w:rPr>
-      <w:t>((address_line_1))</w:t>
+      <w:t>{d.</w:t>
+    </w:r>
+    <w:r>
+      <w:rPr>
+        <w:rFonts w:cs="Noto Sans"/>
+        <w:sz w:val="16"/>
+        <w:szCs w:val="16"/>
+      </w:rPr>
+      <w:t>address_line_1</w:t>
+    </w:r>
+    <w:r>
+      <w:rPr>
+        <w:rFonts w:cs="Noto Sans"/>
+        <w:sz w:val="16"/>
+        <w:szCs w:val="16"/>
+      </w:rPr>
+      <w:t>}</w:t>
     </w:r>
   </w:p>
   <w:p>
@@ -1870,7 +1919,23 @@
         <w:sz w:val="16"/>
         <w:szCs w:val="16"/>
       </w:rPr>
-      <w:t>((address_line_2))</w:t>
+      <w:t>{d.</w:t>
+    </w:r>
+    <w:r>
+      <w:rPr>
+        <w:rFonts w:cs="Noto Sans"/>
+        <w:sz w:val="16"/>
+        <w:szCs w:val="16"/>
+      </w:rPr>
+      <w:t>address_line_2</w:t>
+    </w:r>
+    <w:r>
+      <w:rPr>
+        <w:rFonts w:cs="Noto Sans"/>
+        <w:sz w:val="16"/>
+        <w:szCs w:val="16"/>
+      </w:rPr>
+      <w:t>}</w:t>
     </w:r>
   </w:p>
   <w:p>
@@ -1890,7 +1955,23 @@
         <w:sz w:val="16"/>
         <w:szCs w:val="16"/>
       </w:rPr>
-      <w:t>((address_line_3))</w:t>
+      <w:t>{d.</w:t>
+    </w:r>
+    <w:r>
+      <w:rPr>
+        <w:rFonts w:cs="Noto Sans"/>
+        <w:sz w:val="16"/>
+        <w:szCs w:val="16"/>
+      </w:rPr>
+      <w:t>address_line_3</w:t>
+    </w:r>
+    <w:r>
+      <w:rPr>
+        <w:rFonts w:cs="Noto Sans"/>
+        <w:sz w:val="16"/>
+        <w:szCs w:val="16"/>
+      </w:rPr>
+      <w:t>}</w:t>
     </w:r>
   </w:p>
   <w:p>
@@ -1910,7 +1991,23 @@
         <w:sz w:val="16"/>
         <w:szCs w:val="16"/>
       </w:rPr>
-      <w:t>((address_line_4))</w:t>
+      <w:t>{d.</w:t>
+    </w:r>
+    <w:r>
+      <w:rPr>
+        <w:rFonts w:cs="Noto Sans"/>
+        <w:sz w:val="16"/>
+        <w:szCs w:val="16"/>
+      </w:rPr>
+      <w:t>address_line_4</w:t>
+    </w:r>
+    <w:r>
+      <w:rPr>
+        <w:rFonts w:cs="Noto Sans"/>
+        <w:sz w:val="16"/>
+        <w:szCs w:val="16"/>
+      </w:rPr>
+      <w:t>}</w:t>
     </w:r>
   </w:p>
   <w:p>
@@ -1930,7 +2027,23 @@
         <w:sz w:val="16"/>
         <w:szCs w:val="16"/>
       </w:rPr>
-      <w:t>((address_line_5))</w:t>
+      <w:t>{d.</w:t>
+    </w:r>
+    <w:r>
+      <w:rPr>
+        <w:rFonts w:cs="Noto Sans"/>
+        <w:sz w:val="16"/>
+        <w:szCs w:val="16"/>
+      </w:rPr>
+      <w:t>address_line_5</w:t>
+    </w:r>
+    <w:r>
+      <w:rPr>
+        <w:rFonts w:cs="Noto Sans"/>
+        <w:sz w:val="16"/>
+        <w:szCs w:val="16"/>
+      </w:rPr>
+      <w:t>}</w:t>
     </w:r>
   </w:p>
   <w:p>
@@ -1950,7 +2063,23 @@
         <w:sz w:val="16"/>
         <w:szCs w:val="16"/>
       </w:rPr>
-      <w:t>((address_line_6))</w:t>
+      <w:t>{d.</w:t>
+    </w:r>
+    <w:r>
+      <w:rPr>
+        <w:rFonts w:cs="Noto Sans"/>
+        <w:sz w:val="16"/>
+        <w:szCs w:val="16"/>
+      </w:rPr>
+      <w:t>address_line_6</w:t>
+    </w:r>
+    <w:r>
+      <w:rPr>
+        <w:rFonts w:cs="Noto Sans"/>
+        <w:sz w:val="16"/>
+        <w:szCs w:val="16"/>
+      </w:rPr>
+      <w:t>}</w:t>
     </w:r>
   </w:p>
   <w:p>
@@ -1970,7 +2099,23 @@
         <w:sz w:val="16"/>
         <w:szCs w:val="16"/>
       </w:rPr>
-      <w:t>((address_line_7))</w:t>
+      <w:t>{d.</w:t>
+    </w:r>
+    <w:r>
+      <w:rPr>
+        <w:rFonts w:cs="Noto Sans"/>
+        <w:sz w:val="16"/>
+        <w:szCs w:val="16"/>
+      </w:rPr>
+      <w:t>address_line_7</w:t>
+    </w:r>
+    <w:r>
+      <w:rPr>
+        <w:rFonts w:cs="Noto Sans"/>
+        <w:sz w:val="16"/>
+        <w:szCs w:val="16"/>
+      </w:rPr>
+      <w:t>}</w:t>
     </w:r>
   </w:p>
   <w:p>
@@ -2050,7 +2195,19 @@
       <w:rPr>
         <w:rFonts w:cs="Noto Sans"/>
       </w:rPr>
-      <w:t>((date))</w:t>
+      <w:t>{d.</w:t>
+    </w:r>
+    <w:r>
+      <w:rPr>
+        <w:rFonts w:cs="Noto Sans"/>
+      </w:rPr>
+      <w:t>date</w:t>
+    </w:r>
+    <w:r>
+      <w:rPr>
+        <w:rFonts w:cs="Noto Sans"/>
+      </w:rPr>
+      <w:t>}</w:t>
     </w:r>
   </w:p>
   <w:p>
@@ -2074,7 +2231,19 @@
       <w:rPr>
         <w:rFonts w:cs="Noto Sans"/>
       </w:rPr>
-      <w:t>((nhsNumber))</w:t>
+      <w:t>{d.</w:t>
+    </w:r>
+    <w:r>
+      <w:rPr>
+        <w:rFonts w:cs="Noto Sans"/>
+      </w:rPr>
+      <w:t>nhsNumber</w:t>
+    </w:r>
+    <w:r>
+      <w:rPr>
+        <w:rFonts w:cs="Noto Sans"/>
+      </w:rPr>
+      <w:t>}</w:t>
     </w:r>
   </w:p>
 </w:hdr>

</xml_diff>

<commit_message>
CCM-14430 letter interim process (#165)
* Add draft content to /upload-a-letter

* Further draft updates to /upload-a-letter

* Update numbered steps and How to raise a SN request for letter templates

* /personalisation update

* Update personalisation syntax and numbered steps following chat with Mike

* Changes from Stace's 2i

* Blank Word template update with new syntax and tweak personalisation content on /upload-a-letter
</commit_message>
<xml_diff>
--- a/docs/assets/worddocs/letter-template-nhs-notify-large-print.docx
+++ b/docs/assets/worddocs/letter-template-nhs-notify-large-print.docx
@@ -19,52 +19,64 @@
         </w:rPr>
         <w:t>T</w:t>
       </w:r>
+      <w:commentRangeEnd w:id="3"/>
+      <w:r>
+        <w:rPr>
+          <w:rStyle w:val="CommentReference"/>
+          <w:rFonts w:cs="Noto Sans Medium"/>
+          <w:sz w:val="32"/>
+          <w:szCs w:val="32"/>
+        </w:rPr>
+        <w:commentReference w:id="3"/>
+      </w:r>
+      <w:commentRangeEnd w:id="2"/>
+      <w:r>
+        <w:rPr>
+          <w:rStyle w:val="CommentReference"/>
+          <w:rFonts w:cs="Noto Sans Medium"/>
+          <w:sz w:val="32"/>
+          <w:szCs w:val="32"/>
+        </w:rPr>
+        <w:commentReference w:id="2"/>
+      </w:r>
+      <w:commentRangeEnd w:id="1"/>
+      <w:r>
+        <w:rPr>
+          <w:rStyle w:val="CommentReference"/>
+          <w:rFonts w:cs="Noto Sans Medium"/>
+          <w:sz w:val="32"/>
+          <w:szCs w:val="32"/>
+        </w:rPr>
+        <w:commentReference w:id="1"/>
+      </w:r>
+      <w:r>
+        <w:rPr>
+          <w:rFonts w:cs="Noto Sans Medium"/>
+        </w:rPr>
+        <w:t xml:space="preserve">his is </w:t>
+      </w:r>
+      <w:r>
+        <w:rPr>
+          <w:rFonts w:cs="Noto Sans Medium"/>
+        </w:rPr>
+        <w:t>the main</w:t>
+      </w:r>
+      <w:r>
+        <w:rPr>
+          <w:rFonts w:cs="Noto Sans Medium"/>
+        </w:rPr>
+        <w:t xml:space="preserve"> heading</w:t>
+      </w:r>
       <w:commentRangeEnd w:id="0"/>
-      <w:commentRangeEnd w:id="1"/>
-      <w:r>
-        <w:rPr>
-          <w:rFonts w:cs="Noto Sans Medium"/>
+      <w:r>
+        <w:rPr>
+          <w:rStyle w:val="CommentReference"/>
+          <w:rFonts w:cs="Noto Sans Medium"/>
+          <w:sz w:val="32"/>
+          <w:szCs w:val="32"/>
         </w:rPr>
         <w:commentReference w:id="0"/>
       </w:r>
-      <w:r>
-        <w:rPr>
-          <w:rFonts w:cs="Noto Sans Medium"/>
-        </w:rPr>
-        <w:commentReference w:id="1"/>
-      </w:r>
-      <w:commentRangeEnd w:id="2"/>
-      <w:r>
-        <w:rPr>
-          <w:rFonts w:cs="Noto Sans Medium"/>
-        </w:rPr>
-        <w:commentReference w:id="2"/>
-      </w:r>
-      <w:r>
-        <w:rPr>
-          <w:rFonts w:cs="Noto Sans Medium"/>
-        </w:rPr>
-        <w:t xml:space="preserve">his is </w:t>
-      </w:r>
-      <w:r>
-        <w:rPr>
-          <w:rFonts w:cs="Noto Sans Medium"/>
-        </w:rPr>
-        <w:t>the main</w:t>
-      </w:r>
-      <w:r>
-        <w:rPr>
-          <w:rFonts w:cs="Noto Sans Medium"/>
-        </w:rPr>
-        <w:t xml:space="preserve"> heading</w:t>
-      </w:r>
-      <w:commentRangeEnd w:id="3"/>
-      <w:r>
-        <w:rPr>
-          <w:rFonts w:cs="Noto Sans Medium"/>
-        </w:rPr>
-        <w:commentReference w:id="3"/>
-      </w:r>
     </w:p>
     <w:p>
       <w:pPr>
@@ -86,6 +98,9 @@
         <w:rPr>
           <w:rStyle w:val="CommentReference"/>
           <w:rFonts w:cs="Noto Sans Medium"/>
+          <w:sz w:val="32"/>
+          <w:szCs w:val="24"/>
+          <w:lang w:eastAsia="en-GB"/>
         </w:rPr>
         <w:commentReference w:id="4"/>
       </w:r>
@@ -96,18 +111,28 @@
         </w:rPr>
         <w:t xml:space="preserve"> </w:t>
       </w:r>
+      <w:r>
+        <w:rPr>
+          <w:rFonts w:cs="Noto Sans Medium"/>
+          <w:lang w:eastAsia="en-GB"/>
+        </w:rPr>
+        <w:t>{d.</w:t>
+      </w:r>
       <w:commentRangeStart w:id="5"/>
       <w:r>
         <w:rPr>
           <w:rFonts w:cs="Noto Sans Medium"/>
           <w:lang w:eastAsia="en-GB"/>
         </w:rPr>
-        <w:t>((fullName))</w:t>
+        <w:t>fullName</w:t>
       </w:r>
       <w:commentRangeEnd w:id="5"/>
       <w:r>
         <w:rPr>
-          <w:rFonts w:cs="Noto Sans Medium"/>
+          <w:rStyle w:val="CommentReference"/>
+          <w:rFonts w:cs="Noto Sans Medium"/>
+          <w:sz w:val="32"/>
+          <w:szCs w:val="24"/>
           <w:lang w:eastAsia="en-GB"/>
         </w:rPr>
         <w:commentReference w:id="5"/>
@@ -117,6 +142,13 @@
           <w:rFonts w:cs="Noto Sans Medium"/>
           <w:lang w:eastAsia="en-GB"/>
         </w:rPr>
+        <w:t>}</w:t>
+      </w:r>
+      <w:r>
+        <w:rPr>
+          <w:rFonts w:cs="Noto Sans Medium"/>
+          <w:lang w:eastAsia="en-GB"/>
+        </w:rPr>
         <w:t>,</w:t>
       </w:r>
     </w:p>
@@ -140,6 +172,9 @@
         <w:rPr>
           <w:rStyle w:val="CommentReference"/>
           <w:rFonts w:cs="Noto Sans Medium"/>
+          <w:sz w:val="32"/>
+          <w:szCs w:val="24"/>
+          <w:lang w:eastAsia="en-GB"/>
         </w:rPr>
         <w:commentReference w:id="6"/>
       </w:r>
@@ -239,7 +274,13 @@
       <w:r>
         <w:rPr>
           <w:rStyle w:val="CommentReference"/>
-          <w:rFonts w:cs="Noto Sans Medium"/>
+          <w:rFonts w:eastAsia="Times New Roman" w:cs="Noto Sans Medium"/>
+          <w:color w:val="0D0D0D" w:themeColor="text1" w:themeTint="F2"/>
+          <w:kern w:val="0"/>
+          <w:sz w:val="32"/>
+          <w:szCs w:val="32"/>
+          <w:lang w:eastAsia="en-GB"/>
+          <w14:ligatures w14:val="none"/>
         </w:rPr>
         <w:commentReference w:id="7"/>
       </w:r>
@@ -342,6 +383,8 @@
         <w:rPr>
           <w:rStyle w:val="CommentReference"/>
           <w:rFonts w:cs="Noto Sans Medium"/>
+          <w:sz w:val="32"/>
+          <w:szCs w:val="24"/>
         </w:rPr>
         <w:commentReference w:id="8"/>
       </w:r>
@@ -361,24 +404,11 @@
         <w:rPr>
           <w:rFonts w:cs="Noto Sans Medium"/>
         </w:rPr>
-        <w:t>hello ((firstName)), your NHS Number is ((nhsNumber)).</w:t>
-      </w:r>
-      <w:r>
-        <w:rPr>
-          <w:rFonts w:cs="Noto Sans Medium"/>
-        </w:rPr>
-        <w:t xml:space="preserve"> </w:t>
-      </w:r>
-      <w:r>
-        <w:rPr>
-          <w:rFonts w:cs="Noto Sans Medium"/>
-        </w:rPr>
-        <w:t>Your GP surgery is ((gpSurgeryName)), located at ((gpSurgeryAddress)). Call ((gpSurgeryPhone)) to book your appointment. </w:t>
-      </w:r>
-    </w:p>
-    <w:p>
-      <w:pPr>
-        <w:pStyle w:val="Heading2"/>
+        <w:t>Hello {d.fullName}, your NHS Number is {d.nhsNumber}. Your appointment is on {d.appointmentDate} at {d.gpSurgery}.</w:t>
+      </w:r>
+    </w:p>
+    <w:p>
+      <w:pPr>
         <w:rPr>
           <w:rFonts w:cs="Noto Sans Medium"/>
         </w:rPr>
@@ -425,6 +455,15 @@
       <w:commentRangeEnd w:id="9"/>
       <w:r>
         <w:rPr>
+          <w:rStyle w:val="CommentReference"/>
+          <w:b/>
+          <w:sz w:val="32"/>
+          <w:szCs w:val="24"/>
+        </w:rPr>
+        <w:commentReference w:id="9"/>
+      </w:r>
+      <w:r>
+        <w:rPr>
           <w:rStyle w:val="Hyperlink"/>
         </w:rPr>
         <w:instrText>"</w:instrText>
@@ -451,12 +490,6 @@
           <w:rStyle w:val="Hyperlink"/>
         </w:rPr>
         <w:fldChar w:fldCharType="end"/>
-      </w:r>
-      <w:r>
-        <w:rPr>
-          <w:rStyle w:val="Hyperlink"/>
-        </w:rPr>
-        <w:commentReference w:id="9"/>
       </w:r>
       <w:r>
         <w:rPr>
@@ -753,7 +786,7 @@
           <w:noProof/>
         </w:rPr>
         <w:drawing>
-          <wp:inline distT="0" distB="0" distL="0" distR="0" wp14:anchorId="1EB53E18" wp14:editId="3660A197">
+          <wp:inline distT="0" distB="0" distL="0" distR="0" wp14:anchorId="1EB53E18" wp14:editId="73AF8998">
             <wp:extent cx="1336431" cy="1336431"/>
             <wp:effectExtent l="0" t="0" r="0" b="0"/>
             <wp:docPr id="1392541066" name="Picture 2" descr="A qr code with a black background&#10;&#10;Description automatically generated"/>
@@ -1072,7 +1105,7 @@
 
 <file path=word/comments.xml><?xml version="1.0" encoding="utf-8"?>
 <w:comments xmlns:wpc="http://schemas.microsoft.com/office/word/2010/wordprocessingCanvas" xmlns:cx="http://schemas.microsoft.com/office/drawing/2014/chartex" xmlns:cx1="http://schemas.microsoft.com/office/drawing/2015/9/8/chartex" xmlns:cx2="http://schemas.microsoft.com/office/drawing/2015/10/21/chartex" xmlns:cx3="http://schemas.microsoft.com/office/drawing/2016/5/9/chartex" xmlns:cx4="http://schemas.microsoft.com/office/drawing/2016/5/10/chartex" xmlns:cx5="http://schemas.microsoft.com/office/drawing/2016/5/11/chartex" xmlns:cx6="http://schemas.microsoft.com/office/drawing/2016/5/12/chartex" xmlns:cx7="http://schemas.microsoft.com/office/drawing/2016/5/13/chartex" xmlns:cx8="http://schemas.microsoft.com/office/drawing/2016/5/14/chartex" xmlns:mc="http://schemas.openxmlformats.org/markup-compatibility/2006" xmlns:aink="http://schemas.microsoft.com/office/drawing/2016/ink" xmlns:am3d="http://schemas.microsoft.com/office/drawing/2017/model3d" xmlns:o="urn:schemas-microsoft-com:office:office" xmlns:oel="http://schemas.microsoft.com/office/2019/extlst" xmlns:r="http://schemas.openxmlformats.org/officeDocument/2006/relationships" xmlns:m="http://schemas.openxmlformats.org/officeDocument/2006/math" xmlns:v="urn:schemas-microsoft-com:vml" xmlns:wp14="http://schemas.microsoft.com/office/word/2010/wordprocessingDrawing" xmlns:wp="http://schemas.openxmlformats.org/drawingml/2006/wordprocessingDrawing" xmlns:w10="urn:schemas-microsoft-com:office:word" xmlns:w="http://schemas.openxmlformats.org/wordprocessingml/2006/main" xmlns:w14="http://schemas.microsoft.com/office/word/2010/wordml" xmlns:w15="http://schemas.microsoft.com/office/word/2012/wordml" xmlns:w16cex="http://schemas.microsoft.com/office/word/2018/wordml/cex" xmlns:w16cid="http://schemas.microsoft.com/office/word/2016/wordml/cid" xmlns:w16="http://schemas.microsoft.com/office/word/2018/wordml" xmlns:w16du="http://schemas.microsoft.com/office/word/2023/wordml/word16du" xmlns:w16sdtdh="http://schemas.microsoft.com/office/word/2020/wordml/sdtdatahash" xmlns:w16sdtfl="http://schemas.microsoft.com/office/word/2024/wordml/sdtformatlock" xmlns:w16se="http://schemas.microsoft.com/office/word/2015/wordml/symex" xmlns:wpg="http://schemas.microsoft.com/office/word/2010/wordprocessingGroup" xmlns:wpi="http://schemas.microsoft.com/office/word/2010/wordprocessingInk" xmlns:wne="http://schemas.microsoft.com/office/word/2006/wordml" xmlns:wps="http://schemas.microsoft.com/office/word/2010/wordprocessingShape" mc:Ignorable="w14 w15 w16se w16cid w16 w16cex w16sdtdh w16sdtfl w16du wp14">
-  <w:comment w:id="0" w:author="GIFFORD, Emma (NHS ENGLAND - X26)" w:date="2024-08-27T13:51:00Z" w:initials="EG">
+  <w:comment w:id="3" w:author="GIFFORD, Emma (NHS ENGLAND - X26)" w:date="2024-08-27T13:51:00Z" w:initials="EG">
     <w:p>
       <w:pPr>
         <w:pStyle w:val="CommentText"/>
@@ -1121,7 +1154,7 @@
       </w:r>
     </w:p>
   </w:comment>
-  <w:comment w:id="1" w:author="GIFFORD, Emma (NHS ENGLAND - X26)" w:date="2024-08-27T13:50:00Z" w:initials="EG">
+  <w:comment w:id="2" w:author="GIFFORD, Emma (NHS ENGLAND - X26)" w:date="2024-08-27T13:50:00Z" w:initials="EG">
     <w:p>
       <w:pPr>
         <w:pStyle w:val="CommentText"/>
@@ -1137,7 +1170,7 @@
       </w:r>
     </w:p>
   </w:comment>
-  <w:comment w:id="2" w:author="GIFFORD, Emma (NHS ENGLAND - X26)" w:date="2024-08-27T14:00:00Z" w:initials="EG">
+  <w:comment w:id="1" w:author="GIFFORD, Emma (NHS ENGLAND - X26)" w:date="2024-08-27T14:00:00Z" w:initials="EG">
     <w:p>
       <w:pPr>
         <w:pStyle w:val="CommentText"/>
@@ -1183,7 +1216,7 @@
       </w:r>
     </w:p>
   </w:comment>
-  <w:comment w:id="3" w:author="GIFFORD, Emma (NHS ENGLAND - X26)" w:date="2024-08-27T14:15:00Z" w:initials="EG">
+  <w:comment w:id="0" w:author="GIFFORD, Emma (NHS ENGLAND - X26)" w:date="2024-08-27T14:15:00Z" w:initials="EG">
     <w:p>
       <w:pPr>
         <w:pStyle w:val="CommentText"/>
@@ -1850,7 +1883,23 @@
         <w:sz w:val="16"/>
         <w:szCs w:val="16"/>
       </w:rPr>
-      <w:t>((address_line_1))</w:t>
+      <w:t>{d.</w:t>
+    </w:r>
+    <w:r>
+      <w:rPr>
+        <w:rFonts w:cs="Noto Sans"/>
+        <w:sz w:val="16"/>
+        <w:szCs w:val="16"/>
+      </w:rPr>
+      <w:t>address_line_1</w:t>
+    </w:r>
+    <w:r>
+      <w:rPr>
+        <w:rFonts w:cs="Noto Sans"/>
+        <w:sz w:val="16"/>
+        <w:szCs w:val="16"/>
+      </w:rPr>
+      <w:t>}</w:t>
     </w:r>
   </w:p>
   <w:p>
@@ -1870,7 +1919,23 @@
         <w:sz w:val="16"/>
         <w:szCs w:val="16"/>
       </w:rPr>
-      <w:t>((address_line_2))</w:t>
+      <w:t>{d.</w:t>
+    </w:r>
+    <w:r>
+      <w:rPr>
+        <w:rFonts w:cs="Noto Sans"/>
+        <w:sz w:val="16"/>
+        <w:szCs w:val="16"/>
+      </w:rPr>
+      <w:t>address_line_2</w:t>
+    </w:r>
+    <w:r>
+      <w:rPr>
+        <w:rFonts w:cs="Noto Sans"/>
+        <w:sz w:val="16"/>
+        <w:szCs w:val="16"/>
+      </w:rPr>
+      <w:t>}</w:t>
     </w:r>
   </w:p>
   <w:p>
@@ -1890,7 +1955,23 @@
         <w:sz w:val="16"/>
         <w:szCs w:val="16"/>
       </w:rPr>
-      <w:t>((address_line_3))</w:t>
+      <w:t>{d.</w:t>
+    </w:r>
+    <w:r>
+      <w:rPr>
+        <w:rFonts w:cs="Noto Sans"/>
+        <w:sz w:val="16"/>
+        <w:szCs w:val="16"/>
+      </w:rPr>
+      <w:t>address_line_3</w:t>
+    </w:r>
+    <w:r>
+      <w:rPr>
+        <w:rFonts w:cs="Noto Sans"/>
+        <w:sz w:val="16"/>
+        <w:szCs w:val="16"/>
+      </w:rPr>
+      <w:t>}</w:t>
     </w:r>
   </w:p>
   <w:p>
@@ -1910,7 +1991,23 @@
         <w:sz w:val="16"/>
         <w:szCs w:val="16"/>
       </w:rPr>
-      <w:t>((address_line_4))</w:t>
+      <w:t>{d.</w:t>
+    </w:r>
+    <w:r>
+      <w:rPr>
+        <w:rFonts w:cs="Noto Sans"/>
+        <w:sz w:val="16"/>
+        <w:szCs w:val="16"/>
+      </w:rPr>
+      <w:t>address_line_4</w:t>
+    </w:r>
+    <w:r>
+      <w:rPr>
+        <w:rFonts w:cs="Noto Sans"/>
+        <w:sz w:val="16"/>
+        <w:szCs w:val="16"/>
+      </w:rPr>
+      <w:t>}</w:t>
     </w:r>
   </w:p>
   <w:p>
@@ -1930,7 +2027,23 @@
         <w:sz w:val="16"/>
         <w:szCs w:val="16"/>
       </w:rPr>
-      <w:t>((address_line_5))</w:t>
+      <w:t>{d.</w:t>
+    </w:r>
+    <w:r>
+      <w:rPr>
+        <w:rFonts w:cs="Noto Sans"/>
+        <w:sz w:val="16"/>
+        <w:szCs w:val="16"/>
+      </w:rPr>
+      <w:t>address_line_5</w:t>
+    </w:r>
+    <w:r>
+      <w:rPr>
+        <w:rFonts w:cs="Noto Sans"/>
+        <w:sz w:val="16"/>
+        <w:szCs w:val="16"/>
+      </w:rPr>
+      <w:t>}</w:t>
     </w:r>
   </w:p>
   <w:p>
@@ -1950,7 +2063,23 @@
         <w:sz w:val="16"/>
         <w:szCs w:val="16"/>
       </w:rPr>
-      <w:t>((address_line_6))</w:t>
+      <w:t>{d.</w:t>
+    </w:r>
+    <w:r>
+      <w:rPr>
+        <w:rFonts w:cs="Noto Sans"/>
+        <w:sz w:val="16"/>
+        <w:szCs w:val="16"/>
+      </w:rPr>
+      <w:t>address_line_6</w:t>
+    </w:r>
+    <w:r>
+      <w:rPr>
+        <w:rFonts w:cs="Noto Sans"/>
+        <w:sz w:val="16"/>
+        <w:szCs w:val="16"/>
+      </w:rPr>
+      <w:t>}</w:t>
     </w:r>
   </w:p>
   <w:p>
@@ -1970,7 +2099,23 @@
         <w:sz w:val="16"/>
         <w:szCs w:val="16"/>
       </w:rPr>
-      <w:t>((address_line_7))</w:t>
+      <w:t>{d.</w:t>
+    </w:r>
+    <w:r>
+      <w:rPr>
+        <w:rFonts w:cs="Noto Sans"/>
+        <w:sz w:val="16"/>
+        <w:szCs w:val="16"/>
+      </w:rPr>
+      <w:t>address_line_7</w:t>
+    </w:r>
+    <w:r>
+      <w:rPr>
+        <w:rFonts w:cs="Noto Sans"/>
+        <w:sz w:val="16"/>
+        <w:szCs w:val="16"/>
+      </w:rPr>
+      <w:t>}</w:t>
     </w:r>
   </w:p>
   <w:p>
@@ -2050,7 +2195,19 @@
       <w:rPr>
         <w:rFonts w:cs="Noto Sans"/>
       </w:rPr>
-      <w:t>((date))</w:t>
+      <w:t>{d.</w:t>
+    </w:r>
+    <w:r>
+      <w:rPr>
+        <w:rFonts w:cs="Noto Sans"/>
+      </w:rPr>
+      <w:t>date</w:t>
+    </w:r>
+    <w:r>
+      <w:rPr>
+        <w:rFonts w:cs="Noto Sans"/>
+      </w:rPr>
+      <w:t>}</w:t>
     </w:r>
   </w:p>
   <w:p>
@@ -2074,7 +2231,19 @@
       <w:rPr>
         <w:rFonts w:cs="Noto Sans"/>
       </w:rPr>
-      <w:t>((nhsNumber))</w:t>
+      <w:t>{d.</w:t>
+    </w:r>
+    <w:r>
+      <w:rPr>
+        <w:rFonts w:cs="Noto Sans"/>
+      </w:rPr>
+      <w:t>nhsNumber</w:t>
+    </w:r>
+    <w:r>
+      <w:rPr>
+        <w:rFonts w:cs="Noto Sans"/>
+      </w:rPr>
+      <w:t>}</w:t>
     </w:r>
   </w:p>
 </w:hdr>

</xml_diff>

<commit_message>
update /pricing-and-commercial/letters, /delivery-times#letters and blank letter templates on /upload-a-letter
</commit_message>
<xml_diff>
--- a/docs/assets/worddocs/letter-template-nhs-notify-large-print.docx
+++ b/docs/assets/worddocs/letter-template-nhs-notify-large-print.docx
@@ -1,12 +1,13 @@
 
 <file path=word/document.xml><?xml version="1.0" encoding="utf-8"?>
-<w:document xmlns:wpc="http://schemas.microsoft.com/office/word/2010/wordprocessingCanvas" xmlns:cx="http://schemas.microsoft.com/office/drawing/2014/chartex" xmlns:cx1="http://schemas.microsoft.com/office/drawing/2015/9/8/chartex" xmlns:cx2="http://schemas.microsoft.com/office/drawing/2015/10/21/chartex" xmlns:cx3="http://schemas.microsoft.com/office/drawing/2016/5/9/chartex" xmlns:cx4="http://schemas.microsoft.com/office/drawing/2016/5/10/chartex" xmlns:cx5="http://schemas.microsoft.com/office/drawing/2016/5/11/chartex" xmlns:cx6="http://schemas.microsoft.com/office/drawing/2016/5/12/chartex" xmlns:cx7="http://schemas.microsoft.com/office/drawing/2016/5/13/chartex" xmlns:cx8="http://schemas.microsoft.com/office/drawing/2016/5/14/chartex" xmlns:mc="http://schemas.openxmlformats.org/markup-compatibility/2006" xmlns:aink="http://schemas.microsoft.com/office/drawing/2016/ink" xmlns:am3d="http://schemas.microsoft.com/office/drawing/2017/model3d" xmlns:o="urn:schemas-microsoft-com:office:office" xmlns:oel="http://schemas.microsoft.com/office/2019/extlst" xmlns:r="http://schemas.openxmlformats.org/officeDocument/2006/relationships" xmlns:m="http://schemas.openxmlformats.org/officeDocument/2006/math" xmlns:v="urn:schemas-microsoft-com:vml" xmlns:wp14="http://schemas.microsoft.com/office/word/2010/wordprocessingDrawing" xmlns:wp="http://schemas.openxmlformats.org/drawingml/2006/wordprocessingDrawing" xmlns:w10="urn:schemas-microsoft-com:office:word" xmlns:w="http://schemas.openxmlformats.org/wordprocessingml/2006/main" xmlns:w14="http://schemas.microsoft.com/office/word/2010/wordml" xmlns:w15="http://schemas.microsoft.com/office/word/2012/wordml" xmlns:w16cex="http://schemas.microsoft.com/office/word/2018/wordml/cex" xmlns:w16cid="http://schemas.microsoft.com/office/word/2016/wordml/cid" xmlns:w16="http://schemas.microsoft.com/office/word/2018/wordml" xmlns:w16du="http://schemas.microsoft.com/office/word/2023/wordml/word16du" xmlns:w16sdtdh="http://schemas.microsoft.com/office/word/2020/wordml/sdtdatahash" xmlns:w16sdtfl="http://schemas.microsoft.com/office/word/2024/wordml/sdtformatlock" xmlns:w16se="http://schemas.microsoft.com/office/word/2015/wordml/symex" xmlns:wpg="http://schemas.microsoft.com/office/word/2010/wordprocessingGroup" xmlns:wpi="http://schemas.microsoft.com/office/word/2010/wordprocessingInk" xmlns:wne="http://schemas.microsoft.com/office/word/2006/wordml" xmlns:wps="http://schemas.microsoft.com/office/word/2010/wordprocessingShape" mc:Ignorable="w14 w15 w16se w16cid w16 w16cex w16sdtdh w16sdtfl w16du wp14">
+<w:document xmlns:wpc="http://schemas.microsoft.com/office/word/2010/wordprocessingCanvas" xmlns:cx="http://schemas.microsoft.com/office/drawing/2014/chartex" xmlns:cx1="http://schemas.microsoft.com/office/drawing/2015/9/8/chartex" xmlns:cx2="http://schemas.microsoft.com/office/drawing/2015/10/21/chartex" xmlns:cx3="http://schemas.microsoft.com/office/drawing/2016/5/9/chartex" xmlns:cx4="http://schemas.microsoft.com/office/drawing/2016/5/10/chartex" xmlns:cx5="http://schemas.microsoft.com/office/drawing/2016/5/11/chartex" xmlns:cx6="http://schemas.microsoft.com/office/drawing/2016/5/12/chartex" xmlns:cx7="http://schemas.microsoft.com/office/drawing/2016/5/13/chartex" xmlns:cx8="http://schemas.microsoft.com/office/drawing/2016/5/14/chartex" xmlns:mc="http://schemas.openxmlformats.org/markup-compatibility/2006" xmlns:aink="http://schemas.microsoft.com/office/drawing/2016/ink" xmlns:am3d="http://schemas.microsoft.com/office/drawing/2017/model3d" xmlns:o="urn:schemas-microsoft-com:office:office" xmlns:oel="http://schemas.microsoft.com/office/2019/extlst" xmlns:r="http://schemas.openxmlformats.org/officeDocument/2006/relationships" xmlns:m="http://schemas.openxmlformats.org/officeDocument/2006/math" xmlns:v="urn:schemas-microsoft-com:vml" xmlns:wp14="http://schemas.microsoft.com/office/word/2010/wordprocessingDrawing" xmlns:wp="http://schemas.openxmlformats.org/drawingml/2006/wordprocessingDrawing" xmlns:w10="urn:schemas-microsoft-com:office:word" xmlns:w="http://schemas.openxmlformats.org/wordprocessingml/2006/main" xmlns:w14="http://schemas.microsoft.com/office/word/2010/wordml" xmlns:w15="http://schemas.microsoft.com/office/word/2012/wordml" xmlns:w16cei="http://schemas.microsoft.com/office/word/2026/wordml/cei" xmlns:w16cex="http://schemas.microsoft.com/office/word/2018/wordml/cex" xmlns:w16cid="http://schemas.microsoft.com/office/word/2016/wordml/cid" xmlns:w16="http://schemas.microsoft.com/office/word/2018/wordml" xmlns:w16du="http://schemas.microsoft.com/office/word/2023/wordml/word16du" xmlns:w16sdtdh="http://schemas.microsoft.com/office/word/2020/wordml/sdtdatahash" xmlns:w16sdtfl="http://schemas.microsoft.com/office/word/2024/wordml/sdtformatlock" xmlns:w16se="http://schemas.microsoft.com/office/word/2015/wordml/symex" xmlns:wpg="http://schemas.microsoft.com/office/word/2010/wordprocessingGroup" xmlns:wpi="http://schemas.microsoft.com/office/word/2010/wordprocessingInk" xmlns:wne="http://schemas.microsoft.com/office/word/2006/wordml" xmlns:wps="http://schemas.microsoft.com/office/word/2010/wordprocessingShape" mc:Ignorable="w14 w15 w16se w16cid w16 w16cex w16sdtdh w16sdtfl w16du wp14">
   <w:body>
     <w:p>
       <w:pPr>
         <w:pStyle w:val="Heading2"/>
         <w:rPr>
           <w:rFonts w:cs="Noto Sans Medium"/>
+          <w:sz w:val="32"/>
         </w:rPr>
       </w:pPr>
       <w:commentRangeStart w:id="0"/>
@@ -16,6 +17,7 @@
       <w:r>
         <w:rPr>
           <w:rFonts w:cs="Noto Sans Medium"/>
+          <w:sz w:val="32"/>
         </w:rPr>
         <w:t>T</w:t>
       </w:r>
@@ -52,18 +54,21 @@
       <w:r>
         <w:rPr>
           <w:rFonts w:cs="Noto Sans Medium"/>
+          <w:sz w:val="32"/>
         </w:rPr>
         <w:t xml:space="preserve">his is </w:t>
       </w:r>
       <w:r>
         <w:rPr>
           <w:rFonts w:cs="Noto Sans Medium"/>
+          <w:sz w:val="32"/>
         </w:rPr>
         <w:t>the main</w:t>
       </w:r>
       <w:r>
         <w:rPr>
           <w:rFonts w:cs="Noto Sans Medium"/>
+          <w:sz w:val="32"/>
         </w:rPr>
         <w:t xml:space="preserve"> heading</w:t>
       </w:r>
@@ -82,6 +87,8 @@
       <w:pPr>
         <w:rPr>
           <w:rFonts w:cs="Noto Sans Medium"/>
+          <w:sz w:val="32"/>
+          <w:szCs w:val="32"/>
           <w:lang w:eastAsia="en-GB"/>
         </w:rPr>
       </w:pPr>
@@ -89,6 +96,8 @@
       <w:r>
         <w:rPr>
           <w:rFonts w:cs="Noto Sans Medium"/>
+          <w:sz w:val="32"/>
+          <w:szCs w:val="32"/>
           <w:lang w:eastAsia="en-GB"/>
         </w:rPr>
         <w:t>Dear</w:t>
@@ -99,7 +108,7 @@
           <w:rStyle w:val="CommentReference"/>
           <w:rFonts w:cs="Noto Sans Medium"/>
           <w:sz w:val="32"/>
-          <w:szCs w:val="24"/>
+          <w:szCs w:val="32"/>
           <w:lang w:eastAsia="en-GB"/>
         </w:rPr>
         <w:commentReference w:id="4"/>
@@ -107,76 +116,207 @@
       <w:r>
         <w:rPr>
           <w:rFonts w:cs="Noto Sans Medium"/>
+          <w:sz w:val="32"/>
+          <w:szCs w:val="32"/>
           <w:lang w:eastAsia="en-GB"/>
         </w:rPr>
         <w:t xml:space="preserve"> </w:t>
       </w:r>
       <w:r>
         <w:rPr>
-          <w:rFonts w:cs="Noto Sans Medium"/>
+          <w:rFonts w:cs="Noto Sans"/>
+          <w:sz w:val="32"/>
+          <w:szCs w:val="32"/>
+        </w:rPr>
+        <w:t>{d.</w:t>
+      </w:r>
+      <w:commentRangeStart w:id="5"/>
+      <w:r>
+        <w:rPr>
+          <w:rFonts w:cs="Noto Sans Medium"/>
+          <w:sz w:val="32"/>
+          <w:szCs w:val="32"/>
           <w:lang w:eastAsia="en-GB"/>
         </w:rPr>
-        <w:t>{d.</w:t>
-      </w:r>
-      <w:commentRangeStart w:id="5"/>
-      <w:r>
-        <w:rPr>
-          <w:rFonts w:cs="Noto Sans Medium"/>
+        <w:t>fullName</w:t>
+      </w:r>
+      <w:commentRangeEnd w:id="5"/>
+      <w:r>
+        <w:rPr>
+          <w:rStyle w:val="CommentReference"/>
+          <w:rFonts w:cs="Noto Sans Medium"/>
+          <w:sz w:val="32"/>
+          <w:szCs w:val="32"/>
           <w:lang w:eastAsia="en-GB"/>
         </w:rPr>
-        <w:t>fullName</w:t>
-      </w:r>
-      <w:commentRangeEnd w:id="5"/>
+        <w:commentReference w:id="5"/>
+      </w:r>
+      <w:r>
+        <w:rPr>
+          <w:rFonts w:cs="Noto Sans Medium"/>
+          <w:sz w:val="32"/>
+          <w:szCs w:val="32"/>
+          <w:lang w:eastAsia="en-GB"/>
+        </w:rPr>
+        <w:t>}</w:t>
+      </w:r>
+      <w:r>
+        <w:rPr>
+          <w:rFonts w:cs="Noto Sans Medium"/>
+          <w:sz w:val="32"/>
+          <w:szCs w:val="32"/>
+          <w:lang w:eastAsia="en-GB"/>
+        </w:rPr>
+        <w:t>,</w:t>
+      </w:r>
+    </w:p>
+    <w:p>
+      <w:pPr>
+        <w:rPr>
+          <w:rFonts w:cs="Noto Sans Medium"/>
+          <w:sz w:val="32"/>
+          <w:szCs w:val="32"/>
+          <w:lang w:eastAsia="en-GB"/>
+        </w:rPr>
+      </w:pPr>
+      <w:commentRangeStart w:id="6"/>
+      <w:r>
+        <w:rPr>
+          <w:rFonts w:cs="Noto Sans Medium"/>
+          <w:sz w:val="32"/>
+          <w:szCs w:val="32"/>
+          <w:lang w:eastAsia="en-GB"/>
+        </w:rPr>
+        <w:t xml:space="preserve">This is the body text. </w:t>
+      </w:r>
+      <w:commentRangeEnd w:id="6"/>
       <w:r>
         <w:rPr>
           <w:rStyle w:val="CommentReference"/>
           <w:rFonts w:cs="Noto Sans Medium"/>
           <w:sz w:val="32"/>
-          <w:szCs w:val="24"/>
+          <w:szCs w:val="32"/>
           <w:lang w:eastAsia="en-GB"/>
         </w:rPr>
-        <w:commentReference w:id="5"/>
-      </w:r>
-      <w:r>
-        <w:rPr>
-          <w:rFonts w:cs="Noto Sans Medium"/>
+        <w:commentReference w:id="6"/>
+      </w:r>
+    </w:p>
+    <w:p>
+      <w:pPr>
+        <w:pStyle w:val="Heading2"/>
+        <w:rPr>
+          <w:rFonts w:cs="Noto Sans Medium"/>
+          <w:sz w:val="32"/>
+        </w:rPr>
+      </w:pPr>
+      <w:r>
+        <w:rPr>
+          <w:rFonts w:cs="Noto Sans Medium"/>
+          <w:sz w:val="32"/>
+        </w:rPr>
+        <w:t>Bullet</w:t>
+      </w:r>
+      <w:r>
+        <w:rPr>
+          <w:rFonts w:cs="Noto Sans Medium"/>
+          <w:sz w:val="32"/>
+        </w:rPr>
+        <w:t xml:space="preserve"> point</w:t>
+      </w:r>
+      <w:r>
+        <w:rPr>
+          <w:rFonts w:cs="Noto Sans Medium"/>
+          <w:sz w:val="32"/>
+        </w:rPr>
+        <w:t>s</w:t>
+      </w:r>
+    </w:p>
+    <w:p>
+      <w:pPr>
+        <w:rPr>
+          <w:rFonts w:cs="Noto Sans Medium"/>
+          <w:sz w:val="32"/>
+          <w:szCs w:val="32"/>
           <w:lang w:eastAsia="en-GB"/>
         </w:rPr>
-        <w:t>}</w:t>
-      </w:r>
-      <w:r>
-        <w:rPr>
-          <w:rFonts w:cs="Noto Sans Medium"/>
+      </w:pPr>
+      <w:r>
+        <w:rPr>
+          <w:rFonts w:cs="Noto Sans Medium"/>
+          <w:sz w:val="32"/>
+          <w:szCs w:val="32"/>
           <w:lang w:eastAsia="en-GB"/>
         </w:rPr>
-        <w:t>,</w:t>
-      </w:r>
-    </w:p>
-    <w:p>
-      <w:pPr>
-        <w:rPr>
-          <w:rFonts w:cs="Noto Sans Medium"/>
+        <w:t xml:space="preserve">Use a lead-in line before bullet </w:t>
+      </w:r>
+      <w:r>
+        <w:rPr>
+          <w:rFonts w:cs="Noto Sans Medium"/>
+          <w:sz w:val="32"/>
+          <w:szCs w:val="32"/>
           <w:lang w:eastAsia="en-GB"/>
         </w:rPr>
-      </w:pPr>
-      <w:commentRangeStart w:id="6"/>
-      <w:r>
-        <w:rPr>
-          <w:rFonts w:cs="Noto Sans Medium"/>
+        <w:t>points</w:t>
+      </w:r>
+      <w:r>
+        <w:rPr>
+          <w:rFonts w:cs="Noto Sans Medium"/>
+          <w:sz w:val="32"/>
+          <w:szCs w:val="32"/>
           <w:lang w:eastAsia="en-GB"/>
         </w:rPr>
-        <w:t xml:space="preserve">This is the body text. </w:t>
-      </w:r>
-      <w:commentRangeEnd w:id="6"/>
+        <w:t>. For example</w:t>
+      </w:r>
+      <w:r>
+        <w:rPr>
+          <w:rFonts w:cs="Noto Sans Medium"/>
+          <w:sz w:val="32"/>
+          <w:szCs w:val="32"/>
+          <w:lang w:eastAsia="en-GB"/>
+        </w:rPr>
+        <w:t>:</w:t>
+      </w:r>
+    </w:p>
+    <w:p>
+      <w:pPr>
+        <w:pStyle w:val="ListParagraph"/>
+        <w:rPr>
+          <w:sz w:val="32"/>
+          <w:szCs w:val="32"/>
+        </w:rPr>
+      </w:pPr>
+      <w:commentRangeStart w:id="7"/>
+      <w:r>
+        <w:rPr>
+          <w:sz w:val="32"/>
+          <w:szCs w:val="32"/>
+        </w:rPr>
+        <w:t>item 1 in a bulleted list</w:t>
+      </w:r>
+      <w:commentRangeEnd w:id="7"/>
       <w:r>
         <w:rPr>
           <w:rStyle w:val="CommentReference"/>
-          <w:rFonts w:cs="Noto Sans Medium"/>
-          <w:sz w:val="32"/>
-          <w:szCs w:val="24"/>
-          <w:lang w:eastAsia="en-GB"/>
-        </w:rPr>
-        <w:commentReference w:id="6"/>
+          <w:sz w:val="32"/>
+          <w:szCs w:val="32"/>
+        </w:rPr>
+        <w:commentReference w:id="7"/>
+      </w:r>
+    </w:p>
+    <w:p>
+      <w:pPr>
+        <w:pStyle w:val="ListParagraph"/>
+        <w:rPr>
+          <w:sz w:val="32"/>
+          <w:szCs w:val="32"/>
+        </w:rPr>
+      </w:pPr>
+      <w:r>
+        <w:rPr>
+          <w:sz w:val="32"/>
+          <w:szCs w:val="32"/>
+        </w:rPr>
+        <w:t>item 2 in a bulleted list</w:t>
       </w:r>
     </w:p>
     <w:p>
@@ -184,415 +324,13 @@
         <w:pStyle w:val="Heading2"/>
         <w:rPr>
           <w:rFonts w:cs="Noto Sans Medium"/>
-        </w:rPr>
-      </w:pPr>
-      <w:r>
-        <w:rPr>
-          <w:rFonts w:cs="Noto Sans Medium"/>
-        </w:rPr>
-        <w:t>Bullet</w:t>
-      </w:r>
-      <w:r>
-        <w:rPr>
-          <w:rFonts w:cs="Noto Sans Medium"/>
-        </w:rPr>
-        <w:t xml:space="preserve"> point</w:t>
-      </w:r>
-      <w:r>
-        <w:rPr>
-          <w:rFonts w:cs="Noto Sans Medium"/>
-        </w:rPr>
-        <w:t>s</w:t>
-      </w:r>
-    </w:p>
-    <w:p>
-      <w:pPr>
-        <w:rPr>
-          <w:rFonts w:cs="Noto Sans Medium"/>
-          <w:lang w:eastAsia="en-GB"/>
-        </w:rPr>
-      </w:pPr>
-      <w:r>
-        <w:rPr>
-          <w:rFonts w:cs="Noto Sans Medium"/>
-          <w:lang w:eastAsia="en-GB"/>
-        </w:rPr>
-        <w:t xml:space="preserve">Use a lead-in line before bullet </w:t>
-      </w:r>
-      <w:r>
-        <w:rPr>
-          <w:rFonts w:cs="Noto Sans Medium"/>
-          <w:lang w:eastAsia="en-GB"/>
-        </w:rPr>
-        <w:t>points</w:t>
-      </w:r>
-      <w:r>
-        <w:rPr>
-          <w:rFonts w:cs="Noto Sans Medium"/>
-          <w:lang w:eastAsia="en-GB"/>
-        </w:rPr>
-        <w:t>. For example</w:t>
-      </w:r>
-      <w:r>
-        <w:rPr>
-          <w:rFonts w:cs="Noto Sans Medium"/>
-          <w:lang w:eastAsia="en-GB"/>
-        </w:rPr>
-        <w:t>:</w:t>
-      </w:r>
-    </w:p>
-    <w:p>
-      <w:pPr>
-        <w:pStyle w:val="ListParagraph"/>
-        <w:numPr>
-          <w:ilvl w:val="0"/>
-          <w:numId w:val="6"/>
-        </w:numPr>
-        <w:spacing w:line="288" w:lineRule="auto"/>
-        <w:rPr>
-          <w:rFonts w:eastAsia="Times New Roman" w:cs="Noto Sans Medium"/>
-          <w:color w:val="0D0D0D" w:themeColor="text1" w:themeTint="F2"/>
-          <w:kern w:val="0"/>
-          <w:szCs w:val="32"/>
-          <w:lang w:eastAsia="en-GB"/>
-          <w14:ligatures w14:val="none"/>
-        </w:rPr>
-      </w:pPr>
-      <w:commentRangeStart w:id="7"/>
-      <w:r>
-        <w:rPr>
-          <w:rFonts w:eastAsia="Times New Roman" w:cs="Noto Sans Medium"/>
-          <w:color w:val="0D0D0D" w:themeColor="text1" w:themeTint="F2"/>
-          <w:kern w:val="0"/>
-          <w:szCs w:val="32"/>
-          <w:lang w:eastAsia="en-GB"/>
-          <w14:ligatures w14:val="none"/>
-        </w:rPr>
-        <w:t>item 1 in a bulleted list</w:t>
-      </w:r>
-      <w:commentRangeEnd w:id="7"/>
-      <w:r>
-        <w:rPr>
-          <w:rStyle w:val="CommentReference"/>
-          <w:rFonts w:eastAsia="Times New Roman" w:cs="Noto Sans Medium"/>
-          <w:color w:val="0D0D0D" w:themeColor="text1" w:themeTint="F2"/>
-          <w:kern w:val="0"/>
-          <w:sz w:val="32"/>
-          <w:szCs w:val="32"/>
-          <w:lang w:eastAsia="en-GB"/>
-          <w14:ligatures w14:val="none"/>
-        </w:rPr>
-        <w:commentReference w:id="7"/>
-      </w:r>
-    </w:p>
-    <w:p>
-      <w:pPr>
-        <w:pStyle w:val="ListParagraph"/>
-        <w:numPr>
-          <w:ilvl w:val="0"/>
-          <w:numId w:val="6"/>
-        </w:numPr>
-        <w:spacing w:line="288" w:lineRule="auto"/>
-        <w:rPr>
-          <w:rFonts w:eastAsia="Times New Roman" w:cs="Noto Sans Medium"/>
-          <w:color w:val="0D0D0D" w:themeColor="text1" w:themeTint="F2"/>
-          <w:kern w:val="0"/>
-          <w:szCs w:val="32"/>
-          <w:lang w:eastAsia="en-GB"/>
-          <w14:ligatures w14:val="none"/>
-        </w:rPr>
-      </w:pPr>
-      <w:r>
-        <w:rPr>
-          <w:rFonts w:eastAsia="Times New Roman" w:cs="Noto Sans Medium"/>
-          <w:color w:val="0D0D0D" w:themeColor="text1" w:themeTint="F2"/>
-          <w:kern w:val="0"/>
-          <w:szCs w:val="32"/>
-          <w:lang w:eastAsia="en-GB"/>
-          <w14:ligatures w14:val="none"/>
-        </w:rPr>
-        <w:t>item 2 in a bulleted list</w:t>
-      </w:r>
-    </w:p>
-    <w:p>
-      <w:pPr>
-        <w:pStyle w:val="Heading2"/>
-        <w:rPr>
-          <w:rFonts w:eastAsia="Times New Roman" w:cs="Noto Sans Medium"/>
-          <w:lang w:eastAsia="en-GB"/>
-        </w:rPr>
-      </w:pPr>
-      <w:r>
-        <w:rPr>
-          <w:rFonts w:eastAsia="Times New Roman" w:cs="Noto Sans Medium"/>
-          <w:lang w:eastAsia="en-GB"/>
-        </w:rPr>
-        <w:t>Headings</w:t>
-      </w:r>
-    </w:p>
-    <w:p>
-      <w:pPr>
-        <w:rPr>
-          <w:rFonts w:cs="Noto Sans Medium"/>
-          <w:lang w:eastAsia="en-GB"/>
-        </w:rPr>
-      </w:pPr>
-      <w:r>
-        <w:rPr>
-          <w:rFonts w:cs="Noto Sans Medium"/>
-          <w:lang w:eastAsia="en-GB"/>
-        </w:rPr>
-        <w:t xml:space="preserve">Use headings to break up your message content </w:t>
-      </w:r>
-    </w:p>
-    <w:p>
-      <w:pPr>
-        <w:pStyle w:val="Heading2"/>
-        <w:rPr>
-          <w:rFonts w:cs="Noto Sans Medium"/>
-        </w:rPr>
-      </w:pPr>
-      <w:r>
-        <w:rPr>
-          <w:rFonts w:cs="Noto Sans Medium"/>
-        </w:rPr>
-        <w:t>Personalisation</w:t>
-      </w:r>
-    </w:p>
-    <w:p>
-      <w:pPr>
-        <w:rPr>
-          <w:rFonts w:cs="Noto Sans Medium"/>
-        </w:rPr>
-      </w:pPr>
-      <w:r>
-        <w:rPr>
-          <w:rFonts w:cs="Noto Sans Medium"/>
-        </w:rPr>
-        <w:t xml:space="preserve">To add a </w:t>
-      </w:r>
-      <w:commentRangeStart w:id="8"/>
-      <w:r>
-        <w:rPr>
-          <w:rFonts w:cs="Noto Sans Medium"/>
-        </w:rPr>
-        <w:t xml:space="preserve">personalisation </w:t>
-      </w:r>
-      <w:commentRangeEnd w:id="8"/>
-      <w:r>
-        <w:rPr>
-          <w:rStyle w:val="CommentReference"/>
-          <w:rFonts w:cs="Noto Sans Medium"/>
-          <w:sz w:val="32"/>
-          <w:szCs w:val="24"/>
-        </w:rPr>
-        <w:commentReference w:id="8"/>
-      </w:r>
-      <w:r>
-        <w:rPr>
-          <w:rFonts w:cs="Noto Sans Medium"/>
-        </w:rPr>
-        <w:t>field, include a placeholder with double brackets around it.</w:t>
-      </w:r>
-      <w:r>
-        <w:rPr>
-          <w:rFonts w:cs="Noto Sans Medium"/>
-        </w:rPr>
-        <w:t xml:space="preserve"> For example: </w:t>
-      </w:r>
-      <w:r>
-        <w:rPr>
-          <w:rFonts w:cs="Noto Sans Medium"/>
-        </w:rPr>
-        <w:t>Hello {d.fullName}, your NHS Number is {d.nhsNumber}. Your appointment is on {d.appointmentDate} at {d.gpSurgery}.</w:t>
-      </w:r>
-    </w:p>
-    <w:p>
-      <w:pPr>
-        <w:rPr>
-          <w:rFonts w:cs="Noto Sans Medium"/>
-        </w:rPr>
-      </w:pPr>
-      <w:r>
-        <w:rPr>
-          <w:rFonts w:cs="Noto Sans Medium"/>
-        </w:rPr>
-        <w:lastRenderedPageBreak/>
-        <w:t>Links</w:t>
-      </w:r>
-    </w:p>
-    <w:p>
-      <w:pPr>
-        <w:rPr>
-          <w:rFonts w:cs="Noto Sans Medium"/>
-        </w:rPr>
-      </w:pPr>
-      <w:r>
-        <w:rPr>
-          <w:rFonts w:cs="Noto Sans Medium"/>
-        </w:rPr>
-        <w:t xml:space="preserve">Write links in full. For example, </w:t>
-      </w:r>
-      <w:r>
-        <w:rPr>
-          <w:rStyle w:val="Hyperlink"/>
-        </w:rPr>
-        <w:fldChar w:fldCharType="begin"/>
-      </w:r>
-      <w:r>
-        <w:rPr>
-          <w:rStyle w:val="Hyperlink"/>
-        </w:rPr>
-        <w:instrText>HYPERLINK "http://</w:instrText>
-      </w:r>
-      <w:commentRangeStart w:id="9"/>
-      <w:r>
-        <w:rPr>
-          <w:rStyle w:val="Hyperlink"/>
-        </w:rPr>
-        <w:instrText>www.service-manual.nhs.uk/content</w:instrText>
-      </w:r>
-      <w:commentRangeEnd w:id="9"/>
-      <w:r>
-        <w:rPr>
-          <w:rStyle w:val="CommentReference"/>
-          <w:b/>
-          <w:sz w:val="32"/>
-          <w:szCs w:val="24"/>
-        </w:rPr>
-        <w:commentReference w:id="9"/>
-      </w:r>
-      <w:r>
-        <w:rPr>
-          <w:rStyle w:val="Hyperlink"/>
-        </w:rPr>
-        <w:instrText>"</w:instrText>
-      </w:r>
-      <w:r>
-        <w:rPr>
-          <w:rStyle w:val="Hyperlink"/>
-        </w:rPr>
-      </w:r>
-      <w:r>
-        <w:rPr>
-          <w:rStyle w:val="Hyperlink"/>
-        </w:rPr>
-        <w:fldChar w:fldCharType="separate"/>
-      </w:r>
-      <w:r>
-        <w:rPr>
-          <w:rStyle w:val="Hyperlink"/>
-        </w:rPr>
-        <w:t>www.service-manual.nhs.uk/content</w:t>
-      </w:r>
-      <w:r>
-        <w:rPr>
-          <w:rStyle w:val="Hyperlink"/>
-        </w:rPr>
-        <w:fldChar w:fldCharType="end"/>
-      </w:r>
-      <w:r>
-        <w:rPr>
-          <w:rFonts w:cs="Noto Sans Medium"/>
-        </w:rPr>
-        <w:t>. Put links in bold to make them stand out. Do not use underlined text for links.</w:t>
-      </w:r>
-    </w:p>
-    <w:p>
-      <w:pPr>
-        <w:rPr>
-          <w:rFonts w:cs="Noto Sans Medium"/>
-          <w:szCs w:val="32"/>
-        </w:rPr>
-      </w:pPr>
-      <w:r>
-        <w:rPr>
-          <w:rFonts w:cs="Noto Sans Medium"/>
-          <w:szCs w:val="32"/>
-        </w:rPr>
-        <w:t>Do not split links</w:t>
-      </w:r>
-      <w:r>
-        <w:rPr>
-          <w:rFonts w:cs="Noto Sans Medium"/>
-          <w:szCs w:val="32"/>
-        </w:rPr>
-        <w:t xml:space="preserve"> </w:t>
-      </w:r>
-      <w:r>
-        <w:rPr>
-          <w:rFonts w:cs="Noto Sans Medium"/>
-          <w:szCs w:val="32"/>
-        </w:rPr>
-        <w:t>across</w:t>
-      </w:r>
-      <w:r>
-        <w:rPr>
-          <w:rFonts w:cs="Noto Sans Medium"/>
-          <w:szCs w:val="32"/>
-        </w:rPr>
-        <w:t xml:space="preserve"> different pages</w:t>
-      </w:r>
-      <w:r>
-        <w:rPr>
-          <w:rFonts w:cs="Noto Sans Medium"/>
-          <w:szCs w:val="32"/>
-        </w:rPr>
-        <w:t>.</w:t>
-      </w:r>
-      <w:r>
-        <w:rPr>
-          <w:rFonts w:cs="Noto Sans Medium"/>
-          <w:szCs w:val="32"/>
-        </w:rPr>
-        <w:t xml:space="preserve"> </w:t>
-      </w:r>
-      <w:r>
-        <w:rPr>
-          <w:rFonts w:cs="Noto Sans Medium"/>
-          <w:szCs w:val="32"/>
-        </w:rPr>
-        <w:t>A</w:t>
-      </w:r>
-      <w:r>
-        <w:rPr>
-          <w:rFonts w:cs="Noto Sans Medium"/>
-          <w:szCs w:val="32"/>
-        </w:rPr>
-        <w:t xml:space="preserve">dd a </w:t>
-      </w:r>
-      <w:r>
-        <w:rPr>
-          <w:rFonts w:cs="Noto Sans Medium"/>
-          <w:szCs w:val="32"/>
-        </w:rPr>
-        <w:t>page break before the paragraph</w:t>
-      </w:r>
-      <w:r>
-        <w:rPr>
-          <w:rFonts w:cs="Noto Sans Medium"/>
-          <w:szCs w:val="32"/>
-        </w:rPr>
-        <w:t xml:space="preserve"> with the link</w:t>
-      </w:r>
-      <w:r>
-        <w:rPr>
-          <w:rFonts w:cs="Noto Sans Medium"/>
-          <w:szCs w:val="32"/>
-        </w:rPr>
-        <w:t>.</w:t>
-      </w:r>
-    </w:p>
-    <w:p>
-      <w:pPr>
-        <w:pStyle w:val="Heading2"/>
-        <w:rPr>
-          <w:rFonts w:cs="Noto Sans Medium"/>
-        </w:rPr>
-      </w:pPr>
-      <w:r>
-        <w:rPr>
-          <w:rFonts w:cs="Noto Sans Medium"/>
+          <w:sz w:val="32"/>
+        </w:rPr>
+      </w:pPr>
+      <w:r>
+        <w:rPr>
+          <w:rFonts w:cs="Noto Sans Medium"/>
+          <w:sz w:val="32"/>
         </w:rPr>
         <w:t>Numbered steps</w:t>
       </w:r>
@@ -609,6 +347,7 @@
           <w:rFonts w:eastAsia="Times New Roman" w:cs="Noto Sans Medium"/>
           <w:color w:val="0D0D0D" w:themeColor="text1" w:themeTint="F2"/>
           <w:kern w:val="0"/>
+          <w:sz w:val="32"/>
           <w:szCs w:val="32"/>
           <w:lang w:eastAsia="en-GB"/>
           <w14:ligatures w14:val="none"/>
@@ -619,11 +358,24 @@
           <w:rFonts w:eastAsia="Times New Roman" w:cs="Noto Sans Medium"/>
           <w:color w:val="0D0D0D" w:themeColor="text1" w:themeTint="F2"/>
           <w:kern w:val="0"/>
+          <w:sz w:val="32"/>
           <w:szCs w:val="32"/>
           <w:lang w:eastAsia="en-GB"/>
           <w14:ligatures w14:val="none"/>
         </w:rPr>
-        <w:t>Step 1 in a numbered list.</w:t>
+        <w:t>Step</w:t>
+      </w:r>
+      <w:r>
+        <w:rPr>
+          <w:rFonts w:eastAsia="Times New Roman" w:cs="Noto Sans Medium"/>
+          <w:color w:val="0D0D0D" w:themeColor="text1" w:themeTint="F2"/>
+          <w:kern w:val="0"/>
+          <w:sz w:val="32"/>
+          <w:szCs w:val="32"/>
+          <w:lang w:eastAsia="en-GB"/>
+          <w14:ligatures w14:val="none"/>
+        </w:rPr>
+        <w:t xml:space="preserve"> 1 in a numbered list.</w:t>
       </w:r>
     </w:p>
     <w:p>
@@ -638,6 +390,7 @@
           <w:rFonts w:eastAsia="Times New Roman" w:cs="Noto Sans Medium"/>
           <w:color w:val="0D0D0D" w:themeColor="text1" w:themeTint="F2"/>
           <w:kern w:val="0"/>
+          <w:sz w:val="32"/>
           <w:szCs w:val="32"/>
           <w:lang w:eastAsia="en-GB"/>
           <w14:ligatures w14:val="none"/>
@@ -648,6 +401,7 @@
           <w:rFonts w:eastAsia="Times New Roman" w:cs="Noto Sans Medium"/>
           <w:color w:val="0D0D0D" w:themeColor="text1" w:themeTint="F2"/>
           <w:kern w:val="0"/>
+          <w:sz w:val="32"/>
           <w:szCs w:val="32"/>
           <w:lang w:eastAsia="en-GB"/>
           <w14:ligatures w14:val="none"/>
@@ -659,12 +413,479 @@
       <w:pPr>
         <w:pStyle w:val="Heading2"/>
         <w:rPr>
-          <w:rFonts w:cs="Noto Sans Medium"/>
-        </w:rPr>
-      </w:pPr>
-      <w:r>
-        <w:rPr>
-          <w:rFonts w:cs="Noto Sans Medium"/>
+          <w:rFonts w:eastAsia="Times New Roman" w:cs="Noto Sans Medium"/>
+          <w:sz w:val="32"/>
+          <w:lang w:eastAsia="en-GB"/>
+        </w:rPr>
+      </w:pPr>
+      <w:r>
+        <w:rPr>
+          <w:rFonts w:eastAsia="Times New Roman" w:cs="Noto Sans Medium"/>
+          <w:sz w:val="32"/>
+          <w:lang w:eastAsia="en-GB"/>
+        </w:rPr>
+        <w:t>Headings</w:t>
+      </w:r>
+    </w:p>
+    <w:p>
+      <w:pPr>
+        <w:rPr>
+          <w:rFonts w:cs="Noto Sans Medium"/>
+          <w:sz w:val="32"/>
+          <w:szCs w:val="32"/>
+          <w:lang w:eastAsia="en-GB"/>
+        </w:rPr>
+      </w:pPr>
+      <w:r>
+        <w:rPr>
+          <w:rFonts w:cs="Noto Sans Medium"/>
+          <w:sz w:val="32"/>
+          <w:szCs w:val="32"/>
+          <w:lang w:eastAsia="en-GB"/>
+        </w:rPr>
+        <w:t>Use headings to break up your message content</w:t>
+      </w:r>
+      <w:r>
+        <w:rPr>
+          <w:rFonts w:cs="Noto Sans Medium"/>
+          <w:sz w:val="32"/>
+          <w:szCs w:val="32"/>
+          <w:lang w:eastAsia="en-GB"/>
+        </w:rPr>
+        <w:t>.</w:t>
+      </w:r>
+      <w:r>
+        <w:rPr>
+          <w:rFonts w:cs="Noto Sans Medium"/>
+          <w:sz w:val="32"/>
+          <w:szCs w:val="32"/>
+          <w:lang w:eastAsia="en-GB"/>
+        </w:rPr>
+        <w:t xml:space="preserve"> </w:t>
+      </w:r>
+    </w:p>
+    <w:p>
+      <w:pPr>
+        <w:pStyle w:val="Heading2"/>
+        <w:rPr>
+          <w:rFonts w:cs="Noto Sans Medium"/>
+          <w:sz w:val="32"/>
+        </w:rPr>
+      </w:pPr>
+      <w:r>
+        <w:rPr>
+          <w:rFonts w:cs="Noto Sans Medium"/>
+          <w:sz w:val="32"/>
+        </w:rPr>
+        <w:lastRenderedPageBreak/>
+        <w:t>Personalisation</w:t>
+      </w:r>
+    </w:p>
+    <w:p>
+      <w:pPr>
+        <w:rPr>
+          <w:rFonts w:cs="Noto Sans Medium"/>
+          <w:sz w:val="32"/>
+          <w:szCs w:val="32"/>
+        </w:rPr>
+      </w:pPr>
+      <w:r>
+        <w:rPr>
+          <w:rFonts w:cs="Noto Sans Medium"/>
+          <w:sz w:val="32"/>
+          <w:szCs w:val="32"/>
+        </w:rPr>
+        <w:t xml:space="preserve">To add a </w:t>
+      </w:r>
+      <w:commentRangeStart w:id="8"/>
+      <w:r>
+        <w:rPr>
+          <w:rFonts w:cs="Noto Sans Medium"/>
+          <w:sz w:val="32"/>
+          <w:szCs w:val="32"/>
+        </w:rPr>
+        <w:t xml:space="preserve">personalisation </w:t>
+      </w:r>
+      <w:commentRangeEnd w:id="8"/>
+      <w:r>
+        <w:rPr>
+          <w:rStyle w:val="CommentReference"/>
+          <w:rFonts w:cs="Noto Sans Medium"/>
+          <w:sz w:val="32"/>
+          <w:szCs w:val="32"/>
+        </w:rPr>
+        <w:commentReference w:id="8"/>
+      </w:r>
+      <w:r>
+        <w:rPr>
+          <w:rFonts w:cs="Noto Sans Medium"/>
+          <w:sz w:val="32"/>
+          <w:szCs w:val="32"/>
+        </w:rPr>
+        <w:t xml:space="preserve">field, include a placeholder with </w:t>
+      </w:r>
+      <w:r>
+        <w:rPr>
+          <w:rFonts w:cs="Noto Sans Medium"/>
+          <w:sz w:val="32"/>
+          <w:szCs w:val="32"/>
+        </w:rPr>
+        <w:t>singly curly brackets</w:t>
+      </w:r>
+      <w:r>
+        <w:rPr>
+          <w:rFonts w:cs="Noto Sans Medium"/>
+          <w:sz w:val="32"/>
+          <w:szCs w:val="32"/>
+        </w:rPr>
+        <w:t xml:space="preserve"> around it</w:t>
+      </w:r>
+      <w:r>
+        <w:rPr>
+          <w:rFonts w:cs="Noto Sans Medium"/>
+          <w:sz w:val="32"/>
+          <w:szCs w:val="32"/>
+        </w:rPr>
+        <w:t xml:space="preserve"> and d. at the start</w:t>
+      </w:r>
+      <w:r>
+        <w:rPr>
+          <w:rFonts w:cs="Noto Sans Medium"/>
+          <w:sz w:val="32"/>
+          <w:szCs w:val="32"/>
+        </w:rPr>
+        <w:t>.</w:t>
+      </w:r>
+      <w:r>
+        <w:rPr>
+          <w:rFonts w:cs="Noto Sans Medium"/>
+          <w:sz w:val="32"/>
+          <w:szCs w:val="32"/>
+        </w:rPr>
+        <w:t xml:space="preserve"> For example:</w:t>
+      </w:r>
+    </w:p>
+    <w:p>
+      <w:pPr>
+        <w:rPr>
+          <w:rFonts w:cs="Noto Sans Medium"/>
+          <w:sz w:val="32"/>
+          <w:szCs w:val="32"/>
+        </w:rPr>
+      </w:pPr>
+      <w:r>
+        <w:rPr>
+          <w:rFonts w:cs="Noto Sans Medium"/>
+          <w:sz w:val="32"/>
+          <w:szCs w:val="32"/>
+        </w:rPr>
+        <w:t>Hello {d.fullName}, your NHS Number is {d.nhsNumber}. Your appointment is on {d.appointmentDate} at {d.gpSurgery}.</w:t>
+      </w:r>
+    </w:p>
+    <w:p>
+      <w:pPr>
+        <w:pStyle w:val="Heading2"/>
+        <w:rPr>
+          <w:rFonts w:cs="Noto Sans Medium"/>
+          <w:sz w:val="32"/>
+        </w:rPr>
+      </w:pPr>
+      <w:r>
+        <w:rPr>
+          <w:rFonts w:cs="Noto Sans Medium"/>
+          <w:sz w:val="32"/>
+        </w:rPr>
+        <w:t>Links</w:t>
+      </w:r>
+    </w:p>
+    <w:p>
+      <w:pPr>
+        <w:rPr>
+          <w:rFonts w:cs="Noto Sans Medium"/>
+          <w:sz w:val="32"/>
+          <w:szCs w:val="32"/>
+        </w:rPr>
+      </w:pPr>
+      <w:r>
+        <w:rPr>
+          <w:rFonts w:cs="Noto Sans Medium"/>
+          <w:sz w:val="32"/>
+          <w:szCs w:val="32"/>
+        </w:rPr>
+        <w:t xml:space="preserve">Write </w:t>
+      </w:r>
+      <w:r>
+        <w:rPr>
+          <w:rFonts w:cs="Noto Sans Medium"/>
+          <w:sz w:val="32"/>
+          <w:szCs w:val="32"/>
+        </w:rPr>
+        <w:t>links in full</w:t>
+      </w:r>
+      <w:r>
+        <w:rPr>
+          <w:rFonts w:cs="Noto Sans Medium"/>
+          <w:sz w:val="32"/>
+          <w:szCs w:val="32"/>
+        </w:rPr>
+        <w:t xml:space="preserve">. </w:t>
+      </w:r>
+      <w:r>
+        <w:rPr>
+          <w:rFonts w:cs="Noto Sans Medium"/>
+          <w:sz w:val="32"/>
+          <w:szCs w:val="32"/>
+        </w:rPr>
+        <w:t>For example</w:t>
+      </w:r>
+      <w:r>
+        <w:rPr>
+          <w:rFonts w:cs="Noto Sans Medium"/>
+          <w:sz w:val="32"/>
+          <w:szCs w:val="32"/>
+        </w:rPr>
+        <w:t>,</w:t>
+      </w:r>
+      <w:r>
+        <w:rPr>
+          <w:rFonts w:cs="Noto Sans Medium"/>
+          <w:sz w:val="32"/>
+          <w:szCs w:val="32"/>
+        </w:rPr>
+        <w:t xml:space="preserve"> </w:t>
+      </w:r>
+      <w:r>
+        <w:rPr>
+          <w:rStyle w:val="Hyperlink"/>
+          <w:sz w:val="32"/>
+          <w:szCs w:val="32"/>
+        </w:rPr>
+        <w:fldChar w:fldCharType="begin"/>
+      </w:r>
+      <w:r>
+        <w:rPr>
+          <w:rStyle w:val="Hyperlink"/>
+          <w:sz w:val="32"/>
+          <w:szCs w:val="32"/>
+        </w:rPr>
+        <w:instrText>HYPERLINK "http://</w:instrText>
+      </w:r>
+      <w:commentRangeStart w:id="9"/>
+      <w:r>
+        <w:rPr>
+          <w:rStyle w:val="Hyperlink"/>
+          <w:sz w:val="32"/>
+          <w:szCs w:val="32"/>
+        </w:rPr>
+        <w:instrText>www.service-manual.nhs.uk/content</w:instrText>
+      </w:r>
+      <w:commentRangeEnd w:id="9"/>
+      <w:r>
+        <w:rPr>
+          <w:rStyle w:val="CommentReference"/>
+          <w:b/>
+          <w:sz w:val="32"/>
+          <w:szCs w:val="32"/>
+        </w:rPr>
+        <w:commentReference w:id="9"/>
+      </w:r>
+      <w:r>
+        <w:rPr>
+          <w:rStyle w:val="Hyperlink"/>
+          <w:sz w:val="32"/>
+          <w:szCs w:val="32"/>
+        </w:rPr>
+        <w:instrText>"</w:instrText>
+      </w:r>
+      <w:r>
+        <w:rPr>
+          <w:rStyle w:val="Hyperlink"/>
+          <w:sz w:val="32"/>
+          <w:szCs w:val="32"/>
+        </w:rPr>
+      </w:r>
+      <w:r>
+        <w:rPr>
+          <w:rStyle w:val="Hyperlink"/>
+          <w:sz w:val="32"/>
+          <w:szCs w:val="32"/>
+        </w:rPr>
+        <w:fldChar w:fldCharType="separate"/>
+      </w:r>
+      <w:r>
+        <w:rPr>
+          <w:rStyle w:val="Hyperlink"/>
+          <w:sz w:val="32"/>
+          <w:szCs w:val="32"/>
+        </w:rPr>
+        <w:t>www.service-manual.nhs.uk/content</w:t>
+      </w:r>
+      <w:r>
+        <w:rPr>
+          <w:rStyle w:val="Hyperlink"/>
+          <w:sz w:val="32"/>
+          <w:szCs w:val="32"/>
+        </w:rPr>
+        <w:fldChar w:fldCharType="end"/>
+      </w:r>
+      <w:r>
+        <w:rPr>
+          <w:rFonts w:cs="Noto Sans Medium"/>
+          <w:sz w:val="32"/>
+          <w:szCs w:val="32"/>
+        </w:rPr>
+        <w:t>.</w:t>
+      </w:r>
+      <w:r>
+        <w:rPr>
+          <w:rFonts w:cs="Noto Sans Medium"/>
+          <w:sz w:val="32"/>
+          <w:szCs w:val="32"/>
+        </w:rPr>
+        <w:t xml:space="preserve"> </w:t>
+      </w:r>
+      <w:r>
+        <w:rPr>
+          <w:rFonts w:cs="Noto Sans Medium"/>
+          <w:sz w:val="32"/>
+          <w:szCs w:val="32"/>
+        </w:rPr>
+        <w:t xml:space="preserve">Put links in bold to make them stand out. </w:t>
+      </w:r>
+      <w:r>
+        <w:rPr>
+          <w:rFonts w:cs="Noto Sans Medium"/>
+          <w:sz w:val="32"/>
+          <w:szCs w:val="32"/>
+        </w:rPr>
+        <w:t>Do not</w:t>
+      </w:r>
+      <w:r>
+        <w:rPr>
+          <w:rFonts w:cs="Noto Sans Medium"/>
+          <w:sz w:val="32"/>
+          <w:szCs w:val="32"/>
+        </w:rPr>
+        <w:t xml:space="preserve"> use </w:t>
+      </w:r>
+      <w:r>
+        <w:rPr>
+          <w:rFonts w:cs="Noto Sans Medium"/>
+          <w:sz w:val="32"/>
+          <w:szCs w:val="32"/>
+        </w:rPr>
+        <w:t>underlined text for links.</w:t>
+      </w:r>
+    </w:p>
+    <w:p>
+      <w:pPr>
+        <w:rPr>
+          <w:rFonts w:cs="Noto Sans Medium"/>
+          <w:sz w:val="32"/>
+          <w:szCs w:val="32"/>
+        </w:rPr>
+      </w:pPr>
+      <w:r>
+        <w:rPr>
+          <w:rFonts w:cs="Noto Sans Medium"/>
+          <w:sz w:val="32"/>
+          <w:szCs w:val="32"/>
+        </w:rPr>
+        <w:t>Do not split links</w:t>
+      </w:r>
+      <w:r>
+        <w:rPr>
+          <w:rFonts w:cs="Noto Sans Medium"/>
+          <w:sz w:val="32"/>
+          <w:szCs w:val="32"/>
+        </w:rPr>
+        <w:t xml:space="preserve"> </w:t>
+      </w:r>
+      <w:r>
+        <w:rPr>
+          <w:rFonts w:cs="Noto Sans Medium"/>
+          <w:sz w:val="32"/>
+          <w:szCs w:val="32"/>
+        </w:rPr>
+        <w:t>across</w:t>
+      </w:r>
+      <w:r>
+        <w:rPr>
+          <w:rFonts w:cs="Noto Sans Medium"/>
+          <w:sz w:val="32"/>
+          <w:szCs w:val="32"/>
+        </w:rPr>
+        <w:t xml:space="preserve"> different pages</w:t>
+      </w:r>
+      <w:r>
+        <w:rPr>
+          <w:rFonts w:cs="Noto Sans Medium"/>
+          <w:sz w:val="32"/>
+          <w:szCs w:val="32"/>
+        </w:rPr>
+        <w:t>.</w:t>
+      </w:r>
+      <w:r>
+        <w:rPr>
+          <w:rFonts w:cs="Noto Sans Medium"/>
+          <w:sz w:val="32"/>
+          <w:szCs w:val="32"/>
+        </w:rPr>
+        <w:t xml:space="preserve"> </w:t>
+      </w:r>
+      <w:r>
+        <w:rPr>
+          <w:rFonts w:cs="Noto Sans Medium"/>
+          <w:sz w:val="32"/>
+          <w:szCs w:val="32"/>
+        </w:rPr>
+        <w:t>A</w:t>
+      </w:r>
+      <w:r>
+        <w:rPr>
+          <w:rFonts w:cs="Noto Sans Medium"/>
+          <w:sz w:val="32"/>
+          <w:szCs w:val="32"/>
+        </w:rPr>
+        <w:t xml:space="preserve">dd a </w:t>
+      </w:r>
+      <w:r>
+        <w:rPr>
+          <w:rFonts w:cs="Noto Sans Medium"/>
+          <w:sz w:val="32"/>
+          <w:szCs w:val="32"/>
+        </w:rPr>
+        <w:t>page break before the paragraph</w:t>
+      </w:r>
+      <w:r>
+        <w:rPr>
+          <w:rFonts w:cs="Noto Sans Medium"/>
+          <w:sz w:val="32"/>
+          <w:szCs w:val="32"/>
+        </w:rPr>
+        <w:t xml:space="preserve"> with the link</w:t>
+      </w:r>
+      <w:r>
+        <w:rPr>
+          <w:rFonts w:cs="Noto Sans Medium"/>
+          <w:sz w:val="32"/>
+          <w:szCs w:val="32"/>
+        </w:rPr>
+        <w:t>.</w:t>
+      </w:r>
+    </w:p>
+    <w:p>
+      <w:pPr>
+        <w:pStyle w:val="Heading2"/>
+        <w:rPr>
+          <w:rFonts w:cs="Noto Sans Medium"/>
+          <w:sz w:val="32"/>
+        </w:rPr>
+      </w:pPr>
+      <w:r>
+        <w:rPr>
+          <w:rFonts w:cs="Noto Sans Medium"/>
+          <w:sz w:val="32"/>
         </w:rPr>
         <w:t>QR codes</w:t>
       </w:r>
@@ -673,17 +894,23 @@
       <w:pPr>
         <w:rPr>
           <w:rFonts w:cs="Noto Sans Medium"/>
-        </w:rPr>
-      </w:pPr>
-      <w:r>
-        <w:rPr>
-          <w:rFonts w:cs="Noto Sans Medium"/>
+          <w:sz w:val="32"/>
+          <w:szCs w:val="32"/>
+        </w:rPr>
+      </w:pPr>
+      <w:r>
+        <w:rPr>
+          <w:rFonts w:cs="Noto Sans Medium"/>
+          <w:sz w:val="32"/>
+          <w:szCs w:val="32"/>
         </w:rPr>
         <w:t>If you want to include a QR code, put it in the body of your letter.</w:t>
       </w:r>
       <w:r>
         <w:rPr>
           <w:rFonts w:cs="Noto Sans Medium"/>
+          <w:sz w:val="32"/>
+          <w:szCs w:val="32"/>
         </w:rPr>
         <w:t xml:space="preserve"> Insert it as an image.</w:t>
       </w:r>
@@ -692,12 +919,14 @@
       <w:pPr>
         <w:rPr>
           <w:rFonts w:cs="Noto Sans Medium"/>
-          <w:szCs w:val="32"/>
-        </w:rPr>
-      </w:pPr>
-      <w:r>
-        <w:rPr>
-          <w:rFonts w:cs="Noto Sans Medium"/>
+          <w:sz w:val="32"/>
+          <w:szCs w:val="32"/>
+        </w:rPr>
+      </w:pPr>
+      <w:r>
+        <w:rPr>
+          <w:rFonts w:cs="Noto Sans Medium"/>
+          <w:sz w:val="32"/>
           <w:szCs w:val="32"/>
         </w:rPr>
         <w:t>You’ll need to ge</w:t>
@@ -705,6 +934,7 @@
       <w:r>
         <w:rPr>
           <w:rFonts w:cs="Noto Sans Medium"/>
+          <w:sz w:val="32"/>
           <w:szCs w:val="32"/>
         </w:rPr>
         <w:t xml:space="preserve">nerate </w:t>
@@ -712,6 +942,7 @@
       <w:r>
         <w:rPr>
           <w:rFonts w:cs="Noto Sans Medium"/>
+          <w:sz w:val="32"/>
           <w:szCs w:val="32"/>
         </w:rPr>
         <w:t>the QR code</w:t>
@@ -719,6 +950,7 @@
       <w:r>
         <w:rPr>
           <w:rFonts w:cs="Noto Sans Medium"/>
+          <w:sz w:val="32"/>
           <w:szCs w:val="32"/>
         </w:rPr>
         <w:t xml:space="preserve"> yourself</w:t>
@@ -726,6 +958,7 @@
       <w:r>
         <w:rPr>
           <w:rFonts w:cs="Noto Sans Medium"/>
+          <w:sz w:val="32"/>
           <w:szCs w:val="32"/>
         </w:rPr>
         <w:t>.</w:t>
@@ -735,12 +968,14 @@
       <w:pPr>
         <w:rPr>
           <w:rFonts w:cs="Noto Sans Medium"/>
-          <w:szCs w:val="32"/>
-        </w:rPr>
-      </w:pPr>
-      <w:r>
-        <w:rPr>
-          <w:rFonts w:cs="Noto Sans Medium"/>
+          <w:sz w:val="32"/>
+          <w:szCs w:val="32"/>
+        </w:rPr>
+      </w:pPr>
+      <w:r>
+        <w:rPr>
+          <w:rFonts w:cs="Noto Sans Medium"/>
+          <w:sz w:val="32"/>
           <w:szCs w:val="32"/>
         </w:rPr>
         <w:t>You must also p</w:t>
@@ -748,6 +983,7 @@
       <w:r>
         <w:rPr>
           <w:rFonts w:cs="Noto Sans Medium"/>
+          <w:sz w:val="32"/>
           <w:szCs w:val="32"/>
         </w:rPr>
         <w:t xml:space="preserve">rovide </w:t>
@@ -755,6 +991,7 @@
       <w:r>
         <w:rPr>
           <w:rFonts w:cs="Noto Sans Medium"/>
+          <w:sz w:val="32"/>
           <w:szCs w:val="32"/>
         </w:rPr>
         <w:t>a short URL or written instructions for how to find your webpage.</w:t>
@@ -762,6 +999,7 @@
       <w:r>
         <w:rPr>
           <w:rFonts w:cs="Noto Sans Medium"/>
+          <w:sz w:val="32"/>
           <w:szCs w:val="32"/>
         </w:rPr>
         <w:t xml:space="preserve"> For example:</w:t>
@@ -771,12 +1009,16 @@
       <w:pPr>
         <w:rPr>
           <w:rFonts w:cs="Noto Sans Medium"/>
+          <w:sz w:val="32"/>
+          <w:szCs w:val="32"/>
         </w:rPr>
       </w:pPr>
       <w:r>
         <w:rPr>
           <w:rFonts w:cs="Noto Sans Medium"/>
           <w:noProof/>
+          <w:sz w:val="32"/>
+          <w:szCs w:val="32"/>
         </w:rPr>
         <w:t xml:space="preserve"> </w:t>
       </w:r>
@@ -784,9 +1026,11 @@
         <w:rPr>
           <w:rFonts w:cs="Noto Sans Medium"/>
           <w:noProof/>
+          <w:sz w:val="32"/>
+          <w:szCs w:val="32"/>
         </w:rPr>
         <w:drawing>
-          <wp:inline distT="0" distB="0" distL="0" distR="0" wp14:anchorId="1EB53E18" wp14:editId="73AF8998">
+          <wp:inline distT="0" distB="0" distL="0" distR="0" wp14:anchorId="1EB53E18" wp14:editId="5ACF1E4B">
             <wp:extent cx="1336431" cy="1336431"/>
             <wp:effectExtent l="0" t="0" r="0" b="0"/>
             <wp:docPr id="1392541066" name="Picture 2" descr="A qr code with a black background&#10;&#10;Description automatically generated"/>
@@ -837,6 +1081,8 @@
       <w:r>
         <w:rPr>
           <w:rFonts w:cs="Noto Sans Medium"/>
+          <w:sz w:val="32"/>
+          <w:szCs w:val="32"/>
         </w:rPr>
         <w:t xml:space="preserve"> </w:t>
       </w:r>
@@ -846,12 +1092,16 @@
         <w:rPr>
           <w:rFonts w:cs="Noto Sans Medium"/>
           <w:noProof/>
+          <w:sz w:val="32"/>
+          <w:szCs w:val="32"/>
         </w:rPr>
       </w:pPr>
       <w:r>
         <w:rPr>
           <w:rFonts w:cs="Noto Sans Medium"/>
           <w:noProof/>
+          <w:sz w:val="32"/>
+          <w:szCs w:val="32"/>
         </w:rPr>
         <w:t xml:space="preserve">Scan </w:t>
       </w:r>
@@ -859,19 +1109,33 @@
         <w:rPr>
           <w:rFonts w:cs="Noto Sans Medium"/>
           <w:noProof/>
+          <w:sz w:val="32"/>
+          <w:szCs w:val="32"/>
         </w:rPr>
         <w:t xml:space="preserve">the QR code or visit </w:t>
       </w:r>
       <w:r>
         <w:rPr>
           <w:rStyle w:val="Hyperlink"/>
-        </w:rPr>
-        <w:t>www.notify.nhs.uk</w:t>
+          <w:sz w:val="32"/>
+          <w:szCs w:val="32"/>
+        </w:rPr>
+        <w:t>w</w:t>
+      </w:r>
+      <w:r>
+        <w:rPr>
+          <w:rStyle w:val="Hyperlink"/>
+          <w:sz w:val="32"/>
+          <w:szCs w:val="32"/>
+        </w:rPr>
+        <w:t>ww.notify.nhs.uk</w:t>
       </w:r>
       <w:r>
         <w:rPr>
           <w:rFonts w:cs="Noto Sans Medium"/>
           <w:noProof/>
+          <w:sz w:val="32"/>
+          <w:szCs w:val="32"/>
         </w:rPr>
         <w:t>.</w:t>
       </w:r>
@@ -881,11 +1145,13 @@
         <w:pStyle w:val="Heading2"/>
         <w:rPr>
           <w:rFonts w:cs="Noto Sans Medium"/>
-        </w:rPr>
-      </w:pPr>
-      <w:r>
-        <w:rPr>
-          <w:rFonts w:cs="Noto Sans Medium"/>
+          <w:sz w:val="32"/>
+        </w:rPr>
+      </w:pPr>
+      <w:r>
+        <w:rPr>
+          <w:rFonts w:cs="Noto Sans Medium"/>
+          <w:sz w:val="32"/>
         </w:rPr>
         <w:t>Paragraphs</w:t>
       </w:r>
@@ -894,23 +1160,31 @@
       <w:pPr>
         <w:rPr>
           <w:rFonts w:cs="Noto Sans Medium"/>
-        </w:rPr>
-      </w:pPr>
-      <w:r>
-        <w:rPr>
-          <w:rFonts w:cs="Noto Sans Medium"/>
+          <w:sz w:val="32"/>
+          <w:szCs w:val="32"/>
+        </w:rPr>
+      </w:pPr>
+      <w:r>
+        <w:rPr>
+          <w:rFonts w:cs="Noto Sans Medium"/>
+          <w:sz w:val="32"/>
+          <w:szCs w:val="32"/>
         </w:rPr>
         <w:t xml:space="preserve">Paragraphs can be split across </w:t>
       </w:r>
       <w:r>
         <w:rPr>
           <w:rFonts w:cs="Noto Sans Medium"/>
+          <w:sz w:val="32"/>
+          <w:szCs w:val="32"/>
         </w:rPr>
         <w:t>2</w:t>
       </w:r>
       <w:r>
         <w:rPr>
           <w:rFonts w:cs="Noto Sans Medium"/>
+          <w:sz w:val="32"/>
+          <w:szCs w:val="32"/>
         </w:rPr>
         <w:t xml:space="preserve"> pages. </w:t>
       </w:r>
@@ -919,31 +1193,47 @@
       <w:pPr>
         <w:rPr>
           <w:rFonts w:cs="Noto Sans Medium"/>
-        </w:rPr>
-      </w:pPr>
-      <w:r>
-        <w:rPr>
-          <w:rFonts w:cs="Noto Sans Medium"/>
+          <w:sz w:val="32"/>
+          <w:szCs w:val="32"/>
+        </w:rPr>
+      </w:pPr>
+      <w:r>
+        <w:rPr>
+          <w:rFonts w:cs="Noto Sans Medium"/>
+          <w:sz w:val="32"/>
+          <w:szCs w:val="32"/>
         </w:rPr>
         <w:t>If you do not want</w:t>
       </w:r>
       <w:r>
         <w:rPr>
           <w:rFonts w:cs="Noto Sans Medium"/>
+          <w:sz w:val="32"/>
+          <w:szCs w:val="32"/>
         </w:rPr>
         <w:t xml:space="preserve"> a paragraph to run over different pages, add a page break before the paragraph.</w:t>
       </w:r>
+      <w:r>
+        <w:rPr>
+          <w:noProof/>
+          <w:sz w:val="32"/>
+          <w:szCs w:val="32"/>
+        </w:rPr>
+        <w:t xml:space="preserve"> </w:t>
+      </w:r>
     </w:p>
     <w:p>
       <w:pPr>
         <w:pStyle w:val="Heading2"/>
         <w:rPr>
           <w:rFonts w:cs="Noto Sans Medium"/>
-        </w:rPr>
-      </w:pPr>
-      <w:r>
-        <w:rPr>
-          <w:rFonts w:cs="Noto Sans Medium"/>
+          <w:sz w:val="32"/>
+        </w:rPr>
+      </w:pPr>
+      <w:r>
+        <w:rPr>
+          <w:rFonts w:cs="Noto Sans Medium"/>
+          <w:sz w:val="32"/>
         </w:rPr>
         <w:lastRenderedPageBreak/>
         <w:t>Images</w:t>
@@ -956,47 +1246,63 @@
         </w:tabs>
         <w:rPr>
           <w:rFonts w:cs="Noto Sans Medium"/>
-        </w:rPr>
-      </w:pPr>
-      <w:r>
-        <w:rPr>
-          <w:rFonts w:cs="Noto Sans Medium"/>
+          <w:sz w:val="32"/>
+          <w:szCs w:val="32"/>
+        </w:rPr>
+      </w:pPr>
+      <w:r>
+        <w:rPr>
+          <w:rFonts w:cs="Noto Sans Medium"/>
+          <w:sz w:val="32"/>
+          <w:szCs w:val="32"/>
         </w:rPr>
         <w:t xml:space="preserve">Images must be black and white. Position </w:t>
       </w:r>
       <w:r>
         <w:rPr>
           <w:rFonts w:cs="Noto Sans Medium"/>
+          <w:sz w:val="32"/>
+          <w:szCs w:val="32"/>
         </w:rPr>
         <w:t>them</w:t>
       </w:r>
       <w:r>
         <w:rPr>
           <w:rFonts w:cs="Noto Sans Medium"/>
+          <w:sz w:val="32"/>
+          <w:szCs w:val="32"/>
         </w:rPr>
         <w:t xml:space="preserve"> </w:t>
       </w:r>
       <w:r>
         <w:rPr>
           <w:rFonts w:cs="Noto Sans Medium"/>
+          <w:sz w:val="32"/>
+          <w:szCs w:val="32"/>
         </w:rPr>
         <w:t>with</w:t>
       </w:r>
       <w:r>
         <w:rPr>
           <w:rFonts w:cs="Noto Sans Medium"/>
+          <w:sz w:val="32"/>
+          <w:szCs w:val="32"/>
         </w:rPr>
         <w:t xml:space="preserve">in the same </w:t>
       </w:r>
       <w:r>
         <w:rPr>
           <w:rFonts w:cs="Noto Sans Medium"/>
+          <w:sz w:val="32"/>
+          <w:szCs w:val="32"/>
         </w:rPr>
         <w:t xml:space="preserve">page </w:t>
       </w:r>
       <w:r>
         <w:rPr>
           <w:rFonts w:cs="Noto Sans Medium"/>
+          <w:sz w:val="32"/>
+          <w:szCs w:val="32"/>
         </w:rPr>
         <w:t>margins as the text.</w:t>
       </w:r>
@@ -1005,12 +1311,15 @@
       <w:pPr>
         <w:pStyle w:val="Heading2"/>
         <w:rPr>
-          <w:rFonts w:cs="Noto Sans Medium"/>
-        </w:rPr>
-      </w:pPr>
-      <w:r>
-        <w:rPr>
-          <w:rFonts w:cs="Noto Sans Medium"/>
+          <w:rStyle w:val="normaltextrun"/>
+          <w:rFonts w:cs="Noto Sans Medium"/>
+          <w:sz w:val="32"/>
+        </w:rPr>
+      </w:pPr>
+      <w:r>
+        <w:rPr>
+          <w:rFonts w:cs="Noto Sans Medium"/>
+          <w:sz w:val="32"/>
         </w:rPr>
         <w:t>Data protection</w:t>
       </w:r>
@@ -1023,78 +1332,85 @@
           <w:tab w:val="left" w:pos="7905"/>
         </w:tabs>
         <w:rPr>
+          <w:rFonts w:eastAsia="Arial" w:cs="Noto Sans Medium"/>
+          <w:sz w:val="32"/>
+          <w:szCs w:val="32"/>
+          <w:lang w:val="en-US"/>
+        </w:rPr>
+      </w:pPr>
+      <w:r>
+        <w:rPr>
           <w:rStyle w:val="normaltextrun"/>
           <w:rFonts w:eastAsia="Arial" w:cs="Noto Sans Medium"/>
+          <w:sz w:val="32"/>
           <w:szCs w:val="32"/>
           <w:lang w:val="en-US"/>
         </w:rPr>
-      </w:pPr>
+        <w:t>If you want to include</w:t>
+      </w:r>
+      <w:r>
+        <w:rPr>
+          <w:rFonts w:cs="Noto Sans Medium"/>
+          <w:noProof/>
+          <w:sz w:val="32"/>
+          <w:szCs w:val="32"/>
+          <w:lang w:val="en-US"/>
+        </w:rPr>
+        <w:t xml:space="preserve"> </w:t>
+      </w:r>
       <w:r>
         <w:rPr>
           <w:rStyle w:val="normaltextrun"/>
           <w:rFonts w:eastAsia="Arial" w:cs="Noto Sans Medium"/>
+          <w:sz w:val="32"/>
           <w:szCs w:val="32"/>
           <w:lang w:val="en-US"/>
         </w:rPr>
-        <w:t>If you want to include</w:t>
-      </w:r>
-      <w:r>
-        <w:rPr>
-          <w:rFonts w:cs="Noto Sans Medium"/>
-          <w:noProof/>
-          <w:szCs w:val="32"/>
-          <w:lang w:val="en-US"/>
-        </w:rPr>
-        <w:t xml:space="preserve"> </w:t>
+        <w:t xml:space="preserve">data protection information, put this at the end of your letter. You can write this yourself. NHS Notify does not provide </w:t>
       </w:r>
       <w:r>
         <w:rPr>
           <w:rStyle w:val="normaltextrun"/>
           <w:rFonts w:eastAsia="Arial" w:cs="Noto Sans Medium"/>
+          <w:sz w:val="32"/>
           <w:szCs w:val="32"/>
           <w:lang w:val="en-US"/>
         </w:rPr>
-        <w:t xml:space="preserve">data protection information, put this at the end of your letter. You can write this yourself. NHS Notify does not provide </w:t>
+        <w:t>text for data</w:t>
       </w:r>
       <w:r>
         <w:rPr>
           <w:rStyle w:val="normaltextrun"/>
           <w:rFonts w:eastAsia="Arial" w:cs="Noto Sans Medium"/>
+          <w:sz w:val="32"/>
           <w:szCs w:val="32"/>
           <w:lang w:val="en-US"/>
         </w:rPr>
-        <w:t>text for data</w:t>
-      </w:r>
-      <w:r>
-        <w:rPr>
-          <w:rStyle w:val="normaltextrun"/>
-          <w:rFonts w:eastAsia="Arial" w:cs="Noto Sans Medium"/>
-          <w:szCs w:val="32"/>
-          <w:lang w:val="en-US"/>
-        </w:rPr>
         <w:t xml:space="preserve"> protection or privacy notices.</w:t>
       </w:r>
-    </w:p>
-    <w:p>
-      <w:pPr>
-        <w:pStyle w:val="Footer"/>
-        <w:tabs>
-          <w:tab w:val="clear" w:pos="9026"/>
-          <w:tab w:val="left" w:pos="7905"/>
-        </w:tabs>
-        <w:rPr>
-          <w:rFonts w:eastAsia="Arial" w:cs="Noto Sans Medium"/>
-          <w:szCs w:val="32"/>
-          <w:lang w:val="en-US"/>
-        </w:rPr>
-      </w:pPr>
+      <w:r>
+        <w:rPr>
+          <w:noProof/>
+          <w:sz w:val="32"/>
+          <w:szCs w:val="32"/>
+        </w:rPr>
+        <w:t xml:space="preserve"> </w:t>
+      </w:r>
+      <w:r>
+        <w:rPr>
+          <w:noProof/>
+          <w:sz w:val="32"/>
+          <w:szCs w:val="32"/>
+        </w:rPr>
+        <w:t xml:space="preserve"> </w:t>
+      </w:r>
     </w:p>
     <w:sectPr>
       <w:footerReference w:type="default" r:id="rId13"/>
       <w:headerReference w:type="first" r:id="rId14"/>
       <w:footerReference w:type="first" r:id="rId15"/>
       <w:pgSz w:w="11906" w:h="16838"/>
-      <w:pgMar w:top="567" w:right="851" w:bottom="284" w:left="851" w:header="284" w:footer="284" w:gutter="0"/>
+      <w:pgMar w:top="567" w:right="964" w:bottom="284" w:left="964" w:header="284" w:footer="396" w:gutter="0"/>
       <w:cols w:space="708"/>
       <w:titlePg/>
       <w:docGrid w:linePitch="360"/>
@@ -1104,7 +1420,7 @@
 </file>
 
 <file path=word/comments.xml><?xml version="1.0" encoding="utf-8"?>
-<w:comments xmlns:wpc="http://schemas.microsoft.com/office/word/2010/wordprocessingCanvas" xmlns:cx="http://schemas.microsoft.com/office/drawing/2014/chartex" xmlns:cx1="http://schemas.microsoft.com/office/drawing/2015/9/8/chartex" xmlns:cx2="http://schemas.microsoft.com/office/drawing/2015/10/21/chartex" xmlns:cx3="http://schemas.microsoft.com/office/drawing/2016/5/9/chartex" xmlns:cx4="http://schemas.microsoft.com/office/drawing/2016/5/10/chartex" xmlns:cx5="http://schemas.microsoft.com/office/drawing/2016/5/11/chartex" xmlns:cx6="http://schemas.microsoft.com/office/drawing/2016/5/12/chartex" xmlns:cx7="http://schemas.microsoft.com/office/drawing/2016/5/13/chartex" xmlns:cx8="http://schemas.microsoft.com/office/drawing/2016/5/14/chartex" xmlns:mc="http://schemas.openxmlformats.org/markup-compatibility/2006" xmlns:aink="http://schemas.microsoft.com/office/drawing/2016/ink" xmlns:am3d="http://schemas.microsoft.com/office/drawing/2017/model3d" xmlns:o="urn:schemas-microsoft-com:office:office" xmlns:oel="http://schemas.microsoft.com/office/2019/extlst" xmlns:r="http://schemas.openxmlformats.org/officeDocument/2006/relationships" xmlns:m="http://schemas.openxmlformats.org/officeDocument/2006/math" xmlns:v="urn:schemas-microsoft-com:vml" xmlns:wp14="http://schemas.microsoft.com/office/word/2010/wordprocessingDrawing" xmlns:wp="http://schemas.openxmlformats.org/drawingml/2006/wordprocessingDrawing" xmlns:w10="urn:schemas-microsoft-com:office:word" xmlns:w="http://schemas.openxmlformats.org/wordprocessingml/2006/main" xmlns:w14="http://schemas.microsoft.com/office/word/2010/wordml" xmlns:w15="http://schemas.microsoft.com/office/word/2012/wordml" xmlns:w16cex="http://schemas.microsoft.com/office/word/2018/wordml/cex" xmlns:w16cid="http://schemas.microsoft.com/office/word/2016/wordml/cid" xmlns:w16="http://schemas.microsoft.com/office/word/2018/wordml" xmlns:w16du="http://schemas.microsoft.com/office/word/2023/wordml/word16du" xmlns:w16sdtdh="http://schemas.microsoft.com/office/word/2020/wordml/sdtdatahash" xmlns:w16sdtfl="http://schemas.microsoft.com/office/word/2024/wordml/sdtformatlock" xmlns:w16se="http://schemas.microsoft.com/office/word/2015/wordml/symex" xmlns:wpg="http://schemas.microsoft.com/office/word/2010/wordprocessingGroup" xmlns:wpi="http://schemas.microsoft.com/office/word/2010/wordprocessingInk" xmlns:wne="http://schemas.microsoft.com/office/word/2006/wordml" xmlns:wps="http://schemas.microsoft.com/office/word/2010/wordprocessingShape" mc:Ignorable="w14 w15 w16se w16cid w16 w16cex w16sdtdh w16sdtfl w16du wp14">
+<w:comments xmlns:wpc="http://schemas.microsoft.com/office/word/2010/wordprocessingCanvas" xmlns:cx="http://schemas.microsoft.com/office/drawing/2014/chartex" xmlns:cx1="http://schemas.microsoft.com/office/drawing/2015/9/8/chartex" xmlns:cx2="http://schemas.microsoft.com/office/drawing/2015/10/21/chartex" xmlns:cx3="http://schemas.microsoft.com/office/drawing/2016/5/9/chartex" xmlns:cx4="http://schemas.microsoft.com/office/drawing/2016/5/10/chartex" xmlns:cx5="http://schemas.microsoft.com/office/drawing/2016/5/11/chartex" xmlns:cx6="http://schemas.microsoft.com/office/drawing/2016/5/12/chartex" xmlns:cx7="http://schemas.microsoft.com/office/drawing/2016/5/13/chartex" xmlns:cx8="http://schemas.microsoft.com/office/drawing/2016/5/14/chartex" xmlns:mc="http://schemas.openxmlformats.org/markup-compatibility/2006" xmlns:aink="http://schemas.microsoft.com/office/drawing/2016/ink" xmlns:am3d="http://schemas.microsoft.com/office/drawing/2017/model3d" xmlns:o="urn:schemas-microsoft-com:office:office" xmlns:oel="http://schemas.microsoft.com/office/2019/extlst" xmlns:r="http://schemas.openxmlformats.org/officeDocument/2006/relationships" xmlns:m="http://schemas.openxmlformats.org/officeDocument/2006/math" xmlns:v="urn:schemas-microsoft-com:vml" xmlns:wp14="http://schemas.microsoft.com/office/word/2010/wordprocessingDrawing" xmlns:wp="http://schemas.openxmlformats.org/drawingml/2006/wordprocessingDrawing" xmlns:w10="urn:schemas-microsoft-com:office:word" xmlns:w="http://schemas.openxmlformats.org/wordprocessingml/2006/main" xmlns:w14="http://schemas.microsoft.com/office/word/2010/wordml" xmlns:w15="http://schemas.microsoft.com/office/word/2012/wordml" xmlns:w16cei="http://schemas.microsoft.com/office/word/2026/wordml/cei" xmlns:w16cex="http://schemas.microsoft.com/office/word/2018/wordml/cex" xmlns:w16cid="http://schemas.microsoft.com/office/word/2016/wordml/cid" xmlns:w16="http://schemas.microsoft.com/office/word/2018/wordml" xmlns:w16du="http://schemas.microsoft.com/office/word/2023/wordml/word16du" xmlns:w16sdtdh="http://schemas.microsoft.com/office/word/2020/wordml/sdtdatahash" xmlns:w16sdtfl="http://schemas.microsoft.com/office/word/2024/wordml/sdtformatlock" xmlns:w16se="http://schemas.microsoft.com/office/word/2015/wordml/symex" xmlns:wpg="http://schemas.microsoft.com/office/word/2010/wordprocessingGroup" xmlns:wpi="http://schemas.microsoft.com/office/word/2010/wordprocessingInk" xmlns:wne="http://schemas.microsoft.com/office/word/2006/wordml" xmlns:wps="http://schemas.microsoft.com/office/word/2010/wordprocessingShape" mc:Ignorable="w14 w15 w16se w16cid w16 w16cex w16sdtdh w16sdtfl w16du wp14">
   <w:comment w:id="3" w:author="GIFFORD, Emma (NHS ENGLAND - X26)" w:date="2024-08-27T13:51:00Z" w:initials="EG">
     <w:p>
       <w:pPr>
@@ -1344,18 +1660,18 @@
         <w:pStyle w:val="CommentText"/>
       </w:pPr>
       <w:r>
-        <w:t xml:space="preserve">Read the </w:t>
+        <w:t xml:space="preserve">Read </w:t>
       </w:r>
       <w:hyperlink r:id="rId4" w:history="1">
         <w:r>
           <w:rPr>
             <w:rStyle w:val="Hyperlink"/>
           </w:rPr>
-          <w:t>full list of personalisation fields</w:t>
+          <w:t>how to provide personalisation data</w:t>
         </w:r>
       </w:hyperlink>
       <w:r>
-        <w:t xml:space="preserve"> that are available.</w:t>
+        <w:t xml:space="preserve"> and the full list of personalisation fields that are available in PDS.</w:t>
       </w:r>
     </w:p>
   </w:comment>
@@ -1438,7 +1754,7 @@
 </file>
 
 <file path=word/commentsExtended.xml><?xml version="1.0" encoding="utf-8"?>
-<w15:commentsEx xmlns:wpc="http://schemas.microsoft.com/office/word/2010/wordprocessingCanvas" xmlns:cx="http://schemas.microsoft.com/office/drawing/2014/chartex" xmlns:cx1="http://schemas.microsoft.com/office/drawing/2015/9/8/chartex" xmlns:cx2="http://schemas.microsoft.com/office/drawing/2015/10/21/chartex" xmlns:cx3="http://schemas.microsoft.com/office/drawing/2016/5/9/chartex" xmlns:cx4="http://schemas.microsoft.com/office/drawing/2016/5/10/chartex" xmlns:cx5="http://schemas.microsoft.com/office/drawing/2016/5/11/chartex" xmlns:cx6="http://schemas.microsoft.com/office/drawing/2016/5/12/chartex" xmlns:cx7="http://schemas.microsoft.com/office/drawing/2016/5/13/chartex" xmlns:cx8="http://schemas.microsoft.com/office/drawing/2016/5/14/chartex" xmlns:mc="http://schemas.openxmlformats.org/markup-compatibility/2006" xmlns:aink="http://schemas.microsoft.com/office/drawing/2016/ink" xmlns:am3d="http://schemas.microsoft.com/office/drawing/2017/model3d" xmlns:o="urn:schemas-microsoft-com:office:office" xmlns:oel="http://schemas.microsoft.com/office/2019/extlst" xmlns:r="http://schemas.openxmlformats.org/officeDocument/2006/relationships" xmlns:m="http://schemas.openxmlformats.org/officeDocument/2006/math" xmlns:v="urn:schemas-microsoft-com:vml" xmlns:wp14="http://schemas.microsoft.com/office/word/2010/wordprocessingDrawing" xmlns:wp="http://schemas.openxmlformats.org/drawingml/2006/wordprocessingDrawing" xmlns:w10="urn:schemas-microsoft-com:office:word" xmlns:w="http://schemas.openxmlformats.org/wordprocessingml/2006/main" xmlns:w14="http://schemas.microsoft.com/office/word/2010/wordml" xmlns:w15="http://schemas.microsoft.com/office/word/2012/wordml" xmlns:w16cex="http://schemas.microsoft.com/office/word/2018/wordml/cex" xmlns:w16cid="http://schemas.microsoft.com/office/word/2016/wordml/cid" xmlns:w16="http://schemas.microsoft.com/office/word/2018/wordml" xmlns:w16du="http://schemas.microsoft.com/office/word/2023/wordml/word16du" xmlns:w16sdtdh="http://schemas.microsoft.com/office/word/2020/wordml/sdtdatahash" xmlns:w16sdtfl="http://schemas.microsoft.com/office/word/2024/wordml/sdtformatlock" xmlns:w16se="http://schemas.microsoft.com/office/word/2015/wordml/symex" xmlns:wpg="http://schemas.microsoft.com/office/word/2010/wordprocessingGroup" xmlns:wpi="http://schemas.microsoft.com/office/word/2010/wordprocessingInk" xmlns:wne="http://schemas.microsoft.com/office/word/2006/wordml" xmlns:wps="http://schemas.microsoft.com/office/word/2010/wordprocessingShape" mc:Ignorable="w14 w15 w16se w16cid w16 w16cex w16sdtdh w16sdtfl w16du wp14">
+<w15:commentsEx xmlns:wpc="http://schemas.microsoft.com/office/word/2010/wordprocessingCanvas" xmlns:cx="http://schemas.microsoft.com/office/drawing/2014/chartex" xmlns:cx1="http://schemas.microsoft.com/office/drawing/2015/9/8/chartex" xmlns:cx2="http://schemas.microsoft.com/office/drawing/2015/10/21/chartex" xmlns:cx3="http://schemas.microsoft.com/office/drawing/2016/5/9/chartex" xmlns:cx4="http://schemas.microsoft.com/office/drawing/2016/5/10/chartex" xmlns:cx5="http://schemas.microsoft.com/office/drawing/2016/5/11/chartex" xmlns:cx6="http://schemas.microsoft.com/office/drawing/2016/5/12/chartex" xmlns:cx7="http://schemas.microsoft.com/office/drawing/2016/5/13/chartex" xmlns:cx8="http://schemas.microsoft.com/office/drawing/2016/5/14/chartex" xmlns:mc="http://schemas.openxmlformats.org/markup-compatibility/2006" xmlns:aink="http://schemas.microsoft.com/office/drawing/2016/ink" xmlns:am3d="http://schemas.microsoft.com/office/drawing/2017/model3d" xmlns:o="urn:schemas-microsoft-com:office:office" xmlns:oel="http://schemas.microsoft.com/office/2019/extlst" xmlns:r="http://schemas.openxmlformats.org/officeDocument/2006/relationships" xmlns:m="http://schemas.openxmlformats.org/officeDocument/2006/math" xmlns:v="urn:schemas-microsoft-com:vml" xmlns:wp14="http://schemas.microsoft.com/office/word/2010/wordprocessingDrawing" xmlns:wp="http://schemas.openxmlformats.org/drawingml/2006/wordprocessingDrawing" xmlns:w10="urn:schemas-microsoft-com:office:word" xmlns:w="http://schemas.openxmlformats.org/wordprocessingml/2006/main" xmlns:w14="http://schemas.microsoft.com/office/word/2010/wordml" xmlns:w15="http://schemas.microsoft.com/office/word/2012/wordml" xmlns:w16cei="http://schemas.microsoft.com/office/word/2026/wordml/cei" xmlns:w16cex="http://schemas.microsoft.com/office/word/2018/wordml/cex" xmlns:w16cid="http://schemas.microsoft.com/office/word/2016/wordml/cid" xmlns:w16="http://schemas.microsoft.com/office/word/2018/wordml" xmlns:w16du="http://schemas.microsoft.com/office/word/2023/wordml/word16du" xmlns:w16sdtdh="http://schemas.microsoft.com/office/word/2020/wordml/sdtdatahash" xmlns:w16sdtfl="http://schemas.microsoft.com/office/word/2024/wordml/sdtformatlock" xmlns:w16se="http://schemas.microsoft.com/office/word/2015/wordml/symex" xmlns:wpg="http://schemas.microsoft.com/office/word/2010/wordprocessingGroup" xmlns:wpi="http://schemas.microsoft.com/office/word/2010/wordprocessingInk" xmlns:wne="http://schemas.microsoft.com/office/word/2006/wordml" xmlns:wps="http://schemas.microsoft.com/office/word/2010/wordprocessingShape" mc:Ignorable="w14 w15 w16se w16cid w16 w16cex w16sdtdh w16sdtfl w16du wp14">
   <w15:commentEx w15:paraId="5658C2AB" w15:done="0"/>
   <w15:commentEx w15:paraId="5D816678" w15:done="0"/>
   <w15:commentEx w15:paraId="600C8EC2" w15:done="0"/>
@@ -1447,13 +1763,13 @@
   <w15:commentEx w15:paraId="54AC1DDD" w15:done="0"/>
   <w15:commentEx w15:paraId="7348D7CE" w15:done="0"/>
   <w15:commentEx w15:paraId="40373886" w15:done="0"/>
-  <w15:commentEx w15:paraId="7E4F311B" w15:done="0"/>
-  <w15:commentEx w15:paraId="5CCB82EE" w15:done="0"/>
+  <w15:commentEx w15:paraId="21401BBE" w15:done="0"/>
+  <w15:commentEx w15:paraId="59F2E32A" w15:done="0"/>
 </w15:commentsEx>
 </file>
 
 <file path=word/commentsExtensible.xml><?xml version="1.0" encoding="utf-8"?>
-<w16cex:commentsExtensible xmlns:wpc="http://schemas.microsoft.com/office/word/2010/wordprocessingCanvas" xmlns:cx="http://schemas.microsoft.com/office/drawing/2014/chartex" xmlns:cx1="http://schemas.microsoft.com/office/drawing/2015/9/8/chartex" xmlns:cx2="http://schemas.microsoft.com/office/drawing/2015/10/21/chartex" xmlns:cx3="http://schemas.microsoft.com/office/drawing/2016/5/9/chartex" xmlns:cx4="http://schemas.microsoft.com/office/drawing/2016/5/10/chartex" xmlns:cx5="http://schemas.microsoft.com/office/drawing/2016/5/11/chartex" xmlns:cx6="http://schemas.microsoft.com/office/drawing/2016/5/12/chartex" xmlns:cx7="http://schemas.microsoft.com/office/drawing/2016/5/13/chartex" xmlns:cx8="http://schemas.microsoft.com/office/drawing/2016/5/14/chartex" xmlns:cr="http://schemas.microsoft.com/office/comments/2020/reactions" xmlns:mc="http://schemas.openxmlformats.org/markup-compatibility/2006" xmlns:aink="http://schemas.microsoft.com/office/drawing/2016/ink" xmlns:am3d="http://schemas.microsoft.com/office/drawing/2017/model3d" xmlns:o="urn:schemas-microsoft-com:office:office" xmlns:oel="http://schemas.microsoft.com/office/2019/extlst" xmlns:r="http://schemas.openxmlformats.org/officeDocument/2006/relationships" xmlns:m="http://schemas.openxmlformats.org/officeDocument/2006/math" xmlns:v="urn:schemas-microsoft-com:vml" xmlns:wp14="http://schemas.microsoft.com/office/word/2010/wordprocessingDrawing" xmlns:wp="http://schemas.openxmlformats.org/drawingml/2006/wordprocessingDrawing" xmlns:w10="urn:schemas-microsoft-com:office:word" xmlns:w="http://schemas.openxmlformats.org/wordprocessingml/2006/main" xmlns:w14="http://schemas.microsoft.com/office/word/2010/wordml" xmlns:w15="http://schemas.microsoft.com/office/word/2012/wordml" xmlns:w16cex="http://schemas.microsoft.com/office/word/2018/wordml/cex" xmlns:w16cid="http://schemas.microsoft.com/office/word/2016/wordml/cid" xmlns:w16="http://schemas.microsoft.com/office/word/2018/wordml" xmlns:w16du="http://schemas.microsoft.com/office/word/2023/wordml/word16du" xmlns:w16sdtdh="http://schemas.microsoft.com/office/word/2020/wordml/sdtdatahash" xmlns:w16sdtfl="http://schemas.microsoft.com/office/word/2024/wordml/sdtformatlock" xmlns:w16se="http://schemas.microsoft.com/office/word/2015/wordml/symex" xmlns:wpg="http://schemas.microsoft.com/office/word/2010/wordprocessingGroup" xmlns:wpi="http://schemas.microsoft.com/office/word/2010/wordprocessingInk" xmlns:wne="http://schemas.microsoft.com/office/word/2006/wordml" xmlns:wps="http://schemas.microsoft.com/office/word/2010/wordprocessingShape" mc:Ignorable="w14 w15 w16se w16cid w16 w16cex w16sdtdh w16sdtfl cr w16du wp14">
+<w16cex:commentsExtensible xmlns:wpc="http://schemas.microsoft.com/office/word/2010/wordprocessingCanvas" xmlns:cx="http://schemas.microsoft.com/office/drawing/2014/chartex" xmlns:cx1="http://schemas.microsoft.com/office/drawing/2015/9/8/chartex" xmlns:cx2="http://schemas.microsoft.com/office/drawing/2015/10/21/chartex" xmlns:cx3="http://schemas.microsoft.com/office/drawing/2016/5/9/chartex" xmlns:cx4="http://schemas.microsoft.com/office/drawing/2016/5/10/chartex" xmlns:cx5="http://schemas.microsoft.com/office/drawing/2016/5/11/chartex" xmlns:cx6="http://schemas.microsoft.com/office/drawing/2016/5/12/chartex" xmlns:cx7="http://schemas.microsoft.com/office/drawing/2016/5/13/chartex" xmlns:cx8="http://schemas.microsoft.com/office/drawing/2016/5/14/chartex" xmlns:cr="http://schemas.microsoft.com/office/comments/2020/reactions" xmlns:mc="http://schemas.openxmlformats.org/markup-compatibility/2006" xmlns:aink="http://schemas.microsoft.com/office/drawing/2016/ink" xmlns:am3d="http://schemas.microsoft.com/office/drawing/2017/model3d" xmlns:o="urn:schemas-microsoft-com:office:office" xmlns:oel="http://schemas.microsoft.com/office/2019/extlst" xmlns:r="http://schemas.openxmlformats.org/officeDocument/2006/relationships" xmlns:m="http://schemas.openxmlformats.org/officeDocument/2006/math" xmlns:v="urn:schemas-microsoft-com:vml" xmlns:wp14="http://schemas.microsoft.com/office/word/2010/wordprocessingDrawing" xmlns:wp="http://schemas.openxmlformats.org/drawingml/2006/wordprocessingDrawing" xmlns:w10="urn:schemas-microsoft-com:office:word" xmlns:w="http://schemas.openxmlformats.org/wordprocessingml/2006/main" xmlns:w14="http://schemas.microsoft.com/office/word/2010/wordml" xmlns:w15="http://schemas.microsoft.com/office/word/2012/wordml" xmlns:w16cei="http://schemas.microsoft.com/office/word/2026/wordml/cei" xmlns:w16cex="http://schemas.microsoft.com/office/word/2018/wordml/cex" xmlns:w16cid="http://schemas.microsoft.com/office/word/2016/wordml/cid" xmlns:w16="http://schemas.microsoft.com/office/word/2018/wordml" xmlns:w16du="http://schemas.microsoft.com/office/word/2023/wordml/word16du" xmlns:w16sdtdh="http://schemas.microsoft.com/office/word/2020/wordml/sdtdatahash" xmlns:w16sdtfl="http://schemas.microsoft.com/office/word/2024/wordml/sdtformatlock" xmlns:w16se="http://schemas.microsoft.com/office/word/2015/wordml/symex" xmlns:wpg="http://schemas.microsoft.com/office/word/2010/wordprocessingGroup" xmlns:wpi="http://schemas.microsoft.com/office/word/2010/wordprocessingInk" xmlns:wne="http://schemas.microsoft.com/office/word/2006/wordml" xmlns:wps="http://schemas.microsoft.com/office/word/2010/wordprocessingShape" mc:Ignorable="w14 w15 w16se w16cid w16 w16cex w16sdtdh w16sdtfl cr w16du wp14">
   <w16cex:commentExtensible w16cex:durableId="5C50AEC9" w16cex:dateUtc="2024-08-27T12:51:00Z"/>
   <w16cex:commentExtensible w16cex:durableId="3B7EFCB6" w16cex:dateUtc="2024-08-27T12:50:00Z"/>
   <w16cex:commentExtensible w16cex:durableId="7D5B7042" w16cex:dateUtc="2024-08-27T13:00:00Z"/>
@@ -1468,7 +1784,7 @@
 </file>
 
 <file path=word/commentsIds.xml><?xml version="1.0" encoding="utf-8"?>
-<w16cid:commentsIds xmlns:wpc="http://schemas.microsoft.com/office/word/2010/wordprocessingCanvas" xmlns:cx="http://schemas.microsoft.com/office/drawing/2014/chartex" xmlns:cx1="http://schemas.microsoft.com/office/drawing/2015/9/8/chartex" xmlns:cx2="http://schemas.microsoft.com/office/drawing/2015/10/21/chartex" xmlns:cx3="http://schemas.microsoft.com/office/drawing/2016/5/9/chartex" xmlns:cx4="http://schemas.microsoft.com/office/drawing/2016/5/10/chartex" xmlns:cx5="http://schemas.microsoft.com/office/drawing/2016/5/11/chartex" xmlns:cx6="http://schemas.microsoft.com/office/drawing/2016/5/12/chartex" xmlns:cx7="http://schemas.microsoft.com/office/drawing/2016/5/13/chartex" xmlns:cx8="http://schemas.microsoft.com/office/drawing/2016/5/14/chartex" xmlns:mc="http://schemas.openxmlformats.org/markup-compatibility/2006" xmlns:aink="http://schemas.microsoft.com/office/drawing/2016/ink" xmlns:am3d="http://schemas.microsoft.com/office/drawing/2017/model3d" xmlns:o="urn:schemas-microsoft-com:office:office" xmlns:oel="http://schemas.microsoft.com/office/2019/extlst" xmlns:r="http://schemas.openxmlformats.org/officeDocument/2006/relationships" xmlns:m="http://schemas.openxmlformats.org/officeDocument/2006/math" xmlns:v="urn:schemas-microsoft-com:vml" xmlns:wp14="http://schemas.microsoft.com/office/word/2010/wordprocessingDrawing" xmlns:wp="http://schemas.openxmlformats.org/drawingml/2006/wordprocessingDrawing" xmlns:w10="urn:schemas-microsoft-com:office:word" xmlns:w="http://schemas.openxmlformats.org/wordprocessingml/2006/main" xmlns:w14="http://schemas.microsoft.com/office/word/2010/wordml" xmlns:w15="http://schemas.microsoft.com/office/word/2012/wordml" xmlns:w16cex="http://schemas.microsoft.com/office/word/2018/wordml/cex" xmlns:w16cid="http://schemas.microsoft.com/office/word/2016/wordml/cid" xmlns:w16="http://schemas.microsoft.com/office/word/2018/wordml" xmlns:w16du="http://schemas.microsoft.com/office/word/2023/wordml/word16du" xmlns:w16sdtdh="http://schemas.microsoft.com/office/word/2020/wordml/sdtdatahash" xmlns:w16sdtfl="http://schemas.microsoft.com/office/word/2024/wordml/sdtformatlock" xmlns:w16se="http://schemas.microsoft.com/office/word/2015/wordml/symex" xmlns:wpg="http://schemas.microsoft.com/office/word/2010/wordprocessingGroup" xmlns:wpi="http://schemas.microsoft.com/office/word/2010/wordprocessingInk" xmlns:wne="http://schemas.microsoft.com/office/word/2006/wordml" xmlns:wps="http://schemas.microsoft.com/office/word/2010/wordprocessingShape" mc:Ignorable="w14 w15 w16se w16cid w16 w16cex w16sdtdh w16sdtfl w16du wp14">
+<w16cid:commentsIds xmlns:wpc="http://schemas.microsoft.com/office/word/2010/wordprocessingCanvas" xmlns:cx="http://schemas.microsoft.com/office/drawing/2014/chartex" xmlns:cx1="http://schemas.microsoft.com/office/drawing/2015/9/8/chartex" xmlns:cx2="http://schemas.microsoft.com/office/drawing/2015/10/21/chartex" xmlns:cx3="http://schemas.microsoft.com/office/drawing/2016/5/9/chartex" xmlns:cx4="http://schemas.microsoft.com/office/drawing/2016/5/10/chartex" xmlns:cx5="http://schemas.microsoft.com/office/drawing/2016/5/11/chartex" xmlns:cx6="http://schemas.microsoft.com/office/drawing/2016/5/12/chartex" xmlns:cx7="http://schemas.microsoft.com/office/drawing/2016/5/13/chartex" xmlns:cx8="http://schemas.microsoft.com/office/drawing/2016/5/14/chartex" xmlns:mc="http://schemas.openxmlformats.org/markup-compatibility/2006" xmlns:aink="http://schemas.microsoft.com/office/drawing/2016/ink" xmlns:am3d="http://schemas.microsoft.com/office/drawing/2017/model3d" xmlns:o="urn:schemas-microsoft-com:office:office" xmlns:oel="http://schemas.microsoft.com/office/2019/extlst" xmlns:r="http://schemas.openxmlformats.org/officeDocument/2006/relationships" xmlns:m="http://schemas.openxmlformats.org/officeDocument/2006/math" xmlns:v="urn:schemas-microsoft-com:vml" xmlns:wp14="http://schemas.microsoft.com/office/word/2010/wordprocessingDrawing" xmlns:wp="http://schemas.openxmlformats.org/drawingml/2006/wordprocessingDrawing" xmlns:w10="urn:schemas-microsoft-com:office:word" xmlns:w="http://schemas.openxmlformats.org/wordprocessingml/2006/main" xmlns:w14="http://schemas.microsoft.com/office/word/2010/wordml" xmlns:w15="http://schemas.microsoft.com/office/word/2012/wordml" xmlns:w16cei="http://schemas.microsoft.com/office/word/2026/wordml/cei" xmlns:w16cex="http://schemas.microsoft.com/office/word/2018/wordml/cex" xmlns:w16cid="http://schemas.microsoft.com/office/word/2016/wordml/cid" xmlns:w16="http://schemas.microsoft.com/office/word/2018/wordml" xmlns:w16du="http://schemas.microsoft.com/office/word/2023/wordml/word16du" xmlns:w16sdtdh="http://schemas.microsoft.com/office/word/2020/wordml/sdtdatahash" xmlns:w16sdtfl="http://schemas.microsoft.com/office/word/2024/wordml/sdtformatlock" xmlns:w16se="http://schemas.microsoft.com/office/word/2015/wordml/symex" xmlns:wpg="http://schemas.microsoft.com/office/word/2010/wordprocessingGroup" xmlns:wpi="http://schemas.microsoft.com/office/word/2010/wordprocessingInk" xmlns:wne="http://schemas.microsoft.com/office/word/2006/wordml" xmlns:wps="http://schemas.microsoft.com/office/word/2010/wordprocessingShape" mc:Ignorable="w14 w15 w16se w16cid w16 w16cex w16sdtdh w16sdtfl w16du wp14">
   <w16cid:commentId w16cid:paraId="5658C2AB" w16cid:durableId="5C50AEC9"/>
   <w16cid:commentId w16cid:paraId="5D816678" w16cid:durableId="3B7EFCB6"/>
   <w16cid:commentId w16cid:paraId="600C8EC2" w16cid:durableId="7D5B7042"/>
@@ -1477,13 +1793,13 @@
   <w16cid:commentId w16cid:paraId="54AC1DDD" w16cid:durableId="21904BF1"/>
   <w16cid:commentId w16cid:paraId="7348D7CE" w16cid:durableId="36340119"/>
   <w16cid:commentId w16cid:paraId="40373886" w16cid:durableId="6A34F8AF"/>
-  <w16cid:commentId w16cid:paraId="7E4F311B" w16cid:durableId="27241A13"/>
-  <w16cid:commentId w16cid:paraId="5CCB82EE" w16cid:durableId="2865DA4F"/>
+  <w16cid:commentId w16cid:paraId="21401BBE" w16cid:durableId="27241A13"/>
+  <w16cid:commentId w16cid:paraId="59F2E32A" w16cid:durableId="2865DA4F"/>
 </w16cid:commentsIds>
 </file>
 
 <file path=word/endnotes.xml><?xml version="1.0" encoding="utf-8"?>
-<w:endnotes xmlns:wpc="http://schemas.microsoft.com/office/word/2010/wordprocessingCanvas" xmlns:cx="http://schemas.microsoft.com/office/drawing/2014/chartex" xmlns:cx1="http://schemas.microsoft.com/office/drawing/2015/9/8/chartex" xmlns:cx2="http://schemas.microsoft.com/office/drawing/2015/10/21/chartex" xmlns:cx3="http://schemas.microsoft.com/office/drawing/2016/5/9/chartex" xmlns:cx4="http://schemas.microsoft.com/office/drawing/2016/5/10/chartex" xmlns:cx5="http://schemas.microsoft.com/office/drawing/2016/5/11/chartex" xmlns:cx6="http://schemas.microsoft.com/office/drawing/2016/5/12/chartex" xmlns:cx7="http://schemas.microsoft.com/office/drawing/2016/5/13/chartex" xmlns:cx8="http://schemas.microsoft.com/office/drawing/2016/5/14/chartex" xmlns:mc="http://schemas.openxmlformats.org/markup-compatibility/2006" xmlns:aink="http://schemas.microsoft.com/office/drawing/2016/ink" xmlns:am3d="http://schemas.microsoft.com/office/drawing/2017/model3d" xmlns:o="urn:schemas-microsoft-com:office:office" xmlns:oel="http://schemas.microsoft.com/office/2019/extlst" xmlns:r="http://schemas.openxmlformats.org/officeDocument/2006/relationships" xmlns:m="http://schemas.openxmlformats.org/officeDocument/2006/math" xmlns:v="urn:schemas-microsoft-com:vml" xmlns:wp14="http://schemas.microsoft.com/office/word/2010/wordprocessingDrawing" xmlns:wp="http://schemas.openxmlformats.org/drawingml/2006/wordprocessingDrawing" xmlns:w10="urn:schemas-microsoft-com:office:word" xmlns:w="http://schemas.openxmlformats.org/wordprocessingml/2006/main" xmlns:w14="http://schemas.microsoft.com/office/word/2010/wordml" xmlns:w15="http://schemas.microsoft.com/office/word/2012/wordml" xmlns:w16cex="http://schemas.microsoft.com/office/word/2018/wordml/cex" xmlns:w16cid="http://schemas.microsoft.com/office/word/2016/wordml/cid" xmlns:w16="http://schemas.microsoft.com/office/word/2018/wordml" xmlns:w16du="http://schemas.microsoft.com/office/word/2023/wordml/word16du" xmlns:w16sdtdh="http://schemas.microsoft.com/office/word/2020/wordml/sdtdatahash" xmlns:w16sdtfl="http://schemas.microsoft.com/office/word/2024/wordml/sdtformatlock" xmlns:w16se="http://schemas.microsoft.com/office/word/2015/wordml/symex" xmlns:wpg="http://schemas.microsoft.com/office/word/2010/wordprocessingGroup" xmlns:wpi="http://schemas.microsoft.com/office/word/2010/wordprocessingInk" xmlns:wne="http://schemas.microsoft.com/office/word/2006/wordml" xmlns:wps="http://schemas.microsoft.com/office/word/2010/wordprocessingShape" mc:Ignorable="w14 w15 w16se w16cid w16 w16cex w16sdtdh w16sdtfl w16du wp14">
+<w:endnotes xmlns:wpc="http://schemas.microsoft.com/office/word/2010/wordprocessingCanvas" xmlns:cx="http://schemas.microsoft.com/office/drawing/2014/chartex" xmlns:cx1="http://schemas.microsoft.com/office/drawing/2015/9/8/chartex" xmlns:cx2="http://schemas.microsoft.com/office/drawing/2015/10/21/chartex" xmlns:cx3="http://schemas.microsoft.com/office/drawing/2016/5/9/chartex" xmlns:cx4="http://schemas.microsoft.com/office/drawing/2016/5/10/chartex" xmlns:cx5="http://schemas.microsoft.com/office/drawing/2016/5/11/chartex" xmlns:cx6="http://schemas.microsoft.com/office/drawing/2016/5/12/chartex" xmlns:cx7="http://schemas.microsoft.com/office/drawing/2016/5/13/chartex" xmlns:cx8="http://schemas.microsoft.com/office/drawing/2016/5/14/chartex" xmlns:mc="http://schemas.openxmlformats.org/markup-compatibility/2006" xmlns:aink="http://schemas.microsoft.com/office/drawing/2016/ink" xmlns:am3d="http://schemas.microsoft.com/office/drawing/2017/model3d" xmlns:o="urn:schemas-microsoft-com:office:office" xmlns:oel="http://schemas.microsoft.com/office/2019/extlst" xmlns:r="http://schemas.openxmlformats.org/officeDocument/2006/relationships" xmlns:m="http://schemas.openxmlformats.org/officeDocument/2006/math" xmlns:v="urn:schemas-microsoft-com:vml" xmlns:wp14="http://schemas.microsoft.com/office/word/2010/wordprocessingDrawing" xmlns:wp="http://schemas.openxmlformats.org/drawingml/2006/wordprocessingDrawing" xmlns:w10="urn:schemas-microsoft-com:office:word" xmlns:w="http://schemas.openxmlformats.org/wordprocessingml/2006/main" xmlns:w14="http://schemas.microsoft.com/office/word/2010/wordml" xmlns:w15="http://schemas.microsoft.com/office/word/2012/wordml" xmlns:w16cei="http://schemas.microsoft.com/office/word/2026/wordml/cei" xmlns:w16cex="http://schemas.microsoft.com/office/word/2018/wordml/cex" xmlns:w16cid="http://schemas.microsoft.com/office/word/2016/wordml/cid" xmlns:w16="http://schemas.microsoft.com/office/word/2018/wordml" xmlns:w16du="http://schemas.microsoft.com/office/word/2023/wordml/word16du" xmlns:w16sdtdh="http://schemas.microsoft.com/office/word/2020/wordml/sdtdatahash" xmlns:w16sdtfl="http://schemas.microsoft.com/office/word/2024/wordml/sdtformatlock" xmlns:w16se="http://schemas.microsoft.com/office/word/2015/wordml/symex" xmlns:wpg="http://schemas.microsoft.com/office/word/2010/wordprocessingGroup" xmlns:wpi="http://schemas.microsoft.com/office/word/2010/wordprocessingInk" xmlns:wne="http://schemas.microsoft.com/office/word/2006/wordml" xmlns:wps="http://schemas.microsoft.com/office/word/2010/wordprocessingShape" mc:Ignorable="w14 w15 w16se w16cid w16 w16cex w16sdtdh w16sdtfl w16du wp14">
   <w:endnote w:type="separator" w:id="-1">
     <w:p>
       <w:r>
@@ -1502,7 +1818,7 @@
 </file>
 
 <file path=word/footer1.xml><?xml version="1.0" encoding="utf-8"?>
-<w:ftr xmlns:wpc="http://schemas.microsoft.com/office/word/2010/wordprocessingCanvas" xmlns:cx="http://schemas.microsoft.com/office/drawing/2014/chartex" xmlns:cx1="http://schemas.microsoft.com/office/drawing/2015/9/8/chartex" xmlns:cx2="http://schemas.microsoft.com/office/drawing/2015/10/21/chartex" xmlns:cx3="http://schemas.microsoft.com/office/drawing/2016/5/9/chartex" xmlns:cx4="http://schemas.microsoft.com/office/drawing/2016/5/10/chartex" xmlns:cx5="http://schemas.microsoft.com/office/drawing/2016/5/11/chartex" xmlns:cx6="http://schemas.microsoft.com/office/drawing/2016/5/12/chartex" xmlns:cx7="http://schemas.microsoft.com/office/drawing/2016/5/13/chartex" xmlns:cx8="http://schemas.microsoft.com/office/drawing/2016/5/14/chartex" xmlns:mc="http://schemas.openxmlformats.org/markup-compatibility/2006" xmlns:aink="http://schemas.microsoft.com/office/drawing/2016/ink" xmlns:am3d="http://schemas.microsoft.com/office/drawing/2017/model3d" xmlns:o="urn:schemas-microsoft-com:office:office" xmlns:oel="http://schemas.microsoft.com/office/2019/extlst" xmlns:r="http://schemas.openxmlformats.org/officeDocument/2006/relationships" xmlns:m="http://schemas.openxmlformats.org/officeDocument/2006/math" xmlns:v="urn:schemas-microsoft-com:vml" xmlns:wp14="http://schemas.microsoft.com/office/word/2010/wordprocessingDrawing" xmlns:wp="http://schemas.openxmlformats.org/drawingml/2006/wordprocessingDrawing" xmlns:w10="urn:schemas-microsoft-com:office:word" xmlns:w="http://schemas.openxmlformats.org/wordprocessingml/2006/main" xmlns:w14="http://schemas.microsoft.com/office/word/2010/wordml" xmlns:w15="http://schemas.microsoft.com/office/word/2012/wordml" xmlns:w16cex="http://schemas.microsoft.com/office/word/2018/wordml/cex" xmlns:w16cid="http://schemas.microsoft.com/office/word/2016/wordml/cid" xmlns:w16="http://schemas.microsoft.com/office/word/2018/wordml" xmlns:w16du="http://schemas.microsoft.com/office/word/2023/wordml/word16du" xmlns:w16sdtdh="http://schemas.microsoft.com/office/word/2020/wordml/sdtdatahash" xmlns:w16sdtfl="http://schemas.microsoft.com/office/word/2024/wordml/sdtformatlock" xmlns:w16se="http://schemas.microsoft.com/office/word/2015/wordml/symex" xmlns:wpg="http://schemas.microsoft.com/office/word/2010/wordprocessingGroup" xmlns:wpi="http://schemas.microsoft.com/office/word/2010/wordprocessingInk" xmlns:wne="http://schemas.microsoft.com/office/word/2006/wordml" xmlns:wps="http://schemas.microsoft.com/office/word/2010/wordprocessingShape" mc:Ignorable="w14 w15 w16se w16cid w16 w16cex w16sdtdh w16sdtfl w16du wp14">
+<w:ftr xmlns:wpc="http://schemas.microsoft.com/office/word/2010/wordprocessingCanvas" xmlns:cx="http://schemas.microsoft.com/office/drawing/2014/chartex" xmlns:cx1="http://schemas.microsoft.com/office/drawing/2015/9/8/chartex" xmlns:cx2="http://schemas.microsoft.com/office/drawing/2015/10/21/chartex" xmlns:cx3="http://schemas.microsoft.com/office/drawing/2016/5/9/chartex" xmlns:cx4="http://schemas.microsoft.com/office/drawing/2016/5/10/chartex" xmlns:cx5="http://schemas.microsoft.com/office/drawing/2016/5/11/chartex" xmlns:cx6="http://schemas.microsoft.com/office/drawing/2016/5/12/chartex" xmlns:cx7="http://schemas.microsoft.com/office/drawing/2016/5/13/chartex" xmlns:cx8="http://schemas.microsoft.com/office/drawing/2016/5/14/chartex" xmlns:mc="http://schemas.openxmlformats.org/markup-compatibility/2006" xmlns:aink="http://schemas.microsoft.com/office/drawing/2016/ink" xmlns:am3d="http://schemas.microsoft.com/office/drawing/2017/model3d" xmlns:o="urn:schemas-microsoft-com:office:office" xmlns:oel="http://schemas.microsoft.com/office/2019/extlst" xmlns:r="http://schemas.openxmlformats.org/officeDocument/2006/relationships" xmlns:m="http://schemas.openxmlformats.org/officeDocument/2006/math" xmlns:v="urn:schemas-microsoft-com:vml" xmlns:wp14="http://schemas.microsoft.com/office/word/2010/wordprocessingDrawing" xmlns:wp="http://schemas.openxmlformats.org/drawingml/2006/wordprocessingDrawing" xmlns:w10="urn:schemas-microsoft-com:office:word" xmlns:w="http://schemas.openxmlformats.org/wordprocessingml/2006/main" xmlns:w14="http://schemas.microsoft.com/office/word/2010/wordml" xmlns:w15="http://schemas.microsoft.com/office/word/2012/wordml" xmlns:w16cei="http://schemas.microsoft.com/office/word/2026/wordml/cei" xmlns:w16cex="http://schemas.microsoft.com/office/word/2018/wordml/cex" xmlns:w16cid="http://schemas.microsoft.com/office/word/2016/wordml/cid" xmlns:w16="http://schemas.microsoft.com/office/word/2018/wordml" xmlns:w16du="http://schemas.microsoft.com/office/word/2023/wordml/word16du" xmlns:w16sdtdh="http://schemas.microsoft.com/office/word/2020/wordml/sdtdatahash" xmlns:w16sdtfl="http://schemas.microsoft.com/office/word/2024/wordml/sdtformatlock" xmlns:w16se="http://schemas.microsoft.com/office/word/2015/wordml/symex" xmlns:wpg="http://schemas.microsoft.com/office/word/2010/wordprocessingGroup" xmlns:wpi="http://schemas.microsoft.com/office/word/2010/wordprocessingInk" xmlns:wne="http://schemas.microsoft.com/office/word/2006/wordml" xmlns:wps="http://schemas.microsoft.com/office/word/2010/wordprocessingShape" mc:Ignorable="w14 w15 w16se w16cid w16 w16cex w16sdtdh w16sdtfl w16du wp14">
   <w:sdt>
     <w:sdtPr>
       <w:id w:val="1062981965"/>
@@ -1605,7 +1921,7 @@
 </file>
 
 <file path=word/footer2.xml><?xml version="1.0" encoding="utf-8"?>
-<w:ftr xmlns:wpc="http://schemas.microsoft.com/office/word/2010/wordprocessingCanvas" xmlns:cx="http://schemas.microsoft.com/office/drawing/2014/chartex" xmlns:cx1="http://schemas.microsoft.com/office/drawing/2015/9/8/chartex" xmlns:cx2="http://schemas.microsoft.com/office/drawing/2015/10/21/chartex" xmlns:cx3="http://schemas.microsoft.com/office/drawing/2016/5/9/chartex" xmlns:cx4="http://schemas.microsoft.com/office/drawing/2016/5/10/chartex" xmlns:cx5="http://schemas.microsoft.com/office/drawing/2016/5/11/chartex" xmlns:cx6="http://schemas.microsoft.com/office/drawing/2016/5/12/chartex" xmlns:cx7="http://schemas.microsoft.com/office/drawing/2016/5/13/chartex" xmlns:cx8="http://schemas.microsoft.com/office/drawing/2016/5/14/chartex" xmlns:mc="http://schemas.openxmlformats.org/markup-compatibility/2006" xmlns:aink="http://schemas.microsoft.com/office/drawing/2016/ink" xmlns:am3d="http://schemas.microsoft.com/office/drawing/2017/model3d" xmlns:o="urn:schemas-microsoft-com:office:office" xmlns:oel="http://schemas.microsoft.com/office/2019/extlst" xmlns:r="http://schemas.openxmlformats.org/officeDocument/2006/relationships" xmlns:m="http://schemas.openxmlformats.org/officeDocument/2006/math" xmlns:v="urn:schemas-microsoft-com:vml" xmlns:wp14="http://schemas.microsoft.com/office/word/2010/wordprocessingDrawing" xmlns:wp="http://schemas.openxmlformats.org/drawingml/2006/wordprocessingDrawing" xmlns:w10="urn:schemas-microsoft-com:office:word" xmlns:w="http://schemas.openxmlformats.org/wordprocessingml/2006/main" xmlns:w14="http://schemas.microsoft.com/office/word/2010/wordml" xmlns:w15="http://schemas.microsoft.com/office/word/2012/wordml" xmlns:w16cex="http://schemas.microsoft.com/office/word/2018/wordml/cex" xmlns:w16cid="http://schemas.microsoft.com/office/word/2016/wordml/cid" xmlns:w16="http://schemas.microsoft.com/office/word/2018/wordml" xmlns:w16du="http://schemas.microsoft.com/office/word/2023/wordml/word16du" xmlns:w16sdtdh="http://schemas.microsoft.com/office/word/2020/wordml/sdtdatahash" xmlns:w16sdtfl="http://schemas.microsoft.com/office/word/2024/wordml/sdtformatlock" xmlns:w16se="http://schemas.microsoft.com/office/word/2015/wordml/symex" xmlns:wpg="http://schemas.microsoft.com/office/word/2010/wordprocessingGroup" xmlns:wpi="http://schemas.microsoft.com/office/word/2010/wordprocessingInk" xmlns:wne="http://schemas.microsoft.com/office/word/2006/wordml" xmlns:wps="http://schemas.microsoft.com/office/word/2010/wordprocessingShape" mc:Ignorable="w14 w15 w16se w16cid w16 w16cex w16sdtdh w16sdtfl w16du wp14">
+<w:ftr xmlns:wpc="http://schemas.microsoft.com/office/word/2010/wordprocessingCanvas" xmlns:cx="http://schemas.microsoft.com/office/drawing/2014/chartex" xmlns:cx1="http://schemas.microsoft.com/office/drawing/2015/9/8/chartex" xmlns:cx2="http://schemas.microsoft.com/office/drawing/2015/10/21/chartex" xmlns:cx3="http://schemas.microsoft.com/office/drawing/2016/5/9/chartex" xmlns:cx4="http://schemas.microsoft.com/office/drawing/2016/5/10/chartex" xmlns:cx5="http://schemas.microsoft.com/office/drawing/2016/5/11/chartex" xmlns:cx6="http://schemas.microsoft.com/office/drawing/2016/5/12/chartex" xmlns:cx7="http://schemas.microsoft.com/office/drawing/2016/5/13/chartex" xmlns:cx8="http://schemas.microsoft.com/office/drawing/2016/5/14/chartex" xmlns:mc="http://schemas.openxmlformats.org/markup-compatibility/2006" xmlns:aink="http://schemas.microsoft.com/office/drawing/2016/ink" xmlns:am3d="http://schemas.microsoft.com/office/drawing/2017/model3d" xmlns:o="urn:schemas-microsoft-com:office:office" xmlns:oel="http://schemas.microsoft.com/office/2019/extlst" xmlns:r="http://schemas.openxmlformats.org/officeDocument/2006/relationships" xmlns:m="http://schemas.openxmlformats.org/officeDocument/2006/math" xmlns:v="urn:schemas-microsoft-com:vml" xmlns:wp14="http://schemas.microsoft.com/office/word/2010/wordprocessingDrawing" xmlns:wp="http://schemas.openxmlformats.org/drawingml/2006/wordprocessingDrawing" xmlns:w10="urn:schemas-microsoft-com:office:word" xmlns:w="http://schemas.openxmlformats.org/wordprocessingml/2006/main" xmlns:w14="http://schemas.microsoft.com/office/word/2010/wordml" xmlns:w15="http://schemas.microsoft.com/office/word/2012/wordml" xmlns:w16cei="http://schemas.microsoft.com/office/word/2026/wordml/cei" xmlns:w16cex="http://schemas.microsoft.com/office/word/2018/wordml/cex" xmlns:w16cid="http://schemas.microsoft.com/office/word/2016/wordml/cid" xmlns:w16="http://schemas.microsoft.com/office/word/2018/wordml" xmlns:w16du="http://schemas.microsoft.com/office/word/2023/wordml/word16du" xmlns:w16sdtdh="http://schemas.microsoft.com/office/word/2020/wordml/sdtdatahash" xmlns:w16sdtfl="http://schemas.microsoft.com/office/word/2024/wordml/sdtformatlock" xmlns:w16se="http://schemas.microsoft.com/office/word/2015/wordml/symex" xmlns:wpg="http://schemas.microsoft.com/office/word/2010/wordprocessingGroup" xmlns:wpi="http://schemas.microsoft.com/office/word/2010/wordprocessingInk" xmlns:wne="http://schemas.microsoft.com/office/word/2006/wordml" xmlns:wps="http://schemas.microsoft.com/office/word/2010/wordprocessingShape" mc:Ignorable="w14 w15 w16se w16cid w16 w16cex w16sdtdh w16sdtfl w16du wp14">
   <w:p>
     <w:pPr>
       <w:pStyle w:val="Footer"/>
@@ -1694,7 +2010,7 @@
 </file>
 
 <file path=word/footnotes.xml><?xml version="1.0" encoding="utf-8"?>
-<w:footnotes xmlns:wpc="http://schemas.microsoft.com/office/word/2010/wordprocessingCanvas" xmlns:cx="http://schemas.microsoft.com/office/drawing/2014/chartex" xmlns:cx1="http://schemas.microsoft.com/office/drawing/2015/9/8/chartex" xmlns:cx2="http://schemas.microsoft.com/office/drawing/2015/10/21/chartex" xmlns:cx3="http://schemas.microsoft.com/office/drawing/2016/5/9/chartex" xmlns:cx4="http://schemas.microsoft.com/office/drawing/2016/5/10/chartex" xmlns:cx5="http://schemas.microsoft.com/office/drawing/2016/5/11/chartex" xmlns:cx6="http://schemas.microsoft.com/office/drawing/2016/5/12/chartex" xmlns:cx7="http://schemas.microsoft.com/office/drawing/2016/5/13/chartex" xmlns:cx8="http://schemas.microsoft.com/office/drawing/2016/5/14/chartex" xmlns:mc="http://schemas.openxmlformats.org/markup-compatibility/2006" xmlns:aink="http://schemas.microsoft.com/office/drawing/2016/ink" xmlns:am3d="http://schemas.microsoft.com/office/drawing/2017/model3d" xmlns:o="urn:schemas-microsoft-com:office:office" xmlns:oel="http://schemas.microsoft.com/office/2019/extlst" xmlns:r="http://schemas.openxmlformats.org/officeDocument/2006/relationships" xmlns:m="http://schemas.openxmlformats.org/officeDocument/2006/math" xmlns:v="urn:schemas-microsoft-com:vml" xmlns:wp14="http://schemas.microsoft.com/office/word/2010/wordprocessingDrawing" xmlns:wp="http://schemas.openxmlformats.org/drawingml/2006/wordprocessingDrawing" xmlns:w10="urn:schemas-microsoft-com:office:word" xmlns:w="http://schemas.openxmlformats.org/wordprocessingml/2006/main" xmlns:w14="http://schemas.microsoft.com/office/word/2010/wordml" xmlns:w15="http://schemas.microsoft.com/office/word/2012/wordml" xmlns:w16cex="http://schemas.microsoft.com/office/word/2018/wordml/cex" xmlns:w16cid="http://schemas.microsoft.com/office/word/2016/wordml/cid" xmlns:w16="http://schemas.microsoft.com/office/word/2018/wordml" xmlns:w16du="http://schemas.microsoft.com/office/word/2023/wordml/word16du" xmlns:w16sdtdh="http://schemas.microsoft.com/office/word/2020/wordml/sdtdatahash" xmlns:w16sdtfl="http://schemas.microsoft.com/office/word/2024/wordml/sdtformatlock" xmlns:w16se="http://schemas.microsoft.com/office/word/2015/wordml/symex" xmlns:wpg="http://schemas.microsoft.com/office/word/2010/wordprocessingGroup" xmlns:wpi="http://schemas.microsoft.com/office/word/2010/wordprocessingInk" xmlns:wne="http://schemas.microsoft.com/office/word/2006/wordml" xmlns:wps="http://schemas.microsoft.com/office/word/2010/wordprocessingShape" mc:Ignorable="w14 w15 w16se w16cid w16 w16cex w16sdtdh w16sdtfl w16du wp14">
+<w:footnotes xmlns:wpc="http://schemas.microsoft.com/office/word/2010/wordprocessingCanvas" xmlns:cx="http://schemas.microsoft.com/office/drawing/2014/chartex" xmlns:cx1="http://schemas.microsoft.com/office/drawing/2015/9/8/chartex" xmlns:cx2="http://schemas.microsoft.com/office/drawing/2015/10/21/chartex" xmlns:cx3="http://schemas.microsoft.com/office/drawing/2016/5/9/chartex" xmlns:cx4="http://schemas.microsoft.com/office/drawing/2016/5/10/chartex" xmlns:cx5="http://schemas.microsoft.com/office/drawing/2016/5/11/chartex" xmlns:cx6="http://schemas.microsoft.com/office/drawing/2016/5/12/chartex" xmlns:cx7="http://schemas.microsoft.com/office/drawing/2016/5/13/chartex" xmlns:cx8="http://schemas.microsoft.com/office/drawing/2016/5/14/chartex" xmlns:mc="http://schemas.openxmlformats.org/markup-compatibility/2006" xmlns:aink="http://schemas.microsoft.com/office/drawing/2016/ink" xmlns:am3d="http://schemas.microsoft.com/office/drawing/2017/model3d" xmlns:o="urn:schemas-microsoft-com:office:office" xmlns:oel="http://schemas.microsoft.com/office/2019/extlst" xmlns:r="http://schemas.openxmlformats.org/officeDocument/2006/relationships" xmlns:m="http://schemas.openxmlformats.org/officeDocument/2006/math" xmlns:v="urn:schemas-microsoft-com:vml" xmlns:wp14="http://schemas.microsoft.com/office/word/2010/wordprocessingDrawing" xmlns:wp="http://schemas.openxmlformats.org/drawingml/2006/wordprocessingDrawing" xmlns:w10="urn:schemas-microsoft-com:office:word" xmlns:w="http://schemas.openxmlformats.org/wordprocessingml/2006/main" xmlns:w14="http://schemas.microsoft.com/office/word/2010/wordml" xmlns:w15="http://schemas.microsoft.com/office/word/2012/wordml" xmlns:w16cei="http://schemas.microsoft.com/office/word/2026/wordml/cei" xmlns:w16cex="http://schemas.microsoft.com/office/word/2018/wordml/cex" xmlns:w16cid="http://schemas.microsoft.com/office/word/2016/wordml/cid" xmlns:w16="http://schemas.microsoft.com/office/word/2018/wordml" xmlns:w16du="http://schemas.microsoft.com/office/word/2023/wordml/word16du" xmlns:w16sdtdh="http://schemas.microsoft.com/office/word/2020/wordml/sdtdatahash" xmlns:w16sdtfl="http://schemas.microsoft.com/office/word/2024/wordml/sdtformatlock" xmlns:w16se="http://schemas.microsoft.com/office/word/2015/wordml/symex" xmlns:wpg="http://schemas.microsoft.com/office/word/2010/wordprocessingGroup" xmlns:wpi="http://schemas.microsoft.com/office/word/2010/wordprocessingInk" xmlns:wne="http://schemas.microsoft.com/office/word/2006/wordml" xmlns:wps="http://schemas.microsoft.com/office/word/2010/wordprocessingShape" mc:Ignorable="w14 w15 w16se w16cid w16 w16cex w16sdtdh w16sdtfl w16du wp14">
   <w:footnote w:type="separator" w:id="-1">
     <w:p>
       <w:r>
@@ -1713,35 +2029,32 @@
 </file>
 
 <file path=word/header1.xml><?xml version="1.0" encoding="utf-8"?>
-<w:hdr xmlns:wpc="http://schemas.microsoft.com/office/word/2010/wordprocessingCanvas" xmlns:cx="http://schemas.microsoft.com/office/drawing/2014/chartex" xmlns:cx1="http://schemas.microsoft.com/office/drawing/2015/9/8/chartex" xmlns:cx2="http://schemas.microsoft.com/office/drawing/2015/10/21/chartex" xmlns:cx3="http://schemas.microsoft.com/office/drawing/2016/5/9/chartex" xmlns:cx4="http://schemas.microsoft.com/office/drawing/2016/5/10/chartex" xmlns:cx5="http://schemas.microsoft.com/office/drawing/2016/5/11/chartex" xmlns:cx6="http://schemas.microsoft.com/office/drawing/2016/5/12/chartex" xmlns:cx7="http://schemas.microsoft.com/office/drawing/2016/5/13/chartex" xmlns:cx8="http://schemas.microsoft.com/office/drawing/2016/5/14/chartex" xmlns:mc="http://schemas.openxmlformats.org/markup-compatibility/2006" xmlns:aink="http://schemas.microsoft.com/office/drawing/2016/ink" xmlns:am3d="http://schemas.microsoft.com/office/drawing/2017/model3d" xmlns:o="urn:schemas-microsoft-com:office:office" xmlns:oel="http://schemas.microsoft.com/office/2019/extlst" xmlns:r="http://schemas.openxmlformats.org/officeDocument/2006/relationships" xmlns:m="http://schemas.openxmlformats.org/officeDocument/2006/math" xmlns:v="urn:schemas-microsoft-com:vml" xmlns:wp14="http://schemas.microsoft.com/office/word/2010/wordprocessingDrawing" xmlns:wp="http://schemas.openxmlformats.org/drawingml/2006/wordprocessingDrawing" xmlns:w10="urn:schemas-microsoft-com:office:word" xmlns:w="http://schemas.openxmlformats.org/wordprocessingml/2006/main" xmlns:w14="http://schemas.microsoft.com/office/word/2010/wordml" xmlns:w15="http://schemas.microsoft.com/office/word/2012/wordml" xmlns:w16cex="http://schemas.microsoft.com/office/word/2018/wordml/cex" xmlns:w16cid="http://schemas.microsoft.com/office/word/2016/wordml/cid" xmlns:w16="http://schemas.microsoft.com/office/word/2018/wordml" xmlns:w16du="http://schemas.microsoft.com/office/word/2023/wordml/word16du" xmlns:w16sdtdh="http://schemas.microsoft.com/office/word/2020/wordml/sdtdatahash" xmlns:w16sdtfl="http://schemas.microsoft.com/office/word/2024/wordml/sdtformatlock" xmlns:w16se="http://schemas.microsoft.com/office/word/2015/wordml/symex" xmlns:wpg="http://schemas.microsoft.com/office/word/2010/wordprocessingGroup" xmlns:wpi="http://schemas.microsoft.com/office/word/2010/wordprocessingInk" xmlns:wne="http://schemas.microsoft.com/office/word/2006/wordml" xmlns:wps="http://schemas.microsoft.com/office/word/2010/wordprocessingShape" mc:Ignorable="w14 w15 w16se w16cid w16 w16cex w16sdtdh w16sdtfl w16du wp14">
+<w:hdr xmlns:wpc="http://schemas.microsoft.com/office/word/2010/wordprocessingCanvas" xmlns:cx="http://schemas.microsoft.com/office/drawing/2014/chartex" xmlns:cx1="http://schemas.microsoft.com/office/drawing/2015/9/8/chartex" xmlns:cx2="http://schemas.microsoft.com/office/drawing/2015/10/21/chartex" xmlns:cx3="http://schemas.microsoft.com/office/drawing/2016/5/9/chartex" xmlns:cx4="http://schemas.microsoft.com/office/drawing/2016/5/10/chartex" xmlns:cx5="http://schemas.microsoft.com/office/drawing/2016/5/11/chartex" xmlns:cx6="http://schemas.microsoft.com/office/drawing/2016/5/12/chartex" xmlns:cx7="http://schemas.microsoft.com/office/drawing/2016/5/13/chartex" xmlns:cx8="http://schemas.microsoft.com/office/drawing/2016/5/14/chartex" xmlns:mc="http://schemas.openxmlformats.org/markup-compatibility/2006" xmlns:aink="http://schemas.microsoft.com/office/drawing/2016/ink" xmlns:am3d="http://schemas.microsoft.com/office/drawing/2017/model3d" xmlns:o="urn:schemas-microsoft-com:office:office" xmlns:oel="http://schemas.microsoft.com/office/2019/extlst" xmlns:r="http://schemas.openxmlformats.org/officeDocument/2006/relationships" xmlns:m="http://schemas.openxmlformats.org/officeDocument/2006/math" xmlns:v="urn:schemas-microsoft-com:vml" xmlns:wp14="http://schemas.microsoft.com/office/word/2010/wordprocessingDrawing" xmlns:wp="http://schemas.openxmlformats.org/drawingml/2006/wordprocessingDrawing" xmlns:w10="urn:schemas-microsoft-com:office:word" xmlns:w="http://schemas.openxmlformats.org/wordprocessingml/2006/main" xmlns:w14="http://schemas.microsoft.com/office/word/2010/wordml" xmlns:w15="http://schemas.microsoft.com/office/word/2012/wordml" xmlns:w16cei="http://schemas.microsoft.com/office/word/2026/wordml/cei" xmlns:w16cex="http://schemas.microsoft.com/office/word/2018/wordml/cex" xmlns:w16cid="http://schemas.microsoft.com/office/word/2016/wordml/cid" xmlns:w16="http://schemas.microsoft.com/office/word/2018/wordml" xmlns:w16du="http://schemas.microsoft.com/office/word/2023/wordml/word16du" xmlns:w16sdtdh="http://schemas.microsoft.com/office/word/2020/wordml/sdtdatahash" xmlns:w16sdtfl="http://schemas.microsoft.com/office/word/2024/wordml/sdtformatlock" xmlns:w16se="http://schemas.microsoft.com/office/word/2015/wordml/symex" xmlns:wpg="http://schemas.microsoft.com/office/word/2010/wordprocessingGroup" xmlns:wpi="http://schemas.microsoft.com/office/word/2010/wordprocessingInk" xmlns:wne="http://schemas.microsoft.com/office/word/2006/wordml" xmlns:wps="http://schemas.microsoft.com/office/word/2010/wordprocessingShape" mc:Ignorable="w14 w15 w16se w16cid w16 w16cex w16sdtdh w16sdtfl w16du wp14">
   <w:p>
     <w:pPr>
       <w:pStyle w:val="Header"/>
-      <w:spacing w:after="240"/>
       <w:rPr>
         <w:rFonts w:cs="Noto Sans Medium"/>
-        <w:sz w:val="24"/>
       </w:rPr>
     </w:pPr>
     <w:r>
       <w:rPr>
         <w:rFonts w:cs="Noto Sans Medium"/>
         <w:noProof/>
-        <w:sz w:val="24"/>
       </w:rPr>
       <w:drawing>
-        <wp:anchor distT="0" distB="0" distL="114300" distR="114300" simplePos="0" relativeHeight="251659264" behindDoc="0" locked="0" layoutInCell="1" allowOverlap="1" wp14:anchorId="176161DA" wp14:editId="0DF3A916">
+        <wp:anchor distT="0" distB="0" distL="114300" distR="114300" simplePos="0" relativeHeight="251658752" behindDoc="0" locked="0" layoutInCell="1" allowOverlap="1" wp14:anchorId="69EE6722" wp14:editId="3BF4453F">
           <wp:simplePos x="0" y="0"/>
           <wp:positionH relativeFrom="margin">
-            <wp:align>right</wp:align>
+            <wp:posOffset>5008880</wp:posOffset>
           </wp:positionH>
           <wp:positionV relativeFrom="paragraph">
-            <wp:posOffset>391795</wp:posOffset>
+            <wp:posOffset>309245</wp:posOffset>
           </wp:positionV>
           <wp:extent cx="1301750" cy="520700"/>
           <wp:effectExtent l="0" t="0" r="0" b="0"/>
           <wp:wrapNone/>
-          <wp:docPr id="1831711696" name="Picture 1831711696" descr="A white letter on a black background&#10;&#10;Description automatically generated"/>
+          <wp:docPr id="366440482" name="Picture 366440482" descr="A white letter on a black background&#10;&#10;Description automatically generated"/>
           <wp:cNvGraphicFramePr>
             <a:graphicFrameLocks xmlns:a="http://schemas.openxmlformats.org/drawingml/2006/main" noChangeAspect="1"/>
           </wp:cNvGraphicFramePr>
@@ -1789,10 +2102,8 @@
   <w:p>
     <w:pPr>
       <w:pStyle w:val="Header"/>
-      <w:spacing w:after="240"/>
       <w:rPr>
         <w:rFonts w:cs="Noto Sans Medium"/>
-        <w:sz w:val="24"/>
       </w:rPr>
     </w:pPr>
   </w:p>
@@ -1870,7 +2181,22 @@
     <w:pPr>
       <w:pStyle w:val="Header"/>
       <w:spacing w:after="0"/>
-      <w:ind w:left="369"/>
+      <w:ind w:left="567"/>
+      <w:rPr>
+        <w:rFonts w:cs="Noto Sans Medium"/>
+        <w:sz w:val="12"/>
+        <w:szCs w:val="12"/>
+      </w:rPr>
+    </w:pPr>
+  </w:p>
+  <w:p>
+    <w:pPr>
+      <w:pStyle w:val="Header"/>
+      <w:tabs>
+        <w:tab w:val="left" w:pos="993"/>
+      </w:tabs>
+      <w:spacing w:after="0"/>
+      <w:ind w:left="993"/>
       <w:rPr>
         <w:rFonts w:cs="Noto Sans"/>
         <w:sz w:val="16"/>
@@ -1905,8 +2231,11 @@
   <w:p>
     <w:pPr>
       <w:pStyle w:val="Header"/>
+      <w:tabs>
+        <w:tab w:val="left" w:pos="993"/>
+      </w:tabs>
       <w:spacing w:after="0"/>
-      <w:ind w:left="369"/>
+      <w:ind w:left="993"/>
       <w:rPr>
         <w:rFonts w:cs="Noto Sans"/>
         <w:sz w:val="16"/>
@@ -1919,201 +2248,248 @@
         <w:sz w:val="16"/>
         <w:szCs w:val="16"/>
       </w:rPr>
-      <w:t>{d.</w:t>
+      <w:t>{d.address_line_2}</w:t>
     </w:r>
-    <w:r>
+  </w:p>
+  <w:p>
+    <w:pPr>
+      <w:pStyle w:val="Header"/>
+      <w:tabs>
+        <w:tab w:val="left" w:pos="993"/>
+      </w:tabs>
+      <w:spacing w:after="0"/>
+      <w:ind w:left="993"/>
       <w:rPr>
         <w:rFonts w:cs="Noto Sans"/>
         <w:sz w:val="16"/>
         <w:szCs w:val="16"/>
       </w:rPr>
-      <w:t>address_line_2</w:t>
-    </w:r>
+    </w:pPr>
     <w:r>
       <w:rPr>
         <w:rFonts w:cs="Noto Sans"/>
         <w:sz w:val="16"/>
         <w:szCs w:val="16"/>
       </w:rPr>
-      <w:t>}</w:t>
+      <w:t>{d.address_line_3}</w:t>
+    </w:r>
+  </w:p>
+  <w:p>
+    <w:pPr>
+      <w:pStyle w:val="Header"/>
+      <w:tabs>
+        <w:tab w:val="left" w:pos="993"/>
+      </w:tabs>
+      <w:spacing w:after="0"/>
+      <w:ind w:left="993"/>
+      <w:rPr>
+        <w:rFonts w:cs="Noto Sans"/>
+        <w:sz w:val="16"/>
+        <w:szCs w:val="16"/>
+      </w:rPr>
+    </w:pPr>
+    <w:r>
+      <w:rPr>
+        <w:rFonts w:cs="Noto Sans"/>
+        <w:sz w:val="16"/>
+        <w:szCs w:val="16"/>
+      </w:rPr>
+      <w:t>{d.address_line_4}</w:t>
+    </w:r>
+  </w:p>
+  <w:p>
+    <w:pPr>
+      <w:pStyle w:val="Header"/>
+      <w:tabs>
+        <w:tab w:val="left" w:pos="993"/>
+      </w:tabs>
+      <w:spacing w:after="0"/>
+      <w:ind w:left="993"/>
+      <w:rPr>
+        <w:rFonts w:cs="Noto Sans"/>
+        <w:sz w:val="16"/>
+        <w:szCs w:val="16"/>
+      </w:rPr>
+    </w:pPr>
+    <w:r>
+      <w:rPr>
+        <w:rFonts w:cs="Noto Sans"/>
+        <w:sz w:val="16"/>
+        <w:szCs w:val="16"/>
+      </w:rPr>
+      <w:t>{d.address_line_5}</w:t>
+    </w:r>
+  </w:p>
+  <w:p>
+    <w:pPr>
+      <w:pStyle w:val="Header"/>
+      <w:tabs>
+        <w:tab w:val="left" w:pos="993"/>
+      </w:tabs>
+      <w:spacing w:after="0"/>
+      <w:ind w:left="993"/>
+      <w:rPr>
+        <w:rFonts w:cs="Noto Sans"/>
+        <w:sz w:val="16"/>
+        <w:szCs w:val="16"/>
+      </w:rPr>
+    </w:pPr>
+    <w:r>
+      <w:rPr>
+        <w:rFonts w:cs="Noto Sans"/>
+        <w:sz w:val="16"/>
+        <w:szCs w:val="16"/>
+      </w:rPr>
+      <w:t>{d.address_line_6}</w:t>
+    </w:r>
+  </w:p>
+  <w:p>
+    <w:pPr>
+      <w:pStyle w:val="Header"/>
+      <w:tabs>
+        <w:tab w:val="left" w:pos="993"/>
+      </w:tabs>
+      <w:spacing w:after="0"/>
+      <w:ind w:left="993"/>
+      <w:rPr>
+        <w:rFonts w:cs="Noto Sans"/>
+        <w:sz w:val="16"/>
+        <w:szCs w:val="16"/>
+      </w:rPr>
+    </w:pPr>
+    <w:r>
+      <w:rPr>
+        <w:rFonts w:cs="Noto Sans"/>
+        <w:sz w:val="16"/>
+        <w:szCs w:val="16"/>
+      </w:rPr>
+      <w:t>{d.address_line_7}</w:t>
     </w:r>
   </w:p>
   <w:p>
     <w:pPr>
       <w:pStyle w:val="Header"/>
       <w:spacing w:after="0"/>
-      <w:ind w:left="369"/>
+      <w:jc w:val="right"/>
       <w:rPr>
         <w:rFonts w:cs="Noto Sans"/>
         <w:sz w:val="16"/>
         <w:szCs w:val="16"/>
       </w:rPr>
     </w:pPr>
-    <w:r>
-      <w:rPr>
-        <w:rFonts w:cs="Noto Sans"/>
-        <w:sz w:val="16"/>
-        <w:szCs w:val="16"/>
-      </w:rPr>
-      <w:t>{d.</w:t>
-    </w:r>
-    <w:r>
-      <w:rPr>
-        <w:rFonts w:cs="Noto Sans"/>
-        <w:sz w:val="16"/>
-        <w:szCs w:val="16"/>
-      </w:rPr>
-      <w:t>address_line_3</w:t>
-    </w:r>
-    <w:r>
-      <w:rPr>
-        <w:rFonts w:cs="Noto Sans"/>
-        <w:sz w:val="16"/>
-        <w:szCs w:val="16"/>
-      </w:rPr>
-      <w:t>}</w:t>
-    </w:r>
   </w:p>
   <w:p>
     <w:pPr>
       <w:pStyle w:val="Header"/>
       <w:spacing w:after="0"/>
-      <w:ind w:left="369"/>
-      <w:rPr>
-        <w:rFonts w:cs="Noto Sans"/>
-        <w:sz w:val="16"/>
-        <w:szCs w:val="16"/>
+      <w:jc w:val="right"/>
+      <w:rPr>
+        <w:rFonts w:cs="Noto Sans Medium"/>
+        <w:b/>
+        <w:bCs/>
+        <w:sz w:val="18"/>
+        <w:szCs w:val="18"/>
       </w:rPr>
     </w:pPr>
-    <w:r>
-      <w:rPr>
-        <w:rFonts w:cs="Noto Sans"/>
-        <w:sz w:val="16"/>
-        <w:szCs w:val="16"/>
-      </w:rPr>
-      <w:t>{d.</w:t>
-    </w:r>
-    <w:r>
-      <w:rPr>
-        <w:rFonts w:cs="Noto Sans"/>
-        <w:sz w:val="16"/>
-        <w:szCs w:val="16"/>
-      </w:rPr>
-      <w:t>address_line_4</w:t>
-    </w:r>
-    <w:r>
-      <w:rPr>
-        <w:rFonts w:cs="Noto Sans"/>
-        <w:sz w:val="16"/>
-        <w:szCs w:val="16"/>
-      </w:rPr>
-      <w:t>}</w:t>
-    </w:r>
   </w:p>
   <w:p>
     <w:pPr>
       <w:pStyle w:val="Header"/>
       <w:spacing w:after="0"/>
-      <w:ind w:left="369"/>
-      <w:rPr>
-        <w:rFonts w:cs="Noto Sans"/>
-        <w:sz w:val="16"/>
-        <w:szCs w:val="16"/>
+      <w:jc w:val="right"/>
+      <w:rPr>
+        <w:rFonts w:cs="Noto Sans Medium"/>
+        <w:b/>
+        <w:bCs/>
+        <w:sz w:val="18"/>
+        <w:szCs w:val="18"/>
       </w:rPr>
     </w:pPr>
-    <w:r>
-      <w:rPr>
-        <w:rFonts w:cs="Noto Sans"/>
-        <w:sz w:val="16"/>
-        <w:szCs w:val="16"/>
-      </w:rPr>
-      <w:t>{d.</w:t>
-    </w:r>
-    <w:r>
-      <w:rPr>
-        <w:rFonts w:cs="Noto Sans"/>
-        <w:sz w:val="16"/>
-        <w:szCs w:val="16"/>
-      </w:rPr>
-      <w:t>address_line_5</w:t>
-    </w:r>
-    <w:r>
-      <w:rPr>
-        <w:rFonts w:cs="Noto Sans"/>
-        <w:sz w:val="16"/>
-        <w:szCs w:val="16"/>
-      </w:rPr>
-      <w:t>}</w:t>
-    </w:r>
   </w:p>
   <w:p>
     <w:pPr>
       <w:pStyle w:val="Header"/>
       <w:spacing w:after="0"/>
-      <w:ind w:left="369"/>
-      <w:rPr>
-        <w:rFonts w:cs="Noto Sans"/>
-        <w:sz w:val="16"/>
-        <w:szCs w:val="16"/>
+      <w:jc w:val="right"/>
+      <w:rPr>
+        <w:rFonts w:cs="Noto Sans Medium"/>
+        <w:b/>
+        <w:bCs/>
+        <w:sz w:val="18"/>
+        <w:szCs w:val="18"/>
       </w:rPr>
     </w:pPr>
-    <w:r>
-      <w:rPr>
-        <w:rFonts w:cs="Noto Sans"/>
-        <w:sz w:val="16"/>
-        <w:szCs w:val="16"/>
-      </w:rPr>
-      <w:t>{d.</w:t>
-    </w:r>
-    <w:r>
-      <w:rPr>
-        <w:rFonts w:cs="Noto Sans"/>
-        <w:sz w:val="16"/>
-        <w:szCs w:val="16"/>
-      </w:rPr>
-      <w:t>address_line_6</w:t>
-    </w:r>
-    <w:r>
-      <w:rPr>
-        <w:rFonts w:cs="Noto Sans"/>
-        <w:sz w:val="16"/>
-        <w:szCs w:val="16"/>
-      </w:rPr>
-      <w:t>}</w:t>
-    </w:r>
   </w:p>
   <w:p>
     <w:pPr>
       <w:pStyle w:val="Header"/>
       <w:spacing w:after="0"/>
-      <w:ind w:left="369"/>
+      <w:jc w:val="right"/>
+      <w:rPr>
+        <w:rFonts w:cs="Noto Sans Medium"/>
+        <w:b/>
+        <w:bCs/>
+        <w:sz w:val="18"/>
+        <w:szCs w:val="18"/>
+      </w:rPr>
+    </w:pPr>
+  </w:p>
+  <w:p>
+    <w:pPr>
+      <w:pStyle w:val="Header"/>
+      <w:spacing w:after="0"/>
+      <w:jc w:val="right"/>
+      <w:rPr>
+        <w:rFonts w:cs="Noto Sans Medium"/>
+        <w:b/>
+        <w:bCs/>
+        <w:sz w:val="18"/>
+        <w:szCs w:val="18"/>
+      </w:rPr>
+    </w:pPr>
+  </w:p>
+  <w:p>
+    <w:pPr>
+      <w:pStyle w:val="Header"/>
+      <w:spacing w:after="0"/>
+      <w:jc w:val="right"/>
       <w:rPr>
         <w:rFonts w:cs="Noto Sans"/>
-        <w:sz w:val="16"/>
-        <w:szCs w:val="16"/>
+        <w:sz w:val="32"/>
+        <w:szCs w:val="32"/>
       </w:rPr>
     </w:pPr>
     <w:r>
       <w:rPr>
         <w:rFonts w:cs="Noto Sans"/>
-        <w:sz w:val="16"/>
-        <w:szCs w:val="16"/>
+        <w:b/>
+        <w:bCs/>
+        <w:sz w:val="32"/>
+        <w:szCs w:val="32"/>
+      </w:rPr>
+      <w:t xml:space="preserve">Date: </w:t>
+    </w:r>
+    <w:r>
+      <w:rPr>
+        <w:rFonts w:cs="Noto Sans"/>
+        <w:sz w:val="32"/>
+        <w:szCs w:val="32"/>
       </w:rPr>
       <w:t>{d.</w:t>
     </w:r>
     <w:r>
       <w:rPr>
         <w:rFonts w:cs="Noto Sans"/>
-        <w:sz w:val="16"/>
-        <w:szCs w:val="16"/>
-      </w:rPr>
-      <w:t>address_line_7</w:t>
+        <w:sz w:val="32"/>
+        <w:szCs w:val="32"/>
+      </w:rPr>
+      <w:t>date</w:t>
     </w:r>
     <w:r>
       <w:rPr>
         <w:rFonts w:cs="Noto Sans"/>
-        <w:sz w:val="16"/>
-        <w:szCs w:val="16"/>
+        <w:sz w:val="32"/>
+        <w:szCs w:val="32"/>
       </w:rPr>
       <w:t>}</w:t>
     </w:r>
@@ -2124,63 +2500,9 @@
       <w:spacing w:after="0"/>
       <w:jc w:val="right"/>
       <w:rPr>
-        <w:rFonts w:cs="Noto Sans Medium"/>
-        <w:b/>
-        <w:bCs/>
-        <w:sz w:val="18"/>
-        <w:szCs w:val="18"/>
-      </w:rPr>
-    </w:pPr>
-  </w:p>
-  <w:p>
-    <w:pPr>
-      <w:pStyle w:val="Header"/>
-      <w:spacing w:after="0"/>
-      <w:jc w:val="right"/>
-      <w:rPr>
-        <w:rFonts w:cs="Noto Sans Medium"/>
-        <w:b/>
-        <w:bCs/>
-        <w:sz w:val="18"/>
-        <w:szCs w:val="18"/>
-      </w:rPr>
-    </w:pPr>
-  </w:p>
-  <w:p>
-    <w:pPr>
-      <w:pStyle w:val="Header"/>
-      <w:spacing w:after="0"/>
-      <w:jc w:val="right"/>
-      <w:rPr>
-        <w:rFonts w:cs="Noto Sans Medium"/>
-        <w:b/>
-        <w:bCs/>
-        <w:sz w:val="18"/>
-        <w:szCs w:val="18"/>
-      </w:rPr>
-    </w:pPr>
-  </w:p>
-  <w:p>
-    <w:pPr>
-      <w:pStyle w:val="Header"/>
-      <w:spacing w:after="0"/>
-      <w:jc w:val="right"/>
-      <w:rPr>
-        <w:rFonts w:cs="Noto Sans Medium"/>
-        <w:b/>
-        <w:bCs/>
-        <w:sz w:val="20"/>
-        <w:szCs w:val="20"/>
-      </w:rPr>
-    </w:pPr>
-  </w:p>
-  <w:p>
-    <w:pPr>
-      <w:pStyle w:val="Header"/>
-      <w:spacing w:after="0"/>
-      <w:jc w:val="right"/>
-      <w:rPr>
         <w:rFonts w:cs="Noto Sans"/>
+        <w:sz w:val="32"/>
+        <w:szCs w:val="32"/>
       </w:rPr>
     </w:pPr>
     <w:r>
@@ -2188,60 +2510,32 @@
         <w:rFonts w:cs="Noto Sans"/>
         <w:b/>
         <w:bCs/>
-      </w:rPr>
-      <w:t xml:space="preserve">Date: </w:t>
+        <w:sz w:val="32"/>
+        <w:szCs w:val="32"/>
+      </w:rPr>
+      <w:t xml:space="preserve">NHS number: </w:t>
     </w:r>
     <w:r>
       <w:rPr>
         <w:rFonts w:cs="Noto Sans"/>
+        <w:sz w:val="32"/>
+        <w:szCs w:val="32"/>
       </w:rPr>
       <w:t>{d.</w:t>
     </w:r>
     <w:r>
       <w:rPr>
         <w:rFonts w:cs="Noto Sans"/>
-      </w:rPr>
-      <w:t>date</w:t>
-    </w:r>
-    <w:r>
-      <w:rPr>
-        <w:rFonts w:cs="Noto Sans"/>
-      </w:rPr>
-      <w:t>}</w:t>
-    </w:r>
-  </w:p>
-  <w:p>
-    <w:pPr>
-      <w:pStyle w:val="Header"/>
-      <w:spacing w:after="0"/>
-      <w:jc w:val="right"/>
-      <w:rPr>
-        <w:rFonts w:cs="Noto Sans"/>
-      </w:rPr>
-    </w:pPr>
-    <w:r>
-      <w:rPr>
-        <w:rFonts w:cs="Noto Sans"/>
-        <w:b/>
-        <w:bCs/>
-      </w:rPr>
-      <w:t xml:space="preserve">NHS number: </w:t>
-    </w:r>
-    <w:r>
-      <w:rPr>
-        <w:rFonts w:cs="Noto Sans"/>
-      </w:rPr>
-      <w:t>{d.</w:t>
-    </w:r>
-    <w:r>
-      <w:rPr>
-        <w:rFonts w:cs="Noto Sans"/>
+        <w:sz w:val="32"/>
+        <w:szCs w:val="32"/>
       </w:rPr>
       <w:t>nhsNumber</w:t>
     </w:r>
     <w:r>
       <w:rPr>
         <w:rFonts w:cs="Noto Sans"/>
+        <w:sz w:val="32"/>
+        <w:szCs w:val="32"/>
       </w:rPr>
       <w:t>}</w:t>
     </w:r>
@@ -2250,7 +2544,7 @@
 </file>
 
 <file path=word/numbering.xml><?xml version="1.0" encoding="utf-8"?>
-<w:numbering xmlns:wpc="http://schemas.microsoft.com/office/word/2010/wordprocessingCanvas" xmlns:cx="http://schemas.microsoft.com/office/drawing/2014/chartex" xmlns:cx1="http://schemas.microsoft.com/office/drawing/2015/9/8/chartex" xmlns:cx2="http://schemas.microsoft.com/office/drawing/2015/10/21/chartex" xmlns:cx3="http://schemas.microsoft.com/office/drawing/2016/5/9/chartex" xmlns:cx4="http://schemas.microsoft.com/office/drawing/2016/5/10/chartex" xmlns:cx5="http://schemas.microsoft.com/office/drawing/2016/5/11/chartex" xmlns:cx6="http://schemas.microsoft.com/office/drawing/2016/5/12/chartex" xmlns:cx7="http://schemas.microsoft.com/office/drawing/2016/5/13/chartex" xmlns:cx8="http://schemas.microsoft.com/office/drawing/2016/5/14/chartex" xmlns:mc="http://schemas.openxmlformats.org/markup-compatibility/2006" xmlns:aink="http://schemas.microsoft.com/office/drawing/2016/ink" xmlns:am3d="http://schemas.microsoft.com/office/drawing/2017/model3d" xmlns:o="urn:schemas-microsoft-com:office:office" xmlns:oel="http://schemas.microsoft.com/office/2019/extlst" xmlns:r="http://schemas.openxmlformats.org/officeDocument/2006/relationships" xmlns:m="http://schemas.openxmlformats.org/officeDocument/2006/math" xmlns:v="urn:schemas-microsoft-com:vml" xmlns:wp14="http://schemas.microsoft.com/office/word/2010/wordprocessingDrawing" xmlns:wp="http://schemas.openxmlformats.org/drawingml/2006/wordprocessingDrawing" xmlns:w10="urn:schemas-microsoft-com:office:word" xmlns:w="http://schemas.openxmlformats.org/wordprocessingml/2006/main" xmlns:w14="http://schemas.microsoft.com/office/word/2010/wordml" xmlns:w15="http://schemas.microsoft.com/office/word/2012/wordml" xmlns:w16cex="http://schemas.microsoft.com/office/word/2018/wordml/cex" xmlns:w16cid="http://schemas.microsoft.com/office/word/2016/wordml/cid" xmlns:w16="http://schemas.microsoft.com/office/word/2018/wordml" xmlns:w16du="http://schemas.microsoft.com/office/word/2023/wordml/word16du" xmlns:w16sdtdh="http://schemas.microsoft.com/office/word/2020/wordml/sdtdatahash" xmlns:w16sdtfl="http://schemas.microsoft.com/office/word/2024/wordml/sdtformatlock" xmlns:w16se="http://schemas.microsoft.com/office/word/2015/wordml/symex" xmlns:wpg="http://schemas.microsoft.com/office/word/2010/wordprocessingGroup" xmlns:wpi="http://schemas.microsoft.com/office/word/2010/wordprocessingInk" xmlns:wne="http://schemas.microsoft.com/office/word/2006/wordml" xmlns:wps="http://schemas.microsoft.com/office/word/2010/wordprocessingShape" mc:Ignorable="w14 w15 w16se w16cid w16 w16cex w16sdtdh w16sdtfl w16du wp14">
+<w:numbering xmlns:wpc="http://schemas.microsoft.com/office/word/2010/wordprocessingCanvas" xmlns:cx="http://schemas.microsoft.com/office/drawing/2014/chartex" xmlns:cx1="http://schemas.microsoft.com/office/drawing/2015/9/8/chartex" xmlns:cx2="http://schemas.microsoft.com/office/drawing/2015/10/21/chartex" xmlns:cx3="http://schemas.microsoft.com/office/drawing/2016/5/9/chartex" xmlns:cx4="http://schemas.microsoft.com/office/drawing/2016/5/10/chartex" xmlns:cx5="http://schemas.microsoft.com/office/drawing/2016/5/11/chartex" xmlns:cx6="http://schemas.microsoft.com/office/drawing/2016/5/12/chartex" xmlns:cx7="http://schemas.microsoft.com/office/drawing/2016/5/13/chartex" xmlns:cx8="http://schemas.microsoft.com/office/drawing/2016/5/14/chartex" xmlns:mc="http://schemas.openxmlformats.org/markup-compatibility/2006" xmlns:aink="http://schemas.microsoft.com/office/drawing/2016/ink" xmlns:am3d="http://schemas.microsoft.com/office/drawing/2017/model3d" xmlns:o="urn:schemas-microsoft-com:office:office" xmlns:oel="http://schemas.microsoft.com/office/2019/extlst" xmlns:r="http://schemas.openxmlformats.org/officeDocument/2006/relationships" xmlns:m="http://schemas.openxmlformats.org/officeDocument/2006/math" xmlns:v="urn:schemas-microsoft-com:vml" xmlns:wp14="http://schemas.microsoft.com/office/word/2010/wordprocessingDrawing" xmlns:wp="http://schemas.openxmlformats.org/drawingml/2006/wordprocessingDrawing" xmlns:w10="urn:schemas-microsoft-com:office:word" xmlns:w="http://schemas.openxmlformats.org/wordprocessingml/2006/main" xmlns:w14="http://schemas.microsoft.com/office/word/2010/wordml" xmlns:w15="http://schemas.microsoft.com/office/word/2012/wordml" xmlns:w16cei="http://schemas.microsoft.com/office/word/2026/wordml/cei" xmlns:w16cex="http://schemas.microsoft.com/office/word/2018/wordml/cex" xmlns:w16cid="http://schemas.microsoft.com/office/word/2016/wordml/cid" xmlns:w16="http://schemas.microsoft.com/office/word/2018/wordml" xmlns:w16du="http://schemas.microsoft.com/office/word/2023/wordml/word16du" xmlns:w16sdtdh="http://schemas.microsoft.com/office/word/2020/wordml/sdtdatahash" xmlns:w16sdtfl="http://schemas.microsoft.com/office/word/2024/wordml/sdtformatlock" xmlns:w16se="http://schemas.microsoft.com/office/word/2015/wordml/symex" xmlns:wpg="http://schemas.microsoft.com/office/word/2010/wordprocessingGroup" xmlns:wpi="http://schemas.microsoft.com/office/word/2010/wordprocessingInk" xmlns:wne="http://schemas.microsoft.com/office/word/2006/wordml" xmlns:wps="http://schemas.microsoft.com/office/word/2010/wordprocessingShape" mc:Ignorable="w14 w15 w16se w16cid w16 w16cex w16sdtdh w16sdtfl w16du wp14">
   <w:abstractNum w:abstractNumId="0" w15:restartNumberingAfterBreak="0">
     <w:nsid w:val="2AF11543"/>
     <w:multiLevelType w:val="hybridMultilevel"/>
@@ -3350,6 +3644,120 @@
       <w:rPr>
         <w:rFonts w:ascii="Symbol" w:hAnsi="Symbol" w:hint="default"/>
         <w:sz w:val="20"/>
+      </w:rPr>
+    </w:lvl>
+  </w:abstractNum>
+  <w:abstractNum w:abstractNumId="9" w15:restartNumberingAfterBreak="0">
+    <w:nsid w:val="78E402A6"/>
+    <w:multiLevelType w:val="hybridMultilevel"/>
+    <w:tmpl w:val="B802DDAC"/>
+    <w:lvl w:ilvl="0" w:tplc="00CE41A6">
+      <w:start w:val="1"/>
+      <w:numFmt w:val="bullet"/>
+      <w:pStyle w:val="ListParagraph"/>
+      <w:lvlText w:val=""/>
+      <w:lvlJc w:val="left"/>
+      <w:pPr>
+        <w:ind w:left="1077" w:hanging="360"/>
+      </w:pPr>
+      <w:rPr>
+        <w:rFonts w:ascii="Symbol" w:hAnsi="Symbol" w:hint="default"/>
+      </w:rPr>
+    </w:lvl>
+    <w:lvl w:ilvl="1" w:tplc="08090003" w:tentative="1">
+      <w:start w:val="1"/>
+      <w:numFmt w:val="bullet"/>
+      <w:lvlText w:val="o"/>
+      <w:lvlJc w:val="left"/>
+      <w:pPr>
+        <w:ind w:left="1797" w:hanging="360"/>
+      </w:pPr>
+      <w:rPr>
+        <w:rFonts w:ascii="Courier New" w:hAnsi="Courier New" w:cs="Courier New" w:hint="default"/>
+      </w:rPr>
+    </w:lvl>
+    <w:lvl w:ilvl="2" w:tplc="08090005" w:tentative="1">
+      <w:start w:val="1"/>
+      <w:numFmt w:val="bullet"/>
+      <w:lvlText w:val=""/>
+      <w:lvlJc w:val="left"/>
+      <w:pPr>
+        <w:ind w:left="2517" w:hanging="360"/>
+      </w:pPr>
+      <w:rPr>
+        <w:rFonts w:ascii="Wingdings" w:hAnsi="Wingdings" w:hint="default"/>
+      </w:rPr>
+    </w:lvl>
+    <w:lvl w:ilvl="3" w:tplc="08090001" w:tentative="1">
+      <w:start w:val="1"/>
+      <w:numFmt w:val="bullet"/>
+      <w:lvlText w:val=""/>
+      <w:lvlJc w:val="left"/>
+      <w:pPr>
+        <w:ind w:left="3237" w:hanging="360"/>
+      </w:pPr>
+      <w:rPr>
+        <w:rFonts w:ascii="Symbol" w:hAnsi="Symbol" w:hint="default"/>
+      </w:rPr>
+    </w:lvl>
+    <w:lvl w:ilvl="4" w:tplc="08090003" w:tentative="1">
+      <w:start w:val="1"/>
+      <w:numFmt w:val="bullet"/>
+      <w:lvlText w:val="o"/>
+      <w:lvlJc w:val="left"/>
+      <w:pPr>
+        <w:ind w:left="3957" w:hanging="360"/>
+      </w:pPr>
+      <w:rPr>
+        <w:rFonts w:ascii="Courier New" w:hAnsi="Courier New" w:cs="Courier New" w:hint="default"/>
+      </w:rPr>
+    </w:lvl>
+    <w:lvl w:ilvl="5" w:tplc="08090005" w:tentative="1">
+      <w:start w:val="1"/>
+      <w:numFmt w:val="bullet"/>
+      <w:lvlText w:val=""/>
+      <w:lvlJc w:val="left"/>
+      <w:pPr>
+        <w:ind w:left="4677" w:hanging="360"/>
+      </w:pPr>
+      <w:rPr>
+        <w:rFonts w:ascii="Wingdings" w:hAnsi="Wingdings" w:hint="default"/>
+      </w:rPr>
+    </w:lvl>
+    <w:lvl w:ilvl="6" w:tplc="08090001" w:tentative="1">
+      <w:start w:val="1"/>
+      <w:numFmt w:val="bullet"/>
+      <w:lvlText w:val=""/>
+      <w:lvlJc w:val="left"/>
+      <w:pPr>
+        <w:ind w:left="5397" w:hanging="360"/>
+      </w:pPr>
+      <w:rPr>
+        <w:rFonts w:ascii="Symbol" w:hAnsi="Symbol" w:hint="default"/>
+      </w:rPr>
+    </w:lvl>
+    <w:lvl w:ilvl="7" w:tplc="08090003" w:tentative="1">
+      <w:start w:val="1"/>
+      <w:numFmt w:val="bullet"/>
+      <w:lvlText w:val="o"/>
+      <w:lvlJc w:val="left"/>
+      <w:pPr>
+        <w:ind w:left="6117" w:hanging="360"/>
+      </w:pPr>
+      <w:rPr>
+        <w:rFonts w:ascii="Courier New" w:hAnsi="Courier New" w:cs="Courier New" w:hint="default"/>
+      </w:rPr>
+    </w:lvl>
+    <w:lvl w:ilvl="8" w:tplc="08090005" w:tentative="1">
+      <w:start w:val="1"/>
+      <w:numFmt w:val="bullet"/>
+      <w:lvlText w:val=""/>
+      <w:lvlJc w:val="left"/>
+      <w:pPr>
+        <w:ind w:left="6837" w:hanging="360"/>
+      </w:pPr>
+      <w:rPr>
+        <w:rFonts w:ascii="Wingdings" w:hAnsi="Wingdings" w:hint="default"/>
       </w:rPr>
     </w:lvl>
   </w:abstractNum>
@@ -3380,11 +3788,14 @@
   <w:num w:numId="9" w16cid:durableId="1800612842">
     <w:abstractNumId w:val="5"/>
   </w:num>
+  <w:num w:numId="10" w16cid:durableId="1940600047">
+    <w:abstractNumId w:val="9"/>
+  </w:num>
 </w:numbering>
 </file>
 
 <file path=word/people.xml><?xml version="1.0" encoding="utf-8"?>
-<w15:people xmlns:wpc="http://schemas.microsoft.com/office/word/2010/wordprocessingCanvas" xmlns:cx="http://schemas.microsoft.com/office/drawing/2014/chartex" xmlns:cx1="http://schemas.microsoft.com/office/drawing/2015/9/8/chartex" xmlns:cx2="http://schemas.microsoft.com/office/drawing/2015/10/21/chartex" xmlns:cx3="http://schemas.microsoft.com/office/drawing/2016/5/9/chartex" xmlns:cx4="http://schemas.microsoft.com/office/drawing/2016/5/10/chartex" xmlns:cx5="http://schemas.microsoft.com/office/drawing/2016/5/11/chartex" xmlns:cx6="http://schemas.microsoft.com/office/drawing/2016/5/12/chartex" xmlns:cx7="http://schemas.microsoft.com/office/drawing/2016/5/13/chartex" xmlns:cx8="http://schemas.microsoft.com/office/drawing/2016/5/14/chartex" xmlns:mc="http://schemas.openxmlformats.org/markup-compatibility/2006" xmlns:aink="http://schemas.microsoft.com/office/drawing/2016/ink" xmlns:am3d="http://schemas.microsoft.com/office/drawing/2017/model3d" xmlns:o="urn:schemas-microsoft-com:office:office" xmlns:oel="http://schemas.microsoft.com/office/2019/extlst" xmlns:r="http://schemas.openxmlformats.org/officeDocument/2006/relationships" xmlns:m="http://schemas.openxmlformats.org/officeDocument/2006/math" xmlns:v="urn:schemas-microsoft-com:vml" xmlns:wp14="http://schemas.microsoft.com/office/word/2010/wordprocessingDrawing" xmlns:wp="http://schemas.openxmlformats.org/drawingml/2006/wordprocessingDrawing" xmlns:w10="urn:schemas-microsoft-com:office:word" xmlns:w="http://schemas.openxmlformats.org/wordprocessingml/2006/main" xmlns:w14="http://schemas.microsoft.com/office/word/2010/wordml" xmlns:w15="http://schemas.microsoft.com/office/word/2012/wordml" xmlns:w16cex="http://schemas.microsoft.com/office/word/2018/wordml/cex" xmlns:w16cid="http://schemas.microsoft.com/office/word/2016/wordml/cid" xmlns:w16="http://schemas.microsoft.com/office/word/2018/wordml" xmlns:w16du="http://schemas.microsoft.com/office/word/2023/wordml/word16du" xmlns:w16sdtdh="http://schemas.microsoft.com/office/word/2020/wordml/sdtdatahash" xmlns:w16sdtfl="http://schemas.microsoft.com/office/word/2024/wordml/sdtformatlock" xmlns:w16se="http://schemas.microsoft.com/office/word/2015/wordml/symex" xmlns:wpg="http://schemas.microsoft.com/office/word/2010/wordprocessingGroup" xmlns:wpi="http://schemas.microsoft.com/office/word/2010/wordprocessingInk" xmlns:wne="http://schemas.microsoft.com/office/word/2006/wordml" xmlns:wps="http://schemas.microsoft.com/office/word/2010/wordprocessingShape" mc:Ignorable="w14 w15 w16se w16cid w16 w16cex w16sdtdh w16sdtfl w16du wp14">
+<w15:people xmlns:wpc="http://schemas.microsoft.com/office/word/2010/wordprocessingCanvas" xmlns:cx="http://schemas.microsoft.com/office/drawing/2014/chartex" xmlns:cx1="http://schemas.microsoft.com/office/drawing/2015/9/8/chartex" xmlns:cx2="http://schemas.microsoft.com/office/drawing/2015/10/21/chartex" xmlns:cx3="http://schemas.microsoft.com/office/drawing/2016/5/9/chartex" xmlns:cx4="http://schemas.microsoft.com/office/drawing/2016/5/10/chartex" xmlns:cx5="http://schemas.microsoft.com/office/drawing/2016/5/11/chartex" xmlns:cx6="http://schemas.microsoft.com/office/drawing/2016/5/12/chartex" xmlns:cx7="http://schemas.microsoft.com/office/drawing/2016/5/13/chartex" xmlns:cx8="http://schemas.microsoft.com/office/drawing/2016/5/14/chartex" xmlns:mc="http://schemas.openxmlformats.org/markup-compatibility/2006" xmlns:aink="http://schemas.microsoft.com/office/drawing/2016/ink" xmlns:am3d="http://schemas.microsoft.com/office/drawing/2017/model3d" xmlns:o="urn:schemas-microsoft-com:office:office" xmlns:oel="http://schemas.microsoft.com/office/2019/extlst" xmlns:r="http://schemas.openxmlformats.org/officeDocument/2006/relationships" xmlns:m="http://schemas.openxmlformats.org/officeDocument/2006/math" xmlns:v="urn:schemas-microsoft-com:vml" xmlns:wp14="http://schemas.microsoft.com/office/word/2010/wordprocessingDrawing" xmlns:wp="http://schemas.openxmlformats.org/drawingml/2006/wordprocessingDrawing" xmlns:w10="urn:schemas-microsoft-com:office:word" xmlns:w="http://schemas.openxmlformats.org/wordprocessingml/2006/main" xmlns:w14="http://schemas.microsoft.com/office/word/2010/wordml" xmlns:w15="http://schemas.microsoft.com/office/word/2012/wordml" xmlns:w16cei="http://schemas.microsoft.com/office/word/2026/wordml/cei" xmlns:w16cex="http://schemas.microsoft.com/office/word/2018/wordml/cex" xmlns:w16cid="http://schemas.microsoft.com/office/word/2016/wordml/cid" xmlns:w16="http://schemas.microsoft.com/office/word/2018/wordml" xmlns:w16du="http://schemas.microsoft.com/office/word/2023/wordml/word16du" xmlns:w16sdtdh="http://schemas.microsoft.com/office/word/2020/wordml/sdtdatahash" xmlns:w16sdtfl="http://schemas.microsoft.com/office/word/2024/wordml/sdtformatlock" xmlns:w16se="http://schemas.microsoft.com/office/word/2015/wordml/symex" xmlns:wpg="http://schemas.microsoft.com/office/word/2010/wordprocessingGroup" xmlns:wpi="http://schemas.microsoft.com/office/word/2010/wordprocessingInk" xmlns:wne="http://schemas.microsoft.com/office/word/2006/wordml" xmlns:wps="http://schemas.microsoft.com/office/word/2010/wordprocessingShape" mc:Ignorable="w14 w15 w16se w16cid w16 w16cex w16sdtdh w16sdtfl w16du wp14">
   <w15:person w15:author="GIFFORD, Emma (NHS ENGLAND - X26)">
     <w15:presenceInfo w15:providerId="AD" w15:userId="S::emma.gifford4@nhs.net::ccf95563-42b7-4a59-8eb5-0a2143777171"/>
   </w15:person>
@@ -3409,7 +3820,7 @@
   <w:latentStyles w:defLockedState="0" w:defUIPriority="99" w:defSemiHidden="0" w:defUnhideWhenUsed="0" w:defQFormat="0" w:count="376">
     <w:lsdException w:name="Normal" w:uiPriority="0" w:qFormat="1"/>
     <w:lsdException w:name="heading 1" w:uiPriority="0"/>
-    <w:lsdException w:name="heading 2" w:semiHidden="1" w:uiPriority="0" w:unhideWhenUsed="1" w:qFormat="1"/>
+    <w:lsdException w:name="heading 2" w:semiHidden="1" w:uiPriority="0" w:unhideWhenUsed="1"/>
     <w:lsdException w:name="heading 3" w:semiHidden="1" w:uiPriority="9" w:unhideWhenUsed="1" w:qFormat="1"/>
     <w:lsdException w:name="heading 4" w:semiHidden="1" w:uiPriority="9" w:unhideWhenUsed="1" w:qFormat="1"/>
     <w:lsdException w:name="heading 5" w:semiHidden="1" w:uiPriority="9" w:unhideWhenUsed="1" w:qFormat="1"/>
@@ -3787,13 +4198,12 @@
   <w:style w:type="paragraph" w:default="1" w:styleId="Normal">
     <w:name w:val="Normal"/>
     <w:qFormat/>
-    <w:rsid w:val="003C652B"/>
+    <w:rsid w:val="00384048"/>
     <w:pPr>
-      <w:spacing w:after="320"/>
+      <w:spacing w:after="240"/>
     </w:pPr>
     <w:rPr>
       <w:rFonts w:ascii="Noto Sans" w:hAnsi="Noto Sans"/>
-      <w:sz w:val="32"/>
     </w:rPr>
   </w:style>
   <w:style w:type="paragraph" w:styleId="Heading1">
@@ -3822,8 +4232,7 @@
     <w:next w:val="Normal"/>
     <w:link w:val="Heading2Char"/>
     <w:unhideWhenUsed/>
-    <w:qFormat/>
-    <w:rsid w:val="003C652B"/>
+    <w:rsid w:val="00384048"/>
     <w:pPr>
       <w:keepNext/>
       <w:keepLines/>
@@ -4032,11 +4441,10 @@
     <w:aliases w:val="NHS letter heading Char"/>
     <w:basedOn w:val="DefaultParagraphFont"/>
     <w:link w:val="Heading2"/>
-    <w:rsid w:val="003C652B"/>
+    <w:rsid w:val="00384048"/>
     <w:rPr>
       <w:rFonts w:ascii="Noto Sans" w:eastAsiaTheme="majorEastAsia" w:hAnsi="Noto Sans" w:cstheme="majorBidi"/>
       <w:b/>
-      <w:sz w:val="32"/>
       <w:szCs w:val="32"/>
     </w:rPr>
   </w:style>
@@ -4237,10 +4645,12 @@
     <w:basedOn w:val="Normal"/>
     <w:uiPriority w:val="34"/>
     <w:qFormat/>
-    <w:rsid w:val="001C15AC"/>
+    <w:rsid w:val="00A31E65"/>
     <w:pPr>
-      <w:spacing w:after="120"/>
-      <w:ind w:left="720"/>
+      <w:numPr>
+        <w:numId w:val="10"/>
+      </w:numPr>
+      <w:ind w:left="714" w:hanging="357"/>
       <w:contextualSpacing/>
     </w:pPr>
   </w:style>
@@ -4311,7 +4721,7 @@
     <w:link w:val="HeaderChar"/>
     <w:uiPriority w:val="99"/>
     <w:unhideWhenUsed/>
-    <w:rsid w:val="00343935"/>
+    <w:rsid w:val="00384048"/>
     <w:pPr>
       <w:tabs>
         <w:tab w:val="center" w:pos="4513"/>
@@ -4324,7 +4734,10 @@
     <w:basedOn w:val="DefaultParagraphFont"/>
     <w:link w:val="Header"/>
     <w:uiPriority w:val="99"/>
-    <w:rsid w:val="00343935"/>
+    <w:rsid w:val="00384048"/>
+    <w:rPr>
+      <w:rFonts w:ascii="Noto Sans" w:hAnsi="Noto Sans"/>
+    </w:rPr>
   </w:style>
   <w:style w:type="paragraph" w:styleId="Footer">
     <w:name w:val="footer"/>
@@ -4368,7 +4781,7 @@
     <w:basedOn w:val="DefaultParagraphFont"/>
     <w:uiPriority w:val="99"/>
     <w:unhideWhenUsed/>
-    <w:rsid w:val="003C652B"/>
+    <w:rsid w:val="00706AD3"/>
     <w:rPr>
       <w:rFonts w:ascii="Noto Sans" w:hAnsi="Noto Sans"/>
       <w:b/>
@@ -4489,6 +4902,20 @@
     <w:basedOn w:val="DefaultParagraphFont"/>
     <w:uiPriority w:val="1"/>
     <w:rsid w:val="00DA118C"/>
+  </w:style>
+  <w:style w:type="character" w:styleId="BookTitle">
+    <w:name w:val="Book Title"/>
+    <w:basedOn w:val="DefaultParagraphFont"/>
+    <w:uiPriority w:val="33"/>
+    <w:qFormat/>
+    <w:rsid w:val="003D2B3A"/>
+    <w:rPr>
+      <w:b/>
+      <w:bCs/>
+      <w:i/>
+      <w:iCs/>
+      <w:spacing w:val="5"/>
+    </w:rPr>
   </w:style>
 </w:styles>
 </file>

</xml_diff>

<commit_message>
update /pricing-and-commercial/letters, /delivery-times#letters and b… (#272)
* update /pricing-and-commercial/letters, /delivery-times#letters and blank letter templates on /upload-a-letter

* fix first class styling
</commit_message>
<xml_diff>
--- a/docs/assets/worddocs/letter-template-nhs-notify-large-print.docx
+++ b/docs/assets/worddocs/letter-template-nhs-notify-large-print.docx
@@ -1,12 +1,13 @@
 
 <file path=word/document.xml><?xml version="1.0" encoding="utf-8"?>
-<w:document xmlns:wpc="http://schemas.microsoft.com/office/word/2010/wordprocessingCanvas" xmlns:cx="http://schemas.microsoft.com/office/drawing/2014/chartex" xmlns:cx1="http://schemas.microsoft.com/office/drawing/2015/9/8/chartex" xmlns:cx2="http://schemas.microsoft.com/office/drawing/2015/10/21/chartex" xmlns:cx3="http://schemas.microsoft.com/office/drawing/2016/5/9/chartex" xmlns:cx4="http://schemas.microsoft.com/office/drawing/2016/5/10/chartex" xmlns:cx5="http://schemas.microsoft.com/office/drawing/2016/5/11/chartex" xmlns:cx6="http://schemas.microsoft.com/office/drawing/2016/5/12/chartex" xmlns:cx7="http://schemas.microsoft.com/office/drawing/2016/5/13/chartex" xmlns:cx8="http://schemas.microsoft.com/office/drawing/2016/5/14/chartex" xmlns:mc="http://schemas.openxmlformats.org/markup-compatibility/2006" xmlns:aink="http://schemas.microsoft.com/office/drawing/2016/ink" xmlns:am3d="http://schemas.microsoft.com/office/drawing/2017/model3d" xmlns:o="urn:schemas-microsoft-com:office:office" xmlns:oel="http://schemas.microsoft.com/office/2019/extlst" xmlns:r="http://schemas.openxmlformats.org/officeDocument/2006/relationships" xmlns:m="http://schemas.openxmlformats.org/officeDocument/2006/math" xmlns:v="urn:schemas-microsoft-com:vml" xmlns:wp14="http://schemas.microsoft.com/office/word/2010/wordprocessingDrawing" xmlns:wp="http://schemas.openxmlformats.org/drawingml/2006/wordprocessingDrawing" xmlns:w10="urn:schemas-microsoft-com:office:word" xmlns:w="http://schemas.openxmlformats.org/wordprocessingml/2006/main" xmlns:w14="http://schemas.microsoft.com/office/word/2010/wordml" xmlns:w15="http://schemas.microsoft.com/office/word/2012/wordml" xmlns:w16cex="http://schemas.microsoft.com/office/word/2018/wordml/cex" xmlns:w16cid="http://schemas.microsoft.com/office/word/2016/wordml/cid" xmlns:w16="http://schemas.microsoft.com/office/word/2018/wordml" xmlns:w16du="http://schemas.microsoft.com/office/word/2023/wordml/word16du" xmlns:w16sdtdh="http://schemas.microsoft.com/office/word/2020/wordml/sdtdatahash" xmlns:w16sdtfl="http://schemas.microsoft.com/office/word/2024/wordml/sdtformatlock" xmlns:w16se="http://schemas.microsoft.com/office/word/2015/wordml/symex" xmlns:wpg="http://schemas.microsoft.com/office/word/2010/wordprocessingGroup" xmlns:wpi="http://schemas.microsoft.com/office/word/2010/wordprocessingInk" xmlns:wne="http://schemas.microsoft.com/office/word/2006/wordml" xmlns:wps="http://schemas.microsoft.com/office/word/2010/wordprocessingShape" mc:Ignorable="w14 w15 w16se w16cid w16 w16cex w16sdtdh w16sdtfl w16du wp14">
+<w:document xmlns:wpc="http://schemas.microsoft.com/office/word/2010/wordprocessingCanvas" xmlns:cx="http://schemas.microsoft.com/office/drawing/2014/chartex" xmlns:cx1="http://schemas.microsoft.com/office/drawing/2015/9/8/chartex" xmlns:cx2="http://schemas.microsoft.com/office/drawing/2015/10/21/chartex" xmlns:cx3="http://schemas.microsoft.com/office/drawing/2016/5/9/chartex" xmlns:cx4="http://schemas.microsoft.com/office/drawing/2016/5/10/chartex" xmlns:cx5="http://schemas.microsoft.com/office/drawing/2016/5/11/chartex" xmlns:cx6="http://schemas.microsoft.com/office/drawing/2016/5/12/chartex" xmlns:cx7="http://schemas.microsoft.com/office/drawing/2016/5/13/chartex" xmlns:cx8="http://schemas.microsoft.com/office/drawing/2016/5/14/chartex" xmlns:mc="http://schemas.openxmlformats.org/markup-compatibility/2006" xmlns:aink="http://schemas.microsoft.com/office/drawing/2016/ink" xmlns:am3d="http://schemas.microsoft.com/office/drawing/2017/model3d" xmlns:o="urn:schemas-microsoft-com:office:office" xmlns:oel="http://schemas.microsoft.com/office/2019/extlst" xmlns:r="http://schemas.openxmlformats.org/officeDocument/2006/relationships" xmlns:m="http://schemas.openxmlformats.org/officeDocument/2006/math" xmlns:v="urn:schemas-microsoft-com:vml" xmlns:wp14="http://schemas.microsoft.com/office/word/2010/wordprocessingDrawing" xmlns:wp="http://schemas.openxmlformats.org/drawingml/2006/wordprocessingDrawing" xmlns:w10="urn:schemas-microsoft-com:office:word" xmlns:w="http://schemas.openxmlformats.org/wordprocessingml/2006/main" xmlns:w14="http://schemas.microsoft.com/office/word/2010/wordml" xmlns:w15="http://schemas.microsoft.com/office/word/2012/wordml" xmlns:w16cei="http://schemas.microsoft.com/office/word/2026/wordml/cei" xmlns:w16cex="http://schemas.microsoft.com/office/word/2018/wordml/cex" xmlns:w16cid="http://schemas.microsoft.com/office/word/2016/wordml/cid" xmlns:w16="http://schemas.microsoft.com/office/word/2018/wordml" xmlns:w16du="http://schemas.microsoft.com/office/word/2023/wordml/word16du" xmlns:w16sdtdh="http://schemas.microsoft.com/office/word/2020/wordml/sdtdatahash" xmlns:w16sdtfl="http://schemas.microsoft.com/office/word/2024/wordml/sdtformatlock" xmlns:w16se="http://schemas.microsoft.com/office/word/2015/wordml/symex" xmlns:wpg="http://schemas.microsoft.com/office/word/2010/wordprocessingGroup" xmlns:wpi="http://schemas.microsoft.com/office/word/2010/wordprocessingInk" xmlns:wne="http://schemas.microsoft.com/office/word/2006/wordml" xmlns:wps="http://schemas.microsoft.com/office/word/2010/wordprocessingShape" mc:Ignorable="w14 w15 w16se w16cid w16 w16cex w16sdtdh w16sdtfl w16du wp14">
   <w:body>
     <w:p>
       <w:pPr>
         <w:pStyle w:val="Heading2"/>
         <w:rPr>
           <w:rFonts w:cs="Noto Sans Medium"/>
+          <w:sz w:val="32"/>
         </w:rPr>
       </w:pPr>
       <w:commentRangeStart w:id="0"/>
@@ -16,6 +17,7 @@
       <w:r>
         <w:rPr>
           <w:rFonts w:cs="Noto Sans Medium"/>
+          <w:sz w:val="32"/>
         </w:rPr>
         <w:t>T</w:t>
       </w:r>
@@ -52,18 +54,21 @@
       <w:r>
         <w:rPr>
           <w:rFonts w:cs="Noto Sans Medium"/>
+          <w:sz w:val="32"/>
         </w:rPr>
         <w:t xml:space="preserve">his is </w:t>
       </w:r>
       <w:r>
         <w:rPr>
           <w:rFonts w:cs="Noto Sans Medium"/>
+          <w:sz w:val="32"/>
         </w:rPr>
         <w:t>the main</w:t>
       </w:r>
       <w:r>
         <w:rPr>
           <w:rFonts w:cs="Noto Sans Medium"/>
+          <w:sz w:val="32"/>
         </w:rPr>
         <w:t xml:space="preserve"> heading</w:t>
       </w:r>
@@ -82,6 +87,8 @@
       <w:pPr>
         <w:rPr>
           <w:rFonts w:cs="Noto Sans Medium"/>
+          <w:sz w:val="32"/>
+          <w:szCs w:val="32"/>
           <w:lang w:eastAsia="en-GB"/>
         </w:rPr>
       </w:pPr>
@@ -89,6 +96,8 @@
       <w:r>
         <w:rPr>
           <w:rFonts w:cs="Noto Sans Medium"/>
+          <w:sz w:val="32"/>
+          <w:szCs w:val="32"/>
           <w:lang w:eastAsia="en-GB"/>
         </w:rPr>
         <w:t>Dear</w:t>
@@ -99,7 +108,7 @@
           <w:rStyle w:val="CommentReference"/>
           <w:rFonts w:cs="Noto Sans Medium"/>
           <w:sz w:val="32"/>
-          <w:szCs w:val="24"/>
+          <w:szCs w:val="32"/>
           <w:lang w:eastAsia="en-GB"/>
         </w:rPr>
         <w:commentReference w:id="4"/>
@@ -107,76 +116,207 @@
       <w:r>
         <w:rPr>
           <w:rFonts w:cs="Noto Sans Medium"/>
+          <w:sz w:val="32"/>
+          <w:szCs w:val="32"/>
           <w:lang w:eastAsia="en-GB"/>
         </w:rPr>
         <w:t xml:space="preserve"> </w:t>
       </w:r>
       <w:r>
         <w:rPr>
-          <w:rFonts w:cs="Noto Sans Medium"/>
+          <w:rFonts w:cs="Noto Sans"/>
+          <w:sz w:val="32"/>
+          <w:szCs w:val="32"/>
+        </w:rPr>
+        <w:t>{d.</w:t>
+      </w:r>
+      <w:commentRangeStart w:id="5"/>
+      <w:r>
+        <w:rPr>
+          <w:rFonts w:cs="Noto Sans Medium"/>
+          <w:sz w:val="32"/>
+          <w:szCs w:val="32"/>
           <w:lang w:eastAsia="en-GB"/>
         </w:rPr>
-        <w:t>{d.</w:t>
-      </w:r>
-      <w:commentRangeStart w:id="5"/>
-      <w:r>
-        <w:rPr>
-          <w:rFonts w:cs="Noto Sans Medium"/>
+        <w:t>fullName</w:t>
+      </w:r>
+      <w:commentRangeEnd w:id="5"/>
+      <w:r>
+        <w:rPr>
+          <w:rStyle w:val="CommentReference"/>
+          <w:rFonts w:cs="Noto Sans Medium"/>
+          <w:sz w:val="32"/>
+          <w:szCs w:val="32"/>
           <w:lang w:eastAsia="en-GB"/>
         </w:rPr>
-        <w:t>fullName</w:t>
-      </w:r>
-      <w:commentRangeEnd w:id="5"/>
+        <w:commentReference w:id="5"/>
+      </w:r>
+      <w:r>
+        <w:rPr>
+          <w:rFonts w:cs="Noto Sans Medium"/>
+          <w:sz w:val="32"/>
+          <w:szCs w:val="32"/>
+          <w:lang w:eastAsia="en-GB"/>
+        </w:rPr>
+        <w:t>}</w:t>
+      </w:r>
+      <w:r>
+        <w:rPr>
+          <w:rFonts w:cs="Noto Sans Medium"/>
+          <w:sz w:val="32"/>
+          <w:szCs w:val="32"/>
+          <w:lang w:eastAsia="en-GB"/>
+        </w:rPr>
+        <w:t>,</w:t>
+      </w:r>
+    </w:p>
+    <w:p>
+      <w:pPr>
+        <w:rPr>
+          <w:rFonts w:cs="Noto Sans Medium"/>
+          <w:sz w:val="32"/>
+          <w:szCs w:val="32"/>
+          <w:lang w:eastAsia="en-GB"/>
+        </w:rPr>
+      </w:pPr>
+      <w:commentRangeStart w:id="6"/>
+      <w:r>
+        <w:rPr>
+          <w:rFonts w:cs="Noto Sans Medium"/>
+          <w:sz w:val="32"/>
+          <w:szCs w:val="32"/>
+          <w:lang w:eastAsia="en-GB"/>
+        </w:rPr>
+        <w:t xml:space="preserve">This is the body text. </w:t>
+      </w:r>
+      <w:commentRangeEnd w:id="6"/>
       <w:r>
         <w:rPr>
           <w:rStyle w:val="CommentReference"/>
           <w:rFonts w:cs="Noto Sans Medium"/>
           <w:sz w:val="32"/>
-          <w:szCs w:val="24"/>
+          <w:szCs w:val="32"/>
           <w:lang w:eastAsia="en-GB"/>
         </w:rPr>
-        <w:commentReference w:id="5"/>
-      </w:r>
-      <w:r>
-        <w:rPr>
-          <w:rFonts w:cs="Noto Sans Medium"/>
+        <w:commentReference w:id="6"/>
+      </w:r>
+    </w:p>
+    <w:p>
+      <w:pPr>
+        <w:pStyle w:val="Heading2"/>
+        <w:rPr>
+          <w:rFonts w:cs="Noto Sans Medium"/>
+          <w:sz w:val="32"/>
+        </w:rPr>
+      </w:pPr>
+      <w:r>
+        <w:rPr>
+          <w:rFonts w:cs="Noto Sans Medium"/>
+          <w:sz w:val="32"/>
+        </w:rPr>
+        <w:t>Bullet</w:t>
+      </w:r>
+      <w:r>
+        <w:rPr>
+          <w:rFonts w:cs="Noto Sans Medium"/>
+          <w:sz w:val="32"/>
+        </w:rPr>
+        <w:t xml:space="preserve"> point</w:t>
+      </w:r>
+      <w:r>
+        <w:rPr>
+          <w:rFonts w:cs="Noto Sans Medium"/>
+          <w:sz w:val="32"/>
+        </w:rPr>
+        <w:t>s</w:t>
+      </w:r>
+    </w:p>
+    <w:p>
+      <w:pPr>
+        <w:rPr>
+          <w:rFonts w:cs="Noto Sans Medium"/>
+          <w:sz w:val="32"/>
+          <w:szCs w:val="32"/>
           <w:lang w:eastAsia="en-GB"/>
         </w:rPr>
-        <w:t>}</w:t>
-      </w:r>
-      <w:r>
-        <w:rPr>
-          <w:rFonts w:cs="Noto Sans Medium"/>
+      </w:pPr>
+      <w:r>
+        <w:rPr>
+          <w:rFonts w:cs="Noto Sans Medium"/>
+          <w:sz w:val="32"/>
+          <w:szCs w:val="32"/>
           <w:lang w:eastAsia="en-GB"/>
         </w:rPr>
-        <w:t>,</w:t>
-      </w:r>
-    </w:p>
-    <w:p>
-      <w:pPr>
-        <w:rPr>
-          <w:rFonts w:cs="Noto Sans Medium"/>
+        <w:t xml:space="preserve">Use a lead-in line before bullet </w:t>
+      </w:r>
+      <w:r>
+        <w:rPr>
+          <w:rFonts w:cs="Noto Sans Medium"/>
+          <w:sz w:val="32"/>
+          <w:szCs w:val="32"/>
           <w:lang w:eastAsia="en-GB"/>
         </w:rPr>
-      </w:pPr>
-      <w:commentRangeStart w:id="6"/>
-      <w:r>
-        <w:rPr>
-          <w:rFonts w:cs="Noto Sans Medium"/>
+        <w:t>points</w:t>
+      </w:r>
+      <w:r>
+        <w:rPr>
+          <w:rFonts w:cs="Noto Sans Medium"/>
+          <w:sz w:val="32"/>
+          <w:szCs w:val="32"/>
           <w:lang w:eastAsia="en-GB"/>
         </w:rPr>
-        <w:t xml:space="preserve">This is the body text. </w:t>
-      </w:r>
-      <w:commentRangeEnd w:id="6"/>
+        <w:t>. For example</w:t>
+      </w:r>
+      <w:r>
+        <w:rPr>
+          <w:rFonts w:cs="Noto Sans Medium"/>
+          <w:sz w:val="32"/>
+          <w:szCs w:val="32"/>
+          <w:lang w:eastAsia="en-GB"/>
+        </w:rPr>
+        <w:t>:</w:t>
+      </w:r>
+    </w:p>
+    <w:p>
+      <w:pPr>
+        <w:pStyle w:val="ListParagraph"/>
+        <w:rPr>
+          <w:sz w:val="32"/>
+          <w:szCs w:val="32"/>
+        </w:rPr>
+      </w:pPr>
+      <w:commentRangeStart w:id="7"/>
+      <w:r>
+        <w:rPr>
+          <w:sz w:val="32"/>
+          <w:szCs w:val="32"/>
+        </w:rPr>
+        <w:t>item 1 in a bulleted list</w:t>
+      </w:r>
+      <w:commentRangeEnd w:id="7"/>
       <w:r>
         <w:rPr>
           <w:rStyle w:val="CommentReference"/>
-          <w:rFonts w:cs="Noto Sans Medium"/>
-          <w:sz w:val="32"/>
-          <w:szCs w:val="24"/>
-          <w:lang w:eastAsia="en-GB"/>
-        </w:rPr>
-        <w:commentReference w:id="6"/>
+          <w:sz w:val="32"/>
+          <w:szCs w:val="32"/>
+        </w:rPr>
+        <w:commentReference w:id="7"/>
+      </w:r>
+    </w:p>
+    <w:p>
+      <w:pPr>
+        <w:pStyle w:val="ListParagraph"/>
+        <w:rPr>
+          <w:sz w:val="32"/>
+          <w:szCs w:val="32"/>
+        </w:rPr>
+      </w:pPr>
+      <w:r>
+        <w:rPr>
+          <w:sz w:val="32"/>
+          <w:szCs w:val="32"/>
+        </w:rPr>
+        <w:t>item 2 in a bulleted list</w:t>
       </w:r>
     </w:p>
     <w:p>
@@ -184,415 +324,13 @@
         <w:pStyle w:val="Heading2"/>
         <w:rPr>
           <w:rFonts w:cs="Noto Sans Medium"/>
-        </w:rPr>
-      </w:pPr>
-      <w:r>
-        <w:rPr>
-          <w:rFonts w:cs="Noto Sans Medium"/>
-        </w:rPr>
-        <w:t>Bullet</w:t>
-      </w:r>
-      <w:r>
-        <w:rPr>
-          <w:rFonts w:cs="Noto Sans Medium"/>
-        </w:rPr>
-        <w:t xml:space="preserve"> point</w:t>
-      </w:r>
-      <w:r>
-        <w:rPr>
-          <w:rFonts w:cs="Noto Sans Medium"/>
-        </w:rPr>
-        <w:t>s</w:t>
-      </w:r>
-    </w:p>
-    <w:p>
-      <w:pPr>
-        <w:rPr>
-          <w:rFonts w:cs="Noto Sans Medium"/>
-          <w:lang w:eastAsia="en-GB"/>
-        </w:rPr>
-      </w:pPr>
-      <w:r>
-        <w:rPr>
-          <w:rFonts w:cs="Noto Sans Medium"/>
-          <w:lang w:eastAsia="en-GB"/>
-        </w:rPr>
-        <w:t xml:space="preserve">Use a lead-in line before bullet </w:t>
-      </w:r>
-      <w:r>
-        <w:rPr>
-          <w:rFonts w:cs="Noto Sans Medium"/>
-          <w:lang w:eastAsia="en-GB"/>
-        </w:rPr>
-        <w:t>points</w:t>
-      </w:r>
-      <w:r>
-        <w:rPr>
-          <w:rFonts w:cs="Noto Sans Medium"/>
-          <w:lang w:eastAsia="en-GB"/>
-        </w:rPr>
-        <w:t>. For example</w:t>
-      </w:r>
-      <w:r>
-        <w:rPr>
-          <w:rFonts w:cs="Noto Sans Medium"/>
-          <w:lang w:eastAsia="en-GB"/>
-        </w:rPr>
-        <w:t>:</w:t>
-      </w:r>
-    </w:p>
-    <w:p>
-      <w:pPr>
-        <w:pStyle w:val="ListParagraph"/>
-        <w:numPr>
-          <w:ilvl w:val="0"/>
-          <w:numId w:val="6"/>
-        </w:numPr>
-        <w:spacing w:line="288" w:lineRule="auto"/>
-        <w:rPr>
-          <w:rFonts w:eastAsia="Times New Roman" w:cs="Noto Sans Medium"/>
-          <w:color w:val="0D0D0D" w:themeColor="text1" w:themeTint="F2"/>
-          <w:kern w:val="0"/>
-          <w:szCs w:val="32"/>
-          <w:lang w:eastAsia="en-GB"/>
-          <w14:ligatures w14:val="none"/>
-        </w:rPr>
-      </w:pPr>
-      <w:commentRangeStart w:id="7"/>
-      <w:r>
-        <w:rPr>
-          <w:rFonts w:eastAsia="Times New Roman" w:cs="Noto Sans Medium"/>
-          <w:color w:val="0D0D0D" w:themeColor="text1" w:themeTint="F2"/>
-          <w:kern w:val="0"/>
-          <w:szCs w:val="32"/>
-          <w:lang w:eastAsia="en-GB"/>
-          <w14:ligatures w14:val="none"/>
-        </w:rPr>
-        <w:t>item 1 in a bulleted list</w:t>
-      </w:r>
-      <w:commentRangeEnd w:id="7"/>
-      <w:r>
-        <w:rPr>
-          <w:rStyle w:val="CommentReference"/>
-          <w:rFonts w:eastAsia="Times New Roman" w:cs="Noto Sans Medium"/>
-          <w:color w:val="0D0D0D" w:themeColor="text1" w:themeTint="F2"/>
-          <w:kern w:val="0"/>
-          <w:sz w:val="32"/>
-          <w:szCs w:val="32"/>
-          <w:lang w:eastAsia="en-GB"/>
-          <w14:ligatures w14:val="none"/>
-        </w:rPr>
-        <w:commentReference w:id="7"/>
-      </w:r>
-    </w:p>
-    <w:p>
-      <w:pPr>
-        <w:pStyle w:val="ListParagraph"/>
-        <w:numPr>
-          <w:ilvl w:val="0"/>
-          <w:numId w:val="6"/>
-        </w:numPr>
-        <w:spacing w:line="288" w:lineRule="auto"/>
-        <w:rPr>
-          <w:rFonts w:eastAsia="Times New Roman" w:cs="Noto Sans Medium"/>
-          <w:color w:val="0D0D0D" w:themeColor="text1" w:themeTint="F2"/>
-          <w:kern w:val="0"/>
-          <w:szCs w:val="32"/>
-          <w:lang w:eastAsia="en-GB"/>
-          <w14:ligatures w14:val="none"/>
-        </w:rPr>
-      </w:pPr>
-      <w:r>
-        <w:rPr>
-          <w:rFonts w:eastAsia="Times New Roman" w:cs="Noto Sans Medium"/>
-          <w:color w:val="0D0D0D" w:themeColor="text1" w:themeTint="F2"/>
-          <w:kern w:val="0"/>
-          <w:szCs w:val="32"/>
-          <w:lang w:eastAsia="en-GB"/>
-          <w14:ligatures w14:val="none"/>
-        </w:rPr>
-        <w:t>item 2 in a bulleted list</w:t>
-      </w:r>
-    </w:p>
-    <w:p>
-      <w:pPr>
-        <w:pStyle w:val="Heading2"/>
-        <w:rPr>
-          <w:rFonts w:eastAsia="Times New Roman" w:cs="Noto Sans Medium"/>
-          <w:lang w:eastAsia="en-GB"/>
-        </w:rPr>
-      </w:pPr>
-      <w:r>
-        <w:rPr>
-          <w:rFonts w:eastAsia="Times New Roman" w:cs="Noto Sans Medium"/>
-          <w:lang w:eastAsia="en-GB"/>
-        </w:rPr>
-        <w:t>Headings</w:t>
-      </w:r>
-    </w:p>
-    <w:p>
-      <w:pPr>
-        <w:rPr>
-          <w:rFonts w:cs="Noto Sans Medium"/>
-          <w:lang w:eastAsia="en-GB"/>
-        </w:rPr>
-      </w:pPr>
-      <w:r>
-        <w:rPr>
-          <w:rFonts w:cs="Noto Sans Medium"/>
-          <w:lang w:eastAsia="en-GB"/>
-        </w:rPr>
-        <w:t xml:space="preserve">Use headings to break up your message content </w:t>
-      </w:r>
-    </w:p>
-    <w:p>
-      <w:pPr>
-        <w:pStyle w:val="Heading2"/>
-        <w:rPr>
-          <w:rFonts w:cs="Noto Sans Medium"/>
-        </w:rPr>
-      </w:pPr>
-      <w:r>
-        <w:rPr>
-          <w:rFonts w:cs="Noto Sans Medium"/>
-        </w:rPr>
-        <w:t>Personalisation</w:t>
-      </w:r>
-    </w:p>
-    <w:p>
-      <w:pPr>
-        <w:rPr>
-          <w:rFonts w:cs="Noto Sans Medium"/>
-        </w:rPr>
-      </w:pPr>
-      <w:r>
-        <w:rPr>
-          <w:rFonts w:cs="Noto Sans Medium"/>
-        </w:rPr>
-        <w:t xml:space="preserve">To add a </w:t>
-      </w:r>
-      <w:commentRangeStart w:id="8"/>
-      <w:r>
-        <w:rPr>
-          <w:rFonts w:cs="Noto Sans Medium"/>
-        </w:rPr>
-        <w:t xml:space="preserve">personalisation </w:t>
-      </w:r>
-      <w:commentRangeEnd w:id="8"/>
-      <w:r>
-        <w:rPr>
-          <w:rStyle w:val="CommentReference"/>
-          <w:rFonts w:cs="Noto Sans Medium"/>
-          <w:sz w:val="32"/>
-          <w:szCs w:val="24"/>
-        </w:rPr>
-        <w:commentReference w:id="8"/>
-      </w:r>
-      <w:r>
-        <w:rPr>
-          <w:rFonts w:cs="Noto Sans Medium"/>
-        </w:rPr>
-        <w:t>field, include a placeholder with double brackets around it.</w:t>
-      </w:r>
-      <w:r>
-        <w:rPr>
-          <w:rFonts w:cs="Noto Sans Medium"/>
-        </w:rPr>
-        <w:t xml:space="preserve"> For example: </w:t>
-      </w:r>
-      <w:r>
-        <w:rPr>
-          <w:rFonts w:cs="Noto Sans Medium"/>
-        </w:rPr>
-        <w:t>Hello {d.fullName}, your NHS Number is {d.nhsNumber}. Your appointment is on {d.appointmentDate} at {d.gpSurgery}.</w:t>
-      </w:r>
-    </w:p>
-    <w:p>
-      <w:pPr>
-        <w:rPr>
-          <w:rFonts w:cs="Noto Sans Medium"/>
-        </w:rPr>
-      </w:pPr>
-      <w:r>
-        <w:rPr>
-          <w:rFonts w:cs="Noto Sans Medium"/>
-        </w:rPr>
-        <w:lastRenderedPageBreak/>
-        <w:t>Links</w:t>
-      </w:r>
-    </w:p>
-    <w:p>
-      <w:pPr>
-        <w:rPr>
-          <w:rFonts w:cs="Noto Sans Medium"/>
-        </w:rPr>
-      </w:pPr>
-      <w:r>
-        <w:rPr>
-          <w:rFonts w:cs="Noto Sans Medium"/>
-        </w:rPr>
-        <w:t xml:space="preserve">Write links in full. For example, </w:t>
-      </w:r>
-      <w:r>
-        <w:rPr>
-          <w:rStyle w:val="Hyperlink"/>
-        </w:rPr>
-        <w:fldChar w:fldCharType="begin"/>
-      </w:r>
-      <w:r>
-        <w:rPr>
-          <w:rStyle w:val="Hyperlink"/>
-        </w:rPr>
-        <w:instrText>HYPERLINK "http://</w:instrText>
-      </w:r>
-      <w:commentRangeStart w:id="9"/>
-      <w:r>
-        <w:rPr>
-          <w:rStyle w:val="Hyperlink"/>
-        </w:rPr>
-        <w:instrText>www.service-manual.nhs.uk/content</w:instrText>
-      </w:r>
-      <w:commentRangeEnd w:id="9"/>
-      <w:r>
-        <w:rPr>
-          <w:rStyle w:val="CommentReference"/>
-          <w:b/>
-          <w:sz w:val="32"/>
-          <w:szCs w:val="24"/>
-        </w:rPr>
-        <w:commentReference w:id="9"/>
-      </w:r>
-      <w:r>
-        <w:rPr>
-          <w:rStyle w:val="Hyperlink"/>
-        </w:rPr>
-        <w:instrText>"</w:instrText>
-      </w:r>
-      <w:r>
-        <w:rPr>
-          <w:rStyle w:val="Hyperlink"/>
-        </w:rPr>
-      </w:r>
-      <w:r>
-        <w:rPr>
-          <w:rStyle w:val="Hyperlink"/>
-        </w:rPr>
-        <w:fldChar w:fldCharType="separate"/>
-      </w:r>
-      <w:r>
-        <w:rPr>
-          <w:rStyle w:val="Hyperlink"/>
-        </w:rPr>
-        <w:t>www.service-manual.nhs.uk/content</w:t>
-      </w:r>
-      <w:r>
-        <w:rPr>
-          <w:rStyle w:val="Hyperlink"/>
-        </w:rPr>
-        <w:fldChar w:fldCharType="end"/>
-      </w:r>
-      <w:r>
-        <w:rPr>
-          <w:rFonts w:cs="Noto Sans Medium"/>
-        </w:rPr>
-        <w:t>. Put links in bold to make them stand out. Do not use underlined text for links.</w:t>
-      </w:r>
-    </w:p>
-    <w:p>
-      <w:pPr>
-        <w:rPr>
-          <w:rFonts w:cs="Noto Sans Medium"/>
-          <w:szCs w:val="32"/>
-        </w:rPr>
-      </w:pPr>
-      <w:r>
-        <w:rPr>
-          <w:rFonts w:cs="Noto Sans Medium"/>
-          <w:szCs w:val="32"/>
-        </w:rPr>
-        <w:t>Do not split links</w:t>
-      </w:r>
-      <w:r>
-        <w:rPr>
-          <w:rFonts w:cs="Noto Sans Medium"/>
-          <w:szCs w:val="32"/>
-        </w:rPr>
-        <w:t xml:space="preserve"> </w:t>
-      </w:r>
-      <w:r>
-        <w:rPr>
-          <w:rFonts w:cs="Noto Sans Medium"/>
-          <w:szCs w:val="32"/>
-        </w:rPr>
-        <w:t>across</w:t>
-      </w:r>
-      <w:r>
-        <w:rPr>
-          <w:rFonts w:cs="Noto Sans Medium"/>
-          <w:szCs w:val="32"/>
-        </w:rPr>
-        <w:t xml:space="preserve"> different pages</w:t>
-      </w:r>
-      <w:r>
-        <w:rPr>
-          <w:rFonts w:cs="Noto Sans Medium"/>
-          <w:szCs w:val="32"/>
-        </w:rPr>
-        <w:t>.</w:t>
-      </w:r>
-      <w:r>
-        <w:rPr>
-          <w:rFonts w:cs="Noto Sans Medium"/>
-          <w:szCs w:val="32"/>
-        </w:rPr>
-        <w:t xml:space="preserve"> </w:t>
-      </w:r>
-      <w:r>
-        <w:rPr>
-          <w:rFonts w:cs="Noto Sans Medium"/>
-          <w:szCs w:val="32"/>
-        </w:rPr>
-        <w:t>A</w:t>
-      </w:r>
-      <w:r>
-        <w:rPr>
-          <w:rFonts w:cs="Noto Sans Medium"/>
-          <w:szCs w:val="32"/>
-        </w:rPr>
-        <w:t xml:space="preserve">dd a </w:t>
-      </w:r>
-      <w:r>
-        <w:rPr>
-          <w:rFonts w:cs="Noto Sans Medium"/>
-          <w:szCs w:val="32"/>
-        </w:rPr>
-        <w:t>page break before the paragraph</w:t>
-      </w:r>
-      <w:r>
-        <w:rPr>
-          <w:rFonts w:cs="Noto Sans Medium"/>
-          <w:szCs w:val="32"/>
-        </w:rPr>
-        <w:t xml:space="preserve"> with the link</w:t>
-      </w:r>
-      <w:r>
-        <w:rPr>
-          <w:rFonts w:cs="Noto Sans Medium"/>
-          <w:szCs w:val="32"/>
-        </w:rPr>
-        <w:t>.</w:t>
-      </w:r>
-    </w:p>
-    <w:p>
-      <w:pPr>
-        <w:pStyle w:val="Heading2"/>
-        <w:rPr>
-          <w:rFonts w:cs="Noto Sans Medium"/>
-        </w:rPr>
-      </w:pPr>
-      <w:r>
-        <w:rPr>
-          <w:rFonts w:cs="Noto Sans Medium"/>
+          <w:sz w:val="32"/>
+        </w:rPr>
+      </w:pPr>
+      <w:r>
+        <w:rPr>
+          <w:rFonts w:cs="Noto Sans Medium"/>
+          <w:sz w:val="32"/>
         </w:rPr>
         <w:t>Numbered steps</w:t>
       </w:r>
@@ -609,6 +347,7 @@
           <w:rFonts w:eastAsia="Times New Roman" w:cs="Noto Sans Medium"/>
           <w:color w:val="0D0D0D" w:themeColor="text1" w:themeTint="F2"/>
           <w:kern w:val="0"/>
+          <w:sz w:val="32"/>
           <w:szCs w:val="32"/>
           <w:lang w:eastAsia="en-GB"/>
           <w14:ligatures w14:val="none"/>
@@ -619,11 +358,24 @@
           <w:rFonts w:eastAsia="Times New Roman" w:cs="Noto Sans Medium"/>
           <w:color w:val="0D0D0D" w:themeColor="text1" w:themeTint="F2"/>
           <w:kern w:val="0"/>
+          <w:sz w:val="32"/>
           <w:szCs w:val="32"/>
           <w:lang w:eastAsia="en-GB"/>
           <w14:ligatures w14:val="none"/>
         </w:rPr>
-        <w:t>Step 1 in a numbered list.</w:t>
+        <w:t>Step</w:t>
+      </w:r>
+      <w:r>
+        <w:rPr>
+          <w:rFonts w:eastAsia="Times New Roman" w:cs="Noto Sans Medium"/>
+          <w:color w:val="0D0D0D" w:themeColor="text1" w:themeTint="F2"/>
+          <w:kern w:val="0"/>
+          <w:sz w:val="32"/>
+          <w:szCs w:val="32"/>
+          <w:lang w:eastAsia="en-GB"/>
+          <w14:ligatures w14:val="none"/>
+        </w:rPr>
+        <w:t xml:space="preserve"> 1 in a numbered list.</w:t>
       </w:r>
     </w:p>
     <w:p>
@@ -638,6 +390,7 @@
           <w:rFonts w:eastAsia="Times New Roman" w:cs="Noto Sans Medium"/>
           <w:color w:val="0D0D0D" w:themeColor="text1" w:themeTint="F2"/>
           <w:kern w:val="0"/>
+          <w:sz w:val="32"/>
           <w:szCs w:val="32"/>
           <w:lang w:eastAsia="en-GB"/>
           <w14:ligatures w14:val="none"/>
@@ -648,6 +401,7 @@
           <w:rFonts w:eastAsia="Times New Roman" w:cs="Noto Sans Medium"/>
           <w:color w:val="0D0D0D" w:themeColor="text1" w:themeTint="F2"/>
           <w:kern w:val="0"/>
+          <w:sz w:val="32"/>
           <w:szCs w:val="32"/>
           <w:lang w:eastAsia="en-GB"/>
           <w14:ligatures w14:val="none"/>
@@ -659,12 +413,479 @@
       <w:pPr>
         <w:pStyle w:val="Heading2"/>
         <w:rPr>
-          <w:rFonts w:cs="Noto Sans Medium"/>
-        </w:rPr>
-      </w:pPr>
-      <w:r>
-        <w:rPr>
-          <w:rFonts w:cs="Noto Sans Medium"/>
+          <w:rFonts w:eastAsia="Times New Roman" w:cs="Noto Sans Medium"/>
+          <w:sz w:val="32"/>
+          <w:lang w:eastAsia="en-GB"/>
+        </w:rPr>
+      </w:pPr>
+      <w:r>
+        <w:rPr>
+          <w:rFonts w:eastAsia="Times New Roman" w:cs="Noto Sans Medium"/>
+          <w:sz w:val="32"/>
+          <w:lang w:eastAsia="en-GB"/>
+        </w:rPr>
+        <w:t>Headings</w:t>
+      </w:r>
+    </w:p>
+    <w:p>
+      <w:pPr>
+        <w:rPr>
+          <w:rFonts w:cs="Noto Sans Medium"/>
+          <w:sz w:val="32"/>
+          <w:szCs w:val="32"/>
+          <w:lang w:eastAsia="en-GB"/>
+        </w:rPr>
+      </w:pPr>
+      <w:r>
+        <w:rPr>
+          <w:rFonts w:cs="Noto Sans Medium"/>
+          <w:sz w:val="32"/>
+          <w:szCs w:val="32"/>
+          <w:lang w:eastAsia="en-GB"/>
+        </w:rPr>
+        <w:t>Use headings to break up your message content</w:t>
+      </w:r>
+      <w:r>
+        <w:rPr>
+          <w:rFonts w:cs="Noto Sans Medium"/>
+          <w:sz w:val="32"/>
+          <w:szCs w:val="32"/>
+          <w:lang w:eastAsia="en-GB"/>
+        </w:rPr>
+        <w:t>.</w:t>
+      </w:r>
+      <w:r>
+        <w:rPr>
+          <w:rFonts w:cs="Noto Sans Medium"/>
+          <w:sz w:val="32"/>
+          <w:szCs w:val="32"/>
+          <w:lang w:eastAsia="en-GB"/>
+        </w:rPr>
+        <w:t xml:space="preserve"> </w:t>
+      </w:r>
+    </w:p>
+    <w:p>
+      <w:pPr>
+        <w:pStyle w:val="Heading2"/>
+        <w:rPr>
+          <w:rFonts w:cs="Noto Sans Medium"/>
+          <w:sz w:val="32"/>
+        </w:rPr>
+      </w:pPr>
+      <w:r>
+        <w:rPr>
+          <w:rFonts w:cs="Noto Sans Medium"/>
+          <w:sz w:val="32"/>
+        </w:rPr>
+        <w:lastRenderedPageBreak/>
+        <w:t>Personalisation</w:t>
+      </w:r>
+    </w:p>
+    <w:p>
+      <w:pPr>
+        <w:rPr>
+          <w:rFonts w:cs="Noto Sans Medium"/>
+          <w:sz w:val="32"/>
+          <w:szCs w:val="32"/>
+        </w:rPr>
+      </w:pPr>
+      <w:r>
+        <w:rPr>
+          <w:rFonts w:cs="Noto Sans Medium"/>
+          <w:sz w:val="32"/>
+          <w:szCs w:val="32"/>
+        </w:rPr>
+        <w:t xml:space="preserve">To add a </w:t>
+      </w:r>
+      <w:commentRangeStart w:id="8"/>
+      <w:r>
+        <w:rPr>
+          <w:rFonts w:cs="Noto Sans Medium"/>
+          <w:sz w:val="32"/>
+          <w:szCs w:val="32"/>
+        </w:rPr>
+        <w:t xml:space="preserve">personalisation </w:t>
+      </w:r>
+      <w:commentRangeEnd w:id="8"/>
+      <w:r>
+        <w:rPr>
+          <w:rStyle w:val="CommentReference"/>
+          <w:rFonts w:cs="Noto Sans Medium"/>
+          <w:sz w:val="32"/>
+          <w:szCs w:val="32"/>
+        </w:rPr>
+        <w:commentReference w:id="8"/>
+      </w:r>
+      <w:r>
+        <w:rPr>
+          <w:rFonts w:cs="Noto Sans Medium"/>
+          <w:sz w:val="32"/>
+          <w:szCs w:val="32"/>
+        </w:rPr>
+        <w:t xml:space="preserve">field, include a placeholder with </w:t>
+      </w:r>
+      <w:r>
+        <w:rPr>
+          <w:rFonts w:cs="Noto Sans Medium"/>
+          <w:sz w:val="32"/>
+          <w:szCs w:val="32"/>
+        </w:rPr>
+        <w:t>singly curly brackets</w:t>
+      </w:r>
+      <w:r>
+        <w:rPr>
+          <w:rFonts w:cs="Noto Sans Medium"/>
+          <w:sz w:val="32"/>
+          <w:szCs w:val="32"/>
+        </w:rPr>
+        <w:t xml:space="preserve"> around it</w:t>
+      </w:r>
+      <w:r>
+        <w:rPr>
+          <w:rFonts w:cs="Noto Sans Medium"/>
+          <w:sz w:val="32"/>
+          <w:szCs w:val="32"/>
+        </w:rPr>
+        <w:t xml:space="preserve"> and d. at the start</w:t>
+      </w:r>
+      <w:r>
+        <w:rPr>
+          <w:rFonts w:cs="Noto Sans Medium"/>
+          <w:sz w:val="32"/>
+          <w:szCs w:val="32"/>
+        </w:rPr>
+        <w:t>.</w:t>
+      </w:r>
+      <w:r>
+        <w:rPr>
+          <w:rFonts w:cs="Noto Sans Medium"/>
+          <w:sz w:val="32"/>
+          <w:szCs w:val="32"/>
+        </w:rPr>
+        <w:t xml:space="preserve"> For example:</w:t>
+      </w:r>
+    </w:p>
+    <w:p>
+      <w:pPr>
+        <w:rPr>
+          <w:rFonts w:cs="Noto Sans Medium"/>
+          <w:sz w:val="32"/>
+          <w:szCs w:val="32"/>
+        </w:rPr>
+      </w:pPr>
+      <w:r>
+        <w:rPr>
+          <w:rFonts w:cs="Noto Sans Medium"/>
+          <w:sz w:val="32"/>
+          <w:szCs w:val="32"/>
+        </w:rPr>
+        <w:t>Hello {d.fullName}, your NHS Number is {d.nhsNumber}. Your appointment is on {d.appointmentDate} at {d.gpSurgery}.</w:t>
+      </w:r>
+    </w:p>
+    <w:p>
+      <w:pPr>
+        <w:pStyle w:val="Heading2"/>
+        <w:rPr>
+          <w:rFonts w:cs="Noto Sans Medium"/>
+          <w:sz w:val="32"/>
+        </w:rPr>
+      </w:pPr>
+      <w:r>
+        <w:rPr>
+          <w:rFonts w:cs="Noto Sans Medium"/>
+          <w:sz w:val="32"/>
+        </w:rPr>
+        <w:t>Links</w:t>
+      </w:r>
+    </w:p>
+    <w:p>
+      <w:pPr>
+        <w:rPr>
+          <w:rFonts w:cs="Noto Sans Medium"/>
+          <w:sz w:val="32"/>
+          <w:szCs w:val="32"/>
+        </w:rPr>
+      </w:pPr>
+      <w:r>
+        <w:rPr>
+          <w:rFonts w:cs="Noto Sans Medium"/>
+          <w:sz w:val="32"/>
+          <w:szCs w:val="32"/>
+        </w:rPr>
+        <w:t xml:space="preserve">Write </w:t>
+      </w:r>
+      <w:r>
+        <w:rPr>
+          <w:rFonts w:cs="Noto Sans Medium"/>
+          <w:sz w:val="32"/>
+          <w:szCs w:val="32"/>
+        </w:rPr>
+        <w:t>links in full</w:t>
+      </w:r>
+      <w:r>
+        <w:rPr>
+          <w:rFonts w:cs="Noto Sans Medium"/>
+          <w:sz w:val="32"/>
+          <w:szCs w:val="32"/>
+        </w:rPr>
+        <w:t xml:space="preserve">. </w:t>
+      </w:r>
+      <w:r>
+        <w:rPr>
+          <w:rFonts w:cs="Noto Sans Medium"/>
+          <w:sz w:val="32"/>
+          <w:szCs w:val="32"/>
+        </w:rPr>
+        <w:t>For example</w:t>
+      </w:r>
+      <w:r>
+        <w:rPr>
+          <w:rFonts w:cs="Noto Sans Medium"/>
+          <w:sz w:val="32"/>
+          <w:szCs w:val="32"/>
+        </w:rPr>
+        <w:t>,</w:t>
+      </w:r>
+      <w:r>
+        <w:rPr>
+          <w:rFonts w:cs="Noto Sans Medium"/>
+          <w:sz w:val="32"/>
+          <w:szCs w:val="32"/>
+        </w:rPr>
+        <w:t xml:space="preserve"> </w:t>
+      </w:r>
+      <w:r>
+        <w:rPr>
+          <w:rStyle w:val="Hyperlink"/>
+          <w:sz w:val="32"/>
+          <w:szCs w:val="32"/>
+        </w:rPr>
+        <w:fldChar w:fldCharType="begin"/>
+      </w:r>
+      <w:r>
+        <w:rPr>
+          <w:rStyle w:val="Hyperlink"/>
+          <w:sz w:val="32"/>
+          <w:szCs w:val="32"/>
+        </w:rPr>
+        <w:instrText>HYPERLINK "http://</w:instrText>
+      </w:r>
+      <w:commentRangeStart w:id="9"/>
+      <w:r>
+        <w:rPr>
+          <w:rStyle w:val="Hyperlink"/>
+          <w:sz w:val="32"/>
+          <w:szCs w:val="32"/>
+        </w:rPr>
+        <w:instrText>www.service-manual.nhs.uk/content</w:instrText>
+      </w:r>
+      <w:commentRangeEnd w:id="9"/>
+      <w:r>
+        <w:rPr>
+          <w:rStyle w:val="CommentReference"/>
+          <w:b/>
+          <w:sz w:val="32"/>
+          <w:szCs w:val="32"/>
+        </w:rPr>
+        <w:commentReference w:id="9"/>
+      </w:r>
+      <w:r>
+        <w:rPr>
+          <w:rStyle w:val="Hyperlink"/>
+          <w:sz w:val="32"/>
+          <w:szCs w:val="32"/>
+        </w:rPr>
+        <w:instrText>"</w:instrText>
+      </w:r>
+      <w:r>
+        <w:rPr>
+          <w:rStyle w:val="Hyperlink"/>
+          <w:sz w:val="32"/>
+          <w:szCs w:val="32"/>
+        </w:rPr>
+      </w:r>
+      <w:r>
+        <w:rPr>
+          <w:rStyle w:val="Hyperlink"/>
+          <w:sz w:val="32"/>
+          <w:szCs w:val="32"/>
+        </w:rPr>
+        <w:fldChar w:fldCharType="separate"/>
+      </w:r>
+      <w:r>
+        <w:rPr>
+          <w:rStyle w:val="Hyperlink"/>
+          <w:sz w:val="32"/>
+          <w:szCs w:val="32"/>
+        </w:rPr>
+        <w:t>www.service-manual.nhs.uk/content</w:t>
+      </w:r>
+      <w:r>
+        <w:rPr>
+          <w:rStyle w:val="Hyperlink"/>
+          <w:sz w:val="32"/>
+          <w:szCs w:val="32"/>
+        </w:rPr>
+        <w:fldChar w:fldCharType="end"/>
+      </w:r>
+      <w:r>
+        <w:rPr>
+          <w:rFonts w:cs="Noto Sans Medium"/>
+          <w:sz w:val="32"/>
+          <w:szCs w:val="32"/>
+        </w:rPr>
+        <w:t>.</w:t>
+      </w:r>
+      <w:r>
+        <w:rPr>
+          <w:rFonts w:cs="Noto Sans Medium"/>
+          <w:sz w:val="32"/>
+          <w:szCs w:val="32"/>
+        </w:rPr>
+        <w:t xml:space="preserve"> </w:t>
+      </w:r>
+      <w:r>
+        <w:rPr>
+          <w:rFonts w:cs="Noto Sans Medium"/>
+          <w:sz w:val="32"/>
+          <w:szCs w:val="32"/>
+        </w:rPr>
+        <w:t xml:space="preserve">Put links in bold to make them stand out. </w:t>
+      </w:r>
+      <w:r>
+        <w:rPr>
+          <w:rFonts w:cs="Noto Sans Medium"/>
+          <w:sz w:val="32"/>
+          <w:szCs w:val="32"/>
+        </w:rPr>
+        <w:t>Do not</w:t>
+      </w:r>
+      <w:r>
+        <w:rPr>
+          <w:rFonts w:cs="Noto Sans Medium"/>
+          <w:sz w:val="32"/>
+          <w:szCs w:val="32"/>
+        </w:rPr>
+        <w:t xml:space="preserve"> use </w:t>
+      </w:r>
+      <w:r>
+        <w:rPr>
+          <w:rFonts w:cs="Noto Sans Medium"/>
+          <w:sz w:val="32"/>
+          <w:szCs w:val="32"/>
+        </w:rPr>
+        <w:t>underlined text for links.</w:t>
+      </w:r>
+    </w:p>
+    <w:p>
+      <w:pPr>
+        <w:rPr>
+          <w:rFonts w:cs="Noto Sans Medium"/>
+          <w:sz w:val="32"/>
+          <w:szCs w:val="32"/>
+        </w:rPr>
+      </w:pPr>
+      <w:r>
+        <w:rPr>
+          <w:rFonts w:cs="Noto Sans Medium"/>
+          <w:sz w:val="32"/>
+          <w:szCs w:val="32"/>
+        </w:rPr>
+        <w:t>Do not split links</w:t>
+      </w:r>
+      <w:r>
+        <w:rPr>
+          <w:rFonts w:cs="Noto Sans Medium"/>
+          <w:sz w:val="32"/>
+          <w:szCs w:val="32"/>
+        </w:rPr>
+        <w:t xml:space="preserve"> </w:t>
+      </w:r>
+      <w:r>
+        <w:rPr>
+          <w:rFonts w:cs="Noto Sans Medium"/>
+          <w:sz w:val="32"/>
+          <w:szCs w:val="32"/>
+        </w:rPr>
+        <w:t>across</w:t>
+      </w:r>
+      <w:r>
+        <w:rPr>
+          <w:rFonts w:cs="Noto Sans Medium"/>
+          <w:sz w:val="32"/>
+          <w:szCs w:val="32"/>
+        </w:rPr>
+        <w:t xml:space="preserve"> different pages</w:t>
+      </w:r>
+      <w:r>
+        <w:rPr>
+          <w:rFonts w:cs="Noto Sans Medium"/>
+          <w:sz w:val="32"/>
+          <w:szCs w:val="32"/>
+        </w:rPr>
+        <w:t>.</w:t>
+      </w:r>
+      <w:r>
+        <w:rPr>
+          <w:rFonts w:cs="Noto Sans Medium"/>
+          <w:sz w:val="32"/>
+          <w:szCs w:val="32"/>
+        </w:rPr>
+        <w:t xml:space="preserve"> </w:t>
+      </w:r>
+      <w:r>
+        <w:rPr>
+          <w:rFonts w:cs="Noto Sans Medium"/>
+          <w:sz w:val="32"/>
+          <w:szCs w:val="32"/>
+        </w:rPr>
+        <w:t>A</w:t>
+      </w:r>
+      <w:r>
+        <w:rPr>
+          <w:rFonts w:cs="Noto Sans Medium"/>
+          <w:sz w:val="32"/>
+          <w:szCs w:val="32"/>
+        </w:rPr>
+        <w:t xml:space="preserve">dd a </w:t>
+      </w:r>
+      <w:r>
+        <w:rPr>
+          <w:rFonts w:cs="Noto Sans Medium"/>
+          <w:sz w:val="32"/>
+          <w:szCs w:val="32"/>
+        </w:rPr>
+        <w:t>page break before the paragraph</w:t>
+      </w:r>
+      <w:r>
+        <w:rPr>
+          <w:rFonts w:cs="Noto Sans Medium"/>
+          <w:sz w:val="32"/>
+          <w:szCs w:val="32"/>
+        </w:rPr>
+        <w:t xml:space="preserve"> with the link</w:t>
+      </w:r>
+      <w:r>
+        <w:rPr>
+          <w:rFonts w:cs="Noto Sans Medium"/>
+          <w:sz w:val="32"/>
+          <w:szCs w:val="32"/>
+        </w:rPr>
+        <w:t>.</w:t>
+      </w:r>
+    </w:p>
+    <w:p>
+      <w:pPr>
+        <w:pStyle w:val="Heading2"/>
+        <w:rPr>
+          <w:rFonts w:cs="Noto Sans Medium"/>
+          <w:sz w:val="32"/>
+        </w:rPr>
+      </w:pPr>
+      <w:r>
+        <w:rPr>
+          <w:rFonts w:cs="Noto Sans Medium"/>
+          <w:sz w:val="32"/>
         </w:rPr>
         <w:t>QR codes</w:t>
       </w:r>
@@ -673,17 +894,23 @@
       <w:pPr>
         <w:rPr>
           <w:rFonts w:cs="Noto Sans Medium"/>
-        </w:rPr>
-      </w:pPr>
-      <w:r>
-        <w:rPr>
-          <w:rFonts w:cs="Noto Sans Medium"/>
+          <w:sz w:val="32"/>
+          <w:szCs w:val="32"/>
+        </w:rPr>
+      </w:pPr>
+      <w:r>
+        <w:rPr>
+          <w:rFonts w:cs="Noto Sans Medium"/>
+          <w:sz w:val="32"/>
+          <w:szCs w:val="32"/>
         </w:rPr>
         <w:t>If you want to include a QR code, put it in the body of your letter.</w:t>
       </w:r>
       <w:r>
         <w:rPr>
           <w:rFonts w:cs="Noto Sans Medium"/>
+          <w:sz w:val="32"/>
+          <w:szCs w:val="32"/>
         </w:rPr>
         <w:t xml:space="preserve"> Insert it as an image.</w:t>
       </w:r>
@@ -692,12 +919,14 @@
       <w:pPr>
         <w:rPr>
           <w:rFonts w:cs="Noto Sans Medium"/>
-          <w:szCs w:val="32"/>
-        </w:rPr>
-      </w:pPr>
-      <w:r>
-        <w:rPr>
-          <w:rFonts w:cs="Noto Sans Medium"/>
+          <w:sz w:val="32"/>
+          <w:szCs w:val="32"/>
+        </w:rPr>
+      </w:pPr>
+      <w:r>
+        <w:rPr>
+          <w:rFonts w:cs="Noto Sans Medium"/>
+          <w:sz w:val="32"/>
           <w:szCs w:val="32"/>
         </w:rPr>
         <w:t>You’ll need to ge</w:t>
@@ -705,6 +934,7 @@
       <w:r>
         <w:rPr>
           <w:rFonts w:cs="Noto Sans Medium"/>
+          <w:sz w:val="32"/>
           <w:szCs w:val="32"/>
         </w:rPr>
         <w:t xml:space="preserve">nerate </w:t>
@@ -712,6 +942,7 @@
       <w:r>
         <w:rPr>
           <w:rFonts w:cs="Noto Sans Medium"/>
+          <w:sz w:val="32"/>
           <w:szCs w:val="32"/>
         </w:rPr>
         <w:t>the QR code</w:t>
@@ -719,6 +950,7 @@
       <w:r>
         <w:rPr>
           <w:rFonts w:cs="Noto Sans Medium"/>
+          <w:sz w:val="32"/>
           <w:szCs w:val="32"/>
         </w:rPr>
         <w:t xml:space="preserve"> yourself</w:t>
@@ -726,6 +958,7 @@
       <w:r>
         <w:rPr>
           <w:rFonts w:cs="Noto Sans Medium"/>
+          <w:sz w:val="32"/>
           <w:szCs w:val="32"/>
         </w:rPr>
         <w:t>.</w:t>
@@ -735,12 +968,14 @@
       <w:pPr>
         <w:rPr>
           <w:rFonts w:cs="Noto Sans Medium"/>
-          <w:szCs w:val="32"/>
-        </w:rPr>
-      </w:pPr>
-      <w:r>
-        <w:rPr>
-          <w:rFonts w:cs="Noto Sans Medium"/>
+          <w:sz w:val="32"/>
+          <w:szCs w:val="32"/>
+        </w:rPr>
+      </w:pPr>
+      <w:r>
+        <w:rPr>
+          <w:rFonts w:cs="Noto Sans Medium"/>
+          <w:sz w:val="32"/>
           <w:szCs w:val="32"/>
         </w:rPr>
         <w:t>You must also p</w:t>
@@ -748,6 +983,7 @@
       <w:r>
         <w:rPr>
           <w:rFonts w:cs="Noto Sans Medium"/>
+          <w:sz w:val="32"/>
           <w:szCs w:val="32"/>
         </w:rPr>
         <w:t xml:space="preserve">rovide </w:t>
@@ -755,6 +991,7 @@
       <w:r>
         <w:rPr>
           <w:rFonts w:cs="Noto Sans Medium"/>
+          <w:sz w:val="32"/>
           <w:szCs w:val="32"/>
         </w:rPr>
         <w:t>a short URL or written instructions for how to find your webpage.</w:t>
@@ -762,6 +999,7 @@
       <w:r>
         <w:rPr>
           <w:rFonts w:cs="Noto Sans Medium"/>
+          <w:sz w:val="32"/>
           <w:szCs w:val="32"/>
         </w:rPr>
         <w:t xml:space="preserve"> For example:</w:t>
@@ -771,12 +1009,16 @@
       <w:pPr>
         <w:rPr>
           <w:rFonts w:cs="Noto Sans Medium"/>
+          <w:sz w:val="32"/>
+          <w:szCs w:val="32"/>
         </w:rPr>
       </w:pPr>
       <w:r>
         <w:rPr>
           <w:rFonts w:cs="Noto Sans Medium"/>
           <w:noProof/>
+          <w:sz w:val="32"/>
+          <w:szCs w:val="32"/>
         </w:rPr>
         <w:t xml:space="preserve"> </w:t>
       </w:r>
@@ -784,9 +1026,11 @@
         <w:rPr>
           <w:rFonts w:cs="Noto Sans Medium"/>
           <w:noProof/>
+          <w:sz w:val="32"/>
+          <w:szCs w:val="32"/>
         </w:rPr>
         <w:drawing>
-          <wp:inline distT="0" distB="0" distL="0" distR="0" wp14:anchorId="1EB53E18" wp14:editId="73AF8998">
+          <wp:inline distT="0" distB="0" distL="0" distR="0" wp14:anchorId="1EB53E18" wp14:editId="5ACF1E4B">
             <wp:extent cx="1336431" cy="1336431"/>
             <wp:effectExtent l="0" t="0" r="0" b="0"/>
             <wp:docPr id="1392541066" name="Picture 2" descr="A qr code with a black background&#10;&#10;Description automatically generated"/>
@@ -837,6 +1081,8 @@
       <w:r>
         <w:rPr>
           <w:rFonts w:cs="Noto Sans Medium"/>
+          <w:sz w:val="32"/>
+          <w:szCs w:val="32"/>
         </w:rPr>
         <w:t xml:space="preserve"> </w:t>
       </w:r>
@@ -846,12 +1092,16 @@
         <w:rPr>
           <w:rFonts w:cs="Noto Sans Medium"/>
           <w:noProof/>
+          <w:sz w:val="32"/>
+          <w:szCs w:val="32"/>
         </w:rPr>
       </w:pPr>
       <w:r>
         <w:rPr>
           <w:rFonts w:cs="Noto Sans Medium"/>
           <w:noProof/>
+          <w:sz w:val="32"/>
+          <w:szCs w:val="32"/>
         </w:rPr>
         <w:t xml:space="preserve">Scan </w:t>
       </w:r>
@@ -859,19 +1109,33 @@
         <w:rPr>
           <w:rFonts w:cs="Noto Sans Medium"/>
           <w:noProof/>
+          <w:sz w:val="32"/>
+          <w:szCs w:val="32"/>
         </w:rPr>
         <w:t xml:space="preserve">the QR code or visit </w:t>
       </w:r>
       <w:r>
         <w:rPr>
           <w:rStyle w:val="Hyperlink"/>
-        </w:rPr>
-        <w:t>www.notify.nhs.uk</w:t>
+          <w:sz w:val="32"/>
+          <w:szCs w:val="32"/>
+        </w:rPr>
+        <w:t>w</w:t>
+      </w:r>
+      <w:r>
+        <w:rPr>
+          <w:rStyle w:val="Hyperlink"/>
+          <w:sz w:val="32"/>
+          <w:szCs w:val="32"/>
+        </w:rPr>
+        <w:t>ww.notify.nhs.uk</w:t>
       </w:r>
       <w:r>
         <w:rPr>
           <w:rFonts w:cs="Noto Sans Medium"/>
           <w:noProof/>
+          <w:sz w:val="32"/>
+          <w:szCs w:val="32"/>
         </w:rPr>
         <w:t>.</w:t>
       </w:r>
@@ -881,11 +1145,13 @@
         <w:pStyle w:val="Heading2"/>
         <w:rPr>
           <w:rFonts w:cs="Noto Sans Medium"/>
-        </w:rPr>
-      </w:pPr>
-      <w:r>
-        <w:rPr>
-          <w:rFonts w:cs="Noto Sans Medium"/>
+          <w:sz w:val="32"/>
+        </w:rPr>
+      </w:pPr>
+      <w:r>
+        <w:rPr>
+          <w:rFonts w:cs="Noto Sans Medium"/>
+          <w:sz w:val="32"/>
         </w:rPr>
         <w:t>Paragraphs</w:t>
       </w:r>
@@ -894,23 +1160,31 @@
       <w:pPr>
         <w:rPr>
           <w:rFonts w:cs="Noto Sans Medium"/>
-        </w:rPr>
-      </w:pPr>
-      <w:r>
-        <w:rPr>
-          <w:rFonts w:cs="Noto Sans Medium"/>
+          <w:sz w:val="32"/>
+          <w:szCs w:val="32"/>
+        </w:rPr>
+      </w:pPr>
+      <w:r>
+        <w:rPr>
+          <w:rFonts w:cs="Noto Sans Medium"/>
+          <w:sz w:val="32"/>
+          <w:szCs w:val="32"/>
         </w:rPr>
         <w:t xml:space="preserve">Paragraphs can be split across </w:t>
       </w:r>
       <w:r>
         <w:rPr>
           <w:rFonts w:cs="Noto Sans Medium"/>
+          <w:sz w:val="32"/>
+          <w:szCs w:val="32"/>
         </w:rPr>
         <w:t>2</w:t>
       </w:r>
       <w:r>
         <w:rPr>
           <w:rFonts w:cs="Noto Sans Medium"/>
+          <w:sz w:val="32"/>
+          <w:szCs w:val="32"/>
         </w:rPr>
         <w:t xml:space="preserve"> pages. </w:t>
       </w:r>
@@ -919,31 +1193,47 @@
       <w:pPr>
         <w:rPr>
           <w:rFonts w:cs="Noto Sans Medium"/>
-        </w:rPr>
-      </w:pPr>
-      <w:r>
-        <w:rPr>
-          <w:rFonts w:cs="Noto Sans Medium"/>
+          <w:sz w:val="32"/>
+          <w:szCs w:val="32"/>
+        </w:rPr>
+      </w:pPr>
+      <w:r>
+        <w:rPr>
+          <w:rFonts w:cs="Noto Sans Medium"/>
+          <w:sz w:val="32"/>
+          <w:szCs w:val="32"/>
         </w:rPr>
         <w:t>If you do not want</w:t>
       </w:r>
       <w:r>
         <w:rPr>
           <w:rFonts w:cs="Noto Sans Medium"/>
+          <w:sz w:val="32"/>
+          <w:szCs w:val="32"/>
         </w:rPr>
         <w:t xml:space="preserve"> a paragraph to run over different pages, add a page break before the paragraph.</w:t>
       </w:r>
+      <w:r>
+        <w:rPr>
+          <w:noProof/>
+          <w:sz w:val="32"/>
+          <w:szCs w:val="32"/>
+        </w:rPr>
+        <w:t xml:space="preserve"> </w:t>
+      </w:r>
     </w:p>
     <w:p>
       <w:pPr>
         <w:pStyle w:val="Heading2"/>
         <w:rPr>
           <w:rFonts w:cs="Noto Sans Medium"/>
-        </w:rPr>
-      </w:pPr>
-      <w:r>
-        <w:rPr>
-          <w:rFonts w:cs="Noto Sans Medium"/>
+          <w:sz w:val="32"/>
+        </w:rPr>
+      </w:pPr>
+      <w:r>
+        <w:rPr>
+          <w:rFonts w:cs="Noto Sans Medium"/>
+          <w:sz w:val="32"/>
         </w:rPr>
         <w:lastRenderedPageBreak/>
         <w:t>Images</w:t>
@@ -956,47 +1246,63 @@
         </w:tabs>
         <w:rPr>
           <w:rFonts w:cs="Noto Sans Medium"/>
-        </w:rPr>
-      </w:pPr>
-      <w:r>
-        <w:rPr>
-          <w:rFonts w:cs="Noto Sans Medium"/>
+          <w:sz w:val="32"/>
+          <w:szCs w:val="32"/>
+        </w:rPr>
+      </w:pPr>
+      <w:r>
+        <w:rPr>
+          <w:rFonts w:cs="Noto Sans Medium"/>
+          <w:sz w:val="32"/>
+          <w:szCs w:val="32"/>
         </w:rPr>
         <w:t xml:space="preserve">Images must be black and white. Position </w:t>
       </w:r>
       <w:r>
         <w:rPr>
           <w:rFonts w:cs="Noto Sans Medium"/>
+          <w:sz w:val="32"/>
+          <w:szCs w:val="32"/>
         </w:rPr>
         <w:t>them</w:t>
       </w:r>
       <w:r>
         <w:rPr>
           <w:rFonts w:cs="Noto Sans Medium"/>
+          <w:sz w:val="32"/>
+          <w:szCs w:val="32"/>
         </w:rPr>
         <w:t xml:space="preserve"> </w:t>
       </w:r>
       <w:r>
         <w:rPr>
           <w:rFonts w:cs="Noto Sans Medium"/>
+          <w:sz w:val="32"/>
+          <w:szCs w:val="32"/>
         </w:rPr>
         <w:t>with</w:t>
       </w:r>
       <w:r>
         <w:rPr>
           <w:rFonts w:cs="Noto Sans Medium"/>
+          <w:sz w:val="32"/>
+          <w:szCs w:val="32"/>
         </w:rPr>
         <w:t xml:space="preserve">in the same </w:t>
       </w:r>
       <w:r>
         <w:rPr>
           <w:rFonts w:cs="Noto Sans Medium"/>
+          <w:sz w:val="32"/>
+          <w:szCs w:val="32"/>
         </w:rPr>
         <w:t xml:space="preserve">page </w:t>
       </w:r>
       <w:r>
         <w:rPr>
           <w:rFonts w:cs="Noto Sans Medium"/>
+          <w:sz w:val="32"/>
+          <w:szCs w:val="32"/>
         </w:rPr>
         <w:t>margins as the text.</w:t>
       </w:r>
@@ -1005,12 +1311,15 @@
       <w:pPr>
         <w:pStyle w:val="Heading2"/>
         <w:rPr>
-          <w:rFonts w:cs="Noto Sans Medium"/>
-        </w:rPr>
-      </w:pPr>
-      <w:r>
-        <w:rPr>
-          <w:rFonts w:cs="Noto Sans Medium"/>
+          <w:rStyle w:val="normaltextrun"/>
+          <w:rFonts w:cs="Noto Sans Medium"/>
+          <w:sz w:val="32"/>
+        </w:rPr>
+      </w:pPr>
+      <w:r>
+        <w:rPr>
+          <w:rFonts w:cs="Noto Sans Medium"/>
+          <w:sz w:val="32"/>
         </w:rPr>
         <w:t>Data protection</w:t>
       </w:r>
@@ -1023,78 +1332,85 @@
           <w:tab w:val="left" w:pos="7905"/>
         </w:tabs>
         <w:rPr>
+          <w:rFonts w:eastAsia="Arial" w:cs="Noto Sans Medium"/>
+          <w:sz w:val="32"/>
+          <w:szCs w:val="32"/>
+          <w:lang w:val="en-US"/>
+        </w:rPr>
+      </w:pPr>
+      <w:r>
+        <w:rPr>
           <w:rStyle w:val="normaltextrun"/>
           <w:rFonts w:eastAsia="Arial" w:cs="Noto Sans Medium"/>
+          <w:sz w:val="32"/>
           <w:szCs w:val="32"/>
           <w:lang w:val="en-US"/>
         </w:rPr>
-      </w:pPr>
+        <w:t>If you want to include</w:t>
+      </w:r>
+      <w:r>
+        <w:rPr>
+          <w:rFonts w:cs="Noto Sans Medium"/>
+          <w:noProof/>
+          <w:sz w:val="32"/>
+          <w:szCs w:val="32"/>
+          <w:lang w:val="en-US"/>
+        </w:rPr>
+        <w:t xml:space="preserve"> </w:t>
+      </w:r>
       <w:r>
         <w:rPr>
           <w:rStyle w:val="normaltextrun"/>
           <w:rFonts w:eastAsia="Arial" w:cs="Noto Sans Medium"/>
+          <w:sz w:val="32"/>
           <w:szCs w:val="32"/>
           <w:lang w:val="en-US"/>
         </w:rPr>
-        <w:t>If you want to include</w:t>
-      </w:r>
-      <w:r>
-        <w:rPr>
-          <w:rFonts w:cs="Noto Sans Medium"/>
-          <w:noProof/>
-          <w:szCs w:val="32"/>
-          <w:lang w:val="en-US"/>
-        </w:rPr>
-        <w:t xml:space="preserve"> </w:t>
+        <w:t xml:space="preserve">data protection information, put this at the end of your letter. You can write this yourself. NHS Notify does not provide </w:t>
       </w:r>
       <w:r>
         <w:rPr>
           <w:rStyle w:val="normaltextrun"/>
           <w:rFonts w:eastAsia="Arial" w:cs="Noto Sans Medium"/>
+          <w:sz w:val="32"/>
           <w:szCs w:val="32"/>
           <w:lang w:val="en-US"/>
         </w:rPr>
-        <w:t xml:space="preserve">data protection information, put this at the end of your letter. You can write this yourself. NHS Notify does not provide </w:t>
+        <w:t>text for data</w:t>
       </w:r>
       <w:r>
         <w:rPr>
           <w:rStyle w:val="normaltextrun"/>
           <w:rFonts w:eastAsia="Arial" w:cs="Noto Sans Medium"/>
+          <w:sz w:val="32"/>
           <w:szCs w:val="32"/>
           <w:lang w:val="en-US"/>
         </w:rPr>
-        <w:t>text for data</w:t>
-      </w:r>
-      <w:r>
-        <w:rPr>
-          <w:rStyle w:val="normaltextrun"/>
-          <w:rFonts w:eastAsia="Arial" w:cs="Noto Sans Medium"/>
-          <w:szCs w:val="32"/>
-          <w:lang w:val="en-US"/>
-        </w:rPr>
         <w:t xml:space="preserve"> protection or privacy notices.</w:t>
       </w:r>
-    </w:p>
-    <w:p>
-      <w:pPr>
-        <w:pStyle w:val="Footer"/>
-        <w:tabs>
-          <w:tab w:val="clear" w:pos="9026"/>
-          <w:tab w:val="left" w:pos="7905"/>
-        </w:tabs>
-        <w:rPr>
-          <w:rFonts w:eastAsia="Arial" w:cs="Noto Sans Medium"/>
-          <w:szCs w:val="32"/>
-          <w:lang w:val="en-US"/>
-        </w:rPr>
-      </w:pPr>
+      <w:r>
+        <w:rPr>
+          <w:noProof/>
+          <w:sz w:val="32"/>
+          <w:szCs w:val="32"/>
+        </w:rPr>
+        <w:t xml:space="preserve"> </w:t>
+      </w:r>
+      <w:r>
+        <w:rPr>
+          <w:noProof/>
+          <w:sz w:val="32"/>
+          <w:szCs w:val="32"/>
+        </w:rPr>
+        <w:t xml:space="preserve"> </w:t>
+      </w:r>
     </w:p>
     <w:sectPr>
       <w:footerReference w:type="default" r:id="rId13"/>
       <w:headerReference w:type="first" r:id="rId14"/>
       <w:footerReference w:type="first" r:id="rId15"/>
       <w:pgSz w:w="11906" w:h="16838"/>
-      <w:pgMar w:top="567" w:right="851" w:bottom="284" w:left="851" w:header="284" w:footer="284" w:gutter="0"/>
+      <w:pgMar w:top="567" w:right="964" w:bottom="284" w:left="964" w:header="284" w:footer="396" w:gutter="0"/>
       <w:cols w:space="708"/>
       <w:titlePg/>
       <w:docGrid w:linePitch="360"/>
@@ -1104,7 +1420,7 @@
 </file>
 
 <file path=word/comments.xml><?xml version="1.0" encoding="utf-8"?>
-<w:comments xmlns:wpc="http://schemas.microsoft.com/office/word/2010/wordprocessingCanvas" xmlns:cx="http://schemas.microsoft.com/office/drawing/2014/chartex" xmlns:cx1="http://schemas.microsoft.com/office/drawing/2015/9/8/chartex" xmlns:cx2="http://schemas.microsoft.com/office/drawing/2015/10/21/chartex" xmlns:cx3="http://schemas.microsoft.com/office/drawing/2016/5/9/chartex" xmlns:cx4="http://schemas.microsoft.com/office/drawing/2016/5/10/chartex" xmlns:cx5="http://schemas.microsoft.com/office/drawing/2016/5/11/chartex" xmlns:cx6="http://schemas.microsoft.com/office/drawing/2016/5/12/chartex" xmlns:cx7="http://schemas.microsoft.com/office/drawing/2016/5/13/chartex" xmlns:cx8="http://schemas.microsoft.com/office/drawing/2016/5/14/chartex" xmlns:mc="http://schemas.openxmlformats.org/markup-compatibility/2006" xmlns:aink="http://schemas.microsoft.com/office/drawing/2016/ink" xmlns:am3d="http://schemas.microsoft.com/office/drawing/2017/model3d" xmlns:o="urn:schemas-microsoft-com:office:office" xmlns:oel="http://schemas.microsoft.com/office/2019/extlst" xmlns:r="http://schemas.openxmlformats.org/officeDocument/2006/relationships" xmlns:m="http://schemas.openxmlformats.org/officeDocument/2006/math" xmlns:v="urn:schemas-microsoft-com:vml" xmlns:wp14="http://schemas.microsoft.com/office/word/2010/wordprocessingDrawing" xmlns:wp="http://schemas.openxmlformats.org/drawingml/2006/wordprocessingDrawing" xmlns:w10="urn:schemas-microsoft-com:office:word" xmlns:w="http://schemas.openxmlformats.org/wordprocessingml/2006/main" xmlns:w14="http://schemas.microsoft.com/office/word/2010/wordml" xmlns:w15="http://schemas.microsoft.com/office/word/2012/wordml" xmlns:w16cex="http://schemas.microsoft.com/office/word/2018/wordml/cex" xmlns:w16cid="http://schemas.microsoft.com/office/word/2016/wordml/cid" xmlns:w16="http://schemas.microsoft.com/office/word/2018/wordml" xmlns:w16du="http://schemas.microsoft.com/office/word/2023/wordml/word16du" xmlns:w16sdtdh="http://schemas.microsoft.com/office/word/2020/wordml/sdtdatahash" xmlns:w16sdtfl="http://schemas.microsoft.com/office/word/2024/wordml/sdtformatlock" xmlns:w16se="http://schemas.microsoft.com/office/word/2015/wordml/symex" xmlns:wpg="http://schemas.microsoft.com/office/word/2010/wordprocessingGroup" xmlns:wpi="http://schemas.microsoft.com/office/word/2010/wordprocessingInk" xmlns:wne="http://schemas.microsoft.com/office/word/2006/wordml" xmlns:wps="http://schemas.microsoft.com/office/word/2010/wordprocessingShape" mc:Ignorable="w14 w15 w16se w16cid w16 w16cex w16sdtdh w16sdtfl w16du wp14">
+<w:comments xmlns:wpc="http://schemas.microsoft.com/office/word/2010/wordprocessingCanvas" xmlns:cx="http://schemas.microsoft.com/office/drawing/2014/chartex" xmlns:cx1="http://schemas.microsoft.com/office/drawing/2015/9/8/chartex" xmlns:cx2="http://schemas.microsoft.com/office/drawing/2015/10/21/chartex" xmlns:cx3="http://schemas.microsoft.com/office/drawing/2016/5/9/chartex" xmlns:cx4="http://schemas.microsoft.com/office/drawing/2016/5/10/chartex" xmlns:cx5="http://schemas.microsoft.com/office/drawing/2016/5/11/chartex" xmlns:cx6="http://schemas.microsoft.com/office/drawing/2016/5/12/chartex" xmlns:cx7="http://schemas.microsoft.com/office/drawing/2016/5/13/chartex" xmlns:cx8="http://schemas.microsoft.com/office/drawing/2016/5/14/chartex" xmlns:mc="http://schemas.openxmlformats.org/markup-compatibility/2006" xmlns:aink="http://schemas.microsoft.com/office/drawing/2016/ink" xmlns:am3d="http://schemas.microsoft.com/office/drawing/2017/model3d" xmlns:o="urn:schemas-microsoft-com:office:office" xmlns:oel="http://schemas.microsoft.com/office/2019/extlst" xmlns:r="http://schemas.openxmlformats.org/officeDocument/2006/relationships" xmlns:m="http://schemas.openxmlformats.org/officeDocument/2006/math" xmlns:v="urn:schemas-microsoft-com:vml" xmlns:wp14="http://schemas.microsoft.com/office/word/2010/wordprocessingDrawing" xmlns:wp="http://schemas.openxmlformats.org/drawingml/2006/wordprocessingDrawing" xmlns:w10="urn:schemas-microsoft-com:office:word" xmlns:w="http://schemas.openxmlformats.org/wordprocessingml/2006/main" xmlns:w14="http://schemas.microsoft.com/office/word/2010/wordml" xmlns:w15="http://schemas.microsoft.com/office/word/2012/wordml" xmlns:w16cei="http://schemas.microsoft.com/office/word/2026/wordml/cei" xmlns:w16cex="http://schemas.microsoft.com/office/word/2018/wordml/cex" xmlns:w16cid="http://schemas.microsoft.com/office/word/2016/wordml/cid" xmlns:w16="http://schemas.microsoft.com/office/word/2018/wordml" xmlns:w16du="http://schemas.microsoft.com/office/word/2023/wordml/word16du" xmlns:w16sdtdh="http://schemas.microsoft.com/office/word/2020/wordml/sdtdatahash" xmlns:w16sdtfl="http://schemas.microsoft.com/office/word/2024/wordml/sdtformatlock" xmlns:w16se="http://schemas.microsoft.com/office/word/2015/wordml/symex" xmlns:wpg="http://schemas.microsoft.com/office/word/2010/wordprocessingGroup" xmlns:wpi="http://schemas.microsoft.com/office/word/2010/wordprocessingInk" xmlns:wne="http://schemas.microsoft.com/office/word/2006/wordml" xmlns:wps="http://schemas.microsoft.com/office/word/2010/wordprocessingShape" mc:Ignorable="w14 w15 w16se w16cid w16 w16cex w16sdtdh w16sdtfl w16du wp14">
   <w:comment w:id="3" w:author="GIFFORD, Emma (NHS ENGLAND - X26)" w:date="2024-08-27T13:51:00Z" w:initials="EG">
     <w:p>
       <w:pPr>
@@ -1344,18 +1660,18 @@
         <w:pStyle w:val="CommentText"/>
       </w:pPr>
       <w:r>
-        <w:t xml:space="preserve">Read the </w:t>
+        <w:t xml:space="preserve">Read </w:t>
       </w:r>
       <w:hyperlink r:id="rId4" w:history="1">
         <w:r>
           <w:rPr>
             <w:rStyle w:val="Hyperlink"/>
           </w:rPr>
-          <w:t>full list of personalisation fields</w:t>
+          <w:t>how to provide personalisation data</w:t>
         </w:r>
       </w:hyperlink>
       <w:r>
-        <w:t xml:space="preserve"> that are available.</w:t>
+        <w:t xml:space="preserve"> and the full list of personalisation fields that are available in PDS.</w:t>
       </w:r>
     </w:p>
   </w:comment>
@@ -1438,7 +1754,7 @@
 </file>
 
 <file path=word/commentsExtended.xml><?xml version="1.0" encoding="utf-8"?>
-<w15:commentsEx xmlns:wpc="http://schemas.microsoft.com/office/word/2010/wordprocessingCanvas" xmlns:cx="http://schemas.microsoft.com/office/drawing/2014/chartex" xmlns:cx1="http://schemas.microsoft.com/office/drawing/2015/9/8/chartex" xmlns:cx2="http://schemas.microsoft.com/office/drawing/2015/10/21/chartex" xmlns:cx3="http://schemas.microsoft.com/office/drawing/2016/5/9/chartex" xmlns:cx4="http://schemas.microsoft.com/office/drawing/2016/5/10/chartex" xmlns:cx5="http://schemas.microsoft.com/office/drawing/2016/5/11/chartex" xmlns:cx6="http://schemas.microsoft.com/office/drawing/2016/5/12/chartex" xmlns:cx7="http://schemas.microsoft.com/office/drawing/2016/5/13/chartex" xmlns:cx8="http://schemas.microsoft.com/office/drawing/2016/5/14/chartex" xmlns:mc="http://schemas.openxmlformats.org/markup-compatibility/2006" xmlns:aink="http://schemas.microsoft.com/office/drawing/2016/ink" xmlns:am3d="http://schemas.microsoft.com/office/drawing/2017/model3d" xmlns:o="urn:schemas-microsoft-com:office:office" xmlns:oel="http://schemas.microsoft.com/office/2019/extlst" xmlns:r="http://schemas.openxmlformats.org/officeDocument/2006/relationships" xmlns:m="http://schemas.openxmlformats.org/officeDocument/2006/math" xmlns:v="urn:schemas-microsoft-com:vml" xmlns:wp14="http://schemas.microsoft.com/office/word/2010/wordprocessingDrawing" xmlns:wp="http://schemas.openxmlformats.org/drawingml/2006/wordprocessingDrawing" xmlns:w10="urn:schemas-microsoft-com:office:word" xmlns:w="http://schemas.openxmlformats.org/wordprocessingml/2006/main" xmlns:w14="http://schemas.microsoft.com/office/word/2010/wordml" xmlns:w15="http://schemas.microsoft.com/office/word/2012/wordml" xmlns:w16cex="http://schemas.microsoft.com/office/word/2018/wordml/cex" xmlns:w16cid="http://schemas.microsoft.com/office/word/2016/wordml/cid" xmlns:w16="http://schemas.microsoft.com/office/word/2018/wordml" xmlns:w16du="http://schemas.microsoft.com/office/word/2023/wordml/word16du" xmlns:w16sdtdh="http://schemas.microsoft.com/office/word/2020/wordml/sdtdatahash" xmlns:w16sdtfl="http://schemas.microsoft.com/office/word/2024/wordml/sdtformatlock" xmlns:w16se="http://schemas.microsoft.com/office/word/2015/wordml/symex" xmlns:wpg="http://schemas.microsoft.com/office/word/2010/wordprocessingGroup" xmlns:wpi="http://schemas.microsoft.com/office/word/2010/wordprocessingInk" xmlns:wne="http://schemas.microsoft.com/office/word/2006/wordml" xmlns:wps="http://schemas.microsoft.com/office/word/2010/wordprocessingShape" mc:Ignorable="w14 w15 w16se w16cid w16 w16cex w16sdtdh w16sdtfl w16du wp14">
+<w15:commentsEx xmlns:wpc="http://schemas.microsoft.com/office/word/2010/wordprocessingCanvas" xmlns:cx="http://schemas.microsoft.com/office/drawing/2014/chartex" xmlns:cx1="http://schemas.microsoft.com/office/drawing/2015/9/8/chartex" xmlns:cx2="http://schemas.microsoft.com/office/drawing/2015/10/21/chartex" xmlns:cx3="http://schemas.microsoft.com/office/drawing/2016/5/9/chartex" xmlns:cx4="http://schemas.microsoft.com/office/drawing/2016/5/10/chartex" xmlns:cx5="http://schemas.microsoft.com/office/drawing/2016/5/11/chartex" xmlns:cx6="http://schemas.microsoft.com/office/drawing/2016/5/12/chartex" xmlns:cx7="http://schemas.microsoft.com/office/drawing/2016/5/13/chartex" xmlns:cx8="http://schemas.microsoft.com/office/drawing/2016/5/14/chartex" xmlns:mc="http://schemas.openxmlformats.org/markup-compatibility/2006" xmlns:aink="http://schemas.microsoft.com/office/drawing/2016/ink" xmlns:am3d="http://schemas.microsoft.com/office/drawing/2017/model3d" xmlns:o="urn:schemas-microsoft-com:office:office" xmlns:oel="http://schemas.microsoft.com/office/2019/extlst" xmlns:r="http://schemas.openxmlformats.org/officeDocument/2006/relationships" xmlns:m="http://schemas.openxmlformats.org/officeDocument/2006/math" xmlns:v="urn:schemas-microsoft-com:vml" xmlns:wp14="http://schemas.microsoft.com/office/word/2010/wordprocessingDrawing" xmlns:wp="http://schemas.openxmlformats.org/drawingml/2006/wordprocessingDrawing" xmlns:w10="urn:schemas-microsoft-com:office:word" xmlns:w="http://schemas.openxmlformats.org/wordprocessingml/2006/main" xmlns:w14="http://schemas.microsoft.com/office/word/2010/wordml" xmlns:w15="http://schemas.microsoft.com/office/word/2012/wordml" xmlns:w16cei="http://schemas.microsoft.com/office/word/2026/wordml/cei" xmlns:w16cex="http://schemas.microsoft.com/office/word/2018/wordml/cex" xmlns:w16cid="http://schemas.microsoft.com/office/word/2016/wordml/cid" xmlns:w16="http://schemas.microsoft.com/office/word/2018/wordml" xmlns:w16du="http://schemas.microsoft.com/office/word/2023/wordml/word16du" xmlns:w16sdtdh="http://schemas.microsoft.com/office/word/2020/wordml/sdtdatahash" xmlns:w16sdtfl="http://schemas.microsoft.com/office/word/2024/wordml/sdtformatlock" xmlns:w16se="http://schemas.microsoft.com/office/word/2015/wordml/symex" xmlns:wpg="http://schemas.microsoft.com/office/word/2010/wordprocessingGroup" xmlns:wpi="http://schemas.microsoft.com/office/word/2010/wordprocessingInk" xmlns:wne="http://schemas.microsoft.com/office/word/2006/wordml" xmlns:wps="http://schemas.microsoft.com/office/word/2010/wordprocessingShape" mc:Ignorable="w14 w15 w16se w16cid w16 w16cex w16sdtdh w16sdtfl w16du wp14">
   <w15:commentEx w15:paraId="5658C2AB" w15:done="0"/>
   <w15:commentEx w15:paraId="5D816678" w15:done="0"/>
   <w15:commentEx w15:paraId="600C8EC2" w15:done="0"/>
@@ -1447,13 +1763,13 @@
   <w15:commentEx w15:paraId="54AC1DDD" w15:done="0"/>
   <w15:commentEx w15:paraId="7348D7CE" w15:done="0"/>
   <w15:commentEx w15:paraId="40373886" w15:done="0"/>
-  <w15:commentEx w15:paraId="7E4F311B" w15:done="0"/>
-  <w15:commentEx w15:paraId="5CCB82EE" w15:done="0"/>
+  <w15:commentEx w15:paraId="21401BBE" w15:done="0"/>
+  <w15:commentEx w15:paraId="59F2E32A" w15:done="0"/>
 </w15:commentsEx>
 </file>
 
 <file path=word/commentsExtensible.xml><?xml version="1.0" encoding="utf-8"?>
-<w16cex:commentsExtensible xmlns:wpc="http://schemas.microsoft.com/office/word/2010/wordprocessingCanvas" xmlns:cx="http://schemas.microsoft.com/office/drawing/2014/chartex" xmlns:cx1="http://schemas.microsoft.com/office/drawing/2015/9/8/chartex" xmlns:cx2="http://schemas.microsoft.com/office/drawing/2015/10/21/chartex" xmlns:cx3="http://schemas.microsoft.com/office/drawing/2016/5/9/chartex" xmlns:cx4="http://schemas.microsoft.com/office/drawing/2016/5/10/chartex" xmlns:cx5="http://schemas.microsoft.com/office/drawing/2016/5/11/chartex" xmlns:cx6="http://schemas.microsoft.com/office/drawing/2016/5/12/chartex" xmlns:cx7="http://schemas.microsoft.com/office/drawing/2016/5/13/chartex" xmlns:cx8="http://schemas.microsoft.com/office/drawing/2016/5/14/chartex" xmlns:cr="http://schemas.microsoft.com/office/comments/2020/reactions" xmlns:mc="http://schemas.openxmlformats.org/markup-compatibility/2006" xmlns:aink="http://schemas.microsoft.com/office/drawing/2016/ink" xmlns:am3d="http://schemas.microsoft.com/office/drawing/2017/model3d" xmlns:o="urn:schemas-microsoft-com:office:office" xmlns:oel="http://schemas.microsoft.com/office/2019/extlst" xmlns:r="http://schemas.openxmlformats.org/officeDocument/2006/relationships" xmlns:m="http://schemas.openxmlformats.org/officeDocument/2006/math" xmlns:v="urn:schemas-microsoft-com:vml" xmlns:wp14="http://schemas.microsoft.com/office/word/2010/wordprocessingDrawing" xmlns:wp="http://schemas.openxmlformats.org/drawingml/2006/wordprocessingDrawing" xmlns:w10="urn:schemas-microsoft-com:office:word" xmlns:w="http://schemas.openxmlformats.org/wordprocessingml/2006/main" xmlns:w14="http://schemas.microsoft.com/office/word/2010/wordml" xmlns:w15="http://schemas.microsoft.com/office/word/2012/wordml" xmlns:w16cex="http://schemas.microsoft.com/office/word/2018/wordml/cex" xmlns:w16cid="http://schemas.microsoft.com/office/word/2016/wordml/cid" xmlns:w16="http://schemas.microsoft.com/office/word/2018/wordml" xmlns:w16du="http://schemas.microsoft.com/office/word/2023/wordml/word16du" xmlns:w16sdtdh="http://schemas.microsoft.com/office/word/2020/wordml/sdtdatahash" xmlns:w16sdtfl="http://schemas.microsoft.com/office/word/2024/wordml/sdtformatlock" xmlns:w16se="http://schemas.microsoft.com/office/word/2015/wordml/symex" xmlns:wpg="http://schemas.microsoft.com/office/word/2010/wordprocessingGroup" xmlns:wpi="http://schemas.microsoft.com/office/word/2010/wordprocessingInk" xmlns:wne="http://schemas.microsoft.com/office/word/2006/wordml" xmlns:wps="http://schemas.microsoft.com/office/word/2010/wordprocessingShape" mc:Ignorable="w14 w15 w16se w16cid w16 w16cex w16sdtdh w16sdtfl cr w16du wp14">
+<w16cex:commentsExtensible xmlns:wpc="http://schemas.microsoft.com/office/word/2010/wordprocessingCanvas" xmlns:cx="http://schemas.microsoft.com/office/drawing/2014/chartex" xmlns:cx1="http://schemas.microsoft.com/office/drawing/2015/9/8/chartex" xmlns:cx2="http://schemas.microsoft.com/office/drawing/2015/10/21/chartex" xmlns:cx3="http://schemas.microsoft.com/office/drawing/2016/5/9/chartex" xmlns:cx4="http://schemas.microsoft.com/office/drawing/2016/5/10/chartex" xmlns:cx5="http://schemas.microsoft.com/office/drawing/2016/5/11/chartex" xmlns:cx6="http://schemas.microsoft.com/office/drawing/2016/5/12/chartex" xmlns:cx7="http://schemas.microsoft.com/office/drawing/2016/5/13/chartex" xmlns:cx8="http://schemas.microsoft.com/office/drawing/2016/5/14/chartex" xmlns:cr="http://schemas.microsoft.com/office/comments/2020/reactions" xmlns:mc="http://schemas.openxmlformats.org/markup-compatibility/2006" xmlns:aink="http://schemas.microsoft.com/office/drawing/2016/ink" xmlns:am3d="http://schemas.microsoft.com/office/drawing/2017/model3d" xmlns:o="urn:schemas-microsoft-com:office:office" xmlns:oel="http://schemas.microsoft.com/office/2019/extlst" xmlns:r="http://schemas.openxmlformats.org/officeDocument/2006/relationships" xmlns:m="http://schemas.openxmlformats.org/officeDocument/2006/math" xmlns:v="urn:schemas-microsoft-com:vml" xmlns:wp14="http://schemas.microsoft.com/office/word/2010/wordprocessingDrawing" xmlns:wp="http://schemas.openxmlformats.org/drawingml/2006/wordprocessingDrawing" xmlns:w10="urn:schemas-microsoft-com:office:word" xmlns:w="http://schemas.openxmlformats.org/wordprocessingml/2006/main" xmlns:w14="http://schemas.microsoft.com/office/word/2010/wordml" xmlns:w15="http://schemas.microsoft.com/office/word/2012/wordml" xmlns:w16cei="http://schemas.microsoft.com/office/word/2026/wordml/cei" xmlns:w16cex="http://schemas.microsoft.com/office/word/2018/wordml/cex" xmlns:w16cid="http://schemas.microsoft.com/office/word/2016/wordml/cid" xmlns:w16="http://schemas.microsoft.com/office/word/2018/wordml" xmlns:w16du="http://schemas.microsoft.com/office/word/2023/wordml/word16du" xmlns:w16sdtdh="http://schemas.microsoft.com/office/word/2020/wordml/sdtdatahash" xmlns:w16sdtfl="http://schemas.microsoft.com/office/word/2024/wordml/sdtformatlock" xmlns:w16se="http://schemas.microsoft.com/office/word/2015/wordml/symex" xmlns:wpg="http://schemas.microsoft.com/office/word/2010/wordprocessingGroup" xmlns:wpi="http://schemas.microsoft.com/office/word/2010/wordprocessingInk" xmlns:wne="http://schemas.microsoft.com/office/word/2006/wordml" xmlns:wps="http://schemas.microsoft.com/office/word/2010/wordprocessingShape" mc:Ignorable="w14 w15 w16se w16cid w16 w16cex w16sdtdh w16sdtfl cr w16du wp14">
   <w16cex:commentExtensible w16cex:durableId="5C50AEC9" w16cex:dateUtc="2024-08-27T12:51:00Z"/>
   <w16cex:commentExtensible w16cex:durableId="3B7EFCB6" w16cex:dateUtc="2024-08-27T12:50:00Z"/>
   <w16cex:commentExtensible w16cex:durableId="7D5B7042" w16cex:dateUtc="2024-08-27T13:00:00Z"/>
@@ -1468,7 +1784,7 @@
 </file>
 
 <file path=word/commentsIds.xml><?xml version="1.0" encoding="utf-8"?>
-<w16cid:commentsIds xmlns:wpc="http://schemas.microsoft.com/office/word/2010/wordprocessingCanvas" xmlns:cx="http://schemas.microsoft.com/office/drawing/2014/chartex" xmlns:cx1="http://schemas.microsoft.com/office/drawing/2015/9/8/chartex" xmlns:cx2="http://schemas.microsoft.com/office/drawing/2015/10/21/chartex" xmlns:cx3="http://schemas.microsoft.com/office/drawing/2016/5/9/chartex" xmlns:cx4="http://schemas.microsoft.com/office/drawing/2016/5/10/chartex" xmlns:cx5="http://schemas.microsoft.com/office/drawing/2016/5/11/chartex" xmlns:cx6="http://schemas.microsoft.com/office/drawing/2016/5/12/chartex" xmlns:cx7="http://schemas.microsoft.com/office/drawing/2016/5/13/chartex" xmlns:cx8="http://schemas.microsoft.com/office/drawing/2016/5/14/chartex" xmlns:mc="http://schemas.openxmlformats.org/markup-compatibility/2006" xmlns:aink="http://schemas.microsoft.com/office/drawing/2016/ink" xmlns:am3d="http://schemas.microsoft.com/office/drawing/2017/model3d" xmlns:o="urn:schemas-microsoft-com:office:office" xmlns:oel="http://schemas.microsoft.com/office/2019/extlst" xmlns:r="http://schemas.openxmlformats.org/officeDocument/2006/relationships" xmlns:m="http://schemas.openxmlformats.org/officeDocument/2006/math" xmlns:v="urn:schemas-microsoft-com:vml" xmlns:wp14="http://schemas.microsoft.com/office/word/2010/wordprocessingDrawing" xmlns:wp="http://schemas.openxmlformats.org/drawingml/2006/wordprocessingDrawing" xmlns:w10="urn:schemas-microsoft-com:office:word" xmlns:w="http://schemas.openxmlformats.org/wordprocessingml/2006/main" xmlns:w14="http://schemas.microsoft.com/office/word/2010/wordml" xmlns:w15="http://schemas.microsoft.com/office/word/2012/wordml" xmlns:w16cex="http://schemas.microsoft.com/office/word/2018/wordml/cex" xmlns:w16cid="http://schemas.microsoft.com/office/word/2016/wordml/cid" xmlns:w16="http://schemas.microsoft.com/office/word/2018/wordml" xmlns:w16du="http://schemas.microsoft.com/office/word/2023/wordml/word16du" xmlns:w16sdtdh="http://schemas.microsoft.com/office/word/2020/wordml/sdtdatahash" xmlns:w16sdtfl="http://schemas.microsoft.com/office/word/2024/wordml/sdtformatlock" xmlns:w16se="http://schemas.microsoft.com/office/word/2015/wordml/symex" xmlns:wpg="http://schemas.microsoft.com/office/word/2010/wordprocessingGroup" xmlns:wpi="http://schemas.microsoft.com/office/word/2010/wordprocessingInk" xmlns:wne="http://schemas.microsoft.com/office/word/2006/wordml" xmlns:wps="http://schemas.microsoft.com/office/word/2010/wordprocessingShape" mc:Ignorable="w14 w15 w16se w16cid w16 w16cex w16sdtdh w16sdtfl w16du wp14">
+<w16cid:commentsIds xmlns:wpc="http://schemas.microsoft.com/office/word/2010/wordprocessingCanvas" xmlns:cx="http://schemas.microsoft.com/office/drawing/2014/chartex" xmlns:cx1="http://schemas.microsoft.com/office/drawing/2015/9/8/chartex" xmlns:cx2="http://schemas.microsoft.com/office/drawing/2015/10/21/chartex" xmlns:cx3="http://schemas.microsoft.com/office/drawing/2016/5/9/chartex" xmlns:cx4="http://schemas.microsoft.com/office/drawing/2016/5/10/chartex" xmlns:cx5="http://schemas.microsoft.com/office/drawing/2016/5/11/chartex" xmlns:cx6="http://schemas.microsoft.com/office/drawing/2016/5/12/chartex" xmlns:cx7="http://schemas.microsoft.com/office/drawing/2016/5/13/chartex" xmlns:cx8="http://schemas.microsoft.com/office/drawing/2016/5/14/chartex" xmlns:mc="http://schemas.openxmlformats.org/markup-compatibility/2006" xmlns:aink="http://schemas.microsoft.com/office/drawing/2016/ink" xmlns:am3d="http://schemas.microsoft.com/office/drawing/2017/model3d" xmlns:o="urn:schemas-microsoft-com:office:office" xmlns:oel="http://schemas.microsoft.com/office/2019/extlst" xmlns:r="http://schemas.openxmlformats.org/officeDocument/2006/relationships" xmlns:m="http://schemas.openxmlformats.org/officeDocument/2006/math" xmlns:v="urn:schemas-microsoft-com:vml" xmlns:wp14="http://schemas.microsoft.com/office/word/2010/wordprocessingDrawing" xmlns:wp="http://schemas.openxmlformats.org/drawingml/2006/wordprocessingDrawing" xmlns:w10="urn:schemas-microsoft-com:office:word" xmlns:w="http://schemas.openxmlformats.org/wordprocessingml/2006/main" xmlns:w14="http://schemas.microsoft.com/office/word/2010/wordml" xmlns:w15="http://schemas.microsoft.com/office/word/2012/wordml" xmlns:w16cei="http://schemas.microsoft.com/office/word/2026/wordml/cei" xmlns:w16cex="http://schemas.microsoft.com/office/word/2018/wordml/cex" xmlns:w16cid="http://schemas.microsoft.com/office/word/2016/wordml/cid" xmlns:w16="http://schemas.microsoft.com/office/word/2018/wordml" xmlns:w16du="http://schemas.microsoft.com/office/word/2023/wordml/word16du" xmlns:w16sdtdh="http://schemas.microsoft.com/office/word/2020/wordml/sdtdatahash" xmlns:w16sdtfl="http://schemas.microsoft.com/office/word/2024/wordml/sdtformatlock" xmlns:w16se="http://schemas.microsoft.com/office/word/2015/wordml/symex" xmlns:wpg="http://schemas.microsoft.com/office/word/2010/wordprocessingGroup" xmlns:wpi="http://schemas.microsoft.com/office/word/2010/wordprocessingInk" xmlns:wne="http://schemas.microsoft.com/office/word/2006/wordml" xmlns:wps="http://schemas.microsoft.com/office/word/2010/wordprocessingShape" mc:Ignorable="w14 w15 w16se w16cid w16 w16cex w16sdtdh w16sdtfl w16du wp14">
   <w16cid:commentId w16cid:paraId="5658C2AB" w16cid:durableId="5C50AEC9"/>
   <w16cid:commentId w16cid:paraId="5D816678" w16cid:durableId="3B7EFCB6"/>
   <w16cid:commentId w16cid:paraId="600C8EC2" w16cid:durableId="7D5B7042"/>
@@ -1477,13 +1793,13 @@
   <w16cid:commentId w16cid:paraId="54AC1DDD" w16cid:durableId="21904BF1"/>
   <w16cid:commentId w16cid:paraId="7348D7CE" w16cid:durableId="36340119"/>
   <w16cid:commentId w16cid:paraId="40373886" w16cid:durableId="6A34F8AF"/>
-  <w16cid:commentId w16cid:paraId="7E4F311B" w16cid:durableId="27241A13"/>
-  <w16cid:commentId w16cid:paraId="5CCB82EE" w16cid:durableId="2865DA4F"/>
+  <w16cid:commentId w16cid:paraId="21401BBE" w16cid:durableId="27241A13"/>
+  <w16cid:commentId w16cid:paraId="59F2E32A" w16cid:durableId="2865DA4F"/>
 </w16cid:commentsIds>
 </file>
 
 <file path=word/endnotes.xml><?xml version="1.0" encoding="utf-8"?>
-<w:endnotes xmlns:wpc="http://schemas.microsoft.com/office/word/2010/wordprocessingCanvas" xmlns:cx="http://schemas.microsoft.com/office/drawing/2014/chartex" xmlns:cx1="http://schemas.microsoft.com/office/drawing/2015/9/8/chartex" xmlns:cx2="http://schemas.microsoft.com/office/drawing/2015/10/21/chartex" xmlns:cx3="http://schemas.microsoft.com/office/drawing/2016/5/9/chartex" xmlns:cx4="http://schemas.microsoft.com/office/drawing/2016/5/10/chartex" xmlns:cx5="http://schemas.microsoft.com/office/drawing/2016/5/11/chartex" xmlns:cx6="http://schemas.microsoft.com/office/drawing/2016/5/12/chartex" xmlns:cx7="http://schemas.microsoft.com/office/drawing/2016/5/13/chartex" xmlns:cx8="http://schemas.microsoft.com/office/drawing/2016/5/14/chartex" xmlns:mc="http://schemas.openxmlformats.org/markup-compatibility/2006" xmlns:aink="http://schemas.microsoft.com/office/drawing/2016/ink" xmlns:am3d="http://schemas.microsoft.com/office/drawing/2017/model3d" xmlns:o="urn:schemas-microsoft-com:office:office" xmlns:oel="http://schemas.microsoft.com/office/2019/extlst" xmlns:r="http://schemas.openxmlformats.org/officeDocument/2006/relationships" xmlns:m="http://schemas.openxmlformats.org/officeDocument/2006/math" xmlns:v="urn:schemas-microsoft-com:vml" xmlns:wp14="http://schemas.microsoft.com/office/word/2010/wordprocessingDrawing" xmlns:wp="http://schemas.openxmlformats.org/drawingml/2006/wordprocessingDrawing" xmlns:w10="urn:schemas-microsoft-com:office:word" xmlns:w="http://schemas.openxmlformats.org/wordprocessingml/2006/main" xmlns:w14="http://schemas.microsoft.com/office/word/2010/wordml" xmlns:w15="http://schemas.microsoft.com/office/word/2012/wordml" xmlns:w16cex="http://schemas.microsoft.com/office/word/2018/wordml/cex" xmlns:w16cid="http://schemas.microsoft.com/office/word/2016/wordml/cid" xmlns:w16="http://schemas.microsoft.com/office/word/2018/wordml" xmlns:w16du="http://schemas.microsoft.com/office/word/2023/wordml/word16du" xmlns:w16sdtdh="http://schemas.microsoft.com/office/word/2020/wordml/sdtdatahash" xmlns:w16sdtfl="http://schemas.microsoft.com/office/word/2024/wordml/sdtformatlock" xmlns:w16se="http://schemas.microsoft.com/office/word/2015/wordml/symex" xmlns:wpg="http://schemas.microsoft.com/office/word/2010/wordprocessingGroup" xmlns:wpi="http://schemas.microsoft.com/office/word/2010/wordprocessingInk" xmlns:wne="http://schemas.microsoft.com/office/word/2006/wordml" xmlns:wps="http://schemas.microsoft.com/office/word/2010/wordprocessingShape" mc:Ignorable="w14 w15 w16se w16cid w16 w16cex w16sdtdh w16sdtfl w16du wp14">
+<w:endnotes xmlns:wpc="http://schemas.microsoft.com/office/word/2010/wordprocessingCanvas" xmlns:cx="http://schemas.microsoft.com/office/drawing/2014/chartex" xmlns:cx1="http://schemas.microsoft.com/office/drawing/2015/9/8/chartex" xmlns:cx2="http://schemas.microsoft.com/office/drawing/2015/10/21/chartex" xmlns:cx3="http://schemas.microsoft.com/office/drawing/2016/5/9/chartex" xmlns:cx4="http://schemas.microsoft.com/office/drawing/2016/5/10/chartex" xmlns:cx5="http://schemas.microsoft.com/office/drawing/2016/5/11/chartex" xmlns:cx6="http://schemas.microsoft.com/office/drawing/2016/5/12/chartex" xmlns:cx7="http://schemas.microsoft.com/office/drawing/2016/5/13/chartex" xmlns:cx8="http://schemas.microsoft.com/office/drawing/2016/5/14/chartex" xmlns:mc="http://schemas.openxmlformats.org/markup-compatibility/2006" xmlns:aink="http://schemas.microsoft.com/office/drawing/2016/ink" xmlns:am3d="http://schemas.microsoft.com/office/drawing/2017/model3d" xmlns:o="urn:schemas-microsoft-com:office:office" xmlns:oel="http://schemas.microsoft.com/office/2019/extlst" xmlns:r="http://schemas.openxmlformats.org/officeDocument/2006/relationships" xmlns:m="http://schemas.openxmlformats.org/officeDocument/2006/math" xmlns:v="urn:schemas-microsoft-com:vml" xmlns:wp14="http://schemas.microsoft.com/office/word/2010/wordprocessingDrawing" xmlns:wp="http://schemas.openxmlformats.org/drawingml/2006/wordprocessingDrawing" xmlns:w10="urn:schemas-microsoft-com:office:word" xmlns:w="http://schemas.openxmlformats.org/wordprocessingml/2006/main" xmlns:w14="http://schemas.microsoft.com/office/word/2010/wordml" xmlns:w15="http://schemas.microsoft.com/office/word/2012/wordml" xmlns:w16cei="http://schemas.microsoft.com/office/word/2026/wordml/cei" xmlns:w16cex="http://schemas.microsoft.com/office/word/2018/wordml/cex" xmlns:w16cid="http://schemas.microsoft.com/office/word/2016/wordml/cid" xmlns:w16="http://schemas.microsoft.com/office/word/2018/wordml" xmlns:w16du="http://schemas.microsoft.com/office/word/2023/wordml/word16du" xmlns:w16sdtdh="http://schemas.microsoft.com/office/word/2020/wordml/sdtdatahash" xmlns:w16sdtfl="http://schemas.microsoft.com/office/word/2024/wordml/sdtformatlock" xmlns:w16se="http://schemas.microsoft.com/office/word/2015/wordml/symex" xmlns:wpg="http://schemas.microsoft.com/office/word/2010/wordprocessingGroup" xmlns:wpi="http://schemas.microsoft.com/office/word/2010/wordprocessingInk" xmlns:wne="http://schemas.microsoft.com/office/word/2006/wordml" xmlns:wps="http://schemas.microsoft.com/office/word/2010/wordprocessingShape" mc:Ignorable="w14 w15 w16se w16cid w16 w16cex w16sdtdh w16sdtfl w16du wp14">
   <w:endnote w:type="separator" w:id="-1">
     <w:p>
       <w:r>
@@ -1502,7 +1818,7 @@
 </file>
 
 <file path=word/footer1.xml><?xml version="1.0" encoding="utf-8"?>
-<w:ftr xmlns:wpc="http://schemas.microsoft.com/office/word/2010/wordprocessingCanvas" xmlns:cx="http://schemas.microsoft.com/office/drawing/2014/chartex" xmlns:cx1="http://schemas.microsoft.com/office/drawing/2015/9/8/chartex" xmlns:cx2="http://schemas.microsoft.com/office/drawing/2015/10/21/chartex" xmlns:cx3="http://schemas.microsoft.com/office/drawing/2016/5/9/chartex" xmlns:cx4="http://schemas.microsoft.com/office/drawing/2016/5/10/chartex" xmlns:cx5="http://schemas.microsoft.com/office/drawing/2016/5/11/chartex" xmlns:cx6="http://schemas.microsoft.com/office/drawing/2016/5/12/chartex" xmlns:cx7="http://schemas.microsoft.com/office/drawing/2016/5/13/chartex" xmlns:cx8="http://schemas.microsoft.com/office/drawing/2016/5/14/chartex" xmlns:mc="http://schemas.openxmlformats.org/markup-compatibility/2006" xmlns:aink="http://schemas.microsoft.com/office/drawing/2016/ink" xmlns:am3d="http://schemas.microsoft.com/office/drawing/2017/model3d" xmlns:o="urn:schemas-microsoft-com:office:office" xmlns:oel="http://schemas.microsoft.com/office/2019/extlst" xmlns:r="http://schemas.openxmlformats.org/officeDocument/2006/relationships" xmlns:m="http://schemas.openxmlformats.org/officeDocument/2006/math" xmlns:v="urn:schemas-microsoft-com:vml" xmlns:wp14="http://schemas.microsoft.com/office/word/2010/wordprocessingDrawing" xmlns:wp="http://schemas.openxmlformats.org/drawingml/2006/wordprocessingDrawing" xmlns:w10="urn:schemas-microsoft-com:office:word" xmlns:w="http://schemas.openxmlformats.org/wordprocessingml/2006/main" xmlns:w14="http://schemas.microsoft.com/office/word/2010/wordml" xmlns:w15="http://schemas.microsoft.com/office/word/2012/wordml" xmlns:w16cex="http://schemas.microsoft.com/office/word/2018/wordml/cex" xmlns:w16cid="http://schemas.microsoft.com/office/word/2016/wordml/cid" xmlns:w16="http://schemas.microsoft.com/office/word/2018/wordml" xmlns:w16du="http://schemas.microsoft.com/office/word/2023/wordml/word16du" xmlns:w16sdtdh="http://schemas.microsoft.com/office/word/2020/wordml/sdtdatahash" xmlns:w16sdtfl="http://schemas.microsoft.com/office/word/2024/wordml/sdtformatlock" xmlns:w16se="http://schemas.microsoft.com/office/word/2015/wordml/symex" xmlns:wpg="http://schemas.microsoft.com/office/word/2010/wordprocessingGroup" xmlns:wpi="http://schemas.microsoft.com/office/word/2010/wordprocessingInk" xmlns:wne="http://schemas.microsoft.com/office/word/2006/wordml" xmlns:wps="http://schemas.microsoft.com/office/word/2010/wordprocessingShape" mc:Ignorable="w14 w15 w16se w16cid w16 w16cex w16sdtdh w16sdtfl w16du wp14">
+<w:ftr xmlns:wpc="http://schemas.microsoft.com/office/word/2010/wordprocessingCanvas" xmlns:cx="http://schemas.microsoft.com/office/drawing/2014/chartex" xmlns:cx1="http://schemas.microsoft.com/office/drawing/2015/9/8/chartex" xmlns:cx2="http://schemas.microsoft.com/office/drawing/2015/10/21/chartex" xmlns:cx3="http://schemas.microsoft.com/office/drawing/2016/5/9/chartex" xmlns:cx4="http://schemas.microsoft.com/office/drawing/2016/5/10/chartex" xmlns:cx5="http://schemas.microsoft.com/office/drawing/2016/5/11/chartex" xmlns:cx6="http://schemas.microsoft.com/office/drawing/2016/5/12/chartex" xmlns:cx7="http://schemas.microsoft.com/office/drawing/2016/5/13/chartex" xmlns:cx8="http://schemas.microsoft.com/office/drawing/2016/5/14/chartex" xmlns:mc="http://schemas.openxmlformats.org/markup-compatibility/2006" xmlns:aink="http://schemas.microsoft.com/office/drawing/2016/ink" xmlns:am3d="http://schemas.microsoft.com/office/drawing/2017/model3d" xmlns:o="urn:schemas-microsoft-com:office:office" xmlns:oel="http://schemas.microsoft.com/office/2019/extlst" xmlns:r="http://schemas.openxmlformats.org/officeDocument/2006/relationships" xmlns:m="http://schemas.openxmlformats.org/officeDocument/2006/math" xmlns:v="urn:schemas-microsoft-com:vml" xmlns:wp14="http://schemas.microsoft.com/office/word/2010/wordprocessingDrawing" xmlns:wp="http://schemas.openxmlformats.org/drawingml/2006/wordprocessingDrawing" xmlns:w10="urn:schemas-microsoft-com:office:word" xmlns:w="http://schemas.openxmlformats.org/wordprocessingml/2006/main" xmlns:w14="http://schemas.microsoft.com/office/word/2010/wordml" xmlns:w15="http://schemas.microsoft.com/office/word/2012/wordml" xmlns:w16cei="http://schemas.microsoft.com/office/word/2026/wordml/cei" xmlns:w16cex="http://schemas.microsoft.com/office/word/2018/wordml/cex" xmlns:w16cid="http://schemas.microsoft.com/office/word/2016/wordml/cid" xmlns:w16="http://schemas.microsoft.com/office/word/2018/wordml" xmlns:w16du="http://schemas.microsoft.com/office/word/2023/wordml/word16du" xmlns:w16sdtdh="http://schemas.microsoft.com/office/word/2020/wordml/sdtdatahash" xmlns:w16sdtfl="http://schemas.microsoft.com/office/word/2024/wordml/sdtformatlock" xmlns:w16se="http://schemas.microsoft.com/office/word/2015/wordml/symex" xmlns:wpg="http://schemas.microsoft.com/office/word/2010/wordprocessingGroup" xmlns:wpi="http://schemas.microsoft.com/office/word/2010/wordprocessingInk" xmlns:wne="http://schemas.microsoft.com/office/word/2006/wordml" xmlns:wps="http://schemas.microsoft.com/office/word/2010/wordprocessingShape" mc:Ignorable="w14 w15 w16se w16cid w16 w16cex w16sdtdh w16sdtfl w16du wp14">
   <w:sdt>
     <w:sdtPr>
       <w:id w:val="1062981965"/>
@@ -1605,7 +1921,7 @@
 </file>
 
 <file path=word/footer2.xml><?xml version="1.0" encoding="utf-8"?>
-<w:ftr xmlns:wpc="http://schemas.microsoft.com/office/word/2010/wordprocessingCanvas" xmlns:cx="http://schemas.microsoft.com/office/drawing/2014/chartex" xmlns:cx1="http://schemas.microsoft.com/office/drawing/2015/9/8/chartex" xmlns:cx2="http://schemas.microsoft.com/office/drawing/2015/10/21/chartex" xmlns:cx3="http://schemas.microsoft.com/office/drawing/2016/5/9/chartex" xmlns:cx4="http://schemas.microsoft.com/office/drawing/2016/5/10/chartex" xmlns:cx5="http://schemas.microsoft.com/office/drawing/2016/5/11/chartex" xmlns:cx6="http://schemas.microsoft.com/office/drawing/2016/5/12/chartex" xmlns:cx7="http://schemas.microsoft.com/office/drawing/2016/5/13/chartex" xmlns:cx8="http://schemas.microsoft.com/office/drawing/2016/5/14/chartex" xmlns:mc="http://schemas.openxmlformats.org/markup-compatibility/2006" xmlns:aink="http://schemas.microsoft.com/office/drawing/2016/ink" xmlns:am3d="http://schemas.microsoft.com/office/drawing/2017/model3d" xmlns:o="urn:schemas-microsoft-com:office:office" xmlns:oel="http://schemas.microsoft.com/office/2019/extlst" xmlns:r="http://schemas.openxmlformats.org/officeDocument/2006/relationships" xmlns:m="http://schemas.openxmlformats.org/officeDocument/2006/math" xmlns:v="urn:schemas-microsoft-com:vml" xmlns:wp14="http://schemas.microsoft.com/office/word/2010/wordprocessingDrawing" xmlns:wp="http://schemas.openxmlformats.org/drawingml/2006/wordprocessingDrawing" xmlns:w10="urn:schemas-microsoft-com:office:word" xmlns:w="http://schemas.openxmlformats.org/wordprocessingml/2006/main" xmlns:w14="http://schemas.microsoft.com/office/word/2010/wordml" xmlns:w15="http://schemas.microsoft.com/office/word/2012/wordml" xmlns:w16cex="http://schemas.microsoft.com/office/word/2018/wordml/cex" xmlns:w16cid="http://schemas.microsoft.com/office/word/2016/wordml/cid" xmlns:w16="http://schemas.microsoft.com/office/word/2018/wordml" xmlns:w16du="http://schemas.microsoft.com/office/word/2023/wordml/word16du" xmlns:w16sdtdh="http://schemas.microsoft.com/office/word/2020/wordml/sdtdatahash" xmlns:w16sdtfl="http://schemas.microsoft.com/office/word/2024/wordml/sdtformatlock" xmlns:w16se="http://schemas.microsoft.com/office/word/2015/wordml/symex" xmlns:wpg="http://schemas.microsoft.com/office/word/2010/wordprocessingGroup" xmlns:wpi="http://schemas.microsoft.com/office/word/2010/wordprocessingInk" xmlns:wne="http://schemas.microsoft.com/office/word/2006/wordml" xmlns:wps="http://schemas.microsoft.com/office/word/2010/wordprocessingShape" mc:Ignorable="w14 w15 w16se w16cid w16 w16cex w16sdtdh w16sdtfl w16du wp14">
+<w:ftr xmlns:wpc="http://schemas.microsoft.com/office/word/2010/wordprocessingCanvas" xmlns:cx="http://schemas.microsoft.com/office/drawing/2014/chartex" xmlns:cx1="http://schemas.microsoft.com/office/drawing/2015/9/8/chartex" xmlns:cx2="http://schemas.microsoft.com/office/drawing/2015/10/21/chartex" xmlns:cx3="http://schemas.microsoft.com/office/drawing/2016/5/9/chartex" xmlns:cx4="http://schemas.microsoft.com/office/drawing/2016/5/10/chartex" xmlns:cx5="http://schemas.microsoft.com/office/drawing/2016/5/11/chartex" xmlns:cx6="http://schemas.microsoft.com/office/drawing/2016/5/12/chartex" xmlns:cx7="http://schemas.microsoft.com/office/drawing/2016/5/13/chartex" xmlns:cx8="http://schemas.microsoft.com/office/drawing/2016/5/14/chartex" xmlns:mc="http://schemas.openxmlformats.org/markup-compatibility/2006" xmlns:aink="http://schemas.microsoft.com/office/drawing/2016/ink" xmlns:am3d="http://schemas.microsoft.com/office/drawing/2017/model3d" xmlns:o="urn:schemas-microsoft-com:office:office" xmlns:oel="http://schemas.microsoft.com/office/2019/extlst" xmlns:r="http://schemas.openxmlformats.org/officeDocument/2006/relationships" xmlns:m="http://schemas.openxmlformats.org/officeDocument/2006/math" xmlns:v="urn:schemas-microsoft-com:vml" xmlns:wp14="http://schemas.microsoft.com/office/word/2010/wordprocessingDrawing" xmlns:wp="http://schemas.openxmlformats.org/drawingml/2006/wordprocessingDrawing" xmlns:w10="urn:schemas-microsoft-com:office:word" xmlns:w="http://schemas.openxmlformats.org/wordprocessingml/2006/main" xmlns:w14="http://schemas.microsoft.com/office/word/2010/wordml" xmlns:w15="http://schemas.microsoft.com/office/word/2012/wordml" xmlns:w16cei="http://schemas.microsoft.com/office/word/2026/wordml/cei" xmlns:w16cex="http://schemas.microsoft.com/office/word/2018/wordml/cex" xmlns:w16cid="http://schemas.microsoft.com/office/word/2016/wordml/cid" xmlns:w16="http://schemas.microsoft.com/office/word/2018/wordml" xmlns:w16du="http://schemas.microsoft.com/office/word/2023/wordml/word16du" xmlns:w16sdtdh="http://schemas.microsoft.com/office/word/2020/wordml/sdtdatahash" xmlns:w16sdtfl="http://schemas.microsoft.com/office/word/2024/wordml/sdtformatlock" xmlns:w16se="http://schemas.microsoft.com/office/word/2015/wordml/symex" xmlns:wpg="http://schemas.microsoft.com/office/word/2010/wordprocessingGroup" xmlns:wpi="http://schemas.microsoft.com/office/word/2010/wordprocessingInk" xmlns:wne="http://schemas.microsoft.com/office/word/2006/wordml" xmlns:wps="http://schemas.microsoft.com/office/word/2010/wordprocessingShape" mc:Ignorable="w14 w15 w16se w16cid w16 w16cex w16sdtdh w16sdtfl w16du wp14">
   <w:p>
     <w:pPr>
       <w:pStyle w:val="Footer"/>
@@ -1694,7 +2010,7 @@
 </file>
 
 <file path=word/footnotes.xml><?xml version="1.0" encoding="utf-8"?>
-<w:footnotes xmlns:wpc="http://schemas.microsoft.com/office/word/2010/wordprocessingCanvas" xmlns:cx="http://schemas.microsoft.com/office/drawing/2014/chartex" xmlns:cx1="http://schemas.microsoft.com/office/drawing/2015/9/8/chartex" xmlns:cx2="http://schemas.microsoft.com/office/drawing/2015/10/21/chartex" xmlns:cx3="http://schemas.microsoft.com/office/drawing/2016/5/9/chartex" xmlns:cx4="http://schemas.microsoft.com/office/drawing/2016/5/10/chartex" xmlns:cx5="http://schemas.microsoft.com/office/drawing/2016/5/11/chartex" xmlns:cx6="http://schemas.microsoft.com/office/drawing/2016/5/12/chartex" xmlns:cx7="http://schemas.microsoft.com/office/drawing/2016/5/13/chartex" xmlns:cx8="http://schemas.microsoft.com/office/drawing/2016/5/14/chartex" xmlns:mc="http://schemas.openxmlformats.org/markup-compatibility/2006" xmlns:aink="http://schemas.microsoft.com/office/drawing/2016/ink" xmlns:am3d="http://schemas.microsoft.com/office/drawing/2017/model3d" xmlns:o="urn:schemas-microsoft-com:office:office" xmlns:oel="http://schemas.microsoft.com/office/2019/extlst" xmlns:r="http://schemas.openxmlformats.org/officeDocument/2006/relationships" xmlns:m="http://schemas.openxmlformats.org/officeDocument/2006/math" xmlns:v="urn:schemas-microsoft-com:vml" xmlns:wp14="http://schemas.microsoft.com/office/word/2010/wordprocessingDrawing" xmlns:wp="http://schemas.openxmlformats.org/drawingml/2006/wordprocessingDrawing" xmlns:w10="urn:schemas-microsoft-com:office:word" xmlns:w="http://schemas.openxmlformats.org/wordprocessingml/2006/main" xmlns:w14="http://schemas.microsoft.com/office/word/2010/wordml" xmlns:w15="http://schemas.microsoft.com/office/word/2012/wordml" xmlns:w16cex="http://schemas.microsoft.com/office/word/2018/wordml/cex" xmlns:w16cid="http://schemas.microsoft.com/office/word/2016/wordml/cid" xmlns:w16="http://schemas.microsoft.com/office/word/2018/wordml" xmlns:w16du="http://schemas.microsoft.com/office/word/2023/wordml/word16du" xmlns:w16sdtdh="http://schemas.microsoft.com/office/word/2020/wordml/sdtdatahash" xmlns:w16sdtfl="http://schemas.microsoft.com/office/word/2024/wordml/sdtformatlock" xmlns:w16se="http://schemas.microsoft.com/office/word/2015/wordml/symex" xmlns:wpg="http://schemas.microsoft.com/office/word/2010/wordprocessingGroup" xmlns:wpi="http://schemas.microsoft.com/office/word/2010/wordprocessingInk" xmlns:wne="http://schemas.microsoft.com/office/word/2006/wordml" xmlns:wps="http://schemas.microsoft.com/office/word/2010/wordprocessingShape" mc:Ignorable="w14 w15 w16se w16cid w16 w16cex w16sdtdh w16sdtfl w16du wp14">
+<w:footnotes xmlns:wpc="http://schemas.microsoft.com/office/word/2010/wordprocessingCanvas" xmlns:cx="http://schemas.microsoft.com/office/drawing/2014/chartex" xmlns:cx1="http://schemas.microsoft.com/office/drawing/2015/9/8/chartex" xmlns:cx2="http://schemas.microsoft.com/office/drawing/2015/10/21/chartex" xmlns:cx3="http://schemas.microsoft.com/office/drawing/2016/5/9/chartex" xmlns:cx4="http://schemas.microsoft.com/office/drawing/2016/5/10/chartex" xmlns:cx5="http://schemas.microsoft.com/office/drawing/2016/5/11/chartex" xmlns:cx6="http://schemas.microsoft.com/office/drawing/2016/5/12/chartex" xmlns:cx7="http://schemas.microsoft.com/office/drawing/2016/5/13/chartex" xmlns:cx8="http://schemas.microsoft.com/office/drawing/2016/5/14/chartex" xmlns:mc="http://schemas.openxmlformats.org/markup-compatibility/2006" xmlns:aink="http://schemas.microsoft.com/office/drawing/2016/ink" xmlns:am3d="http://schemas.microsoft.com/office/drawing/2017/model3d" xmlns:o="urn:schemas-microsoft-com:office:office" xmlns:oel="http://schemas.microsoft.com/office/2019/extlst" xmlns:r="http://schemas.openxmlformats.org/officeDocument/2006/relationships" xmlns:m="http://schemas.openxmlformats.org/officeDocument/2006/math" xmlns:v="urn:schemas-microsoft-com:vml" xmlns:wp14="http://schemas.microsoft.com/office/word/2010/wordprocessingDrawing" xmlns:wp="http://schemas.openxmlformats.org/drawingml/2006/wordprocessingDrawing" xmlns:w10="urn:schemas-microsoft-com:office:word" xmlns:w="http://schemas.openxmlformats.org/wordprocessingml/2006/main" xmlns:w14="http://schemas.microsoft.com/office/word/2010/wordml" xmlns:w15="http://schemas.microsoft.com/office/word/2012/wordml" xmlns:w16cei="http://schemas.microsoft.com/office/word/2026/wordml/cei" xmlns:w16cex="http://schemas.microsoft.com/office/word/2018/wordml/cex" xmlns:w16cid="http://schemas.microsoft.com/office/word/2016/wordml/cid" xmlns:w16="http://schemas.microsoft.com/office/word/2018/wordml" xmlns:w16du="http://schemas.microsoft.com/office/word/2023/wordml/word16du" xmlns:w16sdtdh="http://schemas.microsoft.com/office/word/2020/wordml/sdtdatahash" xmlns:w16sdtfl="http://schemas.microsoft.com/office/word/2024/wordml/sdtformatlock" xmlns:w16se="http://schemas.microsoft.com/office/word/2015/wordml/symex" xmlns:wpg="http://schemas.microsoft.com/office/word/2010/wordprocessingGroup" xmlns:wpi="http://schemas.microsoft.com/office/word/2010/wordprocessingInk" xmlns:wne="http://schemas.microsoft.com/office/word/2006/wordml" xmlns:wps="http://schemas.microsoft.com/office/word/2010/wordprocessingShape" mc:Ignorable="w14 w15 w16se w16cid w16 w16cex w16sdtdh w16sdtfl w16du wp14">
   <w:footnote w:type="separator" w:id="-1">
     <w:p>
       <w:r>
@@ -1713,35 +2029,32 @@
 </file>
 
 <file path=word/header1.xml><?xml version="1.0" encoding="utf-8"?>
-<w:hdr xmlns:wpc="http://schemas.microsoft.com/office/word/2010/wordprocessingCanvas" xmlns:cx="http://schemas.microsoft.com/office/drawing/2014/chartex" xmlns:cx1="http://schemas.microsoft.com/office/drawing/2015/9/8/chartex" xmlns:cx2="http://schemas.microsoft.com/office/drawing/2015/10/21/chartex" xmlns:cx3="http://schemas.microsoft.com/office/drawing/2016/5/9/chartex" xmlns:cx4="http://schemas.microsoft.com/office/drawing/2016/5/10/chartex" xmlns:cx5="http://schemas.microsoft.com/office/drawing/2016/5/11/chartex" xmlns:cx6="http://schemas.microsoft.com/office/drawing/2016/5/12/chartex" xmlns:cx7="http://schemas.microsoft.com/office/drawing/2016/5/13/chartex" xmlns:cx8="http://schemas.microsoft.com/office/drawing/2016/5/14/chartex" xmlns:mc="http://schemas.openxmlformats.org/markup-compatibility/2006" xmlns:aink="http://schemas.microsoft.com/office/drawing/2016/ink" xmlns:am3d="http://schemas.microsoft.com/office/drawing/2017/model3d" xmlns:o="urn:schemas-microsoft-com:office:office" xmlns:oel="http://schemas.microsoft.com/office/2019/extlst" xmlns:r="http://schemas.openxmlformats.org/officeDocument/2006/relationships" xmlns:m="http://schemas.openxmlformats.org/officeDocument/2006/math" xmlns:v="urn:schemas-microsoft-com:vml" xmlns:wp14="http://schemas.microsoft.com/office/word/2010/wordprocessingDrawing" xmlns:wp="http://schemas.openxmlformats.org/drawingml/2006/wordprocessingDrawing" xmlns:w10="urn:schemas-microsoft-com:office:word" xmlns:w="http://schemas.openxmlformats.org/wordprocessingml/2006/main" xmlns:w14="http://schemas.microsoft.com/office/word/2010/wordml" xmlns:w15="http://schemas.microsoft.com/office/word/2012/wordml" xmlns:w16cex="http://schemas.microsoft.com/office/word/2018/wordml/cex" xmlns:w16cid="http://schemas.microsoft.com/office/word/2016/wordml/cid" xmlns:w16="http://schemas.microsoft.com/office/word/2018/wordml" xmlns:w16du="http://schemas.microsoft.com/office/word/2023/wordml/word16du" xmlns:w16sdtdh="http://schemas.microsoft.com/office/word/2020/wordml/sdtdatahash" xmlns:w16sdtfl="http://schemas.microsoft.com/office/word/2024/wordml/sdtformatlock" xmlns:w16se="http://schemas.microsoft.com/office/word/2015/wordml/symex" xmlns:wpg="http://schemas.microsoft.com/office/word/2010/wordprocessingGroup" xmlns:wpi="http://schemas.microsoft.com/office/word/2010/wordprocessingInk" xmlns:wne="http://schemas.microsoft.com/office/word/2006/wordml" xmlns:wps="http://schemas.microsoft.com/office/word/2010/wordprocessingShape" mc:Ignorable="w14 w15 w16se w16cid w16 w16cex w16sdtdh w16sdtfl w16du wp14">
+<w:hdr xmlns:wpc="http://schemas.microsoft.com/office/word/2010/wordprocessingCanvas" xmlns:cx="http://schemas.microsoft.com/office/drawing/2014/chartex" xmlns:cx1="http://schemas.microsoft.com/office/drawing/2015/9/8/chartex" xmlns:cx2="http://schemas.microsoft.com/office/drawing/2015/10/21/chartex" xmlns:cx3="http://schemas.microsoft.com/office/drawing/2016/5/9/chartex" xmlns:cx4="http://schemas.microsoft.com/office/drawing/2016/5/10/chartex" xmlns:cx5="http://schemas.microsoft.com/office/drawing/2016/5/11/chartex" xmlns:cx6="http://schemas.microsoft.com/office/drawing/2016/5/12/chartex" xmlns:cx7="http://schemas.microsoft.com/office/drawing/2016/5/13/chartex" xmlns:cx8="http://schemas.microsoft.com/office/drawing/2016/5/14/chartex" xmlns:mc="http://schemas.openxmlformats.org/markup-compatibility/2006" xmlns:aink="http://schemas.microsoft.com/office/drawing/2016/ink" xmlns:am3d="http://schemas.microsoft.com/office/drawing/2017/model3d" xmlns:o="urn:schemas-microsoft-com:office:office" xmlns:oel="http://schemas.microsoft.com/office/2019/extlst" xmlns:r="http://schemas.openxmlformats.org/officeDocument/2006/relationships" xmlns:m="http://schemas.openxmlformats.org/officeDocument/2006/math" xmlns:v="urn:schemas-microsoft-com:vml" xmlns:wp14="http://schemas.microsoft.com/office/word/2010/wordprocessingDrawing" xmlns:wp="http://schemas.openxmlformats.org/drawingml/2006/wordprocessingDrawing" xmlns:w10="urn:schemas-microsoft-com:office:word" xmlns:w="http://schemas.openxmlformats.org/wordprocessingml/2006/main" xmlns:w14="http://schemas.microsoft.com/office/word/2010/wordml" xmlns:w15="http://schemas.microsoft.com/office/word/2012/wordml" xmlns:w16cei="http://schemas.microsoft.com/office/word/2026/wordml/cei" xmlns:w16cex="http://schemas.microsoft.com/office/word/2018/wordml/cex" xmlns:w16cid="http://schemas.microsoft.com/office/word/2016/wordml/cid" xmlns:w16="http://schemas.microsoft.com/office/word/2018/wordml" xmlns:w16du="http://schemas.microsoft.com/office/word/2023/wordml/word16du" xmlns:w16sdtdh="http://schemas.microsoft.com/office/word/2020/wordml/sdtdatahash" xmlns:w16sdtfl="http://schemas.microsoft.com/office/word/2024/wordml/sdtformatlock" xmlns:w16se="http://schemas.microsoft.com/office/word/2015/wordml/symex" xmlns:wpg="http://schemas.microsoft.com/office/word/2010/wordprocessingGroup" xmlns:wpi="http://schemas.microsoft.com/office/word/2010/wordprocessingInk" xmlns:wne="http://schemas.microsoft.com/office/word/2006/wordml" xmlns:wps="http://schemas.microsoft.com/office/word/2010/wordprocessingShape" mc:Ignorable="w14 w15 w16se w16cid w16 w16cex w16sdtdh w16sdtfl w16du wp14">
   <w:p>
     <w:pPr>
       <w:pStyle w:val="Header"/>
-      <w:spacing w:after="240"/>
       <w:rPr>
         <w:rFonts w:cs="Noto Sans Medium"/>
-        <w:sz w:val="24"/>
       </w:rPr>
     </w:pPr>
     <w:r>
       <w:rPr>
         <w:rFonts w:cs="Noto Sans Medium"/>
         <w:noProof/>
-        <w:sz w:val="24"/>
       </w:rPr>
       <w:drawing>
-        <wp:anchor distT="0" distB="0" distL="114300" distR="114300" simplePos="0" relativeHeight="251659264" behindDoc="0" locked="0" layoutInCell="1" allowOverlap="1" wp14:anchorId="176161DA" wp14:editId="0DF3A916">
+        <wp:anchor distT="0" distB="0" distL="114300" distR="114300" simplePos="0" relativeHeight="251658752" behindDoc="0" locked="0" layoutInCell="1" allowOverlap="1" wp14:anchorId="69EE6722" wp14:editId="3BF4453F">
           <wp:simplePos x="0" y="0"/>
           <wp:positionH relativeFrom="margin">
-            <wp:align>right</wp:align>
+            <wp:posOffset>5008880</wp:posOffset>
           </wp:positionH>
           <wp:positionV relativeFrom="paragraph">
-            <wp:posOffset>391795</wp:posOffset>
+            <wp:posOffset>309245</wp:posOffset>
           </wp:positionV>
           <wp:extent cx="1301750" cy="520700"/>
           <wp:effectExtent l="0" t="0" r="0" b="0"/>
           <wp:wrapNone/>
-          <wp:docPr id="1831711696" name="Picture 1831711696" descr="A white letter on a black background&#10;&#10;Description automatically generated"/>
+          <wp:docPr id="366440482" name="Picture 366440482" descr="A white letter on a black background&#10;&#10;Description automatically generated"/>
           <wp:cNvGraphicFramePr>
             <a:graphicFrameLocks xmlns:a="http://schemas.openxmlformats.org/drawingml/2006/main" noChangeAspect="1"/>
           </wp:cNvGraphicFramePr>
@@ -1789,10 +2102,8 @@
   <w:p>
     <w:pPr>
       <w:pStyle w:val="Header"/>
-      <w:spacing w:after="240"/>
       <w:rPr>
         <w:rFonts w:cs="Noto Sans Medium"/>
-        <w:sz w:val="24"/>
       </w:rPr>
     </w:pPr>
   </w:p>
@@ -1870,7 +2181,22 @@
     <w:pPr>
       <w:pStyle w:val="Header"/>
       <w:spacing w:after="0"/>
-      <w:ind w:left="369"/>
+      <w:ind w:left="567"/>
+      <w:rPr>
+        <w:rFonts w:cs="Noto Sans Medium"/>
+        <w:sz w:val="12"/>
+        <w:szCs w:val="12"/>
+      </w:rPr>
+    </w:pPr>
+  </w:p>
+  <w:p>
+    <w:pPr>
+      <w:pStyle w:val="Header"/>
+      <w:tabs>
+        <w:tab w:val="left" w:pos="993"/>
+      </w:tabs>
+      <w:spacing w:after="0"/>
+      <w:ind w:left="993"/>
       <w:rPr>
         <w:rFonts w:cs="Noto Sans"/>
         <w:sz w:val="16"/>
@@ -1905,8 +2231,11 @@
   <w:p>
     <w:pPr>
       <w:pStyle w:val="Header"/>
+      <w:tabs>
+        <w:tab w:val="left" w:pos="993"/>
+      </w:tabs>
       <w:spacing w:after="0"/>
-      <w:ind w:left="369"/>
+      <w:ind w:left="993"/>
       <w:rPr>
         <w:rFonts w:cs="Noto Sans"/>
         <w:sz w:val="16"/>
@@ -1919,201 +2248,248 @@
         <w:sz w:val="16"/>
         <w:szCs w:val="16"/>
       </w:rPr>
-      <w:t>{d.</w:t>
+      <w:t>{d.address_line_2}</w:t>
     </w:r>
-    <w:r>
+  </w:p>
+  <w:p>
+    <w:pPr>
+      <w:pStyle w:val="Header"/>
+      <w:tabs>
+        <w:tab w:val="left" w:pos="993"/>
+      </w:tabs>
+      <w:spacing w:after="0"/>
+      <w:ind w:left="993"/>
       <w:rPr>
         <w:rFonts w:cs="Noto Sans"/>
         <w:sz w:val="16"/>
         <w:szCs w:val="16"/>
       </w:rPr>
-      <w:t>address_line_2</w:t>
-    </w:r>
+    </w:pPr>
     <w:r>
       <w:rPr>
         <w:rFonts w:cs="Noto Sans"/>
         <w:sz w:val="16"/>
         <w:szCs w:val="16"/>
       </w:rPr>
-      <w:t>}</w:t>
+      <w:t>{d.address_line_3}</w:t>
+    </w:r>
+  </w:p>
+  <w:p>
+    <w:pPr>
+      <w:pStyle w:val="Header"/>
+      <w:tabs>
+        <w:tab w:val="left" w:pos="993"/>
+      </w:tabs>
+      <w:spacing w:after="0"/>
+      <w:ind w:left="993"/>
+      <w:rPr>
+        <w:rFonts w:cs="Noto Sans"/>
+        <w:sz w:val="16"/>
+        <w:szCs w:val="16"/>
+      </w:rPr>
+    </w:pPr>
+    <w:r>
+      <w:rPr>
+        <w:rFonts w:cs="Noto Sans"/>
+        <w:sz w:val="16"/>
+        <w:szCs w:val="16"/>
+      </w:rPr>
+      <w:t>{d.address_line_4}</w:t>
+    </w:r>
+  </w:p>
+  <w:p>
+    <w:pPr>
+      <w:pStyle w:val="Header"/>
+      <w:tabs>
+        <w:tab w:val="left" w:pos="993"/>
+      </w:tabs>
+      <w:spacing w:after="0"/>
+      <w:ind w:left="993"/>
+      <w:rPr>
+        <w:rFonts w:cs="Noto Sans"/>
+        <w:sz w:val="16"/>
+        <w:szCs w:val="16"/>
+      </w:rPr>
+    </w:pPr>
+    <w:r>
+      <w:rPr>
+        <w:rFonts w:cs="Noto Sans"/>
+        <w:sz w:val="16"/>
+        <w:szCs w:val="16"/>
+      </w:rPr>
+      <w:t>{d.address_line_5}</w:t>
+    </w:r>
+  </w:p>
+  <w:p>
+    <w:pPr>
+      <w:pStyle w:val="Header"/>
+      <w:tabs>
+        <w:tab w:val="left" w:pos="993"/>
+      </w:tabs>
+      <w:spacing w:after="0"/>
+      <w:ind w:left="993"/>
+      <w:rPr>
+        <w:rFonts w:cs="Noto Sans"/>
+        <w:sz w:val="16"/>
+        <w:szCs w:val="16"/>
+      </w:rPr>
+    </w:pPr>
+    <w:r>
+      <w:rPr>
+        <w:rFonts w:cs="Noto Sans"/>
+        <w:sz w:val="16"/>
+        <w:szCs w:val="16"/>
+      </w:rPr>
+      <w:t>{d.address_line_6}</w:t>
+    </w:r>
+  </w:p>
+  <w:p>
+    <w:pPr>
+      <w:pStyle w:val="Header"/>
+      <w:tabs>
+        <w:tab w:val="left" w:pos="993"/>
+      </w:tabs>
+      <w:spacing w:after="0"/>
+      <w:ind w:left="993"/>
+      <w:rPr>
+        <w:rFonts w:cs="Noto Sans"/>
+        <w:sz w:val="16"/>
+        <w:szCs w:val="16"/>
+      </w:rPr>
+    </w:pPr>
+    <w:r>
+      <w:rPr>
+        <w:rFonts w:cs="Noto Sans"/>
+        <w:sz w:val="16"/>
+        <w:szCs w:val="16"/>
+      </w:rPr>
+      <w:t>{d.address_line_7}</w:t>
     </w:r>
   </w:p>
   <w:p>
     <w:pPr>
       <w:pStyle w:val="Header"/>
       <w:spacing w:after="0"/>
-      <w:ind w:left="369"/>
+      <w:jc w:val="right"/>
       <w:rPr>
         <w:rFonts w:cs="Noto Sans"/>
         <w:sz w:val="16"/>
         <w:szCs w:val="16"/>
       </w:rPr>
     </w:pPr>
-    <w:r>
-      <w:rPr>
-        <w:rFonts w:cs="Noto Sans"/>
-        <w:sz w:val="16"/>
-        <w:szCs w:val="16"/>
-      </w:rPr>
-      <w:t>{d.</w:t>
-    </w:r>
-    <w:r>
-      <w:rPr>
-        <w:rFonts w:cs="Noto Sans"/>
-        <w:sz w:val="16"/>
-        <w:szCs w:val="16"/>
-      </w:rPr>
-      <w:t>address_line_3</w:t>
-    </w:r>
-    <w:r>
-      <w:rPr>
-        <w:rFonts w:cs="Noto Sans"/>
-        <w:sz w:val="16"/>
-        <w:szCs w:val="16"/>
-      </w:rPr>
-      <w:t>}</w:t>
-    </w:r>
   </w:p>
   <w:p>
     <w:pPr>
       <w:pStyle w:val="Header"/>
       <w:spacing w:after="0"/>
-      <w:ind w:left="369"/>
-      <w:rPr>
-        <w:rFonts w:cs="Noto Sans"/>
-        <w:sz w:val="16"/>
-        <w:szCs w:val="16"/>
+      <w:jc w:val="right"/>
+      <w:rPr>
+        <w:rFonts w:cs="Noto Sans Medium"/>
+        <w:b/>
+        <w:bCs/>
+        <w:sz w:val="18"/>
+        <w:szCs w:val="18"/>
       </w:rPr>
     </w:pPr>
-    <w:r>
-      <w:rPr>
-        <w:rFonts w:cs="Noto Sans"/>
-        <w:sz w:val="16"/>
-        <w:szCs w:val="16"/>
-      </w:rPr>
-      <w:t>{d.</w:t>
-    </w:r>
-    <w:r>
-      <w:rPr>
-        <w:rFonts w:cs="Noto Sans"/>
-        <w:sz w:val="16"/>
-        <w:szCs w:val="16"/>
-      </w:rPr>
-      <w:t>address_line_4</w:t>
-    </w:r>
-    <w:r>
-      <w:rPr>
-        <w:rFonts w:cs="Noto Sans"/>
-        <w:sz w:val="16"/>
-        <w:szCs w:val="16"/>
-      </w:rPr>
-      <w:t>}</w:t>
-    </w:r>
   </w:p>
   <w:p>
     <w:pPr>
       <w:pStyle w:val="Header"/>
       <w:spacing w:after="0"/>
-      <w:ind w:left="369"/>
-      <w:rPr>
-        <w:rFonts w:cs="Noto Sans"/>
-        <w:sz w:val="16"/>
-        <w:szCs w:val="16"/>
+      <w:jc w:val="right"/>
+      <w:rPr>
+        <w:rFonts w:cs="Noto Sans Medium"/>
+        <w:b/>
+        <w:bCs/>
+        <w:sz w:val="18"/>
+        <w:szCs w:val="18"/>
       </w:rPr>
     </w:pPr>
-    <w:r>
-      <w:rPr>
-        <w:rFonts w:cs="Noto Sans"/>
-        <w:sz w:val="16"/>
-        <w:szCs w:val="16"/>
-      </w:rPr>
-      <w:t>{d.</w:t>
-    </w:r>
-    <w:r>
-      <w:rPr>
-        <w:rFonts w:cs="Noto Sans"/>
-        <w:sz w:val="16"/>
-        <w:szCs w:val="16"/>
-      </w:rPr>
-      <w:t>address_line_5</w:t>
-    </w:r>
-    <w:r>
-      <w:rPr>
-        <w:rFonts w:cs="Noto Sans"/>
-        <w:sz w:val="16"/>
-        <w:szCs w:val="16"/>
-      </w:rPr>
-      <w:t>}</w:t>
-    </w:r>
   </w:p>
   <w:p>
     <w:pPr>
       <w:pStyle w:val="Header"/>
       <w:spacing w:after="0"/>
-      <w:ind w:left="369"/>
-      <w:rPr>
-        <w:rFonts w:cs="Noto Sans"/>
-        <w:sz w:val="16"/>
-        <w:szCs w:val="16"/>
+      <w:jc w:val="right"/>
+      <w:rPr>
+        <w:rFonts w:cs="Noto Sans Medium"/>
+        <w:b/>
+        <w:bCs/>
+        <w:sz w:val="18"/>
+        <w:szCs w:val="18"/>
       </w:rPr>
     </w:pPr>
-    <w:r>
-      <w:rPr>
-        <w:rFonts w:cs="Noto Sans"/>
-        <w:sz w:val="16"/>
-        <w:szCs w:val="16"/>
-      </w:rPr>
-      <w:t>{d.</w:t>
-    </w:r>
-    <w:r>
-      <w:rPr>
-        <w:rFonts w:cs="Noto Sans"/>
-        <w:sz w:val="16"/>
-        <w:szCs w:val="16"/>
-      </w:rPr>
-      <w:t>address_line_6</w:t>
-    </w:r>
-    <w:r>
-      <w:rPr>
-        <w:rFonts w:cs="Noto Sans"/>
-        <w:sz w:val="16"/>
-        <w:szCs w:val="16"/>
-      </w:rPr>
-      <w:t>}</w:t>
-    </w:r>
   </w:p>
   <w:p>
     <w:pPr>
       <w:pStyle w:val="Header"/>
       <w:spacing w:after="0"/>
-      <w:ind w:left="369"/>
+      <w:jc w:val="right"/>
+      <w:rPr>
+        <w:rFonts w:cs="Noto Sans Medium"/>
+        <w:b/>
+        <w:bCs/>
+        <w:sz w:val="18"/>
+        <w:szCs w:val="18"/>
+      </w:rPr>
+    </w:pPr>
+  </w:p>
+  <w:p>
+    <w:pPr>
+      <w:pStyle w:val="Header"/>
+      <w:spacing w:after="0"/>
+      <w:jc w:val="right"/>
+      <w:rPr>
+        <w:rFonts w:cs="Noto Sans Medium"/>
+        <w:b/>
+        <w:bCs/>
+        <w:sz w:val="18"/>
+        <w:szCs w:val="18"/>
+      </w:rPr>
+    </w:pPr>
+  </w:p>
+  <w:p>
+    <w:pPr>
+      <w:pStyle w:val="Header"/>
+      <w:spacing w:after="0"/>
+      <w:jc w:val="right"/>
       <w:rPr>
         <w:rFonts w:cs="Noto Sans"/>
-        <w:sz w:val="16"/>
-        <w:szCs w:val="16"/>
+        <w:sz w:val="32"/>
+        <w:szCs w:val="32"/>
       </w:rPr>
     </w:pPr>
     <w:r>
       <w:rPr>
         <w:rFonts w:cs="Noto Sans"/>
-        <w:sz w:val="16"/>
-        <w:szCs w:val="16"/>
+        <w:b/>
+        <w:bCs/>
+        <w:sz w:val="32"/>
+        <w:szCs w:val="32"/>
+      </w:rPr>
+      <w:t xml:space="preserve">Date: </w:t>
+    </w:r>
+    <w:r>
+      <w:rPr>
+        <w:rFonts w:cs="Noto Sans"/>
+        <w:sz w:val="32"/>
+        <w:szCs w:val="32"/>
       </w:rPr>
       <w:t>{d.</w:t>
     </w:r>
     <w:r>
       <w:rPr>
         <w:rFonts w:cs="Noto Sans"/>
-        <w:sz w:val="16"/>
-        <w:szCs w:val="16"/>
-      </w:rPr>
-      <w:t>address_line_7</w:t>
+        <w:sz w:val="32"/>
+        <w:szCs w:val="32"/>
+      </w:rPr>
+      <w:t>date</w:t>
     </w:r>
     <w:r>
       <w:rPr>
         <w:rFonts w:cs="Noto Sans"/>
-        <w:sz w:val="16"/>
-        <w:szCs w:val="16"/>
+        <w:sz w:val="32"/>
+        <w:szCs w:val="32"/>
       </w:rPr>
       <w:t>}</w:t>
     </w:r>
@@ -2124,63 +2500,9 @@
       <w:spacing w:after="0"/>
       <w:jc w:val="right"/>
       <w:rPr>
-        <w:rFonts w:cs="Noto Sans Medium"/>
-        <w:b/>
-        <w:bCs/>
-        <w:sz w:val="18"/>
-        <w:szCs w:val="18"/>
-      </w:rPr>
-    </w:pPr>
-  </w:p>
-  <w:p>
-    <w:pPr>
-      <w:pStyle w:val="Header"/>
-      <w:spacing w:after="0"/>
-      <w:jc w:val="right"/>
-      <w:rPr>
-        <w:rFonts w:cs="Noto Sans Medium"/>
-        <w:b/>
-        <w:bCs/>
-        <w:sz w:val="18"/>
-        <w:szCs w:val="18"/>
-      </w:rPr>
-    </w:pPr>
-  </w:p>
-  <w:p>
-    <w:pPr>
-      <w:pStyle w:val="Header"/>
-      <w:spacing w:after="0"/>
-      <w:jc w:val="right"/>
-      <w:rPr>
-        <w:rFonts w:cs="Noto Sans Medium"/>
-        <w:b/>
-        <w:bCs/>
-        <w:sz w:val="18"/>
-        <w:szCs w:val="18"/>
-      </w:rPr>
-    </w:pPr>
-  </w:p>
-  <w:p>
-    <w:pPr>
-      <w:pStyle w:val="Header"/>
-      <w:spacing w:after="0"/>
-      <w:jc w:val="right"/>
-      <w:rPr>
-        <w:rFonts w:cs="Noto Sans Medium"/>
-        <w:b/>
-        <w:bCs/>
-        <w:sz w:val="20"/>
-        <w:szCs w:val="20"/>
-      </w:rPr>
-    </w:pPr>
-  </w:p>
-  <w:p>
-    <w:pPr>
-      <w:pStyle w:val="Header"/>
-      <w:spacing w:after="0"/>
-      <w:jc w:val="right"/>
-      <w:rPr>
         <w:rFonts w:cs="Noto Sans"/>
+        <w:sz w:val="32"/>
+        <w:szCs w:val="32"/>
       </w:rPr>
     </w:pPr>
     <w:r>
@@ -2188,60 +2510,32 @@
         <w:rFonts w:cs="Noto Sans"/>
         <w:b/>
         <w:bCs/>
-      </w:rPr>
-      <w:t xml:space="preserve">Date: </w:t>
+        <w:sz w:val="32"/>
+        <w:szCs w:val="32"/>
+      </w:rPr>
+      <w:t xml:space="preserve">NHS number: </w:t>
     </w:r>
     <w:r>
       <w:rPr>
         <w:rFonts w:cs="Noto Sans"/>
+        <w:sz w:val="32"/>
+        <w:szCs w:val="32"/>
       </w:rPr>
       <w:t>{d.</w:t>
     </w:r>
     <w:r>
       <w:rPr>
         <w:rFonts w:cs="Noto Sans"/>
-      </w:rPr>
-      <w:t>date</w:t>
-    </w:r>
-    <w:r>
-      <w:rPr>
-        <w:rFonts w:cs="Noto Sans"/>
-      </w:rPr>
-      <w:t>}</w:t>
-    </w:r>
-  </w:p>
-  <w:p>
-    <w:pPr>
-      <w:pStyle w:val="Header"/>
-      <w:spacing w:after="0"/>
-      <w:jc w:val="right"/>
-      <w:rPr>
-        <w:rFonts w:cs="Noto Sans"/>
-      </w:rPr>
-    </w:pPr>
-    <w:r>
-      <w:rPr>
-        <w:rFonts w:cs="Noto Sans"/>
-        <w:b/>
-        <w:bCs/>
-      </w:rPr>
-      <w:t xml:space="preserve">NHS number: </w:t>
-    </w:r>
-    <w:r>
-      <w:rPr>
-        <w:rFonts w:cs="Noto Sans"/>
-      </w:rPr>
-      <w:t>{d.</w:t>
-    </w:r>
-    <w:r>
-      <w:rPr>
-        <w:rFonts w:cs="Noto Sans"/>
+        <w:sz w:val="32"/>
+        <w:szCs w:val="32"/>
       </w:rPr>
       <w:t>nhsNumber</w:t>
     </w:r>
     <w:r>
       <w:rPr>
         <w:rFonts w:cs="Noto Sans"/>
+        <w:sz w:val="32"/>
+        <w:szCs w:val="32"/>
       </w:rPr>
       <w:t>}</w:t>
     </w:r>
@@ -2250,7 +2544,7 @@
 </file>
 
 <file path=word/numbering.xml><?xml version="1.0" encoding="utf-8"?>
-<w:numbering xmlns:wpc="http://schemas.microsoft.com/office/word/2010/wordprocessingCanvas" xmlns:cx="http://schemas.microsoft.com/office/drawing/2014/chartex" xmlns:cx1="http://schemas.microsoft.com/office/drawing/2015/9/8/chartex" xmlns:cx2="http://schemas.microsoft.com/office/drawing/2015/10/21/chartex" xmlns:cx3="http://schemas.microsoft.com/office/drawing/2016/5/9/chartex" xmlns:cx4="http://schemas.microsoft.com/office/drawing/2016/5/10/chartex" xmlns:cx5="http://schemas.microsoft.com/office/drawing/2016/5/11/chartex" xmlns:cx6="http://schemas.microsoft.com/office/drawing/2016/5/12/chartex" xmlns:cx7="http://schemas.microsoft.com/office/drawing/2016/5/13/chartex" xmlns:cx8="http://schemas.microsoft.com/office/drawing/2016/5/14/chartex" xmlns:mc="http://schemas.openxmlformats.org/markup-compatibility/2006" xmlns:aink="http://schemas.microsoft.com/office/drawing/2016/ink" xmlns:am3d="http://schemas.microsoft.com/office/drawing/2017/model3d" xmlns:o="urn:schemas-microsoft-com:office:office" xmlns:oel="http://schemas.microsoft.com/office/2019/extlst" xmlns:r="http://schemas.openxmlformats.org/officeDocument/2006/relationships" xmlns:m="http://schemas.openxmlformats.org/officeDocument/2006/math" xmlns:v="urn:schemas-microsoft-com:vml" xmlns:wp14="http://schemas.microsoft.com/office/word/2010/wordprocessingDrawing" xmlns:wp="http://schemas.openxmlformats.org/drawingml/2006/wordprocessingDrawing" xmlns:w10="urn:schemas-microsoft-com:office:word" xmlns:w="http://schemas.openxmlformats.org/wordprocessingml/2006/main" xmlns:w14="http://schemas.microsoft.com/office/word/2010/wordml" xmlns:w15="http://schemas.microsoft.com/office/word/2012/wordml" xmlns:w16cex="http://schemas.microsoft.com/office/word/2018/wordml/cex" xmlns:w16cid="http://schemas.microsoft.com/office/word/2016/wordml/cid" xmlns:w16="http://schemas.microsoft.com/office/word/2018/wordml" xmlns:w16du="http://schemas.microsoft.com/office/word/2023/wordml/word16du" xmlns:w16sdtdh="http://schemas.microsoft.com/office/word/2020/wordml/sdtdatahash" xmlns:w16sdtfl="http://schemas.microsoft.com/office/word/2024/wordml/sdtformatlock" xmlns:w16se="http://schemas.microsoft.com/office/word/2015/wordml/symex" xmlns:wpg="http://schemas.microsoft.com/office/word/2010/wordprocessingGroup" xmlns:wpi="http://schemas.microsoft.com/office/word/2010/wordprocessingInk" xmlns:wne="http://schemas.microsoft.com/office/word/2006/wordml" xmlns:wps="http://schemas.microsoft.com/office/word/2010/wordprocessingShape" mc:Ignorable="w14 w15 w16se w16cid w16 w16cex w16sdtdh w16sdtfl w16du wp14">
+<w:numbering xmlns:wpc="http://schemas.microsoft.com/office/word/2010/wordprocessingCanvas" xmlns:cx="http://schemas.microsoft.com/office/drawing/2014/chartex" xmlns:cx1="http://schemas.microsoft.com/office/drawing/2015/9/8/chartex" xmlns:cx2="http://schemas.microsoft.com/office/drawing/2015/10/21/chartex" xmlns:cx3="http://schemas.microsoft.com/office/drawing/2016/5/9/chartex" xmlns:cx4="http://schemas.microsoft.com/office/drawing/2016/5/10/chartex" xmlns:cx5="http://schemas.microsoft.com/office/drawing/2016/5/11/chartex" xmlns:cx6="http://schemas.microsoft.com/office/drawing/2016/5/12/chartex" xmlns:cx7="http://schemas.microsoft.com/office/drawing/2016/5/13/chartex" xmlns:cx8="http://schemas.microsoft.com/office/drawing/2016/5/14/chartex" xmlns:mc="http://schemas.openxmlformats.org/markup-compatibility/2006" xmlns:aink="http://schemas.microsoft.com/office/drawing/2016/ink" xmlns:am3d="http://schemas.microsoft.com/office/drawing/2017/model3d" xmlns:o="urn:schemas-microsoft-com:office:office" xmlns:oel="http://schemas.microsoft.com/office/2019/extlst" xmlns:r="http://schemas.openxmlformats.org/officeDocument/2006/relationships" xmlns:m="http://schemas.openxmlformats.org/officeDocument/2006/math" xmlns:v="urn:schemas-microsoft-com:vml" xmlns:wp14="http://schemas.microsoft.com/office/word/2010/wordprocessingDrawing" xmlns:wp="http://schemas.openxmlformats.org/drawingml/2006/wordprocessingDrawing" xmlns:w10="urn:schemas-microsoft-com:office:word" xmlns:w="http://schemas.openxmlformats.org/wordprocessingml/2006/main" xmlns:w14="http://schemas.microsoft.com/office/word/2010/wordml" xmlns:w15="http://schemas.microsoft.com/office/word/2012/wordml" xmlns:w16cei="http://schemas.microsoft.com/office/word/2026/wordml/cei" xmlns:w16cex="http://schemas.microsoft.com/office/word/2018/wordml/cex" xmlns:w16cid="http://schemas.microsoft.com/office/word/2016/wordml/cid" xmlns:w16="http://schemas.microsoft.com/office/word/2018/wordml" xmlns:w16du="http://schemas.microsoft.com/office/word/2023/wordml/word16du" xmlns:w16sdtdh="http://schemas.microsoft.com/office/word/2020/wordml/sdtdatahash" xmlns:w16sdtfl="http://schemas.microsoft.com/office/word/2024/wordml/sdtformatlock" xmlns:w16se="http://schemas.microsoft.com/office/word/2015/wordml/symex" xmlns:wpg="http://schemas.microsoft.com/office/word/2010/wordprocessingGroup" xmlns:wpi="http://schemas.microsoft.com/office/word/2010/wordprocessingInk" xmlns:wne="http://schemas.microsoft.com/office/word/2006/wordml" xmlns:wps="http://schemas.microsoft.com/office/word/2010/wordprocessingShape" mc:Ignorable="w14 w15 w16se w16cid w16 w16cex w16sdtdh w16sdtfl w16du wp14">
   <w:abstractNum w:abstractNumId="0" w15:restartNumberingAfterBreak="0">
     <w:nsid w:val="2AF11543"/>
     <w:multiLevelType w:val="hybridMultilevel"/>
@@ -3350,6 +3644,120 @@
       <w:rPr>
         <w:rFonts w:ascii="Symbol" w:hAnsi="Symbol" w:hint="default"/>
         <w:sz w:val="20"/>
+      </w:rPr>
+    </w:lvl>
+  </w:abstractNum>
+  <w:abstractNum w:abstractNumId="9" w15:restartNumberingAfterBreak="0">
+    <w:nsid w:val="78E402A6"/>
+    <w:multiLevelType w:val="hybridMultilevel"/>
+    <w:tmpl w:val="B802DDAC"/>
+    <w:lvl w:ilvl="0" w:tplc="00CE41A6">
+      <w:start w:val="1"/>
+      <w:numFmt w:val="bullet"/>
+      <w:pStyle w:val="ListParagraph"/>
+      <w:lvlText w:val=""/>
+      <w:lvlJc w:val="left"/>
+      <w:pPr>
+        <w:ind w:left="1077" w:hanging="360"/>
+      </w:pPr>
+      <w:rPr>
+        <w:rFonts w:ascii="Symbol" w:hAnsi="Symbol" w:hint="default"/>
+      </w:rPr>
+    </w:lvl>
+    <w:lvl w:ilvl="1" w:tplc="08090003" w:tentative="1">
+      <w:start w:val="1"/>
+      <w:numFmt w:val="bullet"/>
+      <w:lvlText w:val="o"/>
+      <w:lvlJc w:val="left"/>
+      <w:pPr>
+        <w:ind w:left="1797" w:hanging="360"/>
+      </w:pPr>
+      <w:rPr>
+        <w:rFonts w:ascii="Courier New" w:hAnsi="Courier New" w:cs="Courier New" w:hint="default"/>
+      </w:rPr>
+    </w:lvl>
+    <w:lvl w:ilvl="2" w:tplc="08090005" w:tentative="1">
+      <w:start w:val="1"/>
+      <w:numFmt w:val="bullet"/>
+      <w:lvlText w:val=""/>
+      <w:lvlJc w:val="left"/>
+      <w:pPr>
+        <w:ind w:left="2517" w:hanging="360"/>
+      </w:pPr>
+      <w:rPr>
+        <w:rFonts w:ascii="Wingdings" w:hAnsi="Wingdings" w:hint="default"/>
+      </w:rPr>
+    </w:lvl>
+    <w:lvl w:ilvl="3" w:tplc="08090001" w:tentative="1">
+      <w:start w:val="1"/>
+      <w:numFmt w:val="bullet"/>
+      <w:lvlText w:val=""/>
+      <w:lvlJc w:val="left"/>
+      <w:pPr>
+        <w:ind w:left="3237" w:hanging="360"/>
+      </w:pPr>
+      <w:rPr>
+        <w:rFonts w:ascii="Symbol" w:hAnsi="Symbol" w:hint="default"/>
+      </w:rPr>
+    </w:lvl>
+    <w:lvl w:ilvl="4" w:tplc="08090003" w:tentative="1">
+      <w:start w:val="1"/>
+      <w:numFmt w:val="bullet"/>
+      <w:lvlText w:val="o"/>
+      <w:lvlJc w:val="left"/>
+      <w:pPr>
+        <w:ind w:left="3957" w:hanging="360"/>
+      </w:pPr>
+      <w:rPr>
+        <w:rFonts w:ascii="Courier New" w:hAnsi="Courier New" w:cs="Courier New" w:hint="default"/>
+      </w:rPr>
+    </w:lvl>
+    <w:lvl w:ilvl="5" w:tplc="08090005" w:tentative="1">
+      <w:start w:val="1"/>
+      <w:numFmt w:val="bullet"/>
+      <w:lvlText w:val=""/>
+      <w:lvlJc w:val="left"/>
+      <w:pPr>
+        <w:ind w:left="4677" w:hanging="360"/>
+      </w:pPr>
+      <w:rPr>
+        <w:rFonts w:ascii="Wingdings" w:hAnsi="Wingdings" w:hint="default"/>
+      </w:rPr>
+    </w:lvl>
+    <w:lvl w:ilvl="6" w:tplc="08090001" w:tentative="1">
+      <w:start w:val="1"/>
+      <w:numFmt w:val="bullet"/>
+      <w:lvlText w:val=""/>
+      <w:lvlJc w:val="left"/>
+      <w:pPr>
+        <w:ind w:left="5397" w:hanging="360"/>
+      </w:pPr>
+      <w:rPr>
+        <w:rFonts w:ascii="Symbol" w:hAnsi="Symbol" w:hint="default"/>
+      </w:rPr>
+    </w:lvl>
+    <w:lvl w:ilvl="7" w:tplc="08090003" w:tentative="1">
+      <w:start w:val="1"/>
+      <w:numFmt w:val="bullet"/>
+      <w:lvlText w:val="o"/>
+      <w:lvlJc w:val="left"/>
+      <w:pPr>
+        <w:ind w:left="6117" w:hanging="360"/>
+      </w:pPr>
+      <w:rPr>
+        <w:rFonts w:ascii="Courier New" w:hAnsi="Courier New" w:cs="Courier New" w:hint="default"/>
+      </w:rPr>
+    </w:lvl>
+    <w:lvl w:ilvl="8" w:tplc="08090005" w:tentative="1">
+      <w:start w:val="1"/>
+      <w:numFmt w:val="bullet"/>
+      <w:lvlText w:val=""/>
+      <w:lvlJc w:val="left"/>
+      <w:pPr>
+        <w:ind w:left="6837" w:hanging="360"/>
+      </w:pPr>
+      <w:rPr>
+        <w:rFonts w:ascii="Wingdings" w:hAnsi="Wingdings" w:hint="default"/>
       </w:rPr>
     </w:lvl>
   </w:abstractNum>
@@ -3380,11 +3788,14 @@
   <w:num w:numId="9" w16cid:durableId="1800612842">
     <w:abstractNumId w:val="5"/>
   </w:num>
+  <w:num w:numId="10" w16cid:durableId="1940600047">
+    <w:abstractNumId w:val="9"/>
+  </w:num>
 </w:numbering>
 </file>
 
 <file path=word/people.xml><?xml version="1.0" encoding="utf-8"?>
-<w15:people xmlns:wpc="http://schemas.microsoft.com/office/word/2010/wordprocessingCanvas" xmlns:cx="http://schemas.microsoft.com/office/drawing/2014/chartex" xmlns:cx1="http://schemas.microsoft.com/office/drawing/2015/9/8/chartex" xmlns:cx2="http://schemas.microsoft.com/office/drawing/2015/10/21/chartex" xmlns:cx3="http://schemas.microsoft.com/office/drawing/2016/5/9/chartex" xmlns:cx4="http://schemas.microsoft.com/office/drawing/2016/5/10/chartex" xmlns:cx5="http://schemas.microsoft.com/office/drawing/2016/5/11/chartex" xmlns:cx6="http://schemas.microsoft.com/office/drawing/2016/5/12/chartex" xmlns:cx7="http://schemas.microsoft.com/office/drawing/2016/5/13/chartex" xmlns:cx8="http://schemas.microsoft.com/office/drawing/2016/5/14/chartex" xmlns:mc="http://schemas.openxmlformats.org/markup-compatibility/2006" xmlns:aink="http://schemas.microsoft.com/office/drawing/2016/ink" xmlns:am3d="http://schemas.microsoft.com/office/drawing/2017/model3d" xmlns:o="urn:schemas-microsoft-com:office:office" xmlns:oel="http://schemas.microsoft.com/office/2019/extlst" xmlns:r="http://schemas.openxmlformats.org/officeDocument/2006/relationships" xmlns:m="http://schemas.openxmlformats.org/officeDocument/2006/math" xmlns:v="urn:schemas-microsoft-com:vml" xmlns:wp14="http://schemas.microsoft.com/office/word/2010/wordprocessingDrawing" xmlns:wp="http://schemas.openxmlformats.org/drawingml/2006/wordprocessingDrawing" xmlns:w10="urn:schemas-microsoft-com:office:word" xmlns:w="http://schemas.openxmlformats.org/wordprocessingml/2006/main" xmlns:w14="http://schemas.microsoft.com/office/word/2010/wordml" xmlns:w15="http://schemas.microsoft.com/office/word/2012/wordml" xmlns:w16cex="http://schemas.microsoft.com/office/word/2018/wordml/cex" xmlns:w16cid="http://schemas.microsoft.com/office/word/2016/wordml/cid" xmlns:w16="http://schemas.microsoft.com/office/word/2018/wordml" xmlns:w16du="http://schemas.microsoft.com/office/word/2023/wordml/word16du" xmlns:w16sdtdh="http://schemas.microsoft.com/office/word/2020/wordml/sdtdatahash" xmlns:w16sdtfl="http://schemas.microsoft.com/office/word/2024/wordml/sdtformatlock" xmlns:w16se="http://schemas.microsoft.com/office/word/2015/wordml/symex" xmlns:wpg="http://schemas.microsoft.com/office/word/2010/wordprocessingGroup" xmlns:wpi="http://schemas.microsoft.com/office/word/2010/wordprocessingInk" xmlns:wne="http://schemas.microsoft.com/office/word/2006/wordml" xmlns:wps="http://schemas.microsoft.com/office/word/2010/wordprocessingShape" mc:Ignorable="w14 w15 w16se w16cid w16 w16cex w16sdtdh w16sdtfl w16du wp14">
+<w15:people xmlns:wpc="http://schemas.microsoft.com/office/word/2010/wordprocessingCanvas" xmlns:cx="http://schemas.microsoft.com/office/drawing/2014/chartex" xmlns:cx1="http://schemas.microsoft.com/office/drawing/2015/9/8/chartex" xmlns:cx2="http://schemas.microsoft.com/office/drawing/2015/10/21/chartex" xmlns:cx3="http://schemas.microsoft.com/office/drawing/2016/5/9/chartex" xmlns:cx4="http://schemas.microsoft.com/office/drawing/2016/5/10/chartex" xmlns:cx5="http://schemas.microsoft.com/office/drawing/2016/5/11/chartex" xmlns:cx6="http://schemas.microsoft.com/office/drawing/2016/5/12/chartex" xmlns:cx7="http://schemas.microsoft.com/office/drawing/2016/5/13/chartex" xmlns:cx8="http://schemas.microsoft.com/office/drawing/2016/5/14/chartex" xmlns:mc="http://schemas.openxmlformats.org/markup-compatibility/2006" xmlns:aink="http://schemas.microsoft.com/office/drawing/2016/ink" xmlns:am3d="http://schemas.microsoft.com/office/drawing/2017/model3d" xmlns:o="urn:schemas-microsoft-com:office:office" xmlns:oel="http://schemas.microsoft.com/office/2019/extlst" xmlns:r="http://schemas.openxmlformats.org/officeDocument/2006/relationships" xmlns:m="http://schemas.openxmlformats.org/officeDocument/2006/math" xmlns:v="urn:schemas-microsoft-com:vml" xmlns:wp14="http://schemas.microsoft.com/office/word/2010/wordprocessingDrawing" xmlns:wp="http://schemas.openxmlformats.org/drawingml/2006/wordprocessingDrawing" xmlns:w10="urn:schemas-microsoft-com:office:word" xmlns:w="http://schemas.openxmlformats.org/wordprocessingml/2006/main" xmlns:w14="http://schemas.microsoft.com/office/word/2010/wordml" xmlns:w15="http://schemas.microsoft.com/office/word/2012/wordml" xmlns:w16cei="http://schemas.microsoft.com/office/word/2026/wordml/cei" xmlns:w16cex="http://schemas.microsoft.com/office/word/2018/wordml/cex" xmlns:w16cid="http://schemas.microsoft.com/office/word/2016/wordml/cid" xmlns:w16="http://schemas.microsoft.com/office/word/2018/wordml" xmlns:w16du="http://schemas.microsoft.com/office/word/2023/wordml/word16du" xmlns:w16sdtdh="http://schemas.microsoft.com/office/word/2020/wordml/sdtdatahash" xmlns:w16sdtfl="http://schemas.microsoft.com/office/word/2024/wordml/sdtformatlock" xmlns:w16se="http://schemas.microsoft.com/office/word/2015/wordml/symex" xmlns:wpg="http://schemas.microsoft.com/office/word/2010/wordprocessingGroup" xmlns:wpi="http://schemas.microsoft.com/office/word/2010/wordprocessingInk" xmlns:wne="http://schemas.microsoft.com/office/word/2006/wordml" xmlns:wps="http://schemas.microsoft.com/office/word/2010/wordprocessingShape" mc:Ignorable="w14 w15 w16se w16cid w16 w16cex w16sdtdh w16sdtfl w16du wp14">
   <w15:person w15:author="GIFFORD, Emma (NHS ENGLAND - X26)">
     <w15:presenceInfo w15:providerId="AD" w15:userId="S::emma.gifford4@nhs.net::ccf95563-42b7-4a59-8eb5-0a2143777171"/>
   </w15:person>
@@ -3409,7 +3820,7 @@
   <w:latentStyles w:defLockedState="0" w:defUIPriority="99" w:defSemiHidden="0" w:defUnhideWhenUsed="0" w:defQFormat="0" w:count="376">
     <w:lsdException w:name="Normal" w:uiPriority="0" w:qFormat="1"/>
     <w:lsdException w:name="heading 1" w:uiPriority="0"/>
-    <w:lsdException w:name="heading 2" w:semiHidden="1" w:uiPriority="0" w:unhideWhenUsed="1" w:qFormat="1"/>
+    <w:lsdException w:name="heading 2" w:semiHidden="1" w:uiPriority="0" w:unhideWhenUsed="1"/>
     <w:lsdException w:name="heading 3" w:semiHidden="1" w:uiPriority="9" w:unhideWhenUsed="1" w:qFormat="1"/>
     <w:lsdException w:name="heading 4" w:semiHidden="1" w:uiPriority="9" w:unhideWhenUsed="1" w:qFormat="1"/>
     <w:lsdException w:name="heading 5" w:semiHidden="1" w:uiPriority="9" w:unhideWhenUsed="1" w:qFormat="1"/>
@@ -3787,13 +4198,12 @@
   <w:style w:type="paragraph" w:default="1" w:styleId="Normal">
     <w:name w:val="Normal"/>
     <w:qFormat/>
-    <w:rsid w:val="003C652B"/>
+    <w:rsid w:val="00384048"/>
     <w:pPr>
-      <w:spacing w:after="320"/>
+      <w:spacing w:after="240"/>
     </w:pPr>
     <w:rPr>
       <w:rFonts w:ascii="Noto Sans" w:hAnsi="Noto Sans"/>
-      <w:sz w:val="32"/>
     </w:rPr>
   </w:style>
   <w:style w:type="paragraph" w:styleId="Heading1">
@@ -3822,8 +4232,7 @@
     <w:next w:val="Normal"/>
     <w:link w:val="Heading2Char"/>
     <w:unhideWhenUsed/>
-    <w:qFormat/>
-    <w:rsid w:val="003C652B"/>
+    <w:rsid w:val="00384048"/>
     <w:pPr>
       <w:keepNext/>
       <w:keepLines/>
@@ -4032,11 +4441,10 @@
     <w:aliases w:val="NHS letter heading Char"/>
     <w:basedOn w:val="DefaultParagraphFont"/>
     <w:link w:val="Heading2"/>
-    <w:rsid w:val="003C652B"/>
+    <w:rsid w:val="00384048"/>
     <w:rPr>
       <w:rFonts w:ascii="Noto Sans" w:eastAsiaTheme="majorEastAsia" w:hAnsi="Noto Sans" w:cstheme="majorBidi"/>
       <w:b/>
-      <w:sz w:val="32"/>
       <w:szCs w:val="32"/>
     </w:rPr>
   </w:style>
@@ -4237,10 +4645,12 @@
     <w:basedOn w:val="Normal"/>
     <w:uiPriority w:val="34"/>
     <w:qFormat/>
-    <w:rsid w:val="001C15AC"/>
+    <w:rsid w:val="00A31E65"/>
     <w:pPr>
-      <w:spacing w:after="120"/>
-      <w:ind w:left="720"/>
+      <w:numPr>
+        <w:numId w:val="10"/>
+      </w:numPr>
+      <w:ind w:left="714" w:hanging="357"/>
       <w:contextualSpacing/>
     </w:pPr>
   </w:style>
@@ -4311,7 +4721,7 @@
     <w:link w:val="HeaderChar"/>
     <w:uiPriority w:val="99"/>
     <w:unhideWhenUsed/>
-    <w:rsid w:val="00343935"/>
+    <w:rsid w:val="00384048"/>
     <w:pPr>
       <w:tabs>
         <w:tab w:val="center" w:pos="4513"/>
@@ -4324,7 +4734,10 @@
     <w:basedOn w:val="DefaultParagraphFont"/>
     <w:link w:val="Header"/>
     <w:uiPriority w:val="99"/>
-    <w:rsid w:val="00343935"/>
+    <w:rsid w:val="00384048"/>
+    <w:rPr>
+      <w:rFonts w:ascii="Noto Sans" w:hAnsi="Noto Sans"/>
+    </w:rPr>
   </w:style>
   <w:style w:type="paragraph" w:styleId="Footer">
     <w:name w:val="footer"/>
@@ -4368,7 +4781,7 @@
     <w:basedOn w:val="DefaultParagraphFont"/>
     <w:uiPriority w:val="99"/>
     <w:unhideWhenUsed/>
-    <w:rsid w:val="003C652B"/>
+    <w:rsid w:val="00706AD3"/>
     <w:rPr>
       <w:rFonts w:ascii="Noto Sans" w:hAnsi="Noto Sans"/>
       <w:b/>
@@ -4489,6 +4902,20 @@
     <w:basedOn w:val="DefaultParagraphFont"/>
     <w:uiPriority w:val="1"/>
     <w:rsid w:val="00DA118C"/>
+  </w:style>
+  <w:style w:type="character" w:styleId="BookTitle">
+    <w:name w:val="Book Title"/>
+    <w:basedOn w:val="DefaultParagraphFont"/>
+    <w:uiPriority w:val="33"/>
+    <w:qFormat/>
+    <w:rsid w:val="003D2B3A"/>
+    <w:rPr>
+      <w:b/>
+      <w:bCs/>
+      <w:i/>
+      <w:iCs/>
+      <w:spacing w:val="5"/>
+    </w:rPr>
   </w:style>
 </w:styles>
 </file>

</xml_diff>